<commit_message>
Deploying to gh-pages from @ Morrison-Lab/pds@7725a1752d7f3cd8718631c723cbd9dfb47425af 🚀
</commit_message>
<xml_diff>
--- a/variance-covariance.docx
+++ b/variance-covariance.docx
@@ -15,7 +15,7 @@
         <w:pStyle w:val="Date"/>
       </w:pPr>
       <w:r>
-        <w:t xml:space="preserve">Last modified: 2026-10-06 01:26:45 (PDT)</w:t>
+        <w:t xml:space="preserve">Last modified: 2026-10-06 10:41:36 (PDT)</w:t>
       </w:r>
     </w:p>
     <w:bookmarkStart w:id="25" w:name="sec-deviation"/>
@@ -12352,7 +12352,7 @@
     </w:p>
     <w:bookmarkEnd w:id="48"/>
     <w:bookmarkEnd w:id="49"/>
-    <w:bookmarkStart w:id="56" w:name="sec-bias-variance-prediction"/>
+    <w:bookmarkStart w:id="57" w:name="sec-bias-variance-prediction"/>
     <w:p>
       <w:pPr>
         <w:pStyle w:val="Heading2"/>
@@ -13361,7 +13361,7 @@
       </w:r>
     </w:p>
     <w:bookmarkEnd w:id="51"/>
-    <w:bookmarkStart w:id="52" w:name="def-prediction-bias"/>
+    <w:bookmarkStart w:id="53" w:name="def-prediction-bias"/>
     <w:p>
       <w:pPr>
         <w:pStyle w:val="FirstParagraph"/>
@@ -13465,7 +13465,24 @@
         <w:t xml:space="preserve"> </w:t>
       </w:r>
       <w:r>
-        <w:t xml:space="preserve">be a prediction of the value</w:t>
+        <w:t xml:space="preserve">be a</w:t>
+      </w:r>
+      <w:r>
+        <w:t xml:space="preserve"> </w:t>
+      </w:r>
+      <w:hyperlink r:id="rId52">
+        <w:r>
+          <w:rPr>
+            <w:rStyle w:val="Hyperlink"/>
+          </w:rPr>
+          <w:t xml:space="preserve">prediction</w:t>
+        </w:r>
+      </w:hyperlink>
+      <w:r>
+        <w:t xml:space="preserve"> </w:t>
+      </w:r>
+      <w:r>
+        <w:t xml:space="preserve">of the value</w:t>
       </w:r>
       <w:r>
         <w:t xml:space="preserve"> </w:t>
@@ -13803,8 +13820,8 @@
         </m:oMath>
       </m:oMathPara>
     </w:p>
-    <w:bookmarkEnd w:id="52"/>
-    <w:bookmarkStart w:id="53" w:name="exm-prediction-bias"/>
+    <w:bookmarkEnd w:id="53"/>
+    <w:bookmarkStart w:id="54" w:name="exm-prediction-bias"/>
     <w:p>
       <w:pPr>
         <w:pStyle w:val="FirstParagraph"/>
@@ -14090,8 +14107,8 @@
         <w:t xml:space="preserve">.</w:t>
       </w:r>
     </w:p>
-    <w:bookmarkEnd w:id="53"/>
-    <w:bookmarkStart w:id="54" w:name="thm-prediction-error"/>
+    <w:bookmarkEnd w:id="54"/>
+    <w:bookmarkStart w:id="55" w:name="thm-prediction-error"/>
     <w:p>
       <w:pPr>
         <w:pStyle w:val="BodyText"/>
@@ -14739,7 +14756,7 @@
         </m:oMath>
       </m:oMathPara>
     </w:p>
-    <w:bookmarkEnd w:id="54"/>
+    <w:bookmarkEnd w:id="55"/>
     <w:p>
       <w:pPr>
         <w:pStyle w:val="FirstParagraph"/>
@@ -16174,7 +16191,7 @@
         <w:t xml:space="preserve">Adding the three terms gives the claim.</w:t>
       </w:r>
     </w:p>
-    <w:bookmarkStart w:id="55" w:name="def-irreducible-error"/>
+    <w:bookmarkStart w:id="56" w:name="def-irreducible-error"/>
     <w:p>
       <w:pPr>
         <w:pStyle w:val="BodyText"/>
@@ -16376,9 +16393,9 @@
         <w:t xml:space="preserve">.</w:t>
       </w:r>
     </w:p>
-    <w:bookmarkEnd w:id="55"/>
     <w:bookmarkEnd w:id="56"/>
-    <w:bookmarkStart w:id="94" w:name="covariance"/>
+    <w:bookmarkEnd w:id="57"/>
+    <w:bookmarkStart w:id="95" w:name="covariance"/>
     <w:p>
       <w:pPr>
         <w:pStyle w:val="Heading2"/>
@@ -16387,7 +16404,7 @@
         <w:t xml:space="preserve">4 Covariance</w:t>
       </w:r>
     </w:p>
-    <w:bookmarkStart w:id="57" w:name="def-cov"/>
+    <w:bookmarkStart w:id="58" w:name="def-cov"/>
     <w:p>
       <w:pPr>
         <w:pStyle w:val="FirstParagraph"/>
@@ -16743,8 +16760,8 @@
         </m:oMath>
       </m:oMathPara>
     </w:p>
-    <w:bookmarkEnd w:id="57"/>
-    <w:bookmarkStart w:id="58" w:name="thm-alt-cov"/>
+    <w:bookmarkEnd w:id="58"/>
+    <w:bookmarkStart w:id="59" w:name="thm-alt-cov"/>
     <w:p>
       <w:pPr>
         <w:pStyle w:val="FirstParagraph"/>
@@ -16893,7 +16910,7 @@
         </m:oMath>
       </m:oMathPara>
     </w:p>
-    <w:bookmarkEnd w:id="58"/>
+    <w:bookmarkEnd w:id="59"/>
     <w:p>
       <w:pPr>
         <w:pStyle w:val="FirstParagraph"/>
@@ -17712,7 +17729,7 @@
         </m:oMath>
       </m:oMathPara>
     </w:p>
-    <w:bookmarkStart w:id="59" w:name="exm-alt-cov"/>
+    <w:bookmarkStart w:id="60" w:name="exm-alt-cov"/>
     <w:p>
       <w:pPr>
         <w:pStyle w:val="FirstParagraph"/>
@@ -18156,8 +18173,8 @@
         </m:oMath>
       </m:oMathPara>
     </w:p>
-    <w:bookmarkEnd w:id="59"/>
-    <w:bookmarkStart w:id="61" w:name="thm-indpt-uncorrelated"/>
+    <w:bookmarkEnd w:id="60"/>
+    <w:bookmarkStart w:id="62" w:name="thm-indpt-uncorrelated"/>
     <w:p>
       <w:pPr>
         <w:pStyle w:val="FirstParagraph"/>
@@ -18206,7 +18223,7 @@
       <w:r>
         <w:t xml:space="preserve"> </w:t>
       </w:r>
-      <w:hyperlink r:id="rId60">
+      <w:hyperlink r:id="rId61">
         <w:r>
           <w:rPr>
             <w:rStyle w:val="Hyperlink"/>
@@ -18502,7 +18519,7 @@
         <w:t xml:space="preserve">.</w:t>
       </w:r>
     </w:p>
-    <w:bookmarkEnd w:id="61"/>
+    <w:bookmarkEnd w:id="62"/>
     <w:p>
       <w:pPr>
         <w:pStyle w:val="BodyText"/>
@@ -18652,7 +18669,7 @@
       <w:r>
         <w:t xml:space="preserve"> </w:t>
       </w:r>
-      <w:hyperlink r:id="rId62">
+      <w:hyperlink r:id="rId63">
         <w:r>
           <w:rPr>
             <w:rStyle w:val="Hyperlink"/>
@@ -18666,7 +18683,7 @@
       <w:r>
         <w:t xml:space="preserve">(</w:t>
       </w:r>
-      <w:hyperlink r:id="rId63">
+      <w:hyperlink r:id="rId64">
         <w:r>
           <w:rPr>
             <w:rStyle w:val="Hyperlink"/>
@@ -18848,7 +18865,7 @@
       <w:r>
         <w:t xml:space="preserve"> </w:t>
       </w:r>
-      <w:hyperlink r:id="rId60">
+      <w:hyperlink r:id="rId61">
         <w:r>
           <w:rPr>
             <w:rStyle w:val="Hyperlink"/>
@@ -21024,7 +21041,7 @@
         </m:oMath>
       </m:oMathPara>
     </w:p>
-    <w:bookmarkStart w:id="65" w:name="exm-indpt-uncorrelated"/>
+    <w:bookmarkStart w:id="66" w:name="exm-indpt-uncorrelated"/>
     <w:p>
       <w:pPr>
         <w:pStyle w:val="FirstParagraph"/>
@@ -21091,7 +21108,7 @@
       <w:r>
         <w:t xml:space="preserve"> </w:t>
       </w:r>
-      <w:hyperlink r:id="rId64">
+      <w:hyperlink r:id="rId65">
         <w:r>
           <w:rPr>
             <w:rStyle w:val="Hyperlink"/>
@@ -21672,8 +21689,8 @@
         <w:t xml:space="preserve">requires.</w:t>
       </w:r>
     </w:p>
-    <w:bookmarkEnd w:id="65"/>
-    <w:bookmarkStart w:id="66" w:name="exm-uncorrelated-not-indpt"/>
+    <w:bookmarkEnd w:id="66"/>
+    <w:bookmarkStart w:id="67" w:name="exm-uncorrelated-not-indpt"/>
     <w:p>
       <w:pPr>
         <w:pStyle w:val="BodyText"/>
@@ -22772,8 +22789,8 @@
         <w:t xml:space="preserve">.</w:t>
       </w:r>
     </w:p>
-    <w:bookmarkEnd w:id="66"/>
-    <w:bookmarkStart w:id="67" w:name="def-correlation"/>
+    <w:bookmarkEnd w:id="67"/>
+    <w:bookmarkStart w:id="68" w:name="def-correlation"/>
     <w:p>
       <w:pPr>
         <w:pStyle w:val="BodyText"/>
@@ -23045,7 +23062,7 @@
         </m:oMath>
       </m:oMathPara>
     </w:p>
-    <w:bookmarkEnd w:id="67"/>
+    <w:bookmarkEnd w:id="68"/>
     <w:p>
       <w:pPr>
         <w:pStyle w:val="FirstParagraph"/>
@@ -23101,7 +23118,7 @@
         <w:t xml:space="preserve">the sample (Pearson) correlation coefficient computed from data estimates it.</w:t>
       </w:r>
     </w:p>
-    <w:bookmarkStart w:id="68" w:name="exm-correlation"/>
+    <w:bookmarkStart w:id="69" w:name="exm-correlation"/>
     <w:p>
       <w:pPr>
         <w:pStyle w:val="BodyText"/>
@@ -23748,8 +23765,8 @@
         </m:oMath>
       </m:oMathPara>
     </w:p>
-    <w:bookmarkEnd w:id="68"/>
-    <w:bookmarkStart w:id="69" w:name="def-uncorrelated"/>
+    <w:bookmarkEnd w:id="69"/>
+    <w:bookmarkStart w:id="70" w:name="def-uncorrelated"/>
     <w:p>
       <w:pPr>
         <w:pStyle w:val="FirstParagraph"/>
@@ -23998,7 +24015,7 @@
         </m:oMath>
       </m:oMathPara>
     </w:p>
-    <w:bookmarkEnd w:id="69"/>
+    <w:bookmarkEnd w:id="70"/>
     <w:p>
       <w:pPr>
         <w:pStyle w:val="FirstParagraph"/>
@@ -24051,7 +24068,7 @@
         <w:t xml:space="preserve">shows the converse fails.</w:t>
       </w:r>
     </w:p>
-    <w:bookmarkStart w:id="70" w:name="exm-uncorrelated"/>
+    <w:bookmarkStart w:id="71" w:name="exm-uncorrelated"/>
     <w:p>
       <w:pPr>
         <w:pStyle w:val="BodyText"/>
@@ -24273,8 +24290,8 @@
         <w:t xml:space="preserve">so the binary exposure and outcome are not uncorrelated.</w:t>
       </w:r>
     </w:p>
-    <w:bookmarkEnd w:id="70"/>
-    <w:bookmarkStart w:id="71" w:name="cor-uncorrelated-cor-zero"/>
+    <w:bookmarkEnd w:id="71"/>
+    <w:bookmarkStart w:id="72" w:name="cor-uncorrelated-cor-zero"/>
     <w:p>
       <w:pPr>
         <w:pStyle w:val="BodyText"/>
@@ -24437,7 +24454,7 @@
         <w:t xml:space="preserve">.</w:t>
       </w:r>
     </w:p>
-    <w:bookmarkEnd w:id="71"/>
+    <w:bookmarkEnd w:id="72"/>
     <w:p>
       <w:pPr>
         <w:pStyle w:val="BodyText"/>
@@ -24837,7 +24854,7 @@
         <w:t xml:space="preserve">.</w:t>
       </w:r>
     </w:p>
-    <w:bookmarkStart w:id="72" w:name="def-cond-cov"/>
+    <w:bookmarkStart w:id="73" w:name="def-cond-cov"/>
     <w:p>
       <w:pPr>
         <w:pStyle w:val="BodyText"/>
@@ -25289,8 +25306,8 @@
         <w:t xml:space="preserve">.</w:t>
       </w:r>
     </w:p>
-    <w:bookmarkEnd w:id="72"/>
-    <w:bookmarkStart w:id="73" w:name="exm-cond-cov"/>
+    <w:bookmarkEnd w:id="73"/>
+    <w:bookmarkStart w:id="74" w:name="exm-cond-cov"/>
     <w:p>
       <w:pPr>
         <w:pStyle w:val="BodyText"/>
@@ -25561,8 +25578,8 @@
         <w:t xml:space="preserve">.</w:t>
       </w:r>
     </w:p>
-    <w:bookmarkEnd w:id="73"/>
-    <w:bookmarkStart w:id="74" w:name="thm-total-cov"/>
+    <w:bookmarkEnd w:id="74"/>
+    <w:bookmarkStart w:id="75" w:name="thm-total-cov"/>
     <w:p>
       <w:pPr>
         <w:pStyle w:val="BodyText"/>
@@ -25947,7 +25964,7 @@
         </m:oMath>
       </m:oMathPara>
     </w:p>
-    <w:bookmarkEnd w:id="74"/>
+    <w:bookmarkEnd w:id="75"/>
     <w:p>
       <w:pPr>
         <w:pStyle w:val="FirstParagraph"/>
@@ -29063,7 +29080,7 @@
         <w:t xml:space="preserve">.</w:t>
       </w:r>
     </w:p>
-    <w:bookmarkStart w:id="75" w:name="lem-cov-xx"/>
+    <w:bookmarkStart w:id="76" w:name="lem-cov-xx"/>
     <w:p>
       <w:pPr>
         <w:pStyle w:val="BodyText"/>
@@ -29227,7 +29244,7 @@
         </m:oMath>
       </m:oMathPara>
     </w:p>
-    <w:bookmarkEnd w:id="75"/>
+    <w:bookmarkEnd w:id="76"/>
     <w:p>
       <w:pPr>
         <w:pStyle w:val="FirstParagraph"/>
@@ -29629,7 +29646,7 @@
         </m:oMath>
       </m:oMathPara>
     </w:p>
-    <w:bookmarkStart w:id="76" w:name="def-cov-vec-x"/>
+    <w:bookmarkStart w:id="77" w:name="def-cov-vec-x"/>
     <w:p>
       <w:pPr>
         <w:pStyle w:val="FirstParagraph"/>
@@ -29980,8 +29997,8 @@
         </m:oMath>
       </m:oMathPara>
     </w:p>
-    <w:bookmarkEnd w:id="76"/>
-    <w:bookmarkStart w:id="77" w:name="thm-vcov-elements"/>
+    <w:bookmarkEnd w:id="77"/>
+    <w:bookmarkStart w:id="78" w:name="thm-vcov-elements"/>
     <w:p>
       <w:pPr>
         <w:pStyle w:val="FirstParagraph"/>
@@ -30842,7 +30859,7 @@
         </m:oMath>
       </m:oMathPara>
     </w:p>
-    <w:bookmarkEnd w:id="77"/>
+    <w:bookmarkEnd w:id="78"/>
     <w:p>
       <w:pPr>
         <w:pStyle w:val="FirstParagraph"/>
@@ -33107,7 +33124,7 @@
       <w:r>
         <w:t xml:space="preserve"> </w:t>
       </w:r>
-      <w:hyperlink r:id="rId78">
+      <w:hyperlink r:id="rId79">
         <w:r>
           <w:rPr>
             <w:rStyle w:val="Hyperlink"/>
@@ -33171,7 +33188,7 @@
         <w:t xml:space="preserve">.</w:t>
       </w:r>
     </w:p>
-    <w:bookmarkStart w:id="79" w:name="thm-vcov-vec"/>
+    <w:bookmarkStart w:id="80" w:name="thm-vcov-vec"/>
     <w:p>
       <w:pPr>
         <w:pStyle w:val="FirstParagraph"/>
@@ -33377,7 +33394,7 @@
         </m:oMath>
       </m:oMathPara>
     </w:p>
-    <w:bookmarkEnd w:id="79"/>
+    <w:bookmarkEnd w:id="80"/>
     <w:p>
       <w:pPr>
         <w:pStyle w:val="FirstParagraph"/>
@@ -34380,7 +34397,7 @@
         </m:oMath>
       </m:oMathPara>
     </w:p>
-    <w:bookmarkStart w:id="80" w:name="thm-var-lincom"/>
+    <w:bookmarkStart w:id="81" w:name="thm-var-lincom"/>
     <w:p>
       <w:pPr>
         <w:pStyle w:val="FirstParagraph"/>
@@ -34932,7 +34949,7 @@
         </m:oMath>
       </m:oMathPara>
     </w:p>
-    <w:bookmarkEnd w:id="80"/>
+    <w:bookmarkEnd w:id="81"/>
     <w:p>
       <w:pPr>
         <w:pStyle w:val="FirstParagraph"/>
@@ -36362,7 +36379,7 @@
         </m:oMath>
       </m:oMathPara>
     </w:p>
-    <w:bookmarkStart w:id="81" w:name="cor-var-lincom2"/>
+    <w:bookmarkStart w:id="82" w:name="cor-var-lincom2"/>
     <w:p>
       <w:pPr>
         <w:pStyle w:val="FirstParagraph"/>
@@ -36639,7 +36656,7 @@
         </m:oMath>
       </m:oMathPara>
     </w:p>
-    <w:bookmarkEnd w:id="81"/>
+    <w:bookmarkEnd w:id="82"/>
     <w:p>
       <w:pPr>
         <w:pStyle w:val="FirstParagraph"/>
@@ -38169,7 +38186,7 @@
         </m:oMath>
       </m:oMathPara>
     </w:p>
-    <w:bookmarkStart w:id="82" w:name="cor-var-sum-indpt"/>
+    <w:bookmarkStart w:id="83" w:name="cor-var-sum-indpt"/>
     <w:p>
       <w:pPr>
         <w:pStyle w:val="FirstParagraph"/>
@@ -38218,7 +38235,7 @@
       <w:r>
         <w:t xml:space="preserve"> </w:t>
       </w:r>
-      <w:hyperlink r:id="rId60">
+      <w:hyperlink r:id="rId61">
         <w:r>
           <w:rPr>
             <w:rStyle w:val="Hyperlink"/>
@@ -38461,7 +38478,7 @@
         </m:oMath>
       </m:oMathPara>
     </w:p>
-    <w:bookmarkEnd w:id="82"/>
+    <w:bookmarkEnd w:id="83"/>
     <w:p>
       <w:pPr>
         <w:pStyle w:val="FirstParagraph"/>
@@ -39133,7 +39150,7 @@
         <w:t xml:space="preserve">is the case where that term is 0.</w:t>
       </w:r>
     </w:p>
-    <w:bookmarkStart w:id="85" w:name="thm-vcov-psd"/>
+    <w:bookmarkStart w:id="86" w:name="thm-vcov-psd"/>
     <w:p>
       <w:pPr>
         <w:pStyle w:val="BodyText"/>
@@ -39386,7 +39403,7 @@
       <w:r>
         <w:t xml:space="preserve"> </w:t>
       </w:r>
-      <w:hyperlink r:id="rId83">
+      <w:hyperlink r:id="rId84">
         <w:r>
           <w:rPr>
             <w:rStyle w:val="Hyperlink"/>
@@ -39403,7 +39420,7 @@
       <w:r>
         <w:t xml:space="preserve"> </w:t>
       </w:r>
-      <w:hyperlink r:id="rId84">
+      <w:hyperlink r:id="rId85">
         <w:r>
           <w:rPr>
             <w:rStyle w:val="Hyperlink"/>
@@ -39547,7 +39564,7 @@
         </m:oMath>
       </m:oMathPara>
     </w:p>
-    <w:bookmarkEnd w:id="85"/>
+    <w:bookmarkEnd w:id="86"/>
     <w:p>
       <w:pPr>
         <w:pStyle w:val="FirstParagraph"/>
@@ -40776,7 +40793,7 @@
         <w:t xml:space="preserve">).</w:t>
       </w:r>
     </w:p>
-    <w:bookmarkStart w:id="86" w:name="exm-vcov-psd"/>
+    <w:bookmarkStart w:id="87" w:name="exm-vcov-psd"/>
     <w:p>
       <w:pPr>
         <w:pStyle w:val="BodyText"/>
@@ -43476,7 +43493,7 @@
         <w:t xml:space="preserve">.</w:t>
       </w:r>
     </w:p>
-    <w:bookmarkEnd w:id="86"/>
+    <w:bookmarkEnd w:id="87"/>
     <w:p>
       <w:pPr>
         <w:pStyle w:val="BodyText"/>
@@ -43610,7 +43627,7 @@
         <w:t xml:space="preserve">has the larger spread.</w:t>
       </w:r>
     </w:p>
-    <w:bookmarkStart w:id="90" w:name="exm-vcov-singular"/>
+    <w:bookmarkStart w:id="91" w:name="exm-vcov-singular"/>
     <w:p>
       <w:pPr>
         <w:pStyle w:val="BodyText"/>
@@ -44321,7 +44338,7 @@
       <w:r>
         <w:t xml:space="preserve"> </w:t>
       </w:r>
-      <w:hyperlink r:id="rId87">
+      <w:hyperlink r:id="rId88">
         <w:r>
           <w:rPr>
             <w:rStyle w:val="Hyperlink"/>
@@ -44338,7 +44355,7 @@
       <w:r>
         <w:t xml:space="preserve"> </w:t>
       </w:r>
-      <w:hyperlink r:id="rId88">
+      <w:hyperlink r:id="rId89">
         <w:r>
           <w:rPr>
             <w:rStyle w:val="Hyperlink"/>
@@ -44402,7 +44419,7 @@
       <w:r>
         <w:t xml:space="preserve"> </w:t>
       </w:r>
-      <w:hyperlink r:id="rId89">
+      <w:hyperlink r:id="rId90">
         <w:r>
           <w:rPr>
             <w:rStyle w:val="Hyperlink"/>
@@ -44414,8 +44431,8 @@
         <w:t xml:space="preserve">.</w:t>
       </w:r>
     </w:p>
-    <w:bookmarkEnd w:id="90"/>
-    <w:bookmarkStart w:id="92" w:name="cor-vcov-indpt-diagonal"/>
+    <w:bookmarkEnd w:id="91"/>
+    <w:bookmarkStart w:id="93" w:name="cor-vcov-indpt-diagonal"/>
     <w:p>
       <w:pPr>
         <w:pStyle w:val="BodyText"/>
@@ -44666,7 +44683,7 @@
       <w:r>
         <w:t xml:space="preserve"> </w:t>
       </w:r>
-      <w:hyperlink r:id="rId60">
+      <w:hyperlink r:id="rId61">
         <w:r>
           <w:rPr>
             <w:rStyle w:val="Hyperlink"/>
@@ -44754,7 +44771,7 @@
       <w:r>
         <w:t xml:space="preserve"> </w:t>
       </w:r>
-      <w:hyperlink r:id="rId91">
+      <w:hyperlink r:id="rId92">
         <w:r>
           <w:rPr>
             <w:rStyle w:val="Hyperlink"/>
@@ -44866,7 +44883,7 @@
         <w:t xml:space="preserve">.</w:t>
       </w:r>
     </w:p>
-    <w:bookmarkEnd w:id="92"/>
+    <w:bookmarkEnd w:id="93"/>
     <w:p>
       <w:pPr>
         <w:pStyle w:val="BodyText"/>
@@ -45353,7 +45370,7 @@
         <w:t xml:space="preserve">.</w:t>
       </w:r>
     </w:p>
-    <w:bookmarkStart w:id="93" w:name="thm-cor-bounds"/>
+    <w:bookmarkStart w:id="94" w:name="thm-cor-bounds"/>
     <w:p>
       <w:pPr>
         <w:pStyle w:val="BodyText"/>
@@ -45602,7 +45619,7 @@
         </m:oMath>
       </m:oMathPara>
     </w:p>
-    <w:bookmarkEnd w:id="93"/>
+    <w:bookmarkEnd w:id="94"/>
     <w:p>
       <w:pPr>
         <w:pStyle w:val="FirstParagraph"/>
@@ -46824,8 +46841,8 @@
         <w:t xml:space="preserve">.</w:t>
       </w:r>
     </w:p>
-    <w:bookmarkEnd w:id="94"/>
-    <w:bookmarkStart w:id="99" w:name="references"/>
+    <w:bookmarkEnd w:id="95"/>
+    <w:bookmarkStart w:id="100" w:name="references"/>
     <w:p>
       <w:pPr>
         <w:pStyle w:val="Heading2"/>
@@ -46834,8 +46851,8 @@
         <w:t xml:space="preserve">References</w:t>
       </w:r>
     </w:p>
-    <w:bookmarkStart w:id="98" w:name="refs"/>
-    <w:bookmarkStart w:id="95" w:name="ref-billingsley1995probability"/>
+    <w:bookmarkStart w:id="99" w:name="refs"/>
+    <w:bookmarkStart w:id="96" w:name="ref-billingsley1995probability"/>
     <w:p>
       <w:pPr>
         <w:pStyle w:val="Bibliography"/>
@@ -46857,8 +46874,8 @@
         <w:t xml:space="preserve">. 3rd ed. Wiley Series in Probability and Mathematical Statistics. Wiley.</w:t>
       </w:r>
     </w:p>
-    <w:bookmarkEnd w:id="95"/>
-    <w:bookmarkStart w:id="97" w:name="ref-CaseBerg01"/>
+    <w:bookmarkEnd w:id="96"/>
+    <w:bookmarkStart w:id="98" w:name="ref-CaseBerg01"/>
     <w:p>
       <w:pPr>
         <w:pStyle w:val="Bibliography"/>
@@ -46882,7 +46899,7 @@
       <w:r>
         <w:t xml:space="preserve"> </w:t>
       </w:r>
-      <w:hyperlink r:id="rId96">
+      <w:hyperlink r:id="rId97">
         <w:r>
           <w:rPr>
             <w:rStyle w:val="Hyperlink"/>
@@ -46894,9 +46911,9 @@
         <w:t xml:space="preserve">.</w:t>
       </w:r>
     </w:p>
-    <w:bookmarkEnd w:id="97"/>
     <w:bookmarkEnd w:id="98"/>
     <w:bookmarkEnd w:id="99"/>
+    <w:bookmarkEnd w:id="100"/>
     <w:sectPr>
       <w:footnotePr>
         <w:numRestart w:val="eachSect"/>

</xml_diff>

<commit_message>
Deploying to gh-pages from @ Morrison-Lab/pds@e26d61b43e5711286b7b626bab0dae310d51b948 🚀
</commit_message>
<xml_diff>
--- a/variance-covariance.docx
+++ b/variance-covariance.docx
@@ -15,7 +15,7 @@
         <w:pStyle w:val="Date"/>
       </w:pPr>
       <w:r>
-        <w:t xml:space="preserve">Last modified: 2026-10-08 12:54:59 (PDT)</w:t>
+        <w:t xml:space="preserve">Last modified: 2026-10-08 13:05:16 (PDT)</w:t>
       </w:r>
     </w:p>
     <w:bookmarkStart w:id="25" w:name="sec-deviation"/>
@@ -16455,7 +16455,7 @@
       </w:r>
     </w:p>
     <w:bookmarkEnd w:id="57"/>
-    <w:bookmarkStart w:id="95" w:name="covariance"/>
+    <w:bookmarkStart w:id="102" w:name="covariance"/>
     <w:p>
       <w:pPr>
         <w:pStyle w:val="Heading2"/>
@@ -47231,8 +47231,1924 @@
         <w:t xml:space="preserve">.</w:t>
       </w:r>
     </w:p>
-    <w:bookmarkEnd w:id="95"/>
-    <w:bookmarkStart w:id="102" w:name="references"/>
+    <w:bookmarkStart w:id="101" w:name="exm-cor-auto"/>
+    <w:p>
+      <w:pPr>
+        <w:pStyle w:val="BodyText"/>
+      </w:pPr>
+      <w:r>
+        <w:rPr>
+          <w:b/>
+          <w:bCs/>
+        </w:rPr>
+        <w:t xml:space="preserve">Example 18 (Correlation of horsepower and fuel economy)</w:t>
+      </w:r>
+      <w:r>
+        <w:t xml:space="preserve"> </w:t>
+      </w:r>
+      <w:r>
+        <w:t xml:space="preserve">The Auto data record the horsepower and fuel economy (miles per gallon)</w:t>
+      </w:r>
+      <w:r>
+        <w:t xml:space="preserve"> </w:t>
+      </w:r>
+      <w:r>
+        <w:t xml:space="preserve">of 392 car models</w:t>
+      </w:r>
+      <w:r>
+        <w:t xml:space="preserve"> </w:t>
+      </w:r>
+      <w:r>
+        <w:t xml:space="preserve">sold between 1970 and 1982.</w:t>
+      </w:r>
+      <w:r>
+        <w:t xml:space="preserve"> </w:t>
+      </w:r>
+      <w:r>
+        <w:t xml:space="preserve">They come from the StatLib library at Carnegie Mellon University</w:t>
+      </w:r>
+      <w:r>
+        <w:t xml:space="preserve"> </w:t>
+      </w:r>
+      <w:r>
+        <w:t xml:space="preserve">and ship with the book</w:t>
+      </w:r>
+      <w:r>
+        <w:t xml:space="preserve"> </w:t>
+      </w:r>
+      <w:r>
+        <w:rPr>
+          <w:i/>
+          <w:iCs/>
+        </w:rPr>
+        <w:t xml:space="preserve">An Introduction to Statistical Learning</w:t>
+      </w:r>
+      <w:r>
+        <w:t xml:space="preserve">,</w:t>
+      </w:r>
+      <w:r>
+        <w:t xml:space="preserve"> </w:t>
+      </w:r>
+      <w:r>
+        <w:t xml:space="preserve">in the Python package</w:t>
+      </w:r>
+      <w:r>
+        <w:t xml:space="preserve"> </w:t>
+      </w:r>
+      <w:hyperlink r:id="rId95">
+        <w:r>
+          <w:rPr>
+            <w:rStyle w:val="VerbatimChar"/>
+          </w:rPr>
+          <w:t xml:space="preserve">ISLP</w:t>
+        </w:r>
+      </w:hyperlink>
+      <w:r>
+        <w:t xml:space="preserve"> </w:t>
+      </w:r>
+      <w:r>
+        <w:t xml:space="preserve">(</w:t>
+      </w:r>
+      <w:r>
+        <w:rPr>
+          <w:rStyle w:val="VerbatimChar"/>
+        </w:rPr>
+        <w:t xml:space="preserve">ISLP.load_data("Auto")</w:t>
+      </w:r>
+      <w:r>
+        <w:t xml:space="preserve">)</w:t>
+      </w:r>
+      <w:r>
+        <w:t xml:space="preserve"> </w:t>
+      </w:r>
+      <w:r>
+        <w:t xml:space="preserve">and the R package</w:t>
+      </w:r>
+      <w:r>
+        <w:t xml:space="preserve"> </w:t>
+      </w:r>
+      <w:hyperlink r:id="rId96">
+        <w:r>
+          <w:rPr>
+            <w:rStyle w:val="VerbatimChar"/>
+          </w:rPr>
+          <w:t xml:space="preserve">ISLR2</w:t>
+        </w:r>
+      </w:hyperlink>
+      <w:r>
+        <w:t xml:space="preserve"> </w:t>
+      </w:r>
+      <w:r>
+        <w:t xml:space="preserve">(</w:t>
+      </w:r>
+      <w:r>
+        <w:rPr>
+          <w:rStyle w:val="VerbatimChar"/>
+        </w:rPr>
+        <w:t xml:space="preserve">ISLR2::Auto</w:t>
+      </w:r>
+      <w:r>
+        <w:t xml:space="preserve">).</w:t>
+      </w:r>
+      <w:r>
+        <w:t xml:space="preserve"> </w:t>
+      </w:r>
+      <w:r>
+        <w:t xml:space="preserve">This repository holds a copy at</w:t>
+      </w:r>
+      <w:r>
+        <w:t xml:space="preserve"> </w:t>
+      </w:r>
+      <w:r>
+        <w:rPr>
+          <w:rStyle w:val="VerbatimChar"/>
+        </w:rPr>
+        <w:t xml:space="preserve">data/auto.csv</w:t>
+      </w:r>
+      <w:r>
+        <w:t xml:space="preserve">,</w:t>
+      </w:r>
+      <w:r>
+        <w:t xml:space="preserve"> </w:t>
+      </w:r>
+      <w:r>
+        <w:t xml:space="preserve">and both code tabs below read that file.</w:t>
+      </w:r>
+    </w:p>
+    <w:p>
+      <w:pPr>
+        <w:pStyle w:val="BodyText"/>
+      </w:pPr>
+      <w:r>
+        <w:t xml:space="preserve">Choose one car at random, each with the same probability,</w:t>
+      </w:r>
+      <w:r>
+        <w:t xml:space="preserve"> </w:t>
+      </w:r>
+      <w:r>
+        <w:t xml:space="preserve">and let</w:t>
+      </w:r>
+      <w:r>
+        <w:t xml:space="preserve"> </w:t>
+      </w:r>
+      <m:oMath>
+        <m:r>
+          <m:t>X</m:t>
+        </m:r>
+      </m:oMath>
+      <w:r>
+        <w:t xml:space="preserve"> </w:t>
+      </w:r>
+      <w:r>
+        <w:t xml:space="preserve">be its horsepower and</w:t>
+      </w:r>
+      <w:r>
+        <w:t xml:space="preserve"> </w:t>
+      </w:r>
+      <m:oMath>
+        <m:r>
+          <m:t>Y</m:t>
+        </m:r>
+      </m:oMath>
+      <w:r>
+        <w:t xml:space="preserve"> </w:t>
+      </w:r>
+      <w:r>
+        <w:t xml:space="preserve">its miles per gallon.</w:t>
+      </w:r>
+      <w:r>
+        <w:t xml:space="preserve"> </w:t>
+      </w:r>
+      <w:r>
+        <w:t xml:space="preserve">Then</w:t>
+      </w:r>
+      <w:r>
+        <w:t xml:space="preserve"> </w:t>
+      </w:r>
+      <m:oMath>
+        <m:r>
+          <m:rPr>
+            <m:sty m:val="p"/>
+          </m:rPr>
+          <m:t>E</m:t>
+        </m:r>
+        <m:r>
+          <m:t>​</m:t>
+        </m:r>
+        <m:d>
+          <m:dPr>
+            <m:begChr m:val="["/>
+            <m:sepChr m:val=""/>
+            <m:endChr m:val="]"/>
+            <m:grow/>
+          </m:dPr>
+          <m:e>
+            <m:r>
+              <m:t>X</m:t>
+            </m:r>
+          </m:e>
+        </m:d>
+        <m:r>
+          <m:t>​</m:t>
+        </m:r>
+      </m:oMath>
+      <w:r>
+        <w:t xml:space="preserve">,</w:t>
+      </w:r>
+      <w:r>
+        <w:t xml:space="preserve"> </w:t>
+      </w:r>
+      <m:oMath>
+        <m:r>
+          <m:rPr>
+            <m:sty m:val="p"/>
+          </m:rPr>
+          <m:t>Var</m:t>
+        </m:r>
+        <m:r>
+          <m:t>​</m:t>
+        </m:r>
+        <m:d>
+          <m:dPr>
+            <m:begChr m:val="("/>
+            <m:sepChr m:val=""/>
+            <m:endChr m:val=")"/>
+            <m:grow/>
+          </m:dPr>
+          <m:e>
+            <m:r>
+              <m:t>X</m:t>
+            </m:r>
+          </m:e>
+        </m:d>
+        <m:r>
+          <m:t>​</m:t>
+        </m:r>
+      </m:oMath>
+      <w:r>
+        <w:t xml:space="preserve">, and</w:t>
+      </w:r>
+      <w:r>
+        <w:t xml:space="preserve"> </w:t>
+      </w:r>
+      <m:oMath>
+        <m:r>
+          <m:rPr>
+            <m:sty m:val="p"/>
+          </m:rPr>
+          <m:t>Cov</m:t>
+        </m:r>
+        <m:r>
+          <m:t>​</m:t>
+        </m:r>
+        <m:d>
+          <m:dPr>
+            <m:begChr m:val="("/>
+            <m:sepChr m:val=""/>
+            <m:endChr m:val=")"/>
+            <m:grow/>
+          </m:dPr>
+          <m:e>
+            <m:r>
+              <m:t>X</m:t>
+            </m:r>
+            <m:r>
+              <m:rPr>
+                <m:sty m:val="p"/>
+              </m:rPr>
+              <m:t>,</m:t>
+            </m:r>
+            <m:r>
+              <m:t>Y</m:t>
+            </m:r>
+          </m:e>
+        </m:d>
+        <m:r>
+          <m:t>​</m:t>
+        </m:r>
+      </m:oMath>
+      <w:r>
+        <w:t xml:space="preserve"> </w:t>
+      </w:r>
+      <w:r>
+        <w:t xml:space="preserve">are the averages over the cars</w:t>
+      </w:r>
+      <w:r>
+        <w:t xml:space="preserve"> </w:t>
+      </w:r>
+      <w:r>
+        <w:t xml:space="preserve">in the data, and</w:t>
+      </w:r>
+      <w:r>
+        <w:t xml:space="preserve"> </w:t>
+      </w:r>
+      <w:hyperlink w:anchor="def-correlation">
+        <w:r>
+          <w:rPr>
+            <w:rStyle w:val="Hyperlink"/>
+          </w:rPr>
+          <w:t xml:space="preserve">Definition 12</w:t>
+        </w:r>
+      </w:hyperlink>
+      <w:r>
+        <w:t xml:space="preserve"> </w:t>
+      </w:r>
+      <w:r>
+        <w:t xml:space="preserve">gives</w:t>
+      </w:r>
+      <w:r>
+        <w:t xml:space="preserve"> </w:t>
+      </w:r>
+      <m:oMath>
+        <m:r>
+          <m:rPr>
+            <m:sty m:val="p"/>
+          </m:rPr>
+          <m:t>Cor</m:t>
+        </m:r>
+        <m:r>
+          <m:t>​</m:t>
+        </m:r>
+        <m:d>
+          <m:dPr>
+            <m:begChr m:val="("/>
+            <m:sepChr m:val=""/>
+            <m:endChr m:val=")"/>
+            <m:grow/>
+          </m:dPr>
+          <m:e>
+            <m:r>
+              <m:t>X</m:t>
+            </m:r>
+            <m:r>
+              <m:rPr>
+                <m:sty m:val="p"/>
+              </m:rPr>
+              <m:t>,</m:t>
+            </m:r>
+            <m:r>
+              <m:t>Y</m:t>
+            </m:r>
+          </m:e>
+        </m:d>
+        <m:r>
+          <m:t>​</m:t>
+        </m:r>
+      </m:oMath>
+      <w:r>
+        <w:t xml:space="preserve">.</w:t>
+      </w:r>
+      <w:r>
+        <w:t xml:space="preserve"> </w:t>
+      </w:r>
+      <w:r>
+        <w:t xml:space="preserve">The code below computes each part of the definition directly.</w:t>
+      </w:r>
+    </w:p>
+    <w:p>
+      <w:pPr>
+        <w:pStyle w:val="Heading4"/>
+      </w:pPr>
+      <w:r>
+        <w:t xml:space="preserve">Python</w:t>
+      </w:r>
+    </w:p>
+    <w:p>
+      <w:pPr>
+        <w:pStyle w:val="SourceCode"/>
+      </w:pPr>
+      <w:r>
+        <w:rPr>
+          <w:rStyle w:val="ImportTok"/>
+        </w:rPr>
+        <w:t xml:space="preserve">import</w:t>
+      </w:r>
+      <w:r>
+        <w:rPr>
+          <w:rStyle w:val="NormalTok"/>
+        </w:rPr>
+        <w:t xml:space="preserve"> numpy </w:t>
+      </w:r>
+      <w:r>
+        <w:rPr>
+          <w:rStyle w:val="ImportTok"/>
+        </w:rPr>
+        <w:t xml:space="preserve">as</w:t>
+      </w:r>
+      <w:r>
+        <w:rPr>
+          <w:rStyle w:val="NormalTok"/>
+        </w:rPr>
+        <w:t xml:space="preserve"> np</w:t>
+      </w:r>
+      <w:r>
+        <w:br/>
+      </w:r>
+      <w:r>
+        <w:rPr>
+          <w:rStyle w:val="ImportTok"/>
+        </w:rPr>
+        <w:t xml:space="preserve">import</w:t>
+      </w:r>
+      <w:r>
+        <w:rPr>
+          <w:rStyle w:val="NormalTok"/>
+        </w:rPr>
+        <w:t xml:space="preserve"> pandas </w:t>
+      </w:r>
+      <w:r>
+        <w:rPr>
+          <w:rStyle w:val="ImportTok"/>
+        </w:rPr>
+        <w:t xml:space="preserve">as</w:t>
+      </w:r>
+      <w:r>
+        <w:rPr>
+          <w:rStyle w:val="NormalTok"/>
+        </w:rPr>
+        <w:t xml:space="preserve"> pd</w:t>
+      </w:r>
+      <w:r>
+        <w:br/>
+      </w:r>
+      <w:r>
+        <w:br/>
+      </w:r>
+      <w:r>
+        <w:rPr>
+          <w:rStyle w:val="NormalTok"/>
+        </w:rPr>
+        <w:t xml:space="preserve">auto </w:t>
+      </w:r>
+      <w:r>
+        <w:rPr>
+          <w:rStyle w:val="OperatorTok"/>
+        </w:rPr>
+        <w:t xml:space="preserve">=</w:t>
+      </w:r>
+      <w:r>
+        <w:rPr>
+          <w:rStyle w:val="NormalTok"/>
+        </w:rPr>
+        <w:t xml:space="preserve"> pd.read_csv(</w:t>
+      </w:r>
+      <w:r>
+        <w:rPr>
+          <w:rStyle w:val="StringTok"/>
+        </w:rPr>
+        <w:t xml:space="preserve">"data/auto.csv"</w:t>
+      </w:r>
+      <w:r>
+        <w:rPr>
+          <w:rStyle w:val="NormalTok"/>
+        </w:rPr>
+        <w:t xml:space="preserve">)</w:t>
+      </w:r>
+      <w:r>
+        <w:br/>
+      </w:r>
+      <w:r>
+        <w:rPr>
+          <w:rStyle w:val="NormalTok"/>
+        </w:rPr>
+        <w:t xml:space="preserve">x </w:t>
+      </w:r>
+      <w:r>
+        <w:rPr>
+          <w:rStyle w:val="OperatorTok"/>
+        </w:rPr>
+        <w:t xml:space="preserve">=</w:t>
+      </w:r>
+      <w:r>
+        <w:rPr>
+          <w:rStyle w:val="NormalTok"/>
+        </w:rPr>
+        <w:t xml:space="preserve"> auto[</w:t>
+      </w:r>
+      <w:r>
+        <w:rPr>
+          <w:rStyle w:val="StringTok"/>
+        </w:rPr>
+        <w:t xml:space="preserve">"horsepower"</w:t>
+      </w:r>
+      <w:r>
+        <w:rPr>
+          <w:rStyle w:val="NormalTok"/>
+        </w:rPr>
+        <w:t xml:space="preserve">].to_numpy(dtype</w:t>
+      </w:r>
+      <w:r>
+        <w:rPr>
+          <w:rStyle w:val="OperatorTok"/>
+        </w:rPr>
+        <w:t xml:space="preserve">=</w:t>
+      </w:r>
+      <w:r>
+        <w:rPr>
+          <w:rStyle w:val="BuiltInTok"/>
+        </w:rPr>
+        <w:t xml:space="preserve">float</w:t>
+      </w:r>
+      <w:r>
+        <w:rPr>
+          <w:rStyle w:val="NormalTok"/>
+        </w:rPr>
+        <w:t xml:space="preserve">)</w:t>
+      </w:r>
+      <w:r>
+        <w:br/>
+      </w:r>
+      <w:r>
+        <w:rPr>
+          <w:rStyle w:val="NormalTok"/>
+        </w:rPr>
+        <w:t xml:space="preserve">y </w:t>
+      </w:r>
+      <w:r>
+        <w:rPr>
+          <w:rStyle w:val="OperatorTok"/>
+        </w:rPr>
+        <w:t xml:space="preserve">=</w:t>
+      </w:r>
+      <w:r>
+        <w:rPr>
+          <w:rStyle w:val="NormalTok"/>
+        </w:rPr>
+        <w:t xml:space="preserve"> auto[</w:t>
+      </w:r>
+      <w:r>
+        <w:rPr>
+          <w:rStyle w:val="StringTok"/>
+        </w:rPr>
+        <w:t xml:space="preserve">"mpg"</w:t>
+      </w:r>
+      <w:r>
+        <w:rPr>
+          <w:rStyle w:val="NormalTok"/>
+        </w:rPr>
+        <w:t xml:space="preserve">].to_numpy(dtype</w:t>
+      </w:r>
+      <w:r>
+        <w:rPr>
+          <w:rStyle w:val="OperatorTok"/>
+        </w:rPr>
+        <w:t xml:space="preserve">=</w:t>
+      </w:r>
+      <w:r>
+        <w:rPr>
+          <w:rStyle w:val="BuiltInTok"/>
+        </w:rPr>
+        <w:t xml:space="preserve">float</w:t>
+      </w:r>
+      <w:r>
+        <w:rPr>
+          <w:rStyle w:val="NormalTok"/>
+        </w:rPr>
+        <w:t xml:space="preserve">)</w:t>
+      </w:r>
+      <w:r>
+        <w:br/>
+      </w:r>
+      <w:r>
+        <w:br/>
+      </w:r>
+      <w:r>
+        <w:rPr>
+          <w:rStyle w:val="NormalTok"/>
+        </w:rPr>
+        <w:t xml:space="preserve">cov_xy </w:t>
+      </w:r>
+      <w:r>
+        <w:rPr>
+          <w:rStyle w:val="OperatorTok"/>
+        </w:rPr>
+        <w:t xml:space="preserve">=</w:t>
+      </w:r>
+      <w:r>
+        <w:rPr>
+          <w:rStyle w:val="NormalTok"/>
+        </w:rPr>
+        <w:t xml:space="preserve"> np.mean((x </w:t>
+      </w:r>
+      <w:r>
+        <w:rPr>
+          <w:rStyle w:val="OperatorTok"/>
+        </w:rPr>
+        <w:t xml:space="preserve">-</w:t>
+      </w:r>
+      <w:r>
+        <w:rPr>
+          <w:rStyle w:val="NormalTok"/>
+        </w:rPr>
+        <w:t xml:space="preserve"> x.mean()) </w:t>
+      </w:r>
+      <w:r>
+        <w:rPr>
+          <w:rStyle w:val="OperatorTok"/>
+        </w:rPr>
+        <w:t xml:space="preserve">*</w:t>
+      </w:r>
+      <w:r>
+        <w:rPr>
+          <w:rStyle w:val="NormalTok"/>
+        </w:rPr>
+        <w:t xml:space="preserve"> (y </w:t>
+      </w:r>
+      <w:r>
+        <w:rPr>
+          <w:rStyle w:val="OperatorTok"/>
+        </w:rPr>
+        <w:t xml:space="preserve">-</w:t>
+      </w:r>
+      <w:r>
+        <w:rPr>
+          <w:rStyle w:val="NormalTok"/>
+        </w:rPr>
+        <w:t xml:space="preserve"> y.mean()))</w:t>
+      </w:r>
+      <w:r>
+        <w:br/>
+      </w:r>
+      <w:r>
+        <w:rPr>
+          <w:rStyle w:val="NormalTok"/>
+        </w:rPr>
+        <w:t xml:space="preserve">sd_x </w:t>
+      </w:r>
+      <w:r>
+        <w:rPr>
+          <w:rStyle w:val="OperatorTok"/>
+        </w:rPr>
+        <w:t xml:space="preserve">=</w:t>
+      </w:r>
+      <w:r>
+        <w:rPr>
+          <w:rStyle w:val="NormalTok"/>
+        </w:rPr>
+        <w:t xml:space="preserve"> np.sqrt(np.mean((x </w:t>
+      </w:r>
+      <w:r>
+        <w:rPr>
+          <w:rStyle w:val="OperatorTok"/>
+        </w:rPr>
+        <w:t xml:space="preserve">-</w:t>
+      </w:r>
+      <w:r>
+        <w:rPr>
+          <w:rStyle w:val="NormalTok"/>
+        </w:rPr>
+        <w:t xml:space="preserve"> x.mean()) </w:t>
+      </w:r>
+      <w:r>
+        <w:rPr>
+          <w:rStyle w:val="OperatorTok"/>
+        </w:rPr>
+        <w:t xml:space="preserve">**</w:t>
+      </w:r>
+      <w:r>
+        <w:rPr>
+          <w:rStyle w:val="NormalTok"/>
+        </w:rPr>
+        <w:t xml:space="preserve"> </w:t>
+      </w:r>
+      <w:r>
+        <w:rPr>
+          <w:rStyle w:val="DecValTok"/>
+        </w:rPr>
+        <w:t xml:space="preserve">2</w:t>
+      </w:r>
+      <w:r>
+        <w:rPr>
+          <w:rStyle w:val="NormalTok"/>
+        </w:rPr>
+        <w:t xml:space="preserve">))</w:t>
+      </w:r>
+      <w:r>
+        <w:br/>
+      </w:r>
+      <w:r>
+        <w:rPr>
+          <w:rStyle w:val="NormalTok"/>
+        </w:rPr>
+        <w:t xml:space="preserve">sd_y </w:t>
+      </w:r>
+      <w:r>
+        <w:rPr>
+          <w:rStyle w:val="OperatorTok"/>
+        </w:rPr>
+        <w:t xml:space="preserve">=</w:t>
+      </w:r>
+      <w:r>
+        <w:rPr>
+          <w:rStyle w:val="NormalTok"/>
+        </w:rPr>
+        <w:t xml:space="preserve"> np.sqrt(np.mean((y </w:t>
+      </w:r>
+      <w:r>
+        <w:rPr>
+          <w:rStyle w:val="OperatorTok"/>
+        </w:rPr>
+        <w:t xml:space="preserve">-</w:t>
+      </w:r>
+      <w:r>
+        <w:rPr>
+          <w:rStyle w:val="NormalTok"/>
+        </w:rPr>
+        <w:t xml:space="preserve"> y.mean()) </w:t>
+      </w:r>
+      <w:r>
+        <w:rPr>
+          <w:rStyle w:val="OperatorTok"/>
+        </w:rPr>
+        <w:t xml:space="preserve">**</w:t>
+      </w:r>
+      <w:r>
+        <w:rPr>
+          <w:rStyle w:val="NormalTok"/>
+        </w:rPr>
+        <w:t xml:space="preserve"> </w:t>
+      </w:r>
+      <w:r>
+        <w:rPr>
+          <w:rStyle w:val="DecValTok"/>
+        </w:rPr>
+        <w:t xml:space="preserve">2</w:t>
+      </w:r>
+      <w:r>
+        <w:rPr>
+          <w:rStyle w:val="NormalTok"/>
+        </w:rPr>
+        <w:t xml:space="preserve">))</w:t>
+      </w:r>
+      <w:r>
+        <w:br/>
+      </w:r>
+      <w:r>
+        <w:br/>
+      </w:r>
+      <w:r>
+        <w:rPr>
+          <w:rStyle w:val="NormalTok"/>
+        </w:rPr>
+        <w:t xml:space="preserve">pd.Series({</w:t>
+      </w:r>
+      <w:r>
+        <w:br/>
+      </w:r>
+      <w:r>
+        <w:rPr>
+          <w:rStyle w:val="NormalTok"/>
+        </w:rPr>
+        <w:t xml:space="preserve">    </w:t>
+      </w:r>
+      <w:r>
+        <w:rPr>
+          <w:rStyle w:val="StringTok"/>
+        </w:rPr>
+        <w:t xml:space="preserve">"Cov(X, Y)"</w:t>
+      </w:r>
+      <w:r>
+        <w:rPr>
+          <w:rStyle w:val="NormalTok"/>
+        </w:rPr>
+        <w:t xml:space="preserve">: cov_xy,</w:t>
+      </w:r>
+      <w:r>
+        <w:br/>
+      </w:r>
+      <w:r>
+        <w:rPr>
+          <w:rStyle w:val="NormalTok"/>
+        </w:rPr>
+        <w:t xml:space="preserve">    </w:t>
+      </w:r>
+      <w:r>
+        <w:rPr>
+          <w:rStyle w:val="StringTok"/>
+        </w:rPr>
+        <w:t xml:space="preserve">"SD(X)"</w:t>
+      </w:r>
+      <w:r>
+        <w:rPr>
+          <w:rStyle w:val="NormalTok"/>
+        </w:rPr>
+        <w:t xml:space="preserve">: sd_x,</w:t>
+      </w:r>
+      <w:r>
+        <w:br/>
+      </w:r>
+      <w:r>
+        <w:rPr>
+          <w:rStyle w:val="NormalTok"/>
+        </w:rPr>
+        <w:t xml:space="preserve">    </w:t>
+      </w:r>
+      <w:r>
+        <w:rPr>
+          <w:rStyle w:val="StringTok"/>
+        </w:rPr>
+        <w:t xml:space="preserve">"SD(Y)"</w:t>
+      </w:r>
+      <w:r>
+        <w:rPr>
+          <w:rStyle w:val="NormalTok"/>
+        </w:rPr>
+        <w:t xml:space="preserve">: sd_y,</w:t>
+      </w:r>
+      <w:r>
+        <w:br/>
+      </w:r>
+      <w:r>
+        <w:rPr>
+          <w:rStyle w:val="NormalTok"/>
+        </w:rPr>
+        <w:t xml:space="preserve">    </w:t>
+      </w:r>
+      <w:r>
+        <w:rPr>
+          <w:rStyle w:val="StringTok"/>
+        </w:rPr>
+        <w:t xml:space="preserve">"Cor(X, Y)"</w:t>
+      </w:r>
+      <w:r>
+        <w:rPr>
+          <w:rStyle w:val="NormalTok"/>
+        </w:rPr>
+        <w:t xml:space="preserve">: cov_xy </w:t>
+      </w:r>
+      <w:r>
+        <w:rPr>
+          <w:rStyle w:val="OperatorTok"/>
+        </w:rPr>
+        <w:t xml:space="preserve">/</w:t>
+      </w:r>
+      <w:r>
+        <w:rPr>
+          <w:rStyle w:val="NormalTok"/>
+        </w:rPr>
+        <w:t xml:space="preserve"> (sd_x </w:t>
+      </w:r>
+      <w:r>
+        <w:rPr>
+          <w:rStyle w:val="OperatorTok"/>
+        </w:rPr>
+        <w:t xml:space="preserve">*</w:t>
+      </w:r>
+      <w:r>
+        <w:rPr>
+          <w:rStyle w:val="NormalTok"/>
+        </w:rPr>
+        <w:t xml:space="preserve"> sd_y),</w:t>
+      </w:r>
+      <w:r>
+        <w:br/>
+      </w:r>
+      <w:r>
+        <w:rPr>
+          <w:rStyle w:val="NormalTok"/>
+        </w:rPr>
+        <w:t xml:space="preserve">})</w:t>
+      </w:r>
+      <w:r>
+        <w:br/>
+      </w:r>
+      <w:r>
+        <w:rPr>
+          <w:rStyle w:val="CommentTok"/>
+        </w:rPr>
+        <w:t xml:space="preserve">#&gt; Cov(X, Y)   -233.261349</w:t>
+      </w:r>
+      <w:r>
+        <w:br/>
+      </w:r>
+      <w:r>
+        <w:rPr>
+          <w:rStyle w:val="CommentTok"/>
+        </w:rPr>
+        <w:t xml:space="preserve">#&gt; SD(X)         38.442033</w:t>
+      </w:r>
+      <w:r>
+        <w:br/>
+      </w:r>
+      <w:r>
+        <w:rPr>
+          <w:rStyle w:val="CommentTok"/>
+        </w:rPr>
+        <w:t xml:space="preserve">#&gt; SD(Y)          7.795046</w:t>
+      </w:r>
+      <w:r>
+        <w:br/>
+      </w:r>
+      <w:r>
+        <w:rPr>
+          <w:rStyle w:val="CommentTok"/>
+        </w:rPr>
+        <w:t xml:space="preserve">#&gt; Cor(X, Y)     -0.778427</w:t>
+      </w:r>
+      <w:r>
+        <w:br/>
+      </w:r>
+      <w:r>
+        <w:rPr>
+          <w:rStyle w:val="CommentTok"/>
+        </w:rPr>
+        <w:t xml:space="preserve">#&gt; dtype: float64</w:t>
+      </w:r>
+    </w:p>
+    <w:p>
+      <w:pPr>
+        <w:pStyle w:val="Heading4"/>
+      </w:pPr>
+      <w:r>
+        <w:t xml:space="preserve">R</w:t>
+      </w:r>
+    </w:p>
+    <w:p>
+      <w:pPr>
+        <w:pStyle w:val="SourceCode"/>
+      </w:pPr>
+      <w:r>
+        <w:rPr>
+          <w:rStyle w:val="NormalTok"/>
+        </w:rPr>
+        <w:t xml:space="preserve">auto </w:t>
+      </w:r>
+      <w:r>
+        <w:rPr>
+          <w:rStyle w:val="OtherTok"/>
+        </w:rPr>
+        <w:t xml:space="preserve">&lt;-</w:t>
+      </w:r>
+      <w:r>
+        <w:rPr>
+          <w:rStyle w:val="NormalTok"/>
+        </w:rPr>
+        <w:t xml:space="preserve"> </w:t>
+      </w:r>
+      <w:r>
+        <w:rPr>
+          <w:rStyle w:val="FunctionTok"/>
+        </w:rPr>
+        <w:t xml:space="preserve">read.csv</w:t>
+      </w:r>
+      <w:r>
+        <w:rPr>
+          <w:rStyle w:val="NormalTok"/>
+        </w:rPr>
+        <w:t xml:space="preserve">(</w:t>
+      </w:r>
+      <w:r>
+        <w:rPr>
+          <w:rStyle w:val="StringTok"/>
+        </w:rPr>
+        <w:t xml:space="preserve">"data/auto.csv"</w:t>
+      </w:r>
+      <w:r>
+        <w:rPr>
+          <w:rStyle w:val="NormalTok"/>
+        </w:rPr>
+        <w:t xml:space="preserve">)</w:t>
+      </w:r>
+      <w:r>
+        <w:br/>
+      </w:r>
+      <w:r>
+        <w:rPr>
+          <w:rStyle w:val="NormalTok"/>
+        </w:rPr>
+        <w:t xml:space="preserve">x </w:t>
+      </w:r>
+      <w:r>
+        <w:rPr>
+          <w:rStyle w:val="OtherTok"/>
+        </w:rPr>
+        <w:t xml:space="preserve">&lt;-</w:t>
+      </w:r>
+      <w:r>
+        <w:rPr>
+          <w:rStyle w:val="NormalTok"/>
+        </w:rPr>
+        <w:t xml:space="preserve"> auto</w:t>
+      </w:r>
+      <w:r>
+        <w:rPr>
+          <w:rStyle w:val="SpecialCharTok"/>
+        </w:rPr>
+        <w:t xml:space="preserve">$</w:t>
+      </w:r>
+      <w:r>
+        <w:rPr>
+          <w:rStyle w:val="NormalTok"/>
+        </w:rPr>
+        <w:t xml:space="preserve">horsepower</w:t>
+      </w:r>
+      <w:r>
+        <w:br/>
+      </w:r>
+      <w:r>
+        <w:rPr>
+          <w:rStyle w:val="NormalTok"/>
+        </w:rPr>
+        <w:t xml:space="preserve">y </w:t>
+      </w:r>
+      <w:r>
+        <w:rPr>
+          <w:rStyle w:val="OtherTok"/>
+        </w:rPr>
+        <w:t xml:space="preserve">&lt;-</w:t>
+      </w:r>
+      <w:r>
+        <w:rPr>
+          <w:rStyle w:val="NormalTok"/>
+        </w:rPr>
+        <w:t xml:space="preserve"> auto</w:t>
+      </w:r>
+      <w:r>
+        <w:rPr>
+          <w:rStyle w:val="SpecialCharTok"/>
+        </w:rPr>
+        <w:t xml:space="preserve">$</w:t>
+      </w:r>
+      <w:r>
+        <w:rPr>
+          <w:rStyle w:val="NormalTok"/>
+        </w:rPr>
+        <w:t xml:space="preserve">mpg</w:t>
+      </w:r>
+      <w:r>
+        <w:br/>
+      </w:r>
+      <w:r>
+        <w:br/>
+      </w:r>
+      <w:r>
+        <w:rPr>
+          <w:rStyle w:val="NormalTok"/>
+        </w:rPr>
+        <w:t xml:space="preserve">cov_xy </w:t>
+      </w:r>
+      <w:r>
+        <w:rPr>
+          <w:rStyle w:val="OtherTok"/>
+        </w:rPr>
+        <w:t xml:space="preserve">&lt;-</w:t>
+      </w:r>
+      <w:r>
+        <w:rPr>
+          <w:rStyle w:val="NormalTok"/>
+        </w:rPr>
+        <w:t xml:space="preserve"> </w:t>
+      </w:r>
+      <w:r>
+        <w:rPr>
+          <w:rStyle w:val="FunctionTok"/>
+        </w:rPr>
+        <w:t xml:space="preserve">mean</w:t>
+      </w:r>
+      <w:r>
+        <w:rPr>
+          <w:rStyle w:val="NormalTok"/>
+        </w:rPr>
+        <w:t xml:space="preserve">((x </w:t>
+      </w:r>
+      <w:r>
+        <w:rPr>
+          <w:rStyle w:val="SpecialCharTok"/>
+        </w:rPr>
+        <w:t xml:space="preserve">-</w:t>
+      </w:r>
+      <w:r>
+        <w:rPr>
+          <w:rStyle w:val="NormalTok"/>
+        </w:rPr>
+        <w:t xml:space="preserve"> </w:t>
+      </w:r>
+      <w:r>
+        <w:rPr>
+          <w:rStyle w:val="FunctionTok"/>
+        </w:rPr>
+        <w:t xml:space="preserve">mean</w:t>
+      </w:r>
+      <w:r>
+        <w:rPr>
+          <w:rStyle w:val="NormalTok"/>
+        </w:rPr>
+        <w:t xml:space="preserve">(x)) </w:t>
+      </w:r>
+      <w:r>
+        <w:rPr>
+          <w:rStyle w:val="SpecialCharTok"/>
+        </w:rPr>
+        <w:t xml:space="preserve">*</w:t>
+      </w:r>
+      <w:r>
+        <w:rPr>
+          <w:rStyle w:val="NormalTok"/>
+        </w:rPr>
+        <w:t xml:space="preserve"> (y </w:t>
+      </w:r>
+      <w:r>
+        <w:rPr>
+          <w:rStyle w:val="SpecialCharTok"/>
+        </w:rPr>
+        <w:t xml:space="preserve">-</w:t>
+      </w:r>
+      <w:r>
+        <w:rPr>
+          <w:rStyle w:val="NormalTok"/>
+        </w:rPr>
+        <w:t xml:space="preserve"> </w:t>
+      </w:r>
+      <w:r>
+        <w:rPr>
+          <w:rStyle w:val="FunctionTok"/>
+        </w:rPr>
+        <w:t xml:space="preserve">mean</w:t>
+      </w:r>
+      <w:r>
+        <w:rPr>
+          <w:rStyle w:val="NormalTok"/>
+        </w:rPr>
+        <w:t xml:space="preserve">(y)))</w:t>
+      </w:r>
+      <w:r>
+        <w:br/>
+      </w:r>
+      <w:r>
+        <w:rPr>
+          <w:rStyle w:val="NormalTok"/>
+        </w:rPr>
+        <w:t xml:space="preserve">sd_x </w:t>
+      </w:r>
+      <w:r>
+        <w:rPr>
+          <w:rStyle w:val="OtherTok"/>
+        </w:rPr>
+        <w:t xml:space="preserve">&lt;-</w:t>
+      </w:r>
+      <w:r>
+        <w:rPr>
+          <w:rStyle w:val="NormalTok"/>
+        </w:rPr>
+        <w:t xml:space="preserve"> </w:t>
+      </w:r>
+      <w:r>
+        <w:rPr>
+          <w:rStyle w:val="FunctionTok"/>
+        </w:rPr>
+        <w:t xml:space="preserve">sqrt</w:t>
+      </w:r>
+      <w:r>
+        <w:rPr>
+          <w:rStyle w:val="NormalTok"/>
+        </w:rPr>
+        <w:t xml:space="preserve">(</w:t>
+      </w:r>
+      <w:r>
+        <w:rPr>
+          <w:rStyle w:val="FunctionTok"/>
+        </w:rPr>
+        <w:t xml:space="preserve">mean</w:t>
+      </w:r>
+      <w:r>
+        <w:rPr>
+          <w:rStyle w:val="NormalTok"/>
+        </w:rPr>
+        <w:t xml:space="preserve">((x </w:t>
+      </w:r>
+      <w:r>
+        <w:rPr>
+          <w:rStyle w:val="SpecialCharTok"/>
+        </w:rPr>
+        <w:t xml:space="preserve">-</w:t>
+      </w:r>
+      <w:r>
+        <w:rPr>
+          <w:rStyle w:val="NormalTok"/>
+        </w:rPr>
+        <w:t xml:space="preserve"> </w:t>
+      </w:r>
+      <w:r>
+        <w:rPr>
+          <w:rStyle w:val="FunctionTok"/>
+        </w:rPr>
+        <w:t xml:space="preserve">mean</w:t>
+      </w:r>
+      <w:r>
+        <w:rPr>
+          <w:rStyle w:val="NormalTok"/>
+        </w:rPr>
+        <w:t xml:space="preserve">(x))</w:t>
+      </w:r>
+      <w:r>
+        <w:rPr>
+          <w:rStyle w:val="SpecialCharTok"/>
+        </w:rPr>
+        <w:t xml:space="preserve">^</w:t>
+      </w:r>
+      <w:r>
+        <w:rPr>
+          <w:rStyle w:val="DecValTok"/>
+        </w:rPr>
+        <w:t xml:space="preserve">2</w:t>
+      </w:r>
+      <w:r>
+        <w:rPr>
+          <w:rStyle w:val="NormalTok"/>
+        </w:rPr>
+        <w:t xml:space="preserve">))</w:t>
+      </w:r>
+      <w:r>
+        <w:br/>
+      </w:r>
+      <w:r>
+        <w:rPr>
+          <w:rStyle w:val="NormalTok"/>
+        </w:rPr>
+        <w:t xml:space="preserve">sd_y </w:t>
+      </w:r>
+      <w:r>
+        <w:rPr>
+          <w:rStyle w:val="OtherTok"/>
+        </w:rPr>
+        <w:t xml:space="preserve">&lt;-</w:t>
+      </w:r>
+      <w:r>
+        <w:rPr>
+          <w:rStyle w:val="NormalTok"/>
+        </w:rPr>
+        <w:t xml:space="preserve"> </w:t>
+      </w:r>
+      <w:r>
+        <w:rPr>
+          <w:rStyle w:val="FunctionTok"/>
+        </w:rPr>
+        <w:t xml:space="preserve">sqrt</w:t>
+      </w:r>
+      <w:r>
+        <w:rPr>
+          <w:rStyle w:val="NormalTok"/>
+        </w:rPr>
+        <w:t xml:space="preserve">(</w:t>
+      </w:r>
+      <w:r>
+        <w:rPr>
+          <w:rStyle w:val="FunctionTok"/>
+        </w:rPr>
+        <w:t xml:space="preserve">mean</w:t>
+      </w:r>
+      <w:r>
+        <w:rPr>
+          <w:rStyle w:val="NormalTok"/>
+        </w:rPr>
+        <w:t xml:space="preserve">((y </w:t>
+      </w:r>
+      <w:r>
+        <w:rPr>
+          <w:rStyle w:val="SpecialCharTok"/>
+        </w:rPr>
+        <w:t xml:space="preserve">-</w:t>
+      </w:r>
+      <w:r>
+        <w:rPr>
+          <w:rStyle w:val="NormalTok"/>
+        </w:rPr>
+        <w:t xml:space="preserve"> </w:t>
+      </w:r>
+      <w:r>
+        <w:rPr>
+          <w:rStyle w:val="FunctionTok"/>
+        </w:rPr>
+        <w:t xml:space="preserve">mean</w:t>
+      </w:r>
+      <w:r>
+        <w:rPr>
+          <w:rStyle w:val="NormalTok"/>
+        </w:rPr>
+        <w:t xml:space="preserve">(y))</w:t>
+      </w:r>
+      <w:r>
+        <w:rPr>
+          <w:rStyle w:val="SpecialCharTok"/>
+        </w:rPr>
+        <w:t xml:space="preserve">^</w:t>
+      </w:r>
+      <w:r>
+        <w:rPr>
+          <w:rStyle w:val="DecValTok"/>
+        </w:rPr>
+        <w:t xml:space="preserve">2</w:t>
+      </w:r>
+      <w:r>
+        <w:rPr>
+          <w:rStyle w:val="NormalTok"/>
+        </w:rPr>
+        <w:t xml:space="preserve">))</w:t>
+      </w:r>
+      <w:r>
+        <w:br/>
+      </w:r>
+      <w:r>
+        <w:br/>
+      </w:r>
+      <w:r>
+        <w:rPr>
+          <w:rStyle w:val="FunctionTok"/>
+        </w:rPr>
+        <w:t xml:space="preserve">c</w:t>
+      </w:r>
+      <w:r>
+        <w:rPr>
+          <w:rStyle w:val="NormalTok"/>
+        </w:rPr>
+        <w:t xml:space="preserve">(</w:t>
+      </w:r>
+      <w:r>
+        <w:br/>
+      </w:r>
+      <w:r>
+        <w:rPr>
+          <w:rStyle w:val="NormalTok"/>
+        </w:rPr>
+        <w:t xml:space="preserve">  </w:t>
+      </w:r>
+      <w:r>
+        <w:rPr>
+          <w:rStyle w:val="StringTok"/>
+        </w:rPr>
+        <w:t xml:space="preserve">"Cov(X, Y)"</w:t>
+      </w:r>
+      <w:r>
+        <w:rPr>
+          <w:rStyle w:val="NormalTok"/>
+        </w:rPr>
+        <w:t xml:space="preserve"> </w:t>
+      </w:r>
+      <w:r>
+        <w:rPr>
+          <w:rStyle w:val="OtherTok"/>
+        </w:rPr>
+        <w:t xml:space="preserve">=</w:t>
+      </w:r>
+      <w:r>
+        <w:rPr>
+          <w:rStyle w:val="NormalTok"/>
+        </w:rPr>
+        <w:t xml:space="preserve"> cov_xy,</w:t>
+      </w:r>
+      <w:r>
+        <w:br/>
+      </w:r>
+      <w:r>
+        <w:rPr>
+          <w:rStyle w:val="NormalTok"/>
+        </w:rPr>
+        <w:t xml:space="preserve">  </w:t>
+      </w:r>
+      <w:r>
+        <w:rPr>
+          <w:rStyle w:val="StringTok"/>
+        </w:rPr>
+        <w:t xml:space="preserve">"SD(X)"</w:t>
+      </w:r>
+      <w:r>
+        <w:rPr>
+          <w:rStyle w:val="NormalTok"/>
+        </w:rPr>
+        <w:t xml:space="preserve"> </w:t>
+      </w:r>
+      <w:r>
+        <w:rPr>
+          <w:rStyle w:val="OtherTok"/>
+        </w:rPr>
+        <w:t xml:space="preserve">=</w:t>
+      </w:r>
+      <w:r>
+        <w:rPr>
+          <w:rStyle w:val="NormalTok"/>
+        </w:rPr>
+        <w:t xml:space="preserve"> sd_x,</w:t>
+      </w:r>
+      <w:r>
+        <w:br/>
+      </w:r>
+      <w:r>
+        <w:rPr>
+          <w:rStyle w:val="NormalTok"/>
+        </w:rPr>
+        <w:t xml:space="preserve">  </w:t>
+      </w:r>
+      <w:r>
+        <w:rPr>
+          <w:rStyle w:val="StringTok"/>
+        </w:rPr>
+        <w:t xml:space="preserve">"SD(Y)"</w:t>
+      </w:r>
+      <w:r>
+        <w:rPr>
+          <w:rStyle w:val="NormalTok"/>
+        </w:rPr>
+        <w:t xml:space="preserve"> </w:t>
+      </w:r>
+      <w:r>
+        <w:rPr>
+          <w:rStyle w:val="OtherTok"/>
+        </w:rPr>
+        <w:t xml:space="preserve">=</w:t>
+      </w:r>
+      <w:r>
+        <w:rPr>
+          <w:rStyle w:val="NormalTok"/>
+        </w:rPr>
+        <w:t xml:space="preserve"> sd_y,</w:t>
+      </w:r>
+      <w:r>
+        <w:br/>
+      </w:r>
+      <w:r>
+        <w:rPr>
+          <w:rStyle w:val="NormalTok"/>
+        </w:rPr>
+        <w:t xml:space="preserve">  </w:t>
+      </w:r>
+      <w:r>
+        <w:rPr>
+          <w:rStyle w:val="StringTok"/>
+        </w:rPr>
+        <w:t xml:space="preserve">"Cor(X, Y)"</w:t>
+      </w:r>
+      <w:r>
+        <w:rPr>
+          <w:rStyle w:val="NormalTok"/>
+        </w:rPr>
+        <w:t xml:space="preserve"> </w:t>
+      </w:r>
+      <w:r>
+        <w:rPr>
+          <w:rStyle w:val="OtherTok"/>
+        </w:rPr>
+        <w:t xml:space="preserve">=</w:t>
+      </w:r>
+      <w:r>
+        <w:rPr>
+          <w:rStyle w:val="NormalTok"/>
+        </w:rPr>
+        <w:t xml:space="preserve"> cov_xy </w:t>
+      </w:r>
+      <w:r>
+        <w:rPr>
+          <w:rStyle w:val="SpecialCharTok"/>
+        </w:rPr>
+        <w:t xml:space="preserve">/</w:t>
+      </w:r>
+      <w:r>
+        <w:rPr>
+          <w:rStyle w:val="NormalTok"/>
+        </w:rPr>
+        <w:t xml:space="preserve"> (sd_x </w:t>
+      </w:r>
+      <w:r>
+        <w:rPr>
+          <w:rStyle w:val="SpecialCharTok"/>
+        </w:rPr>
+        <w:t xml:space="preserve">*</w:t>
+      </w:r>
+      <w:r>
+        <w:rPr>
+          <w:rStyle w:val="NormalTok"/>
+        </w:rPr>
+        <w:t xml:space="preserve"> sd_y)</w:t>
+      </w:r>
+      <w:r>
+        <w:br/>
+      </w:r>
+      <w:r>
+        <w:rPr>
+          <w:rStyle w:val="NormalTok"/>
+        </w:rPr>
+        <w:t xml:space="preserve">)</w:t>
+      </w:r>
+      <w:r>
+        <w:br/>
+      </w:r>
+      <w:r>
+        <w:rPr>
+          <w:rStyle w:val="CommentTok"/>
+        </w:rPr>
+        <w:t xml:space="preserve">#&gt;    Cov(X, Y)        SD(X)        SD(Y)    Cor(X, Y) </w:t>
+      </w:r>
+      <w:r>
+        <w:br/>
+      </w:r>
+      <w:r>
+        <w:rPr>
+          <w:rStyle w:val="CommentTok"/>
+        </w:rPr>
+        <w:t xml:space="preserve">#&gt; -233.2613494   38.4420327    7.7950458   -0.7784268</w:t>
+      </w:r>
+    </w:p>
+    <w:p>
+      <w:pPr>
+        <w:pStyle w:val="FirstParagraph"/>
+      </w:pPr>
+      <w:hyperlink w:anchor="fig-cor-auto">
+        <w:r>
+          <w:rPr>
+            <w:rStyle w:val="Hyperlink"/>
+          </w:rPr>
+          <w:t xml:space="preserve">Figure 1</w:t>
+        </w:r>
+      </w:hyperlink>
+      <w:r>
+        <w:t xml:space="preserve"> </w:t>
+      </w:r>
+      <w:r>
+        <w:t xml:space="preserve">plots each car’s miles per gallon against its horsepower.</w:t>
+      </w:r>
+    </w:p>
+    <w:p>
+      <w:pPr>
+        <w:pStyle w:val="SourceCode"/>
+      </w:pPr>
+      <w:r>
+        <w:rPr>
+          <w:rStyle w:val="FunctionTok"/>
+        </w:rPr>
+        <w:t xml:space="preserve">plot</w:t>
+      </w:r>
+      <w:r>
+        <w:rPr>
+          <w:rStyle w:val="NormalTok"/>
+        </w:rPr>
+        <w:t xml:space="preserve">(x, y, </w:t>
+      </w:r>
+      <w:r>
+        <w:rPr>
+          <w:rStyle w:val="AttributeTok"/>
+        </w:rPr>
+        <w:t xml:space="preserve">xlab =</w:t>
+      </w:r>
+      <w:r>
+        <w:rPr>
+          <w:rStyle w:val="NormalTok"/>
+        </w:rPr>
+        <w:t xml:space="preserve"> </w:t>
+      </w:r>
+      <w:r>
+        <w:rPr>
+          <w:rStyle w:val="StringTok"/>
+        </w:rPr>
+        <w:t xml:space="preserve">"horsepower"</w:t>
+      </w:r>
+      <w:r>
+        <w:rPr>
+          <w:rStyle w:val="NormalTok"/>
+        </w:rPr>
+        <w:t xml:space="preserve">, </w:t>
+      </w:r>
+      <w:r>
+        <w:rPr>
+          <w:rStyle w:val="AttributeTok"/>
+        </w:rPr>
+        <w:t xml:space="preserve">ylab =</w:t>
+      </w:r>
+      <w:r>
+        <w:rPr>
+          <w:rStyle w:val="NormalTok"/>
+        </w:rPr>
+        <w:t xml:space="preserve"> </w:t>
+      </w:r>
+      <w:r>
+        <w:rPr>
+          <w:rStyle w:val="StringTok"/>
+        </w:rPr>
+        <w:t xml:space="preserve">"miles per gallon"</w:t>
+      </w:r>
+      <w:r>
+        <w:rPr>
+          <w:rStyle w:val="NormalTok"/>
+        </w:rPr>
+        <w:t xml:space="preserve">, </w:t>
+      </w:r>
+      <w:r>
+        <w:rPr>
+          <w:rStyle w:val="AttributeTok"/>
+        </w:rPr>
+        <w:t xml:space="preserve">pch =</w:t>
+      </w:r>
+      <w:r>
+        <w:rPr>
+          <w:rStyle w:val="NormalTok"/>
+        </w:rPr>
+        <w:t xml:space="preserve"> </w:t>
+      </w:r>
+      <w:r>
+        <w:rPr>
+          <w:rStyle w:val="DecValTok"/>
+        </w:rPr>
+        <w:t xml:space="preserve">16</w:t>
+      </w:r>
+      <w:r>
+        <w:rPr>
+          <w:rStyle w:val="NormalTok"/>
+        </w:rPr>
+        <w:t xml:space="preserve">,</w:t>
+      </w:r>
+      <w:r>
+        <w:br/>
+      </w:r>
+      <w:r>
+        <w:rPr>
+          <w:rStyle w:val="NormalTok"/>
+        </w:rPr>
+        <w:t xml:space="preserve">     </w:t>
+      </w:r>
+      <w:r>
+        <w:rPr>
+          <w:rStyle w:val="AttributeTok"/>
+        </w:rPr>
+        <w:t xml:space="preserve">col =</w:t>
+      </w:r>
+      <w:r>
+        <w:rPr>
+          <w:rStyle w:val="NormalTok"/>
+        </w:rPr>
+        <w:t xml:space="preserve"> </w:t>
+      </w:r>
+      <w:r>
+        <w:rPr>
+          <w:rStyle w:val="FunctionTok"/>
+        </w:rPr>
+        <w:t xml:space="preserve">adjustcolor</w:t>
+      </w:r>
+      <w:r>
+        <w:rPr>
+          <w:rStyle w:val="NormalTok"/>
+        </w:rPr>
+        <w:t xml:space="preserve">(</w:t>
+      </w:r>
+      <w:r>
+        <w:rPr>
+          <w:rStyle w:val="StringTok"/>
+        </w:rPr>
+        <w:t xml:space="preserve">"black"</w:t>
+      </w:r>
+      <w:r>
+        <w:rPr>
+          <w:rStyle w:val="NormalTok"/>
+        </w:rPr>
+        <w:t xml:space="preserve">, </w:t>
+      </w:r>
+      <w:r>
+        <w:rPr>
+          <w:rStyle w:val="AttributeTok"/>
+        </w:rPr>
+        <w:t xml:space="preserve">alpha.f =</w:t>
+      </w:r>
+      <w:r>
+        <w:rPr>
+          <w:rStyle w:val="NormalTok"/>
+        </w:rPr>
+        <w:t xml:space="preserve"> </w:t>
+      </w:r>
+      <w:r>
+        <w:rPr>
+          <w:rStyle w:val="FloatTok"/>
+        </w:rPr>
+        <w:t xml:space="preserve">0.4</w:t>
+      </w:r>
+      <w:r>
+        <w:rPr>
+          <w:rStyle w:val="NormalTok"/>
+        </w:rPr>
+        <w:t xml:space="preserve">))</w:t>
+      </w:r>
+    </w:p>
+    <w:tbl>
+      <w:tblPr>
+        <w:tblStyle w:val="Table"/>
+        <w:tblW w:type="pct" w:w="5000"/>
+        <w:tblLayout w:type="fixed"/>
+        <w:tblLook w:firstRow="0" w:lastRow="0" w:firstColumn="0" w:lastColumn="0" w:noHBand="0" w:noVBand="0" w:val="0000"/>
+      </w:tblPr>
+      <w:tblGrid>
+        <w:gridCol w:w="7920"/>
+      </w:tblGrid>
+      <w:tr>
+        <w:tc>
+          <w:tcPr/>
+          <w:bookmarkStart w:id="100" w:name="fig-cor-auto"/>
+          <w:p>
+            <w:pPr>
+              <w:pStyle w:val="Compact"/>
+              <w:jc w:val="center"/>
+            </w:pPr>
+            <w:r>
+              <w:drawing>
+                <wp:inline>
+                  <wp:extent cx="4620126" cy="3234088"/>
+                  <wp:effectExtent b="0" l="0" r="0" t="0"/>
+                  <wp:docPr descr="" title="" id="98" name="Picture"/>
+                  <a:graphic>
+                    <a:graphicData uri="http://schemas.openxmlformats.org/drawingml/2006/picture">
+                      <pic:pic>
+                        <pic:nvPicPr>
+                          <pic:cNvPr descr="variance-covariance_files/figure-docx/fig-cor-auto-1.png" id="99" name="Picture"/>
+                          <pic:cNvPicPr>
+                            <a:picLocks noChangeArrowheads="1" noChangeAspect="1"/>
+                          </pic:cNvPicPr>
+                        </pic:nvPicPr>
+                        <pic:blipFill>
+                          <a:blip r:embed="rId97"/>
+                          <a:stretch>
+                            <a:fillRect/>
+                          </a:stretch>
+                        </pic:blipFill>
+                        <pic:spPr bwMode="auto">
+                          <a:xfrm>
+                            <a:off x="0" y="0"/>
+                            <a:ext cx="4620126" cy="3234088"/>
+                          </a:xfrm>
+                          <a:prstGeom prst="rect">
+                            <a:avLst/>
+                          </a:prstGeom>
+                          <a:noFill/>
+                          <a:ln w="9525">
+                            <a:noFill/>
+                            <a:headEnd/>
+                            <a:tailEnd/>
+                          </a:ln>
+                        </pic:spPr>
+                      </pic:pic>
+                    </a:graphicData>
+                  </a:graphic>
+                </wp:inline>
+              </w:drawing>
+            </w:r>
+          </w:p>
+          <w:p>
+            <w:pPr>
+              <w:jc w:val="center"/>
+            </w:pPr>
+            <w:pPr>
+              <w:jc w:val="left"/>
+              <w:spacing w:before="200"/>
+              <w:pStyle w:val="ImageCaption"/>
+            </w:pPr>
+            <w:r>
+              <w:t xml:space="preserve">Figure 1: Miles per gallon against horsepower for the cars in the Auto data. Cars with more horsepower tend to have lower fuel economy.</w:t>
+            </w:r>
+          </w:p>
+          <w:bookmarkEnd w:id="100"/>
+        </w:tc>
+      </w:tr>
+    </w:tbl>
+    <w:p>
+      <w:pPr>
+        <w:pStyle w:val="BodyText"/>
+      </w:pPr>
+      <w:r>
+        <w:t xml:space="preserve">The covariance is</w:t>
+      </w:r>
+      <w:r>
+        <w:t xml:space="preserve"> </w:t>
+      </w:r>
+      <w:r>
+        <w:t xml:space="preserve">-233.3,</w:t>
+      </w:r>
+      <w:r>
+        <w:t xml:space="preserve"> </w:t>
+      </w:r>
+      <w:r>
+        <w:t xml:space="preserve">in units of horsepower times miles per gallon.</w:t>
+      </w:r>
+      <w:r>
+        <w:t xml:space="preserve"> </w:t>
+      </w:r>
+      <w:r>
+        <w:t xml:space="preserve">It is negative, so cars with more horsepower than average tend to have</w:t>
+      </w:r>
+      <w:r>
+        <w:t xml:space="preserve"> </w:t>
+      </w:r>
+      <w:r>
+        <w:t xml:space="preserve">lower fuel economy than average.</w:t>
+      </w:r>
+      <w:r>
+        <w:t xml:space="preserve"> </w:t>
+      </w:r>
+      <w:r>
+        <w:t xml:space="preserve">Dividing by the two standard deviations,</w:t>
+      </w:r>
+      <w:r>
+        <w:t xml:space="preserve"> </w:t>
+      </w:r>
+      <w:r>
+        <w:t xml:space="preserve">38.4 horsepower and 7.8 miles per gallon,</w:t>
+      </w:r>
+      <w:r>
+        <w:t xml:space="preserve"> </w:t>
+      </w:r>
+      <w:r>
+        <w:t xml:space="preserve">removes the units and gives a correlation of</w:t>
+      </w:r>
+      <w:r>
+        <w:t xml:space="preserve"> </w:t>
+      </w:r>
+      <w:r>
+        <w:t xml:space="preserve">-0.78,</w:t>
+      </w:r>
+      <w:r>
+        <w:t xml:space="preserve"> </w:t>
+      </w:r>
+      <w:r>
+        <w:t xml:space="preserve">which lies between</w:t>
+      </w:r>
+      <w:r>
+        <w:t xml:space="preserve"> </w:t>
+      </w:r>
+      <m:oMath>
+        <m:r>
+          <m:rPr>
+            <m:sty m:val="p"/>
+          </m:rPr>
+          <m:t>−</m:t>
+        </m:r>
+        <m:r>
+          <m:t>1</m:t>
+        </m:r>
+      </m:oMath>
+      <w:r>
+        <w:t xml:space="preserve"> </w:t>
+      </w:r>
+      <w:r>
+        <w:t xml:space="preserve">and</w:t>
+      </w:r>
+      <w:r>
+        <w:t xml:space="preserve"> </w:t>
+      </w:r>
+      <m:oMath>
+        <m:r>
+          <m:t>1</m:t>
+        </m:r>
+      </m:oMath>
+      <w:r>
+        <w:t xml:space="preserve"> </w:t>
+      </w:r>
+      <w:r>
+        <w:t xml:space="preserve">as</w:t>
+      </w:r>
+      <w:r>
+        <w:t xml:space="preserve"> </w:t>
+      </w:r>
+      <w:hyperlink w:anchor="thm-cor-bounds">
+        <w:r>
+          <w:rPr>
+            <w:rStyle w:val="Hyperlink"/>
+          </w:rPr>
+          <w:t xml:space="preserve">Theorem 12</w:t>
+        </w:r>
+      </w:hyperlink>
+      <w:r>
+        <w:t xml:space="preserve"> </w:t>
+      </w:r>
+      <w:r>
+        <w:t xml:space="preserve">requires.</w:t>
+      </w:r>
+      <w:r>
+        <w:t xml:space="preserve"> </w:t>
+      </w:r>
+      <w:r>
+        <w:t xml:space="preserve">The same value comes from R’s built-in</w:t>
+      </w:r>
+      <w:r>
+        <w:t xml:space="preserve"> </w:t>
+      </w:r>
+      <w:r>
+        <w:rPr>
+          <w:rStyle w:val="VerbatimChar"/>
+        </w:rPr>
+        <w:t xml:space="preserve">cor(x, y)</w:t>
+      </w:r>
+      <w:r>
+        <w:t xml:space="preserve">,</w:t>
+      </w:r>
+      <w:r>
+        <w:t xml:space="preserve"> </w:t>
+      </w:r>
+      <w:r>
+        <w:t xml:space="preserve">because the sample correlation divides the covariance and both standard</w:t>
+      </w:r>
+      <w:r>
+        <w:t xml:space="preserve"> </w:t>
+      </w:r>
+      <w:r>
+        <w:t xml:space="preserve">deviations by the same count, which cancels.</w:t>
+      </w:r>
+    </w:p>
+    <w:bookmarkEnd w:id="101"/>
+    <w:bookmarkEnd w:id="102"/>
+    <w:bookmarkStart w:id="109" w:name="references"/>
     <w:p>
       <w:pPr>
         <w:pStyle w:val="Heading2"/>
@@ -47241,8 +49157,8 @@
         <w:t xml:space="preserve">References</w:t>
       </w:r>
     </w:p>
-    <w:bookmarkStart w:id="101" w:name="refs"/>
-    <w:bookmarkStart w:id="96" w:name="ref-billingsley1995probability"/>
+    <w:bookmarkStart w:id="108" w:name="refs"/>
+    <w:bookmarkStart w:id="103" w:name="ref-billingsley1995probability"/>
     <w:p>
       <w:pPr>
         <w:pStyle w:val="Bibliography"/>
@@ -47264,8 +49180,8 @@
         <w:t xml:space="preserve">. 3rd ed. Wiley Series in Probability and Mathematical Statistics. Wiley.</w:t>
       </w:r>
     </w:p>
-    <w:bookmarkEnd w:id="96"/>
-    <w:bookmarkStart w:id="98" w:name="ref-CaseBerg01"/>
+    <w:bookmarkEnd w:id="103"/>
+    <w:bookmarkStart w:id="105" w:name="ref-CaseBerg01"/>
     <w:p>
       <w:pPr>
         <w:pStyle w:val="Bibliography"/>
@@ -47289,7 +49205,7 @@
       <w:r>
         <w:t xml:space="preserve"> </w:t>
       </w:r>
-      <w:hyperlink r:id="rId97">
+      <w:hyperlink r:id="rId104">
         <w:r>
           <w:rPr>
             <w:rStyle w:val="Hyperlink"/>
@@ -47301,8 +49217,8 @@
         <w:t xml:space="preserve">.</w:t>
       </w:r>
     </w:p>
-    <w:bookmarkEnd w:id="98"/>
-    <w:bookmarkStart w:id="100" w:name="ref-james2021islr2e"/>
+    <w:bookmarkEnd w:id="105"/>
+    <w:bookmarkStart w:id="107" w:name="ref-james2021islr2e"/>
     <w:p>
       <w:pPr>
         <w:pStyle w:val="Bibliography"/>
@@ -47340,7 +49256,7 @@
       <w:r>
         <w:t xml:space="preserve"> </w:t>
       </w:r>
-      <w:hyperlink r:id="rId99">
+      <w:hyperlink r:id="rId106">
         <w:r>
           <w:rPr>
             <w:rStyle w:val="Hyperlink"/>
@@ -47352,9 +49268,9 @@
         <w:t xml:space="preserve">.</w:t>
       </w:r>
     </w:p>
-    <w:bookmarkEnd w:id="100"/>
-    <w:bookmarkEnd w:id="101"/>
-    <w:bookmarkEnd w:id="102"/>
+    <w:bookmarkEnd w:id="107"/>
+    <w:bookmarkEnd w:id="108"/>
+    <w:bookmarkEnd w:id="109"/>
     <w:sectPr>
       <w:footnotePr>
         <w:numRestart w:val="eachSect"/>

</xml_diff>

<commit_message>
Deploying to gh-pages from @ Morrison-Lab/pds@7581895aa107e9f9d01751f912976d3ba43bcd26 🚀
</commit_message>
<xml_diff>
--- a/variance-covariance.docx
+++ b/variance-covariance.docx
@@ -15,7 +15,7 @@
         <w:pStyle w:val="Date"/>
       </w:pPr>
       <w:r>
-        <w:t xml:space="preserve">Last modified: 2026-10-08 13:05:16 (PDT)</w:t>
+        <w:t xml:space="preserve">Last modified: 2026-10-08 14:33:50 (PDT)</w:t>
       </w:r>
     </w:p>
     <w:bookmarkStart w:id="25" w:name="sec-deviation"/>
@@ -1443,19 +1443,23 @@
           <m:t>Var</m:t>
         </m:r>
         <m:r>
-          <m:rPr>
-            <m:sty m:val="p"/>
-          </m:rPr>
-          <m:t>(</m:t>
-        </m:r>
-        <m:r>
-          <m:t>ε</m:t>
-        </m:r>
-        <m:r>
-          <m:rPr>
-            <m:sty m:val="p"/>
-          </m:rPr>
-          <m:t>)</m:t>
+          <m:t>​</m:t>
+        </m:r>
+        <m:d>
+          <m:dPr>
+            <m:begChr m:val="("/>
+            <m:sepChr m:val=""/>
+            <m:endChr m:val=")"/>
+            <m:grow/>
+          </m:dPr>
+          <m:e>
+            <m:r>
+              <m:t>ε</m:t>
+            </m:r>
+          </m:e>
+        </m:d>
+        <m:r>
+          <m:t>​</m:t>
         </m:r>
         <m:r>
           <m:rPr>
@@ -1592,19 +1596,23 @@
           <m:t>Var</m:t>
         </m:r>
         <m:r>
-          <m:rPr>
-            <m:sty m:val="p"/>
-          </m:rPr>
-          <m:t>(</m:t>
-        </m:r>
-        <m:r>
-          <m:t>X</m:t>
-        </m:r>
-        <m:r>
-          <m:rPr>
-            <m:sty m:val="p"/>
-          </m:rPr>
-          <m:t>)</m:t>
+          <m:t>​</m:t>
+        </m:r>
+        <m:d>
+          <m:dPr>
+            <m:begChr m:val="("/>
+            <m:sepChr m:val=""/>
+            <m:endChr m:val=")"/>
+            <m:grow/>
+          </m:dPr>
+          <m:e>
+            <m:r>
+              <m:t>X</m:t>
+            </m:r>
+          </m:e>
+        </m:d>
+        <m:r>
+          <m:t>​</m:t>
         </m:r>
         <m:r>
           <m:rPr>
@@ -1833,19 +1841,23 @@
             <m:t>Var</m:t>
           </m:r>
           <m:r>
-            <m:rPr>
-              <m:sty m:val="p"/>
-            </m:rPr>
-            <m:t>(</m:t>
+            <m:t>​</m:t>
           </m:r>
+          <m:d>
+            <m:dPr>
+              <m:begChr m:val="("/>
+              <m:sepChr m:val=""/>
+              <m:endChr m:val=")"/>
+              <m:grow/>
+            </m:dPr>
+            <m:e>
+              <m:r>
+                <m:t>ε</m:t>
+              </m:r>
+            </m:e>
+          </m:d>
           <m:r>
-            <m:t>ε</m:t>
-          </m:r>
-          <m:r>
-            <m:rPr>
-              <m:sty m:val="p"/>
-            </m:rPr>
-            <m:t>)</m:t>
+            <m:t>​</m:t>
           </m:r>
           <m:r>
             <m:rPr>

</xml_diff>

<commit_message>
Deploying to gh-pages from @ Morrison-Lab/pds@a0e402aec62a4fcb2f29a157c323322ad01fbd20 🚀
</commit_message>
<xml_diff>
--- a/variance-covariance.docx
+++ b/variance-covariance.docx
@@ -15,7 +15,7 @@
         <w:pStyle w:val="Date"/>
       </w:pPr>
       <w:r>
-        <w:t xml:space="preserve">Last modified: 2026-10-09 09:51:06 (PDT)</w:t>
+        <w:t xml:space="preserve">Last modified: 2026-10-09 09:57:02 (PDT)</w:t>
       </w:r>
     </w:p>
     <w:bookmarkStart w:id="25" w:name="sec-deviation"/>
@@ -1396,7 +1396,6 @@
       <m:oMath>
         <m:r>
           <m:rPr>
-            <m:scr m:val="double-struck"/>
             <m:sty m:val="p"/>
           </m:rPr>
           <m:t>E</m:t>
@@ -1497,7 +1496,6 @@
       <m:oMath>
         <m:r>
           <m:rPr>
-            <m:scr m:val="double-struck"/>
             <m:sty m:val="p"/>
           </m:rPr>
           <m:t>E</m:t>
@@ -1622,7 +1620,6 @@
         </m:r>
         <m:r>
           <m:rPr>
-            <m:scr m:val="double-struck"/>
             <m:sty m:val="p"/>
           </m:rPr>
           <m:t>E</m:t>
@@ -1665,7 +1662,6 @@
         </m:r>
         <m:r>
           <m:rPr>
-            <m:scr m:val="double-struck"/>
             <m:sty m:val="p"/>
           </m:rPr>
           <m:t>E</m:t>
@@ -1753,7 +1749,6 @@
       <m:oMath>
         <m:r>
           <m:rPr>
-            <m:scr m:val="double-struck"/>
             <m:sty m:val="p"/>
           </m:rPr>
           <m:t>E</m:t>
@@ -1801,7 +1796,6 @@
             <m:e>
               <m:r>
                 <m:rPr>
-                  <m:scr m:val="double-struck"/>
                   <m:sty m:val="p"/>
                 </m:rPr>
                 <m:t>E</m:t>

</xml_diff>

<commit_message>
Deploying to gh-pages from @ Morrison-Lab/pds@04de494024d87153497360c0729b607d591c6231 🚀
</commit_message>
<xml_diff>
--- a/variance-covariance.docx
+++ b/variance-covariance.docx
@@ -15,7 +15,7 @@
         <w:pStyle w:val="Date"/>
       </w:pPr>
       <w:r>
-        <w:t xml:space="preserve">Last modified: 2026-10-12 20:27:50 (PDT)</w:t>
+        <w:t xml:space="preserve">Last modified: 2026-10-12 22:10:18 (PDT)</w:t>
       </w:r>
     </w:p>
     <w:bookmarkStart w:id="25" w:name="sec-deviation"/>
@@ -50024,7 +50024,7 @@
         <w:t xml:space="preserve"> </w:t>
       </w:r>
       <w:r>
-        <w:t xml:space="preserve">because the sample correlation divides the covariance and both standard</w:t>
+        <w:t xml:space="preserve">because the correlation computed from the data divides the covariance and both standard</w:t>
       </w:r>
       <w:r>
         <w:t xml:space="preserve"> </w:t>

</xml_diff>

<commit_message>
Deploying to gh-pages from @ Morrison-Lab/pds@2bf70a94d5dbd545e69b25a11b3363bf5d00a50b 🚀
</commit_message>
<xml_diff>
--- a/variance-covariance.docx
+++ b/variance-covariance.docx
@@ -15,10 +15,10 @@
         <w:pStyle w:val="Date"/>
       </w:pPr>
       <w:r>
-        <w:t xml:space="preserve">Last modified: 2026-10-14 01:48:52 (PDT)</w:t>
+        <w:t xml:space="preserve">Last modified: 2026-10-14 11:38:02 (PDT)</w:t>
       </w:r>
     </w:p>
-    <w:bookmarkStart w:id="25" w:name="sec-deviation"/>
+    <w:bookmarkStart w:id="26" w:name="sec-deviation"/>
     <w:p>
       <w:pPr>
         <w:pStyle w:val="Heading2"/>
@@ -1297,7 +1297,7 @@
       </m:oMathPara>
     </w:p>
     <w:bookmarkEnd w:id="20"/>
-    <w:bookmarkStart w:id="24" w:name="sec-noise-model"/>
+    <w:bookmarkStart w:id="25" w:name="sec-noise-model"/>
     <w:p>
       <w:pPr>
         <w:pStyle w:val="Heading3"/>
@@ -1364,38 +1364,356 @@
         <w:t xml:space="preserve">.</w:t>
       </w:r>
     </w:p>
+    <w:bookmarkStart w:id="21" w:name="rem-mean-zero-parametrization"/>
     <w:p>
       <w:pPr>
         <w:pStyle w:val="BodyText"/>
       </w:pPr>
       <w:r>
-        <w:t xml:space="preserve">Mean zero is a modeling choice rather than a fact about the world,</w:t>
-      </w:r>
-      <w:r>
-        <w:t xml:space="preserve"> </w:t>
-      </w:r>
-      <w:r>
-        <w:t xml:space="preserve">and it costs nothing:</w:t>
-      </w:r>
-      <w:r>
-        <w:t xml:space="preserve"> </w:t>
-      </w:r>
-      <w:r>
-        <w:t xml:space="preserve">any systematic offset in the noise can be absorbed into the model’s own</w:t>
-      </w:r>
-      <w:r>
-        <w:t xml:space="preserve"> </w:t>
-      </w:r>
-      <w:r>
-        <w:t xml:space="preserve">intercept, leaving what remains centered at zero by construction.</w:t>
+        <w:rPr>
+          <w:i/>
+          <w:iCs/>
+        </w:rPr>
+        <w:t xml:space="preserve">Remark 1</w:t>
+      </w:r>
+      <w:r>
+        <w:t xml:space="preserve"> (Mean zero is a parametrization choice). </w:t>
+      </w:r>
+      <w:r>
+        <w:t xml:space="preserve">Mean zero is a parametrization choice, not a substantive assumption.</w:t>
+      </w:r>
+      <w:r>
+        <w:t xml:space="preserve"> </w:t>
+      </w:r>
+      <w:r>
+        <w:t xml:space="preserve">In</w:t>
+      </w:r>
+      <w:r>
+        <w:t xml:space="preserve"> </w:t>
+      </w:r>
+      <m:oMath>
+        <m:r>
+          <m:t>Y</m:t>
+        </m:r>
+        <m:r>
+          <m:rPr>
+            <m:sty m:val="p"/>
+          </m:rPr>
+          <m:t>=</m:t>
+        </m:r>
+        <m:r>
+          <m:t>f</m:t>
+        </m:r>
+        <m:r>
+          <m:rPr>
+            <m:sty m:val="p"/>
+          </m:rPr>
+          <m:t>(</m:t>
+        </m:r>
+        <m:r>
+          <m:t>x</m:t>
+        </m:r>
+        <m:r>
+          <m:rPr>
+            <m:sty m:val="p"/>
+          </m:rPr>
+          <m:t>)</m:t>
+        </m:r>
+        <m:r>
+          <m:rPr>
+            <m:sty m:val="p"/>
+          </m:rPr>
+          <m:t>+</m:t>
+        </m:r>
+        <m:r>
+          <m:t>ε</m:t>
+        </m:r>
+      </m:oMath>
+      <w:r>
+        <w:t xml:space="preserve">, moving a constant from</w:t>
+      </w:r>
+      <w:r>
+        <w:t xml:space="preserve"> </w:t>
+      </w:r>
+      <m:oMath>
+        <m:r>
+          <m:t>ε</m:t>
+        </m:r>
+      </m:oMath>
+      <w:r>
+        <w:t xml:space="preserve"> </w:t>
+      </w:r>
+      <w:r>
+        <w:t xml:space="preserve">into</w:t>
+      </w:r>
+      <w:r>
+        <w:t xml:space="preserve"> </w:t>
+      </w:r>
+      <m:oMath>
+        <m:r>
+          <m:t>f</m:t>
+        </m:r>
+        <m:r>
+          <m:rPr>
+            <m:sty m:val="p"/>
+          </m:rPr>
+          <m:t>(</m:t>
+        </m:r>
+        <m:r>
+          <m:t>x</m:t>
+        </m:r>
+        <m:r>
+          <m:rPr>
+            <m:sty m:val="p"/>
+          </m:rPr>
+          <m:t>)</m:t>
+        </m:r>
+      </m:oMath>
+      <w:r>
+        <w:t xml:space="preserve"> </w:t>
+      </w:r>
+      <w:r>
+        <w:t xml:space="preserve">changes the split but not the distribution of</w:t>
+      </w:r>
+      <w:r>
+        <w:t xml:space="preserve"> </w:t>
+      </w:r>
+      <m:oMath>
+        <m:r>
+          <m:t>Y</m:t>
+        </m:r>
+      </m:oMath>
+      <w:r>
+        <w:t xml:space="preserve">,</w:t>
+      </w:r>
+      <w:r>
+        <w:t xml:space="preserve"> </w:t>
+      </w:r>
+      <w:r>
+        <w:t xml:space="preserve">so the data identify only the sum</w:t>
+      </w:r>
+      <w:r>
+        <w:t xml:space="preserve"> </w:t>
+      </w:r>
+      <m:oMath>
+        <m:r>
+          <m:t>f</m:t>
+        </m:r>
+        <m:r>
+          <m:rPr>
+            <m:sty m:val="p"/>
+          </m:rPr>
+          <m:t>(</m:t>
+        </m:r>
+        <m:r>
+          <m:t>x</m:t>
+        </m:r>
+        <m:r>
+          <m:rPr>
+            <m:sty m:val="p"/>
+          </m:rPr>
+          <m:t>)</m:t>
+        </m:r>
+        <m:r>
+          <m:rPr>
+            <m:sty m:val="p"/>
+          </m:rPr>
+          <m:t>+</m:t>
+        </m:r>
+        <m:r>
+          <m:rPr>
+            <m:sty m:val="p"/>
+          </m:rPr>
+          <m:t>E</m:t>
+        </m:r>
+        <m:r>
+          <m:t>​</m:t>
+        </m:r>
+        <m:d>
+          <m:dPr>
+            <m:begChr m:val="["/>
+            <m:sepChr m:val=""/>
+            <m:endChr m:val="]"/>
+            <m:grow/>
+          </m:dPr>
+          <m:e>
+            <m:r>
+              <m:t>ε</m:t>
+            </m:r>
+          </m:e>
+        </m:d>
+        <m:r>
+          <m:t>​</m:t>
+        </m:r>
+      </m:oMath>
+      <w:r>
+        <w:t xml:space="preserve">, the mean of</w:t>
+      </w:r>
+      <w:r>
+        <w:t xml:space="preserve"> </w:t>
+      </w:r>
+      <m:oMath>
+        <m:r>
+          <m:t>Y</m:t>
+        </m:r>
+      </m:oMath>
+      <w:r>
+        <w:t xml:space="preserve"> </w:t>
+      </w:r>
+      <w:r>
+        <w:t xml:space="preserve">at</w:t>
+      </w:r>
+      <w:r>
+        <w:t xml:space="preserve"> </w:t>
+      </w:r>
+      <m:oMath>
+        <m:r>
+          <m:t>x</m:t>
+        </m:r>
+      </m:oMath>
+      <w:r>
+        <w:t xml:space="preserve">.</w:t>
+      </w:r>
+      <w:r>
+        <w:t xml:space="preserve"> </w:t>
+      </w:r>
+      <w:r>
+        <w:t xml:space="preserve">Requiring</w:t>
+      </w:r>
+      <w:r>
+        <w:t xml:space="preserve"> </w:t>
+      </w:r>
+      <m:oMath>
+        <m:r>
+          <m:rPr>
+            <m:sty m:val="p"/>
+          </m:rPr>
+          <m:t>E</m:t>
+        </m:r>
+        <m:r>
+          <m:t>​</m:t>
+        </m:r>
+        <m:d>
+          <m:dPr>
+            <m:begChr m:val="["/>
+            <m:sepChr m:val=""/>
+            <m:endChr m:val="]"/>
+            <m:grow/>
+          </m:dPr>
+          <m:e>
+            <m:r>
+              <m:t>ε</m:t>
+            </m:r>
+          </m:e>
+        </m:d>
+        <m:r>
+          <m:t>​</m:t>
+        </m:r>
+        <m:r>
+          <m:rPr>
+            <m:sty m:val="p"/>
+          </m:rPr>
+          <m:t>=</m:t>
+        </m:r>
+        <m:r>
+          <m:t>0</m:t>
+        </m:r>
+      </m:oMath>
+      <w:r>
+        <w:t xml:space="preserve"> </w:t>
+      </w:r>
+      <w:r>
+        <w:t xml:space="preserve">picks the one split in which</w:t>
+      </w:r>
+      <w:r>
+        <w:t xml:space="preserve"> </w:t>
+      </w:r>
+      <m:oMath>
+        <m:r>
+          <m:t>f</m:t>
+        </m:r>
+        <m:r>
+          <m:rPr>
+            <m:sty m:val="p"/>
+          </m:rPr>
+          <m:t>(</m:t>
+        </m:r>
+        <m:r>
+          <m:t>x</m:t>
+        </m:r>
+        <m:r>
+          <m:rPr>
+            <m:sty m:val="p"/>
+          </m:rPr>
+          <m:t>)</m:t>
+        </m:r>
+      </m:oMath>
+      <w:r>
+        <w:t xml:space="preserve"> </w:t>
+      </w:r>
+      <w:r>
+        <w:t xml:space="preserve">is that mean.</w:t>
+      </w:r>
+      <w:r>
+        <w:t xml:space="preserve"> </w:t>
+      </w:r>
+      <w:r>
+        <w:t xml:space="preserve">This loses no generality when the model for</w:t>
+      </w:r>
+      <w:r>
+        <w:t xml:space="preserve"> </w:t>
+      </w:r>
+      <m:oMath>
+        <m:r>
+          <m:t>f</m:t>
+        </m:r>
+      </m:oMath>
+      <w:r>
+        <w:t xml:space="preserve"> </w:t>
+      </w:r>
+      <w:r>
+        <w:t xml:space="preserve">can absorb a constant,</w:t>
+      </w:r>
+      <w:r>
+        <w:t xml:space="preserve"> </w:t>
+      </w:r>
+      <w:r>
+        <w:t xml:space="preserve">as any model with an intercept can.</w:t>
+      </w:r>
+      <w:r>
+        <w:t xml:space="preserve"> </w:t>
+      </w:r>
+      <w:r>
+        <w:t xml:space="preserve">It restricts the model only when</w:t>
+      </w:r>
+      <w:r>
+        <w:t xml:space="preserve"> </w:t>
+      </w:r>
+      <m:oMath>
+        <m:r>
+          <m:t>f</m:t>
+        </m:r>
+      </m:oMath>
+      <w:r>
+        <w:t xml:space="preserve"> </w:t>
+      </w:r>
+      <w:r>
+        <w:t xml:space="preserve">cannot absorb one,</w:t>
+      </w:r>
+      <w:r>
+        <w:t xml:space="preserve"> </w:t>
+      </w:r>
+      <w:r>
+        <w:t xml:space="preserve">as in a regression through the origin.</w:t>
       </w:r>
     </w:p>
+    <w:bookmarkEnd w:id="21"/>
     <w:p>
       <w:pPr>
         <w:pStyle w:val="BodyText"/>
       </w:pPr>
       <w:r>
-        <w:t xml:space="preserve">That choice buys one identity, used repeatedly across statistical modeling</w:t>
+        <w:t xml:space="preserve">Mean zero gives one identity, used repeatedly across statistical modeling</w:t>
       </w:r>
       <w:r>
         <w:t xml:space="preserve"> </w:t>
@@ -1404,7 +1722,7 @@
         <w:t xml:space="preserve">and machine learning.</w:t>
       </w:r>
     </w:p>
-    <w:bookmarkStart w:id="21" w:name="exr-noise-second-moment"/>
+    <w:bookmarkStart w:id="22" w:name="exr-noise-second-moment"/>
     <w:p>
       <w:pPr>
         <w:pStyle w:val="BodyText"/>
@@ -1599,8 +1917,8 @@
         <w:t xml:space="preserve">and say which earlier result you used.</w:t>
       </w:r>
     </w:p>
-    <w:bookmarkEnd w:id="21"/>
-    <w:bookmarkStart w:id="23" w:name="sol-noise-second-moment"/>
+    <w:bookmarkEnd w:id="22"/>
+    <w:bookmarkStart w:id="24" w:name="sol-noise-second-moment"/>
     <w:p>
       <w:pPr>
         <w:pStyle w:val="BodyText"/>
@@ -1832,7 +2150,7 @@
       <w:pPr>
         <w:pStyle w:val="BodyText"/>
       </w:pPr>
-      <w:bookmarkStart w:id="22" w:name="eq-noise-second-moment"/>
+      <w:bookmarkStart w:id="23" w:name="eq-noise-second-moment"/>
       <m:oMathPara>
         <m:oMathParaPr>
           <m:jc m:val="center"/>
@@ -1967,7 +2285,7 @@
           </m:r>
         </m:oMath>
       </m:oMathPara>
-      <w:bookmarkEnd w:id="22"/>
+      <w:bookmarkEnd w:id="23"/>
     </w:p>
     <w:p>
       <w:pPr>
@@ -2071,10 +2389,10 @@
         <w:t xml:space="preserve">is what the fitting objective measures.</w:t>
       </w:r>
     </w:p>
-    <w:bookmarkEnd w:id="23"/>
     <w:bookmarkEnd w:id="24"/>
     <w:bookmarkEnd w:id="25"/>
-    <w:bookmarkStart w:id="49" w:name="variance-and-related-characteristics"/>
+    <w:bookmarkEnd w:id="26"/>
+    <w:bookmarkStart w:id="50" w:name="variance-and-related-characteristics"/>
     <w:p>
       <w:pPr>
         <w:pStyle w:val="Heading2"/>
@@ -2083,7 +2401,7 @@
         <w:t xml:space="preserve">2 Variance and related characteristics</w:t>
       </w:r>
     </w:p>
-    <w:bookmarkStart w:id="26" w:name="def-variance"/>
+    <w:bookmarkStart w:id="27" w:name="def-variance"/>
     <w:p>
       <w:pPr>
         <w:pStyle w:val="FirstParagraph"/>
@@ -2337,8 +2655,8 @@
         </m:oMath>
       </m:oMathPara>
     </w:p>
-    <w:bookmarkEnd w:id="26"/>
-    <w:bookmarkStart w:id="27" w:name="thm-variance-expanded"/>
+    <w:bookmarkEnd w:id="27"/>
+    <w:bookmarkStart w:id="28" w:name="thm-variance-expanded"/>
     <w:p>
       <w:pPr>
         <w:pStyle w:val="FirstParagraph"/>
@@ -2471,7 +2789,7 @@
         </m:oMath>
       </m:oMathPara>
     </w:p>
-    <w:bookmarkEnd w:id="27"/>
+    <w:bookmarkEnd w:id="28"/>
     <w:p>
       <w:pPr>
         <w:pStyle w:val="FirstParagraph"/>
@@ -2835,7 +3153,7 @@
         <w:t xml:space="preserve">.</w:t>
       </w:r>
     </w:p>
-    <w:bookmarkStart w:id="28" w:name="thm-variance"/>
+    <w:bookmarkStart w:id="29" w:name="thm-variance"/>
     <w:p>
       <w:pPr>
         <w:pStyle w:val="BodyText"/>
@@ -2981,7 +3299,7 @@
         </m:oMath>
       </m:oMathPara>
     </w:p>
-    <w:bookmarkEnd w:id="28"/>
+    <w:bookmarkEnd w:id="29"/>
     <w:p>
       <w:pPr>
         <w:pStyle w:val="FirstParagraph"/>
@@ -3002,7 +3320,7 @@
       <w:r>
         <w:t xml:space="preserve"> </w:t>
       </w:r>
-      <w:hyperlink r:id="rId29">
+      <w:hyperlink r:id="rId30">
         <w:r>
           <w:rPr>
             <w:rStyle w:val="Hyperlink"/>
@@ -3764,7 +4082,7 @@
         </m:oMath>
       </m:oMathPara>
     </w:p>
-    <w:bookmarkStart w:id="31" w:name="exm-variance-bernoulli"/>
+    <w:bookmarkStart w:id="32" w:name="exm-variance-bernoulli"/>
     <w:p>
       <w:pPr>
         <w:pStyle w:val="FirstParagraph"/>
@@ -3928,7 +4246,7 @@
       <w:r>
         <w:t xml:space="preserve"> </w:t>
       </w:r>
-      <w:hyperlink r:id="rId30">
+      <w:hyperlink r:id="rId31">
         <w:r>
           <w:rPr>
             <w:rStyle w:val="Hyperlink"/>
@@ -4274,8 +4592,8 @@
         <w:t xml:space="preserve">.</w:t>
       </w:r>
     </w:p>
-    <w:bookmarkEnd w:id="31"/>
-    <w:bookmarkStart w:id="33" w:name="def-cond-variance"/>
+    <w:bookmarkEnd w:id="32"/>
+    <w:bookmarkStart w:id="34" w:name="def-cond-variance"/>
     <w:p>
       <w:pPr>
         <w:pStyle w:val="BodyText"/>
@@ -4658,7 +4976,7 @@
       <w:r>
         <w:t xml:space="preserve"> </w:t>
       </w:r>
-      <w:hyperlink r:id="rId32">
+      <w:hyperlink r:id="rId33">
         <w:r>
           <w:rPr>
             <w:rStyle w:val="Hyperlink"/>
@@ -4763,8 +5081,8 @@
         <w:t xml:space="preserve">.</w:t>
       </w:r>
     </w:p>
-    <w:bookmarkEnd w:id="33"/>
-    <w:bookmarkStart w:id="35" w:name="exm-cond-variance"/>
+    <w:bookmarkEnd w:id="34"/>
+    <w:bookmarkStart w:id="36" w:name="exm-cond-variance"/>
     <w:p>
       <w:pPr>
         <w:pStyle w:val="BodyText"/>
@@ -5083,7 +5401,7 @@
       <w:r>
         <w:t xml:space="preserve"> </w:t>
       </w:r>
-      <w:hyperlink r:id="rId34">
+      <w:hyperlink r:id="rId35">
         <w:r>
           <w:rPr>
             <w:rStyle w:val="Hyperlink"/>
@@ -5831,8 +6149,8 @@
         </m:oMath>
       </m:oMathPara>
     </w:p>
-    <w:bookmarkEnd w:id="35"/>
-    <w:bookmarkStart w:id="36" w:name="def-homosked"/>
+    <w:bookmarkEnd w:id="36"/>
+    <w:bookmarkStart w:id="37" w:name="def-homosked"/>
     <w:p>
       <w:pPr>
         <w:pStyle w:val="FirstParagraph"/>
@@ -6074,8 +6392,8 @@
         <w:t xml:space="preserve">.</w:t>
       </w:r>
     </w:p>
-    <w:bookmarkEnd w:id="36"/>
-    <w:bookmarkStart w:id="37" w:name="exm-homosked"/>
+    <w:bookmarkEnd w:id="37"/>
+    <w:bookmarkStart w:id="38" w:name="exm-homosked"/>
     <w:p>
       <w:pPr>
         <w:pStyle w:val="BodyText"/>
@@ -6624,8 +6942,8 @@
         <w:t xml:space="preserve">.</w:t>
       </w:r>
     </w:p>
-    <w:bookmarkEnd w:id="37"/>
-    <w:bookmarkStart w:id="38" w:name="def-heterosked"/>
+    <w:bookmarkEnd w:id="38"/>
+    <w:bookmarkStart w:id="39" w:name="def-heterosked"/>
     <w:p>
       <w:pPr>
         <w:pStyle w:val="BodyText"/>
@@ -6787,8 +7105,8 @@
         <w:t xml:space="preserve">.</w:t>
       </w:r>
     </w:p>
-    <w:bookmarkEnd w:id="38"/>
-    <w:bookmarkStart w:id="39" w:name="exm-heterosked"/>
+    <w:bookmarkEnd w:id="39"/>
+    <w:bookmarkStart w:id="40" w:name="exm-heterosked"/>
     <w:p>
       <w:pPr>
         <w:pStyle w:val="BodyText"/>
@@ -7233,8 +7551,8 @@
         <w:t xml:space="preserve">.</w:t>
       </w:r>
     </w:p>
-    <w:bookmarkEnd w:id="39"/>
-    <w:bookmarkStart w:id="40" w:name="thm-total-variance"/>
+    <w:bookmarkEnd w:id="40"/>
+    <w:bookmarkStart w:id="41" w:name="thm-total-variance"/>
     <w:p>
       <w:pPr>
         <w:pStyle w:val="BodyText"/>
@@ -7496,7 +7814,7 @@
         </m:oMath>
       </m:oMathPara>
     </w:p>
-    <w:bookmarkEnd w:id="40"/>
+    <w:bookmarkEnd w:id="41"/>
     <w:p>
       <w:pPr>
         <w:pStyle w:val="FirstParagraph"/>
@@ -8308,7 +8626,7 @@
       <w:r>
         <w:t xml:space="preserve"> </w:t>
       </w:r>
-      <w:hyperlink r:id="rId41">
+      <w:hyperlink r:id="rId42">
         <w:r>
           <w:rPr>
             <w:rStyle w:val="Hyperlink"/>
@@ -8353,7 +8671,7 @@
       <w:r>
         <w:t xml:space="preserve">(</w:t>
       </w:r>
-      <w:hyperlink r:id="rId42">
+      <w:hyperlink r:id="rId43">
         <w:r>
           <w:rPr>
             <w:rStyle w:val="Hyperlink"/>
@@ -8379,7 +8697,7 @@
       <w:r>
         <w:t xml:space="preserve"> </w:t>
       </w:r>
-      <w:hyperlink r:id="rId43">
+      <w:hyperlink r:id="rId44">
         <w:r>
           <w:rPr>
             <w:rStyle w:val="Hyperlink"/>
@@ -8433,7 +8751,7 @@
       <w:r>
         <w:t xml:space="preserve"> </w:t>
       </w:r>
-      <w:hyperlink r:id="rId44">
+      <w:hyperlink r:id="rId45">
         <w:r>
           <w:rPr>
             <w:rStyle w:val="Hyperlink"/>
@@ -10945,7 +11263,7 @@
         <w:t xml:space="preserve">.</w:t>
       </w:r>
     </w:p>
-    <w:bookmarkStart w:id="45" w:name="exm-total-variance"/>
+    <w:bookmarkStart w:id="46" w:name="exm-total-variance"/>
     <w:p>
       <w:pPr>
         <w:pStyle w:val="BodyText"/>
@@ -11908,8 +12226,8 @@
         </m:oMath>
       </m:oMathPara>
     </w:p>
-    <w:bookmarkEnd w:id="45"/>
-    <w:bookmarkStart w:id="46" w:name="def-precision"/>
+    <w:bookmarkEnd w:id="46"/>
+    <w:bookmarkStart w:id="47" w:name="def-precision"/>
     <w:p>
       <w:pPr>
         <w:pStyle w:val="FirstParagraph"/>
@@ -12182,8 +12500,8 @@
         </m:oMath>
       </m:oMathPara>
     </w:p>
-    <w:bookmarkEnd w:id="46"/>
-    <w:bookmarkStart w:id="47" w:name="def-sd"/>
+    <w:bookmarkEnd w:id="47"/>
+    <w:bookmarkStart w:id="48" w:name="def-sd"/>
     <w:p>
       <w:pPr>
         <w:pStyle w:val="FirstParagraph"/>
@@ -12349,7 +12667,7 @@
         </m:oMath>
       </m:oMathPara>
     </w:p>
-    <w:bookmarkEnd w:id="47"/>
+    <w:bookmarkEnd w:id="48"/>
     <w:p>
       <w:pPr>
         <w:pStyle w:val="FirstParagraph"/>
@@ -12405,7 +12723,7 @@
         <w:t xml:space="preserve">which is why it is often the preferred measure of spread when reporting results.</w:t>
       </w:r>
     </w:p>
-    <w:bookmarkStart w:id="48" w:name="exm-sd"/>
+    <w:bookmarkStart w:id="49" w:name="exm-sd"/>
     <w:p>
       <w:pPr>
         <w:pStyle w:val="BodyText"/>
@@ -12692,9 +13010,9 @@
         </m:oMath>
       </m:oMathPara>
     </w:p>
-    <w:bookmarkEnd w:id="48"/>
     <w:bookmarkEnd w:id="49"/>
-    <w:bookmarkStart w:id="57" w:name="sec-bias-variance-prediction"/>
+    <w:bookmarkEnd w:id="50"/>
+    <w:bookmarkStart w:id="58" w:name="sec-bias-variance-prediction"/>
     <w:p>
       <w:pPr>
         <w:pStyle w:val="Heading2"/>
@@ -12703,7 +13021,7 @@
         <w:t xml:space="preserve">3 Bias, variance, and prediction error</w:t>
       </w:r>
     </w:p>
-    <w:bookmarkStart w:id="50" w:name="exr-prediction-error"/>
+    <w:bookmarkStart w:id="51" w:name="exr-prediction-error"/>
     <w:p>
       <w:pPr>
         <w:pStyle w:val="FirstParagraph"/>
@@ -13409,8 +13727,8 @@
         <w:t xml:space="preserve">and which cannot?</w:t>
       </w:r>
     </w:p>
-    <w:bookmarkEnd w:id="50"/>
-    <w:bookmarkStart w:id="51" w:name="sol-prediction-error"/>
+    <w:bookmarkEnd w:id="51"/>
+    <w:bookmarkStart w:id="52" w:name="sol-prediction-error"/>
     <w:p>
       <w:pPr>
         <w:pStyle w:val="FirstParagraph"/>
@@ -13702,8 +14020,8 @@
         <w:t xml:space="preserve">in the new response.</w:t>
       </w:r>
     </w:p>
-    <w:bookmarkEnd w:id="51"/>
-    <w:bookmarkStart w:id="53" w:name="def-prediction-bias"/>
+    <w:bookmarkEnd w:id="52"/>
+    <w:bookmarkStart w:id="54" w:name="def-prediction-bias"/>
     <w:p>
       <w:pPr>
         <w:pStyle w:val="FirstParagraph"/>
@@ -13812,7 +14130,7 @@
       <w:r>
         <w:t xml:space="preserve"> </w:t>
       </w:r>
-      <w:hyperlink r:id="rId52">
+      <w:hyperlink r:id="rId53">
         <w:r>
           <w:rPr>
             <w:rStyle w:val="Hyperlink"/>
@@ -14162,7 +14480,7 @@
         </m:oMath>
       </m:oMathPara>
     </w:p>
-    <w:bookmarkEnd w:id="53"/>
+    <w:bookmarkEnd w:id="54"/>
     <w:p>
       <w:pPr>
         <w:pStyle w:val="FirstParagraph"/>
@@ -14196,7 +14514,7 @@
         <w:t xml:space="preserve">the bias reflects the error introduced by approximating a real-world relationship by a model.</w:t>
       </w:r>
     </w:p>
-    <w:bookmarkStart w:id="54" w:name="exm-prediction-bias"/>
+    <w:bookmarkStart w:id="55" w:name="exm-prediction-bias"/>
     <w:p>
       <w:pPr>
         <w:pStyle w:val="BodyText"/>
@@ -14506,8 +14824,8 @@
         <w:t xml:space="preserve">.</w:t>
       </w:r>
     </w:p>
-    <w:bookmarkEnd w:id="54"/>
-    <w:bookmarkStart w:id="55" w:name="thm-prediction-error"/>
+    <w:bookmarkEnd w:id="55"/>
+    <w:bookmarkStart w:id="56" w:name="thm-prediction-error"/>
     <w:p>
       <w:pPr>
         <w:pStyle w:val="BodyText"/>
@@ -15155,7 +15473,7 @@
         </m:oMath>
       </m:oMathPara>
     </w:p>
-    <w:bookmarkEnd w:id="55"/>
+    <w:bookmarkEnd w:id="56"/>
     <w:p>
       <w:pPr>
         <w:pStyle w:val="FirstParagraph"/>
@@ -16636,7 +16954,7 @@
         <w:t xml:space="preserve">Adding the three terms gives the claim.</w:t>
       </w:r>
     </w:p>
-    <w:bookmarkStart w:id="56" w:name="def-irreducible-error"/>
+    <w:bookmarkStart w:id="57" w:name="def-irreducible-error"/>
     <w:p>
       <w:pPr>
         <w:pStyle w:val="BodyText"/>
@@ -16838,7 +17156,7 @@
         <w:t xml:space="preserve">.</w:t>
       </w:r>
     </w:p>
-    <w:bookmarkEnd w:id="56"/>
+    <w:bookmarkEnd w:id="57"/>
     <w:p>
       <w:pPr>
         <w:pStyle w:val="BodyText"/>
@@ -16866,8 +17184,8 @@
         <w:t xml:space="preserve">.</w:t>
       </w:r>
     </w:p>
-    <w:bookmarkEnd w:id="57"/>
-    <w:bookmarkStart w:id="105" w:name="covariance"/>
+    <w:bookmarkEnd w:id="58"/>
+    <w:bookmarkStart w:id="106" w:name="covariance"/>
     <w:p>
       <w:pPr>
         <w:pStyle w:val="Heading2"/>
@@ -16876,7 +17194,7 @@
         <w:t xml:space="preserve">4 Covariance</w:t>
       </w:r>
     </w:p>
-    <w:bookmarkStart w:id="58" w:name="def-cov"/>
+    <w:bookmarkStart w:id="59" w:name="def-cov"/>
     <w:p>
       <w:pPr>
         <w:pStyle w:val="FirstParagraph"/>
@@ -17232,8 +17550,8 @@
         </m:oMath>
       </m:oMathPara>
     </w:p>
-    <w:bookmarkEnd w:id="58"/>
-    <w:bookmarkStart w:id="59" w:name="thm-alt-cov"/>
+    <w:bookmarkEnd w:id="59"/>
+    <w:bookmarkStart w:id="60" w:name="thm-alt-cov"/>
     <w:p>
       <w:pPr>
         <w:pStyle w:val="FirstParagraph"/>
@@ -17382,7 +17700,7 @@
         </m:oMath>
       </m:oMathPara>
     </w:p>
-    <w:bookmarkEnd w:id="59"/>
+    <w:bookmarkEnd w:id="60"/>
     <w:p>
       <w:pPr>
         <w:pStyle w:val="FirstParagraph"/>
@@ -17403,7 +17721,7 @@
       <w:r>
         <w:t xml:space="preserve"> </w:t>
       </w:r>
-      <w:hyperlink r:id="rId29">
+      <w:hyperlink r:id="rId30">
         <w:r>
           <w:rPr>
             <w:rStyle w:val="Hyperlink"/>
@@ -18201,7 +18519,7 @@
         </m:oMath>
       </m:oMathPara>
     </w:p>
-    <w:bookmarkStart w:id="60" w:name="exm-alt-cov"/>
+    <w:bookmarkStart w:id="61" w:name="exm-alt-cov"/>
     <w:p>
       <w:pPr>
         <w:pStyle w:val="FirstParagraph"/>
@@ -18669,8 +18987,8 @@
         </m:oMath>
       </m:oMathPara>
     </w:p>
-    <w:bookmarkEnd w:id="60"/>
-    <w:bookmarkStart w:id="62" w:name="thm-indpt-uncorrelated"/>
+    <w:bookmarkEnd w:id="61"/>
+    <w:bookmarkStart w:id="63" w:name="thm-indpt-uncorrelated"/>
     <w:p>
       <w:pPr>
         <w:pStyle w:val="FirstParagraph"/>
@@ -18719,7 +19037,7 @@
       <w:r>
         <w:t xml:space="preserve"> </w:t>
       </w:r>
-      <w:hyperlink r:id="rId61">
+      <w:hyperlink r:id="rId62">
         <w:r>
           <w:rPr>
             <w:rStyle w:val="Hyperlink"/>
@@ -19015,7 +19333,7 @@
         <w:t xml:space="preserve">.</w:t>
       </w:r>
     </w:p>
-    <w:bookmarkEnd w:id="62"/>
+    <w:bookmarkEnd w:id="63"/>
     <w:p>
       <w:pPr>
         <w:pStyle w:val="BodyText"/>
@@ -19165,7 +19483,7 @@
       <w:r>
         <w:t xml:space="preserve"> </w:t>
       </w:r>
-      <w:hyperlink r:id="rId63">
+      <w:hyperlink r:id="rId64">
         <w:r>
           <w:rPr>
             <w:rStyle w:val="Hyperlink"/>
@@ -19179,7 +19497,7 @@
       <w:r>
         <w:t xml:space="preserve">(</w:t>
       </w:r>
-      <w:hyperlink r:id="rId64">
+      <w:hyperlink r:id="rId65">
         <w:r>
           <w:rPr>
             <w:rStyle w:val="Hyperlink"/>
@@ -19361,7 +19679,7 @@
       <w:r>
         <w:t xml:space="preserve"> </w:t>
       </w:r>
-      <w:hyperlink r:id="rId61">
+      <w:hyperlink r:id="rId62">
         <w:r>
           <w:rPr>
             <w:rStyle w:val="Hyperlink"/>
@@ -21867,7 +22185,7 @@
         </m:oMath>
       </m:oMathPara>
     </w:p>
-    <w:bookmarkStart w:id="66" w:name="exm-indpt-uncorrelated"/>
+    <w:bookmarkStart w:id="67" w:name="exm-indpt-uncorrelated"/>
     <w:p>
       <w:pPr>
         <w:pStyle w:val="FirstParagraph"/>
@@ -21934,7 +22252,7 @@
       <w:r>
         <w:t xml:space="preserve"> </w:t>
       </w:r>
-      <w:hyperlink r:id="rId65">
+      <w:hyperlink r:id="rId66">
         <w:r>
           <w:rPr>
             <w:rStyle w:val="Hyperlink"/>
@@ -22515,8 +22833,8 @@
         <w:t xml:space="preserve">requires.</w:t>
       </w:r>
     </w:p>
-    <w:bookmarkEnd w:id="66"/>
-    <w:bookmarkStart w:id="67" w:name="exm-uncorrelated-not-indpt"/>
+    <w:bookmarkEnd w:id="67"/>
+    <w:bookmarkStart w:id="68" w:name="exm-uncorrelated-not-indpt"/>
     <w:p>
       <w:pPr>
         <w:pStyle w:val="BodyText"/>
@@ -23740,8 +24058,8 @@
         </m:oMath>
       </m:oMathPara>
     </w:p>
-    <w:bookmarkEnd w:id="67"/>
-    <w:bookmarkStart w:id="68" w:name="def-correlation"/>
+    <w:bookmarkEnd w:id="68"/>
+    <w:bookmarkStart w:id="69" w:name="def-correlation"/>
     <w:p>
       <w:pPr>
         <w:pStyle w:val="FirstParagraph"/>
@@ -24013,7 +24331,7 @@
         </m:oMath>
       </m:oMathPara>
     </w:p>
-    <w:bookmarkEnd w:id="68"/>
+    <w:bookmarkEnd w:id="69"/>
     <w:p>
       <w:pPr>
         <w:pStyle w:val="FirstParagraph"/>
@@ -24069,7 +24387,7 @@
         <w:t xml:space="preserve">the sample (Pearson) correlation coefficient computed from data estimates it.</w:t>
       </w:r>
     </w:p>
-    <w:bookmarkStart w:id="69" w:name="exm-correlation"/>
+    <w:bookmarkStart w:id="70" w:name="exm-correlation"/>
     <w:p>
       <w:pPr>
         <w:pStyle w:val="BodyText"/>
@@ -24716,8 +25034,8 @@
         </m:oMath>
       </m:oMathPara>
     </w:p>
-    <w:bookmarkEnd w:id="69"/>
-    <w:bookmarkStart w:id="70" w:name="def-uncorrelated"/>
+    <w:bookmarkEnd w:id="70"/>
+    <w:bookmarkStart w:id="71" w:name="def-uncorrelated"/>
     <w:p>
       <w:pPr>
         <w:pStyle w:val="FirstParagraph"/>
@@ -24966,7 +25284,7 @@
         </m:oMath>
       </m:oMathPara>
     </w:p>
-    <w:bookmarkEnd w:id="70"/>
+    <w:bookmarkEnd w:id="71"/>
     <w:p>
       <w:pPr>
         <w:pStyle w:val="FirstParagraph"/>
@@ -25019,7 +25337,7 @@
         <w:t xml:space="preserve">shows the converse fails.</w:t>
       </w:r>
     </w:p>
-    <w:bookmarkStart w:id="71" w:name="exm-uncorrelated"/>
+    <w:bookmarkStart w:id="72" w:name="exm-uncorrelated"/>
     <w:p>
       <w:pPr>
         <w:pStyle w:val="BodyText"/>
@@ -25241,8 +25559,8 @@
         <w:t xml:space="preserve">so the binary exposure and outcome are not uncorrelated.</w:t>
       </w:r>
     </w:p>
-    <w:bookmarkEnd w:id="71"/>
-    <w:bookmarkStart w:id="72" w:name="cor-uncorrelated-cor-zero"/>
+    <w:bookmarkEnd w:id="72"/>
+    <w:bookmarkStart w:id="73" w:name="cor-uncorrelated-cor-zero"/>
     <w:p>
       <w:pPr>
         <w:pStyle w:val="BodyText"/>
@@ -25405,7 +25723,7 @@
         <w:t xml:space="preserve">.</w:t>
       </w:r>
     </w:p>
-    <w:bookmarkEnd w:id="72"/>
+    <w:bookmarkEnd w:id="73"/>
     <w:p>
       <w:pPr>
         <w:pStyle w:val="BodyText"/>
@@ -25805,7 +26123,7 @@
         <w:t xml:space="preserve">.</w:t>
       </w:r>
     </w:p>
-    <w:bookmarkStart w:id="73" w:name="def-cond-cov"/>
+    <w:bookmarkStart w:id="74" w:name="def-cond-cov"/>
     <w:p>
       <w:pPr>
         <w:pStyle w:val="BodyText"/>
@@ -26257,8 +26575,8 @@
         <w:t xml:space="preserve">.</w:t>
       </w:r>
     </w:p>
-    <w:bookmarkEnd w:id="73"/>
-    <w:bookmarkStart w:id="74" w:name="exm-cond-cov"/>
+    <w:bookmarkEnd w:id="74"/>
+    <w:bookmarkStart w:id="75" w:name="exm-cond-cov"/>
     <w:p>
       <w:pPr>
         <w:pStyle w:val="BodyText"/>
@@ -26529,8 +26847,8 @@
         <w:t xml:space="preserve">.</w:t>
       </w:r>
     </w:p>
-    <w:bookmarkEnd w:id="74"/>
-    <w:bookmarkStart w:id="75" w:name="thm-total-cov"/>
+    <w:bookmarkEnd w:id="75"/>
+    <w:bookmarkStart w:id="76" w:name="thm-total-cov"/>
     <w:p>
       <w:pPr>
         <w:pStyle w:val="BodyText"/>
@@ -26915,7 +27233,7 @@
         </m:oMath>
       </m:oMathPara>
     </w:p>
-    <w:bookmarkEnd w:id="75"/>
+    <w:bookmarkEnd w:id="76"/>
     <w:p>
       <w:pPr>
         <w:pStyle w:val="FirstParagraph"/>
@@ -28490,7 +28808,7 @@
       <w:r>
         <w:t xml:space="preserve"> </w:t>
       </w:r>
-      <w:hyperlink r:id="rId41">
+      <w:hyperlink r:id="rId42">
         <w:r>
           <w:rPr>
             <w:rStyle w:val="Hyperlink"/>
@@ -28521,7 +28839,7 @@
       <w:r>
         <w:t xml:space="preserve">(</w:t>
       </w:r>
-      <w:hyperlink r:id="rId43">
+      <w:hyperlink r:id="rId44">
         <w:r>
           <w:rPr>
             <w:rStyle w:val="Hyperlink"/>
@@ -28718,7 +29036,7 @@
       <w:r>
         <w:t xml:space="preserve"> </w:t>
       </w:r>
-      <w:hyperlink r:id="rId44">
+      <w:hyperlink r:id="rId45">
         <w:r>
           <w:rPr>
             <w:rStyle w:val="Hyperlink"/>
@@ -30031,7 +30349,7 @@
         <w:t xml:space="preserve">.</w:t>
       </w:r>
     </w:p>
-    <w:bookmarkStart w:id="76" w:name="lem-cov-xx"/>
+    <w:bookmarkStart w:id="77" w:name="lem-cov-xx"/>
     <w:p>
       <w:pPr>
         <w:pStyle w:val="BodyText"/>
@@ -30195,7 +30513,7 @@
         </m:oMath>
       </m:oMathPara>
     </w:p>
-    <w:bookmarkEnd w:id="76"/>
+    <w:bookmarkEnd w:id="77"/>
     <w:p>
       <w:pPr>
         <w:pStyle w:val="FirstParagraph"/>
@@ -30597,7 +30915,7 @@
         </m:oMath>
       </m:oMathPara>
     </w:p>
-    <w:bookmarkStart w:id="77" w:name="def-cov-vec-x"/>
+    <w:bookmarkStart w:id="78" w:name="def-cov-vec-x"/>
     <w:p>
       <w:pPr>
         <w:pStyle w:val="FirstParagraph"/>
@@ -30948,8 +31266,8 @@
         </m:oMath>
       </m:oMathPara>
     </w:p>
-    <w:bookmarkEnd w:id="77"/>
-    <w:bookmarkStart w:id="78" w:name="thm-vcov-elements"/>
+    <w:bookmarkEnd w:id="78"/>
+    <w:bookmarkStart w:id="79" w:name="thm-vcov-elements"/>
     <w:p>
       <w:pPr>
         <w:pStyle w:val="FirstParagraph"/>
@@ -31810,7 +32128,7 @@
         </m:oMath>
       </m:oMathPara>
     </w:p>
-    <w:bookmarkEnd w:id="78"/>
+    <w:bookmarkEnd w:id="79"/>
     <w:p>
       <w:pPr>
         <w:pStyle w:val="FirstParagraph"/>
@@ -34075,7 +34393,7 @@
       <w:r>
         <w:t xml:space="preserve"> </w:t>
       </w:r>
-      <w:hyperlink r:id="rId79">
+      <w:hyperlink r:id="rId80">
         <w:r>
           <w:rPr>
             <w:rStyle w:val="Hyperlink"/>
@@ -34139,7 +34457,7 @@
         <w:t xml:space="preserve">.</w:t>
       </w:r>
     </w:p>
-    <w:bookmarkStart w:id="80" w:name="thm-vcov-vec"/>
+    <w:bookmarkStart w:id="81" w:name="thm-vcov-vec"/>
     <w:p>
       <w:pPr>
         <w:pStyle w:val="FirstParagraph"/>
@@ -34345,7 +34663,7 @@
         </m:oMath>
       </m:oMathPara>
     </w:p>
-    <w:bookmarkEnd w:id="80"/>
+    <w:bookmarkEnd w:id="81"/>
     <w:p>
       <w:pPr>
         <w:pStyle w:val="FirstParagraph"/>
@@ -35348,7 +35666,7 @@
         </m:oMath>
       </m:oMathPara>
     </w:p>
-    <w:bookmarkStart w:id="81" w:name="thm-var-lincom"/>
+    <w:bookmarkStart w:id="82" w:name="thm-var-lincom"/>
     <w:p>
       <w:pPr>
         <w:pStyle w:val="FirstParagraph"/>
@@ -35900,7 +36218,7 @@
         </m:oMath>
       </m:oMathPara>
     </w:p>
-    <w:bookmarkEnd w:id="81"/>
+    <w:bookmarkEnd w:id="82"/>
     <w:p>
       <w:pPr>
         <w:pStyle w:val="FirstParagraph"/>
@@ -37360,7 +37678,7 @@
         </m:oMath>
       </m:oMathPara>
     </w:p>
-    <w:bookmarkStart w:id="82" w:name="cor-var-lincom2"/>
+    <w:bookmarkStart w:id="83" w:name="cor-var-lincom2"/>
     <w:p>
       <w:pPr>
         <w:pStyle w:val="FirstParagraph"/>
@@ -37637,7 +37955,7 @@
         </m:oMath>
       </m:oMathPara>
     </w:p>
-    <w:bookmarkEnd w:id="82"/>
+    <w:bookmarkEnd w:id="83"/>
     <w:p>
       <w:pPr>
         <w:pStyle w:val="FirstParagraph"/>
@@ -39167,7 +39485,7 @@
         </m:oMath>
       </m:oMathPara>
     </w:p>
-    <w:bookmarkStart w:id="83" w:name="cor-var-sum-indpt"/>
+    <w:bookmarkStart w:id="84" w:name="cor-var-sum-indpt"/>
     <w:p>
       <w:pPr>
         <w:pStyle w:val="FirstParagraph"/>
@@ -39216,7 +39534,7 @@
       <w:r>
         <w:t xml:space="preserve"> </w:t>
       </w:r>
-      <w:hyperlink r:id="rId61">
+      <w:hyperlink r:id="rId62">
         <w:r>
           <w:rPr>
             <w:rStyle w:val="Hyperlink"/>
@@ -39459,7 +39777,7 @@
         </m:oMath>
       </m:oMathPara>
     </w:p>
-    <w:bookmarkEnd w:id="83"/>
+    <w:bookmarkEnd w:id="84"/>
     <w:p>
       <w:pPr>
         <w:pStyle w:val="FirstParagraph"/>
@@ -40153,7 +40471,7 @@
         <w:t xml:space="preserve">is the case where that term is 0.</w:t>
       </w:r>
     </w:p>
-    <w:bookmarkStart w:id="86" w:name="thm-vcov-psd"/>
+    <w:bookmarkStart w:id="87" w:name="thm-vcov-psd"/>
     <w:p>
       <w:pPr>
         <w:pStyle w:val="BodyText"/>
@@ -40406,7 +40724,7 @@
       <w:r>
         <w:t xml:space="preserve"> </w:t>
       </w:r>
-      <w:hyperlink r:id="rId84">
+      <w:hyperlink r:id="rId85">
         <w:r>
           <w:rPr>
             <w:rStyle w:val="Hyperlink"/>
@@ -40423,7 +40741,7 @@
       <w:r>
         <w:t xml:space="preserve"> </w:t>
       </w:r>
-      <w:hyperlink r:id="rId85">
+      <w:hyperlink r:id="rId86">
         <w:r>
           <w:rPr>
             <w:rStyle w:val="Hyperlink"/>
@@ -40567,7 +40885,7 @@
         </m:oMath>
       </m:oMathPara>
     </w:p>
-    <w:bookmarkEnd w:id="86"/>
+    <w:bookmarkEnd w:id="87"/>
     <w:p>
       <w:pPr>
         <w:pStyle w:val="FirstParagraph"/>
@@ -41796,7 +42114,7 @@
         <w:t xml:space="preserve">).</w:t>
       </w:r>
     </w:p>
-    <w:bookmarkStart w:id="87" w:name="exm-vcov-psd"/>
+    <w:bookmarkStart w:id="88" w:name="exm-vcov-psd"/>
     <w:p>
       <w:pPr>
         <w:pStyle w:val="BodyText"/>
@@ -44598,7 +44916,7 @@
         <w:t xml:space="preserve">.</w:t>
       </w:r>
     </w:p>
-    <w:bookmarkEnd w:id="87"/>
+    <w:bookmarkEnd w:id="88"/>
     <w:p>
       <w:pPr>
         <w:pStyle w:val="BodyText"/>
@@ -44732,7 +45050,7 @@
         <w:t xml:space="preserve">has the larger spread.</w:t>
       </w:r>
     </w:p>
-    <w:bookmarkStart w:id="91" w:name="exm-vcov-singular"/>
+    <w:bookmarkStart w:id="92" w:name="exm-vcov-singular"/>
     <w:p>
       <w:pPr>
         <w:pStyle w:val="BodyText"/>
@@ -45472,7 +45790,7 @@
       <w:r>
         <w:t xml:space="preserve"> </w:t>
       </w:r>
-      <w:hyperlink r:id="rId88">
+      <w:hyperlink r:id="rId89">
         <w:r>
           <w:rPr>
             <w:rStyle w:val="Hyperlink"/>
@@ -45489,7 +45807,7 @@
       <w:r>
         <w:t xml:space="preserve"> </w:t>
       </w:r>
-      <w:hyperlink r:id="rId89">
+      <w:hyperlink r:id="rId90">
         <w:r>
           <w:rPr>
             <w:rStyle w:val="Hyperlink"/>
@@ -45553,7 +45871,7 @@
       <w:r>
         <w:t xml:space="preserve"> </w:t>
       </w:r>
-      <w:hyperlink r:id="rId90">
+      <w:hyperlink r:id="rId91">
         <w:r>
           <w:rPr>
             <w:rStyle w:val="Hyperlink"/>
@@ -45565,8 +45883,8 @@
         <w:t xml:space="preserve">.</w:t>
       </w:r>
     </w:p>
-    <w:bookmarkEnd w:id="91"/>
-    <w:bookmarkStart w:id="93" w:name="cor-vcov-indpt-diagonal"/>
+    <w:bookmarkEnd w:id="92"/>
+    <w:bookmarkStart w:id="94" w:name="cor-vcov-indpt-diagonal"/>
     <w:p>
       <w:pPr>
         <w:pStyle w:val="BodyText"/>
@@ -45817,7 +46135,7 @@
       <w:r>
         <w:t xml:space="preserve"> </w:t>
       </w:r>
-      <w:hyperlink r:id="rId61">
+      <w:hyperlink r:id="rId62">
         <w:r>
           <w:rPr>
             <w:rStyle w:val="Hyperlink"/>
@@ -45905,7 +46223,7 @@
       <w:r>
         <w:t xml:space="preserve"> </w:t>
       </w:r>
-      <w:hyperlink r:id="rId92">
+      <w:hyperlink r:id="rId93">
         <w:r>
           <w:rPr>
             <w:rStyle w:val="Hyperlink"/>
@@ -46017,7 +46335,7 @@
         <w:t xml:space="preserve">.</w:t>
       </w:r>
     </w:p>
-    <w:bookmarkEnd w:id="93"/>
+    <w:bookmarkEnd w:id="94"/>
     <w:p>
       <w:pPr>
         <w:pStyle w:val="BodyText"/>
@@ -46504,7 +46822,7 @@
         <w:t xml:space="preserve">.</w:t>
       </w:r>
     </w:p>
-    <w:bookmarkStart w:id="94" w:name="thm-cor-bounds"/>
+    <w:bookmarkStart w:id="95" w:name="thm-cor-bounds"/>
     <w:p>
       <w:pPr>
         <w:pStyle w:val="BodyText"/>
@@ -46753,7 +47071,7 @@
         </m:oMath>
       </m:oMathPara>
     </w:p>
-    <w:bookmarkEnd w:id="94"/>
+    <w:bookmarkEnd w:id="95"/>
     <w:p>
       <w:pPr>
         <w:pStyle w:val="FirstParagraph"/>
@@ -47975,7 +48293,7 @@
         <w:t xml:space="preserve">.</w:t>
       </w:r>
     </w:p>
-    <w:bookmarkStart w:id="102" w:name="exm-cor-auto"/>
+    <w:bookmarkStart w:id="103" w:name="exm-cor-auto"/>
     <w:p>
       <w:pPr>
         <w:pStyle w:val="BodyText"/>
@@ -48039,7 +48357,7 @@
       <w:r>
         <w:t xml:space="preserve"> </w:t>
       </w:r>
-      <w:hyperlink r:id="rId95">
+      <w:hyperlink r:id="rId96">
         <w:r>
           <w:rPr>
             <w:rStyle w:val="VerbatimChar"/>
@@ -48071,7 +48389,7 @@
       <w:r>
         <w:t xml:space="preserve"> </w:t>
       </w:r>
-      <w:hyperlink r:id="rId96">
+      <w:hyperlink r:id="rId97">
         <w:r>
           <w:rPr>
             <w:rStyle w:val="VerbatimChar"/>
@@ -48103,7 +48421,7 @@
       <w:r>
         <w:t xml:space="preserve"> </w:t>
       </w:r>
-      <w:hyperlink r:id="rId97">
+      <w:hyperlink r:id="rId98">
         <w:r>
           <w:rPr>
             <w:rStyle w:val="VerbatimChar"/>
@@ -49824,7 +50142,7 @@
       <w:tr>
         <w:tc>
           <w:tcPr/>
-          <w:bookmarkStart w:id="101" w:name="fig-cor-auto"/>
+          <w:bookmarkStart w:id="102" w:name="fig-cor-auto"/>
           <w:p>
             <w:pPr>
               <w:pStyle w:val="Compact"/>
@@ -49835,18 +50153,18 @@
                 <wp:inline>
                   <wp:extent cx="4620126" cy="3234088"/>
                   <wp:effectExtent b="0" l="0" r="0" t="0"/>
-                  <wp:docPr descr="" title="" id="99" name="Picture"/>
+                  <wp:docPr descr="" title="" id="100" name="Picture"/>
                   <a:graphic>
                     <a:graphicData uri="http://schemas.openxmlformats.org/drawingml/2006/picture">
                       <pic:pic>
                         <pic:nvPicPr>
-                          <pic:cNvPr descr="variance-covariance_files/figure-docx/fig-cor-auto-1.png" id="100" name="Picture"/>
+                          <pic:cNvPr descr="variance-covariance_files/figure-docx/fig-cor-auto-1.png" id="101" name="Picture"/>
                           <pic:cNvPicPr>
                             <a:picLocks noChangeArrowheads="1" noChangeAspect="1"/>
                           </pic:cNvPicPr>
                         </pic:nvPicPr>
                         <pic:blipFill>
-                          <a:blip r:embed="rId98"/>
+                          <a:blip r:embed="rId99"/>
                           <a:stretch>
                             <a:fillRect/>
                           </a:stretch>
@@ -49886,7 +50204,7 @@
               <w:t xml:space="preserve">Figure 1: Miles per gallon against horsepower for the cars in the Auto data. Cars with more horsepower tend to have lower fuel economy.</w:t>
             </w:r>
           </w:p>
-          <w:bookmarkEnd w:id="101"/>
+          <w:bookmarkEnd w:id="102"/>
         </w:tc>
       </w:tr>
     </w:tbl>
@@ -50033,7 +50351,7 @@
         <w:t xml:space="preserve">deviations by the same count, which cancels.</w:t>
       </w:r>
     </w:p>
-    <w:bookmarkEnd w:id="102"/>
+    <w:bookmarkEnd w:id="103"/>
     <w:p>
       <w:pPr>
         <w:pStyle w:val="BodyText"/>
@@ -50044,7 +50362,7 @@
       <w:r>
         <w:t xml:space="preserve"> </w:t>
       </w:r>
-      <w:hyperlink r:id="rId103">
+      <w:hyperlink r:id="rId104">
         <w:r>
           <w:rPr>
             <w:rStyle w:val="Hyperlink"/>
@@ -50061,7 +50379,7 @@
       <w:r>
         <w:t xml:space="preserve"> </w:t>
       </w:r>
-      <w:hyperlink r:id="rId104">
+      <w:hyperlink r:id="rId105">
         <w:r>
           <w:rPr>
             <w:rStyle w:val="Hyperlink"/>
@@ -50091,8 +50409,8 @@
         <w:t xml:space="preserve">.</w:t>
       </w:r>
     </w:p>
-    <w:bookmarkEnd w:id="105"/>
-    <w:bookmarkStart w:id="114" w:name="references"/>
+    <w:bookmarkEnd w:id="106"/>
+    <w:bookmarkStart w:id="115" w:name="references"/>
     <w:p>
       <w:pPr>
         <w:pStyle w:val="Heading2"/>
@@ -50101,8 +50419,8 @@
         <w:t xml:space="preserve">References</w:t>
       </w:r>
     </w:p>
-    <w:bookmarkStart w:id="113" w:name="refs"/>
-    <w:bookmarkStart w:id="107" w:name="ref-fiveminuteai_probstat"/>
+    <w:bookmarkStart w:id="114" w:name="refs"/>
+    <w:bookmarkStart w:id="108" w:name="ref-fiveminuteai_probstat"/>
     <w:p>
       <w:pPr>
         <w:pStyle w:val="Bibliography"/>
@@ -50126,7 +50444,7 @@
       <w:r>
         <w:t xml:space="preserve"> </w:t>
       </w:r>
-      <w:hyperlink r:id="rId106">
+      <w:hyperlink r:id="rId107">
         <w:r>
           <w:rPr>
             <w:rStyle w:val="Hyperlink"/>
@@ -50138,8 +50456,8 @@
         <w:t xml:space="preserve">.</w:t>
       </w:r>
     </w:p>
-    <w:bookmarkEnd w:id="107"/>
-    <w:bookmarkStart w:id="108" w:name="ref-billingsley1995probability"/>
+    <w:bookmarkEnd w:id="108"/>
+    <w:bookmarkStart w:id="109" w:name="ref-billingsley1995probability"/>
     <w:p>
       <w:pPr>
         <w:pStyle w:val="Bibliography"/>
@@ -50161,8 +50479,8 @@
         <w:t xml:space="preserve">. 3rd ed. Wiley Series in Probability and Mathematical Statistics. Wiley.</w:t>
       </w:r>
     </w:p>
-    <w:bookmarkEnd w:id="108"/>
-    <w:bookmarkStart w:id="110" w:name="ref-CaseBerg01"/>
+    <w:bookmarkEnd w:id="109"/>
+    <w:bookmarkStart w:id="111" w:name="ref-CaseBerg01"/>
     <w:p>
       <w:pPr>
         <w:pStyle w:val="Bibliography"/>
@@ -50186,7 +50504,7 @@
       <w:r>
         <w:t xml:space="preserve"> </w:t>
       </w:r>
-      <w:hyperlink r:id="rId109">
+      <w:hyperlink r:id="rId110">
         <w:r>
           <w:rPr>
             <w:rStyle w:val="Hyperlink"/>
@@ -50198,8 +50516,8 @@
         <w:t xml:space="preserve">.</w:t>
       </w:r>
     </w:p>
-    <w:bookmarkEnd w:id="110"/>
-    <w:bookmarkStart w:id="112" w:name="ref-james2021islr2e"/>
+    <w:bookmarkEnd w:id="111"/>
+    <w:bookmarkStart w:id="113" w:name="ref-james2021islr2e"/>
     <w:p>
       <w:pPr>
         <w:pStyle w:val="Bibliography"/>
@@ -50237,7 +50555,7 @@
       <w:r>
         <w:t xml:space="preserve"> </w:t>
       </w:r>
-      <w:hyperlink r:id="rId111">
+      <w:hyperlink r:id="rId112">
         <w:r>
           <w:rPr>
             <w:rStyle w:val="Hyperlink"/>
@@ -50249,9 +50567,9 @@
         <w:t xml:space="preserve">.</w:t>
       </w:r>
     </w:p>
-    <w:bookmarkEnd w:id="112"/>
     <w:bookmarkEnd w:id="113"/>
     <w:bookmarkEnd w:id="114"/>
+    <w:bookmarkEnd w:id="115"/>
     <w:sectPr>
       <w:footnotePr>
         <w:numRestart w:val="eachSect"/>

</xml_diff>

<commit_message>
Deploying to gh-pages from @ Morrison-Lab/pds@28bd177bb5726229308dd32d74099b45cdf65343 🚀
</commit_message>
<xml_diff>
--- a/variance-covariance.docx
+++ b/variance-covariance.docx
@@ -15,10 +15,10 @@
         <w:pStyle w:val="Date"/>
       </w:pPr>
       <w:r>
-        <w:t xml:space="preserve">Last modified: 2026-10-14 11:38:02 (PDT)</w:t>
+        <w:t xml:space="preserve">Last modified: 2026-10-14 17:51:58 (PDT)</w:t>
       </w:r>
     </w:p>
-    <w:bookmarkStart w:id="26" w:name="sec-deviation"/>
+    <w:bookmarkStart w:id="27" w:name="sec-deviation"/>
     <w:p>
       <w:pPr>
         <w:pStyle w:val="Heading2"/>
@@ -1297,7 +1297,7 @@
       </m:oMathPara>
     </w:p>
     <w:bookmarkEnd w:id="20"/>
-    <w:bookmarkStart w:id="25" w:name="sec-noise-model"/>
+    <w:bookmarkStart w:id="26" w:name="sec-noise-model"/>
     <w:p>
       <w:pPr>
         <w:pStyle w:val="Heading3"/>
@@ -1852,7 +1852,7 @@
         <w:pStyle w:val="BodyText"/>
       </w:pPr>
       <w:r>
-        <w:t xml:space="preserve">Show that</w:t>
+        <w:t xml:space="preserve">Find</w:t>
       </w:r>
       <w:r>
         <w:t xml:space="preserve"> </w:t>
@@ -1888,12 +1888,17 @@
           </m:rPr>
           <m:t>]</m:t>
         </m:r>
-        <m:r>
-          <m:rPr>
-            <m:sty m:val="p"/>
-          </m:rPr>
-          <m:t>=</m:t>
-        </m:r>
+      </m:oMath>
+      <w:r>
+        <w:t xml:space="preserve"> </w:t>
+      </w:r>
+      <w:r>
+        <w:t xml:space="preserve">in terms of</w:t>
+      </w:r>
+      <w:r>
+        <w:t xml:space="preserve"> </w:t>
+      </w:r>
+      <m:oMath>
         <m:sSup>
           <m:e>
             <m:r>
@@ -1938,7 +1943,7 @@
           <w:rPr>
             <w:rStyle w:val="Hyperlink"/>
           </w:rPr>
-          <w:t xml:space="preserve">Theorem 2</w:t>
+          <w:t xml:space="preserve">Theorem 3</w:t>
         </w:r>
       </w:hyperlink>
       <w:r>
@@ -2390,9 +2395,305 @@
       </w:r>
     </w:p>
     <w:bookmarkEnd w:id="24"/>
+    <w:bookmarkStart w:id="25" w:name="thm-noise-second-moment"/>
+    <w:p>
+      <w:pPr>
+        <w:pStyle w:val="BodyText"/>
+      </w:pPr>
+      <w:r>
+        <w:rPr>
+          <w:b/>
+          <w:bCs/>
+        </w:rPr>
+        <w:t xml:space="preserve">Theorem 1 (The second moment of mean-zero noise)</w:t>
+      </w:r>
+      <w:r>
+        <w:t xml:space="preserve"> </w:t>
+      </w:r>
+      <w:r>
+        <w:t xml:space="preserve">Let</w:t>
+      </w:r>
+      <w:r>
+        <w:t xml:space="preserve"> </w:t>
+      </w:r>
+      <m:oMath>
+        <m:r>
+          <m:t>ε</m:t>
+        </m:r>
+      </m:oMath>
+      <w:r>
+        <w:t xml:space="preserve"> </w:t>
+      </w:r>
+      <w:r>
+        <w:t xml:space="preserve">be a random variable with</w:t>
+      </w:r>
+      <w:r>
+        <w:t xml:space="preserve"> </w:t>
+      </w:r>
+      <m:oMath>
+        <m:r>
+          <m:rPr>
+            <m:sty m:val="p"/>
+          </m:rPr>
+          <m:t>E</m:t>
+        </m:r>
+        <m:r>
+          <m:rPr>
+            <m:sty m:val="p"/>
+          </m:rPr>
+          <m:t>[</m:t>
+        </m:r>
+        <m:r>
+          <m:t>ε</m:t>
+        </m:r>
+        <m:r>
+          <m:rPr>
+            <m:sty m:val="p"/>
+          </m:rPr>
+          <m:t>]</m:t>
+        </m:r>
+        <m:r>
+          <m:rPr>
+            <m:sty m:val="p"/>
+          </m:rPr>
+          <m:t>=</m:t>
+        </m:r>
+        <m:r>
+          <m:t>0</m:t>
+        </m:r>
+      </m:oMath>
+      <w:r>
+        <w:t xml:space="preserve"> </w:t>
+      </w:r>
+      <w:r>
+        <w:t xml:space="preserve">and</w:t>
+      </w:r>
+      <w:r>
+        <w:t xml:space="preserve"> </w:t>
+      </w:r>
+      <m:oMath>
+        <m:r>
+          <m:rPr>
+            <m:sty m:val="p"/>
+          </m:rPr>
+          <m:t>Var</m:t>
+        </m:r>
+        <m:r>
+          <m:t>​</m:t>
+        </m:r>
+        <m:d>
+          <m:dPr>
+            <m:begChr m:val="("/>
+            <m:sepChr m:val=""/>
+            <m:endChr m:val=")"/>
+            <m:grow/>
+          </m:dPr>
+          <m:e>
+            <m:r>
+              <m:t>ε</m:t>
+            </m:r>
+          </m:e>
+        </m:d>
+        <m:r>
+          <m:t>​</m:t>
+        </m:r>
+        <m:r>
+          <m:rPr>
+            <m:sty m:val="p"/>
+          </m:rPr>
+          <m:t>=</m:t>
+        </m:r>
+        <m:sSup>
+          <m:e>
+            <m:r>
+              <m:t>σ</m:t>
+            </m:r>
+          </m:e>
+          <m:sup>
+            <m:r>
+              <m:t>2</m:t>
+            </m:r>
+          </m:sup>
+        </m:sSup>
+      </m:oMath>
+      <w:r>
+        <w:t xml:space="preserve">.</w:t>
+      </w:r>
+      <w:r>
+        <w:t xml:space="preserve"> </w:t>
+      </w:r>
+      <w:r>
+        <w:t xml:space="preserve">Then</w:t>
+      </w:r>
+    </w:p>
+    <w:p>
+      <w:pPr>
+        <w:pStyle w:val="BodyText"/>
+      </w:pPr>
+      <m:oMathPara>
+        <m:oMathParaPr>
+          <m:jc m:val="center"/>
+        </m:oMathParaPr>
+        <m:oMath>
+          <m:r>
+            <m:rPr>
+              <m:sty m:val="p"/>
+            </m:rPr>
+            <m:t>E</m:t>
+          </m:r>
+          <m:r>
+            <m:rPr>
+              <m:sty m:val="p"/>
+            </m:rPr>
+            <m:t>[</m:t>
+          </m:r>
+          <m:sSup>
+            <m:e>
+              <m:r>
+                <m:t>ε</m:t>
+              </m:r>
+            </m:e>
+            <m:sup>
+              <m:r>
+                <m:t>2</m:t>
+              </m:r>
+            </m:sup>
+          </m:sSup>
+          <m:r>
+            <m:rPr>
+              <m:sty m:val="p"/>
+            </m:rPr>
+            <m:t>]</m:t>
+          </m:r>
+          <m:r>
+            <m:rPr>
+              <m:sty m:val="p"/>
+            </m:rPr>
+            <m:t>=</m:t>
+          </m:r>
+          <m:sSup>
+            <m:e>
+              <m:r>
+                <m:t>σ</m:t>
+              </m:r>
+            </m:e>
+            <m:sup>
+              <m:r>
+                <m:t>2</m:t>
+              </m:r>
+            </m:sup>
+          </m:sSup>
+        </m:oMath>
+      </m:oMathPara>
+    </w:p>
     <w:bookmarkEnd w:id="25"/>
+    <w:p>
+      <w:pPr>
+        <w:pStyle w:val="FirstParagraph"/>
+      </w:pPr>
+      <w:r>
+        <w:rPr>
+          <w:i/>
+          <w:iCs/>
+        </w:rPr>
+        <w:t xml:space="preserve">Proof</w:t>
+      </w:r>
+      <w:r>
+        <w:t xml:space="preserve">. </w:t>
+      </w:r>
+      <w:r>
+        <w:t xml:space="preserve">This is the solution to</w:t>
+      </w:r>
+      <w:r>
+        <w:t xml:space="preserve"> </w:t>
+      </w:r>
+      <w:hyperlink w:anchor="exr-noise-second-moment">
+        <w:r>
+          <w:rPr>
+            <w:rStyle w:val="Hyperlink"/>
+          </w:rPr>
+          <w:t xml:space="preserve">Exercise 1</w:t>
+        </w:r>
+      </w:hyperlink>
+      <w:r>
+        <w:t xml:space="preserve">, worked in</w:t>
+      </w:r>
+      <w:r>
+        <w:t xml:space="preserve"> </w:t>
+      </w:r>
+      <w:hyperlink w:anchor="sol-noise-second-moment">
+        <w:r>
+          <w:rPr>
+            <w:rStyle w:val="Hyperlink"/>
+          </w:rPr>
+          <w:t xml:space="preserve">Solution 1</w:t>
+        </w:r>
+      </w:hyperlink>
+      <w:r>
+        <w:t xml:space="preserve">.</w:t>
+      </w:r>
+      <w:r>
+        <w:t xml:space="preserve"> </w:t>
+      </w:r>
+      <w:r>
+        <w:t xml:space="preserve">It rearranges</w:t>
+      </w:r>
+      <w:r>
+        <w:t xml:space="preserve"> </w:t>
+      </w:r>
+      <w:hyperlink w:anchor="thm-variance">
+        <w:r>
+          <w:rPr>
+            <w:rStyle w:val="Hyperlink"/>
+          </w:rPr>
+          <w:t xml:space="preserve">Theorem 3</w:t>
+        </w:r>
+      </w:hyperlink>
+      <w:r>
+        <w:t xml:space="preserve">, using</w:t>
+      </w:r>
+      <w:r>
+        <w:t xml:space="preserve"> </w:t>
+      </w:r>
+      <m:oMath>
+        <m:r>
+          <m:rPr>
+            <m:sty m:val="p"/>
+          </m:rPr>
+          <m:t>E</m:t>
+        </m:r>
+        <m:r>
+          <m:rPr>
+            <m:sty m:val="p"/>
+          </m:rPr>
+          <m:t>[</m:t>
+        </m:r>
+        <m:r>
+          <m:t>ε</m:t>
+        </m:r>
+        <m:r>
+          <m:rPr>
+            <m:sty m:val="p"/>
+          </m:rPr>
+          <m:t>]</m:t>
+        </m:r>
+        <m:r>
+          <m:rPr>
+            <m:sty m:val="p"/>
+          </m:rPr>
+          <m:t>=</m:t>
+        </m:r>
+        <m:r>
+          <m:t>0</m:t>
+        </m:r>
+      </m:oMath>
+      <w:r>
+        <w:t xml:space="preserve">.</w:t>
+      </w:r>
+    </w:p>
     <w:bookmarkEnd w:id="26"/>
-    <w:bookmarkStart w:id="50" w:name="variance-and-related-characteristics"/>
+    <w:bookmarkEnd w:id="27"/>
+    <w:bookmarkStart w:id="51" w:name="variance-and-related-characteristics"/>
     <w:p>
       <w:pPr>
         <w:pStyle w:val="Heading2"/>
@@ -2401,7 +2702,7 @@
         <w:t xml:space="preserve">2 Variance and related characteristics</w:t>
       </w:r>
     </w:p>
-    <w:bookmarkStart w:id="27" w:name="def-variance"/>
+    <w:bookmarkStart w:id="28" w:name="def-variance"/>
     <w:p>
       <w:pPr>
         <w:pStyle w:val="FirstParagraph"/>
@@ -2655,8 +2956,8 @@
         </m:oMath>
       </m:oMathPara>
     </w:p>
-    <w:bookmarkEnd w:id="27"/>
-    <w:bookmarkStart w:id="28" w:name="thm-variance-expanded"/>
+    <w:bookmarkEnd w:id="28"/>
+    <w:bookmarkStart w:id="29" w:name="thm-variance-expanded"/>
     <w:p>
       <w:pPr>
         <w:pStyle w:val="FirstParagraph"/>
@@ -2666,7 +2967,7 @@
           <w:b/>
           <w:bCs/>
         </w:rPr>
-        <w:t xml:space="preserve">Theorem 1 (Variance as expected squared deviation from the mean)</w:t>
+        <w:t xml:space="preserve">Theorem 2 (Variance as expected squared deviation from the mean)</w:t>
       </w:r>
     </w:p>
     <w:p>
@@ -2789,7 +3090,7 @@
         </m:oMath>
       </m:oMathPara>
     </w:p>
-    <w:bookmarkEnd w:id="28"/>
+    <w:bookmarkEnd w:id="29"/>
     <w:p>
       <w:pPr>
         <w:pStyle w:val="FirstParagraph"/>
@@ -3153,7 +3454,7 @@
         <w:t xml:space="preserve">.</w:t>
       </w:r>
     </w:p>
-    <w:bookmarkStart w:id="29" w:name="thm-variance"/>
+    <w:bookmarkStart w:id="30" w:name="thm-variance"/>
     <w:p>
       <w:pPr>
         <w:pStyle w:val="BodyText"/>
@@ -3163,7 +3464,7 @@
           <w:b/>
           <w:bCs/>
         </w:rPr>
-        <w:t xml:space="preserve">Theorem 2 (Simplified expression for variance)</w:t>
+        <w:t xml:space="preserve">Theorem 3 (Simplified expression for variance)</w:t>
       </w:r>
     </w:p>
     <w:p>
@@ -3299,7 +3600,7 @@
         </m:oMath>
       </m:oMathPara>
     </w:p>
-    <w:bookmarkEnd w:id="29"/>
+    <w:bookmarkEnd w:id="30"/>
     <w:p>
       <w:pPr>
         <w:pStyle w:val="FirstParagraph"/>
@@ -3320,7 +3621,7 @@
       <w:r>
         <w:t xml:space="preserve"> </w:t>
       </w:r>
-      <w:hyperlink r:id="rId30">
+      <w:hyperlink r:id="rId31">
         <w:r>
           <w:rPr>
             <w:rStyle w:val="Hyperlink"/>
@@ -4082,7 +4383,7 @@
         </m:oMath>
       </m:oMathPara>
     </w:p>
-    <w:bookmarkStart w:id="32" w:name="exm-variance-bernoulli"/>
+    <w:bookmarkStart w:id="33" w:name="exm-variance-bernoulli"/>
     <w:p>
       <w:pPr>
         <w:pStyle w:val="FirstParagraph"/>
@@ -4246,7 +4547,7 @@
       <w:r>
         <w:t xml:space="preserve"> </w:t>
       </w:r>
-      <w:hyperlink r:id="rId31">
+      <w:hyperlink r:id="rId32">
         <w:r>
           <w:rPr>
             <w:rStyle w:val="Hyperlink"/>
@@ -4592,8 +4893,8 @@
         <w:t xml:space="preserve">.</w:t>
       </w:r>
     </w:p>
-    <w:bookmarkEnd w:id="32"/>
-    <w:bookmarkStart w:id="34" w:name="def-cond-variance"/>
+    <w:bookmarkEnd w:id="33"/>
+    <w:bookmarkStart w:id="35" w:name="def-cond-variance"/>
     <w:p>
       <w:pPr>
         <w:pStyle w:val="BodyText"/>
@@ -4976,7 +5277,7 @@
       <w:r>
         <w:t xml:space="preserve"> </w:t>
       </w:r>
-      <w:hyperlink r:id="rId33">
+      <w:hyperlink r:id="rId34">
         <w:r>
           <w:rPr>
             <w:rStyle w:val="Hyperlink"/>
@@ -5081,8 +5382,8 @@
         <w:t xml:space="preserve">.</w:t>
       </w:r>
     </w:p>
-    <w:bookmarkEnd w:id="34"/>
-    <w:bookmarkStart w:id="36" w:name="exm-cond-variance"/>
+    <w:bookmarkEnd w:id="35"/>
+    <w:bookmarkStart w:id="37" w:name="exm-cond-variance"/>
     <w:p>
       <w:pPr>
         <w:pStyle w:val="BodyText"/>
@@ -5401,7 +5702,7 @@
       <w:r>
         <w:t xml:space="preserve"> </w:t>
       </w:r>
-      <w:hyperlink r:id="rId35">
+      <w:hyperlink r:id="rId36">
         <w:r>
           <w:rPr>
             <w:rStyle w:val="Hyperlink"/>
@@ -6149,8 +6450,8 @@
         </m:oMath>
       </m:oMathPara>
     </w:p>
-    <w:bookmarkEnd w:id="36"/>
-    <w:bookmarkStart w:id="37" w:name="def-homosked"/>
+    <w:bookmarkEnd w:id="37"/>
+    <w:bookmarkStart w:id="38" w:name="def-homosked"/>
     <w:p>
       <w:pPr>
         <w:pStyle w:val="FirstParagraph"/>
@@ -6392,8 +6693,8 @@
         <w:t xml:space="preserve">.</w:t>
       </w:r>
     </w:p>
-    <w:bookmarkEnd w:id="37"/>
-    <w:bookmarkStart w:id="38" w:name="exm-homosked"/>
+    <w:bookmarkEnd w:id="38"/>
+    <w:bookmarkStart w:id="39" w:name="exm-homosked"/>
     <w:p>
       <w:pPr>
         <w:pStyle w:val="BodyText"/>
@@ -6942,8 +7243,8 @@
         <w:t xml:space="preserve">.</w:t>
       </w:r>
     </w:p>
-    <w:bookmarkEnd w:id="38"/>
-    <w:bookmarkStart w:id="39" w:name="def-heterosked"/>
+    <w:bookmarkEnd w:id="39"/>
+    <w:bookmarkStart w:id="40" w:name="def-heterosked"/>
     <w:p>
       <w:pPr>
         <w:pStyle w:val="BodyText"/>
@@ -7105,8 +7406,8 @@
         <w:t xml:space="preserve">.</w:t>
       </w:r>
     </w:p>
-    <w:bookmarkEnd w:id="39"/>
-    <w:bookmarkStart w:id="40" w:name="exm-heterosked"/>
+    <w:bookmarkEnd w:id="40"/>
+    <w:bookmarkStart w:id="41" w:name="exm-heterosked"/>
     <w:p>
       <w:pPr>
         <w:pStyle w:val="BodyText"/>
@@ -7551,8 +7852,8 @@
         <w:t xml:space="preserve">.</w:t>
       </w:r>
     </w:p>
-    <w:bookmarkEnd w:id="40"/>
-    <w:bookmarkStart w:id="41" w:name="thm-total-variance"/>
+    <w:bookmarkEnd w:id="41"/>
+    <w:bookmarkStart w:id="42" w:name="thm-total-variance"/>
     <w:p>
       <w:pPr>
         <w:pStyle w:val="BodyText"/>
@@ -7562,7 +7863,7 @@
           <w:b/>
           <w:bCs/>
         </w:rPr>
-        <w:t xml:space="preserve">Theorem 3 (Law of total variance)</w:t>
+        <w:t xml:space="preserve">Theorem 4 (Law of total variance)</w:t>
       </w:r>
       <w:r>
         <w:t xml:space="preserve"> </w:t>
@@ -7814,7 +8115,7 @@
         </m:oMath>
       </m:oMathPara>
     </w:p>
-    <w:bookmarkEnd w:id="41"/>
+    <w:bookmarkEnd w:id="42"/>
     <w:p>
       <w:pPr>
         <w:pStyle w:val="FirstParagraph"/>
@@ -8626,7 +8927,7 @@
       <w:r>
         <w:t xml:space="preserve"> </w:t>
       </w:r>
-      <w:hyperlink r:id="rId42">
+      <w:hyperlink r:id="rId43">
         <w:r>
           <w:rPr>
             <w:rStyle w:val="Hyperlink"/>
@@ -8671,7 +8972,7 @@
       <w:r>
         <w:t xml:space="preserve">(</w:t>
       </w:r>
-      <w:hyperlink r:id="rId43">
+      <w:hyperlink r:id="rId44">
         <w:r>
           <w:rPr>
             <w:rStyle w:val="Hyperlink"/>
@@ -8697,7 +8998,7 @@
       <w:r>
         <w:t xml:space="preserve"> </w:t>
       </w:r>
-      <w:hyperlink r:id="rId44">
+      <w:hyperlink r:id="rId45">
         <w:r>
           <w:rPr>
             <w:rStyle w:val="Hyperlink"/>
@@ -8751,7 +9052,7 @@
       <w:r>
         <w:t xml:space="preserve"> </w:t>
       </w:r>
-      <w:hyperlink r:id="rId45">
+      <w:hyperlink r:id="rId46">
         <w:r>
           <w:rPr>
             <w:rStyle w:val="Hyperlink"/>
@@ -11263,7 +11564,7 @@
         <w:t xml:space="preserve">.</w:t>
       </w:r>
     </w:p>
-    <w:bookmarkStart w:id="46" w:name="exm-total-variance"/>
+    <w:bookmarkStart w:id="47" w:name="exm-total-variance"/>
     <w:p>
       <w:pPr>
         <w:pStyle w:val="BodyText"/>
@@ -11609,7 +11910,7 @@
           <w:rPr>
             <w:rStyle w:val="Hyperlink"/>
           </w:rPr>
-          <w:t xml:space="preserve">Theorem 3</w:t>
+          <w:t xml:space="preserve">Theorem 4</w:t>
         </w:r>
       </w:hyperlink>
       <w:r>
@@ -12226,8 +12527,8 @@
         </m:oMath>
       </m:oMathPara>
     </w:p>
-    <w:bookmarkEnd w:id="46"/>
-    <w:bookmarkStart w:id="47" w:name="def-precision"/>
+    <w:bookmarkEnd w:id="47"/>
+    <w:bookmarkStart w:id="48" w:name="def-precision"/>
     <w:p>
       <w:pPr>
         <w:pStyle w:val="FirstParagraph"/>
@@ -12500,8 +12801,8 @@
         </m:oMath>
       </m:oMathPara>
     </w:p>
-    <w:bookmarkEnd w:id="47"/>
-    <w:bookmarkStart w:id="48" w:name="def-sd"/>
+    <w:bookmarkEnd w:id="48"/>
+    <w:bookmarkStart w:id="49" w:name="def-sd"/>
     <w:p>
       <w:pPr>
         <w:pStyle w:val="FirstParagraph"/>
@@ -12667,7 +12968,7 @@
         </m:oMath>
       </m:oMathPara>
     </w:p>
-    <w:bookmarkEnd w:id="48"/>
+    <w:bookmarkEnd w:id="49"/>
     <w:p>
       <w:pPr>
         <w:pStyle w:val="FirstParagraph"/>
@@ -12723,7 +13024,7 @@
         <w:t xml:space="preserve">which is why it is often the preferred measure of spread when reporting results.</w:t>
       </w:r>
     </w:p>
-    <w:bookmarkStart w:id="49" w:name="exm-sd"/>
+    <w:bookmarkStart w:id="50" w:name="exm-sd"/>
     <w:p>
       <w:pPr>
         <w:pStyle w:val="BodyText"/>
@@ -13010,9 +13311,9 @@
         </m:oMath>
       </m:oMathPara>
     </w:p>
-    <w:bookmarkEnd w:id="49"/>
     <w:bookmarkEnd w:id="50"/>
-    <w:bookmarkStart w:id="58" w:name="sec-bias-variance-prediction"/>
+    <w:bookmarkEnd w:id="51"/>
+    <w:bookmarkStart w:id="59" w:name="sec-bias-variance-prediction"/>
     <w:p>
       <w:pPr>
         <w:pStyle w:val="Heading2"/>
@@ -13021,7 +13322,7 @@
         <w:t xml:space="preserve">3 Bias, variance, and prediction error</w:t>
       </w:r>
     </w:p>
-    <w:bookmarkStart w:id="51" w:name="exr-prediction-error"/>
+    <w:bookmarkStart w:id="52" w:name="exr-prediction-error"/>
     <w:p>
       <w:pPr>
         <w:pStyle w:val="FirstParagraph"/>
@@ -13727,8 +14028,8 @@
         <w:t xml:space="preserve">and which cannot?</w:t>
       </w:r>
     </w:p>
-    <w:bookmarkEnd w:id="51"/>
-    <w:bookmarkStart w:id="52" w:name="sol-prediction-error"/>
+    <w:bookmarkEnd w:id="52"/>
+    <w:bookmarkStart w:id="53" w:name="sol-prediction-error"/>
     <w:p>
       <w:pPr>
         <w:pStyle w:val="FirstParagraph"/>
@@ -14020,8 +14321,8 @@
         <w:t xml:space="preserve">in the new response.</w:t>
       </w:r>
     </w:p>
-    <w:bookmarkEnd w:id="52"/>
-    <w:bookmarkStart w:id="54" w:name="def-prediction-bias"/>
+    <w:bookmarkEnd w:id="53"/>
+    <w:bookmarkStart w:id="55" w:name="def-prediction-bias"/>
     <w:p>
       <w:pPr>
         <w:pStyle w:val="FirstParagraph"/>
@@ -14130,7 +14431,7 @@
       <w:r>
         <w:t xml:space="preserve"> </w:t>
       </w:r>
-      <w:hyperlink r:id="rId53">
+      <w:hyperlink r:id="rId54">
         <w:r>
           <w:rPr>
             <w:rStyle w:val="Hyperlink"/>
@@ -14480,7 +14781,7 @@
         </m:oMath>
       </m:oMathPara>
     </w:p>
-    <w:bookmarkEnd w:id="54"/>
+    <w:bookmarkEnd w:id="55"/>
     <w:p>
       <w:pPr>
         <w:pStyle w:val="FirstParagraph"/>
@@ -14514,7 +14815,7 @@
         <w:t xml:space="preserve">the bias reflects the error introduced by approximating a real-world relationship by a model.</w:t>
       </w:r>
     </w:p>
-    <w:bookmarkStart w:id="55" w:name="exm-prediction-bias"/>
+    <w:bookmarkStart w:id="56" w:name="exm-prediction-bias"/>
     <w:p>
       <w:pPr>
         <w:pStyle w:val="BodyText"/>
@@ -14824,8 +15125,8 @@
         <w:t xml:space="preserve">.</w:t>
       </w:r>
     </w:p>
-    <w:bookmarkEnd w:id="55"/>
-    <w:bookmarkStart w:id="56" w:name="thm-prediction-error"/>
+    <w:bookmarkEnd w:id="56"/>
+    <w:bookmarkStart w:id="57" w:name="thm-prediction-error"/>
     <w:p>
       <w:pPr>
         <w:pStyle w:val="BodyText"/>
@@ -14835,7 +15136,7 @@
           <w:b/>
           <w:bCs/>
         </w:rPr>
-        <w:t xml:space="preserve">Theorem 4 (Expected squared prediction error)</w:t>
+        <w:t xml:space="preserve">Theorem 5 (Expected squared prediction error)</w:t>
       </w:r>
       <w:r>
         <w:t xml:space="preserve"> </w:t>
@@ -15473,7 +15774,7 @@
         </m:oMath>
       </m:oMathPara>
     </w:p>
-    <w:bookmarkEnd w:id="56"/>
+    <w:bookmarkEnd w:id="57"/>
     <w:p>
       <w:pPr>
         <w:pStyle w:val="FirstParagraph"/>
@@ -16000,12 +16301,12 @@
       <w:r>
         <w:t xml:space="preserve"> </w:t>
       </w:r>
-      <w:hyperlink w:anchor="sol-noise-second-moment">
+      <w:hyperlink w:anchor="thm-noise-second-moment">
         <w:r>
           <w:rPr>
             <w:rStyle w:val="Hyperlink"/>
           </w:rPr>
-          <w:t xml:space="preserve">Solution 1</w:t>
+          <w:t xml:space="preserve">Theorem 1</w:t>
         </w:r>
       </w:hyperlink>
       <w:r>
@@ -16285,7 +16586,7 @@
           <w:rPr>
             <w:rStyle w:val="Hyperlink"/>
           </w:rPr>
-          <w:t xml:space="preserve">Theorem 2</w:t>
+          <w:t xml:space="preserve">Theorem 3</w:t>
         </w:r>
       </w:hyperlink>
       <w:r>
@@ -16954,7 +17255,7 @@
         <w:t xml:space="preserve">Adding the three terms gives the claim.</w:t>
       </w:r>
     </w:p>
-    <w:bookmarkStart w:id="57" w:name="def-irreducible-error"/>
+    <w:bookmarkStart w:id="58" w:name="def-irreducible-error"/>
     <w:p>
       <w:pPr>
         <w:pStyle w:val="BodyText"/>
@@ -16980,7 +17281,7 @@
           <w:rPr>
             <w:rStyle w:val="Hyperlink"/>
           </w:rPr>
-          <w:t xml:space="preserve">Theorem 4</w:t>
+          <w:t xml:space="preserve">Theorem 5</w:t>
         </w:r>
       </w:hyperlink>
       <w:r>
@@ -17156,7 +17457,7 @@
         <w:t xml:space="preserve">.</w:t>
       </w:r>
     </w:p>
-    <w:bookmarkEnd w:id="57"/>
+    <w:bookmarkEnd w:id="58"/>
     <w:p>
       <w:pPr>
         <w:pStyle w:val="BodyText"/>
@@ -17184,8 +17485,8 @@
         <w:t xml:space="preserve">.</w:t>
       </w:r>
     </w:p>
-    <w:bookmarkEnd w:id="58"/>
-    <w:bookmarkStart w:id="106" w:name="covariance"/>
+    <w:bookmarkEnd w:id="59"/>
+    <w:bookmarkStart w:id="107" w:name="covariance"/>
     <w:p>
       <w:pPr>
         <w:pStyle w:val="Heading2"/>
@@ -17194,7 +17495,7 @@
         <w:t xml:space="preserve">4 Covariance</w:t>
       </w:r>
     </w:p>
-    <w:bookmarkStart w:id="59" w:name="def-cov"/>
+    <w:bookmarkStart w:id="60" w:name="def-cov"/>
     <w:p>
       <w:pPr>
         <w:pStyle w:val="FirstParagraph"/>
@@ -17550,8 +17851,8 @@
         </m:oMath>
       </m:oMathPara>
     </w:p>
-    <w:bookmarkEnd w:id="59"/>
-    <w:bookmarkStart w:id="60" w:name="thm-alt-cov"/>
+    <w:bookmarkEnd w:id="60"/>
+    <w:bookmarkStart w:id="61" w:name="thm-alt-cov"/>
     <w:p>
       <w:pPr>
         <w:pStyle w:val="FirstParagraph"/>
@@ -17561,7 +17862,7 @@
           <w:b/>
           <w:bCs/>
         </w:rPr>
-        <w:t xml:space="preserve">Theorem 5 (Alternative formula for covariance)</w:t>
+        <w:t xml:space="preserve">Theorem 6 (Alternative formula for covariance)</w:t>
       </w:r>
     </w:p>
     <w:p>
@@ -17700,7 +18001,7 @@
         </m:oMath>
       </m:oMathPara>
     </w:p>
-    <w:bookmarkEnd w:id="60"/>
+    <w:bookmarkEnd w:id="61"/>
     <w:p>
       <w:pPr>
         <w:pStyle w:val="FirstParagraph"/>
@@ -17721,7 +18022,7 @@
       <w:r>
         <w:t xml:space="preserve"> </w:t>
       </w:r>
-      <w:hyperlink r:id="rId30">
+      <w:hyperlink r:id="rId31">
         <w:r>
           <w:rPr>
             <w:rStyle w:val="Hyperlink"/>
@@ -18519,7 +18820,7 @@
         </m:oMath>
       </m:oMathPara>
     </w:p>
-    <w:bookmarkStart w:id="61" w:name="exm-alt-cov"/>
+    <w:bookmarkStart w:id="62" w:name="exm-alt-cov"/>
     <w:p>
       <w:pPr>
         <w:pStyle w:val="FirstParagraph"/>
@@ -18987,8 +19288,8 @@
         </m:oMath>
       </m:oMathPara>
     </w:p>
-    <w:bookmarkEnd w:id="61"/>
-    <w:bookmarkStart w:id="63" w:name="thm-indpt-uncorrelated"/>
+    <w:bookmarkEnd w:id="62"/>
+    <w:bookmarkStart w:id="64" w:name="thm-indpt-uncorrelated"/>
     <w:p>
       <w:pPr>
         <w:pStyle w:val="FirstParagraph"/>
@@ -18998,7 +19299,7 @@
           <w:b/>
           <w:bCs/>
         </w:rPr>
-        <w:t xml:space="preserve">Theorem 6 (Independent random variables have zero covariance)</w:t>
+        <w:t xml:space="preserve">Theorem 7 (Independent random variables have zero covariance)</w:t>
       </w:r>
       <w:r>
         <w:t xml:space="preserve"> </w:t>
@@ -19037,7 +19338,7 @@
       <w:r>
         <w:t xml:space="preserve"> </w:t>
       </w:r>
-      <w:hyperlink r:id="rId62">
+      <w:hyperlink r:id="rId63">
         <w:r>
           <w:rPr>
             <w:rStyle w:val="Hyperlink"/>
@@ -19333,7 +19634,7 @@
         <w:t xml:space="preserve">.</w:t>
       </w:r>
     </w:p>
-    <w:bookmarkEnd w:id="63"/>
+    <w:bookmarkEnd w:id="64"/>
     <w:p>
       <w:pPr>
         <w:pStyle w:val="BodyText"/>
@@ -19483,7 +19784,7 @@
       <w:r>
         <w:t xml:space="preserve"> </w:t>
       </w:r>
-      <w:hyperlink r:id="rId64">
+      <w:hyperlink r:id="rId65">
         <w:r>
           <w:rPr>
             <w:rStyle w:val="Hyperlink"/>
@@ -19497,7 +19798,7 @@
       <w:r>
         <w:t xml:space="preserve">(</w:t>
       </w:r>
-      <w:hyperlink r:id="rId65">
+      <w:hyperlink r:id="rId66">
         <w:r>
           <w:rPr>
             <w:rStyle w:val="Hyperlink"/>
@@ -19679,7 +19980,7 @@
       <w:r>
         <w:t xml:space="preserve"> </w:t>
       </w:r>
-      <w:hyperlink r:id="rId62">
+      <w:hyperlink r:id="rId63">
         <w:r>
           <w:rPr>
             <w:rStyle w:val="Hyperlink"/>
@@ -22185,7 +22486,7 @@
         </m:oMath>
       </m:oMathPara>
     </w:p>
-    <w:bookmarkStart w:id="67" w:name="exm-indpt-uncorrelated"/>
+    <w:bookmarkStart w:id="68" w:name="exm-indpt-uncorrelated"/>
     <w:p>
       <w:pPr>
         <w:pStyle w:val="FirstParagraph"/>
@@ -22252,7 +22553,7 @@
       <w:r>
         <w:t xml:space="preserve"> </w:t>
       </w:r>
-      <w:hyperlink r:id="rId66">
+      <w:hyperlink r:id="rId67">
         <w:r>
           <w:rPr>
             <w:rStyle w:val="Hyperlink"/>
@@ -22823,7 +23124,7 @@
           <w:rPr>
             <w:rStyle w:val="Hyperlink"/>
           </w:rPr>
-          <w:t xml:space="preserve">Theorem 6</w:t>
+          <w:t xml:space="preserve">Theorem 7</w:t>
         </w:r>
       </w:hyperlink>
       <w:r>
@@ -22833,8 +23134,8 @@
         <w:t xml:space="preserve">requires.</w:t>
       </w:r>
     </w:p>
-    <w:bookmarkEnd w:id="67"/>
-    <w:bookmarkStart w:id="68" w:name="exm-uncorrelated-not-indpt"/>
+    <w:bookmarkEnd w:id="68"/>
+    <w:bookmarkStart w:id="69" w:name="exm-uncorrelated-not-indpt"/>
     <w:p>
       <w:pPr>
         <w:pStyle w:val="BodyText"/>
@@ -22860,7 +23161,7 @@
           <w:rPr>
             <w:rStyle w:val="Hyperlink"/>
           </w:rPr>
-          <w:t xml:space="preserve">Theorem 6</w:t>
+          <w:t xml:space="preserve">Theorem 7</w:t>
         </w:r>
       </w:hyperlink>
       <w:r>
@@ -24058,8 +24359,8 @@
         </m:oMath>
       </m:oMathPara>
     </w:p>
-    <w:bookmarkEnd w:id="68"/>
-    <w:bookmarkStart w:id="69" w:name="def-correlation"/>
+    <w:bookmarkEnd w:id="69"/>
+    <w:bookmarkStart w:id="70" w:name="def-correlation"/>
     <w:p>
       <w:pPr>
         <w:pStyle w:val="FirstParagraph"/>
@@ -24331,7 +24632,7 @@
         </m:oMath>
       </m:oMathPara>
     </w:p>
-    <w:bookmarkEnd w:id="69"/>
+    <w:bookmarkEnd w:id="70"/>
     <w:p>
       <w:pPr>
         <w:pStyle w:val="FirstParagraph"/>
@@ -24387,7 +24688,7 @@
         <w:t xml:space="preserve">the sample (Pearson) correlation coefficient computed from data estimates it.</w:t>
       </w:r>
     </w:p>
-    <w:bookmarkStart w:id="70" w:name="exm-correlation"/>
+    <w:bookmarkStart w:id="71" w:name="exm-correlation"/>
     <w:p>
       <w:pPr>
         <w:pStyle w:val="BodyText"/>
@@ -25034,8 +25335,8 @@
         </m:oMath>
       </m:oMathPara>
     </w:p>
-    <w:bookmarkEnd w:id="70"/>
-    <w:bookmarkStart w:id="71" w:name="def-uncorrelated"/>
+    <w:bookmarkEnd w:id="71"/>
+    <w:bookmarkStart w:id="72" w:name="def-uncorrelated"/>
     <w:p>
       <w:pPr>
         <w:pStyle w:val="FirstParagraph"/>
@@ -25284,7 +25585,7 @@
         </m:oMath>
       </m:oMathPara>
     </w:p>
-    <w:bookmarkEnd w:id="71"/>
+    <w:bookmarkEnd w:id="72"/>
     <w:p>
       <w:pPr>
         <w:pStyle w:val="FirstParagraph"/>
@@ -25304,7 +25605,7 @@
           <w:rPr>
             <w:rStyle w:val="Hyperlink"/>
           </w:rPr>
-          <w:t xml:space="preserve">Theorem 6</w:t>
+          <w:t xml:space="preserve">Theorem 7</w:t>
         </w:r>
       </w:hyperlink>
       <w:r>
@@ -25337,7 +25638,7 @@
         <w:t xml:space="preserve">shows the converse fails.</w:t>
       </w:r>
     </w:p>
-    <w:bookmarkStart w:id="72" w:name="exm-uncorrelated"/>
+    <w:bookmarkStart w:id="73" w:name="exm-uncorrelated"/>
     <w:p>
       <w:pPr>
         <w:pStyle w:val="BodyText"/>
@@ -25559,8 +25860,8 @@
         <w:t xml:space="preserve">so the binary exposure and outcome are not uncorrelated.</w:t>
       </w:r>
     </w:p>
-    <w:bookmarkEnd w:id="72"/>
-    <w:bookmarkStart w:id="73" w:name="cor-uncorrelated-cor-zero"/>
+    <w:bookmarkEnd w:id="73"/>
+    <w:bookmarkStart w:id="74" w:name="cor-uncorrelated-cor-zero"/>
     <w:p>
       <w:pPr>
         <w:pStyle w:val="BodyText"/>
@@ -25723,7 +26024,7 @@
         <w:t xml:space="preserve">.</w:t>
       </w:r>
     </w:p>
-    <w:bookmarkEnd w:id="73"/>
+    <w:bookmarkEnd w:id="74"/>
     <w:p>
       <w:pPr>
         <w:pStyle w:val="BodyText"/>
@@ -26123,7 +26424,7 @@
         <w:t xml:space="preserve">.</w:t>
       </w:r>
     </w:p>
-    <w:bookmarkStart w:id="74" w:name="def-cond-cov"/>
+    <w:bookmarkStart w:id="75" w:name="def-cond-cov"/>
     <w:p>
       <w:pPr>
         <w:pStyle w:val="BodyText"/>
@@ -26575,8 +26876,8 @@
         <w:t xml:space="preserve">.</w:t>
       </w:r>
     </w:p>
-    <w:bookmarkEnd w:id="74"/>
-    <w:bookmarkStart w:id="75" w:name="exm-cond-cov"/>
+    <w:bookmarkEnd w:id="75"/>
+    <w:bookmarkStart w:id="76" w:name="exm-cond-cov"/>
     <w:p>
       <w:pPr>
         <w:pStyle w:val="BodyText"/>
@@ -26847,8 +27148,8 @@
         <w:t xml:space="preserve">.</w:t>
       </w:r>
     </w:p>
-    <w:bookmarkEnd w:id="75"/>
-    <w:bookmarkStart w:id="76" w:name="thm-total-cov"/>
+    <w:bookmarkEnd w:id="76"/>
+    <w:bookmarkStart w:id="77" w:name="thm-total-cov"/>
     <w:p>
       <w:pPr>
         <w:pStyle w:val="BodyText"/>
@@ -26858,7 +27159,7 @@
           <w:b/>
           <w:bCs/>
         </w:rPr>
-        <w:t xml:space="preserve">Theorem 7 (Law of total covariance)</w:t>
+        <w:t xml:space="preserve">Theorem 8 (Law of total covariance)</w:t>
       </w:r>
       <w:r>
         <w:t xml:space="preserve"> </w:t>
@@ -27233,7 +27534,7 @@
         </m:oMath>
       </m:oMathPara>
     </w:p>
-    <w:bookmarkEnd w:id="76"/>
+    <w:bookmarkEnd w:id="77"/>
     <w:p>
       <w:pPr>
         <w:pStyle w:val="FirstParagraph"/>
@@ -28779,7 +29080,7 @@
           <w:rPr>
             <w:rStyle w:val="Hyperlink"/>
           </w:rPr>
-          <w:t xml:space="preserve">Theorem 3</w:t>
+          <w:t xml:space="preserve">Theorem 4</w:t>
         </w:r>
       </w:hyperlink>
       <w:r>
@@ -28808,7 +29109,7 @@
       <w:r>
         <w:t xml:space="preserve"> </w:t>
       </w:r>
-      <w:hyperlink r:id="rId42">
+      <w:hyperlink r:id="rId43">
         <w:r>
           <w:rPr>
             <w:rStyle w:val="Hyperlink"/>
@@ -28839,7 +29140,7 @@
       <w:r>
         <w:t xml:space="preserve">(</w:t>
       </w:r>
-      <w:hyperlink r:id="rId44">
+      <w:hyperlink r:id="rId45">
         <w:r>
           <w:rPr>
             <w:rStyle w:val="Hyperlink"/>
@@ -29036,7 +29337,7 @@
       <w:r>
         <w:t xml:space="preserve"> </w:t>
       </w:r>
-      <w:hyperlink r:id="rId45">
+      <w:hyperlink r:id="rId46">
         <w:r>
           <w:rPr>
             <w:rStyle w:val="Hyperlink"/>
@@ -30349,7 +30650,7 @@
         <w:t xml:space="preserve">.</w:t>
       </w:r>
     </w:p>
-    <w:bookmarkStart w:id="77" w:name="lem-cov-xx"/>
+    <w:bookmarkStart w:id="78" w:name="lem-cov-xx"/>
     <w:p>
       <w:pPr>
         <w:pStyle w:val="BodyText"/>
@@ -30513,7 +30814,7 @@
         </m:oMath>
       </m:oMathPara>
     </w:p>
-    <w:bookmarkEnd w:id="77"/>
+    <w:bookmarkEnd w:id="78"/>
     <w:p>
       <w:pPr>
         <w:pStyle w:val="FirstParagraph"/>
@@ -30915,7 +31216,7 @@
         </m:oMath>
       </m:oMathPara>
     </w:p>
-    <w:bookmarkStart w:id="78" w:name="def-cov-vec-x"/>
+    <w:bookmarkStart w:id="79" w:name="def-cov-vec-x"/>
     <w:p>
       <w:pPr>
         <w:pStyle w:val="FirstParagraph"/>
@@ -31266,8 +31567,8 @@
         </m:oMath>
       </m:oMathPara>
     </w:p>
-    <w:bookmarkEnd w:id="78"/>
-    <w:bookmarkStart w:id="79" w:name="thm-vcov-elements"/>
+    <w:bookmarkEnd w:id="79"/>
+    <w:bookmarkStart w:id="80" w:name="thm-vcov-elements"/>
     <w:p>
       <w:pPr>
         <w:pStyle w:val="FirstParagraph"/>
@@ -31277,7 +31578,7 @@
           <w:b/>
           <w:bCs/>
         </w:rPr>
-        <w:t xml:space="preserve">Theorem 8 (Elements of the variance-covariance matrix are pairwise covariances)</w:t>
+        <w:t xml:space="preserve">Theorem 9 (Elements of the variance-covariance matrix are pairwise covariances)</w:t>
       </w:r>
       <w:r>
         <w:t xml:space="preserve"> </w:t>
@@ -32128,7 +32429,7 @@
         </m:oMath>
       </m:oMathPara>
     </w:p>
-    <w:bookmarkEnd w:id="79"/>
+    <w:bookmarkEnd w:id="80"/>
     <w:p>
       <w:pPr>
         <w:pStyle w:val="FirstParagraph"/>
@@ -34393,7 +34694,7 @@
       <w:r>
         <w:t xml:space="preserve"> </w:t>
       </w:r>
-      <w:hyperlink r:id="rId80">
+      <w:hyperlink r:id="rId81">
         <w:r>
           <w:rPr>
             <w:rStyle w:val="Hyperlink"/>
@@ -34457,7 +34758,7 @@
         <w:t xml:space="preserve">.</w:t>
       </w:r>
     </w:p>
-    <w:bookmarkStart w:id="81" w:name="thm-vcov-vec"/>
+    <w:bookmarkStart w:id="82" w:name="thm-vcov-vec"/>
     <w:p>
       <w:pPr>
         <w:pStyle w:val="FirstParagraph"/>
@@ -34467,7 +34768,7 @@
           <w:b/>
           <w:bCs/>
         </w:rPr>
-        <w:t xml:space="preserve">Theorem 9 (Alternate expression for variance of a random vector)</w:t>
+        <w:t xml:space="preserve">Theorem 10 (Alternate expression for variance of a random vector)</w:t>
       </w:r>
     </w:p>
     <w:p>
@@ -34663,7 +34964,7 @@
         </m:oMath>
       </m:oMathPara>
     </w:p>
-    <w:bookmarkEnd w:id="81"/>
+    <w:bookmarkEnd w:id="82"/>
     <w:p>
       <w:pPr>
         <w:pStyle w:val="FirstParagraph"/>
@@ -35666,7 +35967,7 @@
         </m:oMath>
       </m:oMathPara>
     </w:p>
-    <w:bookmarkStart w:id="82" w:name="thm-var-lincom"/>
+    <w:bookmarkStart w:id="83" w:name="thm-var-lincom"/>
     <w:p>
       <w:pPr>
         <w:pStyle w:val="FirstParagraph"/>
@@ -35676,7 +35977,7 @@
           <w:b/>
           <w:bCs/>
         </w:rPr>
-        <w:t xml:space="preserve">Theorem 10 (Variance of a linear combination)</w:t>
+        <w:t xml:space="preserve">Theorem 11 (Variance of a linear combination)</w:t>
       </w:r>
       <w:r>
         <w:t xml:space="preserve"> </w:t>
@@ -36218,7 +36519,7 @@
         </m:oMath>
       </m:oMathPara>
     </w:p>
-    <w:bookmarkEnd w:id="82"/>
+    <w:bookmarkEnd w:id="83"/>
     <w:p>
       <w:pPr>
         <w:pStyle w:val="FirstParagraph"/>
@@ -37678,7 +37979,7 @@
         </m:oMath>
       </m:oMathPara>
     </w:p>
-    <w:bookmarkStart w:id="83" w:name="cor-var-lincom2"/>
+    <w:bookmarkStart w:id="84" w:name="cor-var-lincom2"/>
     <w:p>
       <w:pPr>
         <w:pStyle w:val="FirstParagraph"/>
@@ -37955,7 +38256,7 @@
         </m:oMath>
       </m:oMathPara>
     </w:p>
-    <w:bookmarkEnd w:id="83"/>
+    <w:bookmarkEnd w:id="84"/>
     <w:p>
       <w:pPr>
         <w:pStyle w:val="FirstParagraph"/>
@@ -37981,7 +38282,7 @@
           <w:rPr>
             <w:rStyle w:val="Hyperlink"/>
           </w:rPr>
-          <w:t xml:space="preserve">Theorem 10</w:t>
+          <w:t xml:space="preserve">Theorem 11</w:t>
         </w:r>
       </w:hyperlink>
       <w:r>
@@ -39485,7 +39786,7 @@
         </m:oMath>
       </m:oMathPara>
     </w:p>
-    <w:bookmarkStart w:id="84" w:name="cor-var-sum-indpt"/>
+    <w:bookmarkStart w:id="85" w:name="cor-var-sum-indpt"/>
     <w:p>
       <w:pPr>
         <w:pStyle w:val="FirstParagraph"/>
@@ -39534,7 +39835,7 @@
       <w:r>
         <w:t xml:space="preserve"> </w:t>
       </w:r>
-      <w:hyperlink r:id="rId62">
+      <w:hyperlink r:id="rId63">
         <w:r>
           <w:rPr>
             <w:rStyle w:val="Hyperlink"/>
@@ -39777,7 +40078,7 @@
         </m:oMath>
       </m:oMathPara>
     </w:p>
-    <w:bookmarkEnd w:id="84"/>
+    <w:bookmarkEnd w:id="85"/>
     <w:p>
       <w:pPr>
         <w:pStyle w:val="FirstParagraph"/>
@@ -39803,7 +40104,7 @@
           <w:rPr>
             <w:rStyle w:val="Hyperlink"/>
           </w:rPr>
-          <w:t xml:space="preserve">Theorem 6</w:t>
+          <w:t xml:space="preserve">Theorem 7</w:t>
         </w:r>
       </w:hyperlink>
       <w:r>
@@ -40471,7 +40772,7 @@
         <w:t xml:space="preserve">is the case where that term is 0.</w:t>
       </w:r>
     </w:p>
-    <w:bookmarkStart w:id="87" w:name="thm-vcov-psd"/>
+    <w:bookmarkStart w:id="88" w:name="thm-vcov-psd"/>
     <w:p>
       <w:pPr>
         <w:pStyle w:val="BodyText"/>
@@ -40481,7 +40782,7 @@
           <w:b/>
           <w:bCs/>
         </w:rPr>
-        <w:t xml:space="preserve">Theorem 11 (A variance matrix is symmetric and positive semidefinite)</w:t>
+        <w:t xml:space="preserve">Theorem 12 (A variance matrix is symmetric and positive semidefinite)</w:t>
       </w:r>
       <w:r>
         <w:t xml:space="preserve"> </w:t>
@@ -40724,7 +41025,7 @@
       <w:r>
         <w:t xml:space="preserve"> </w:t>
       </w:r>
-      <w:hyperlink r:id="rId85">
+      <w:hyperlink r:id="rId86">
         <w:r>
           <w:rPr>
             <w:rStyle w:val="Hyperlink"/>
@@ -40741,7 +41042,7 @@
       <w:r>
         <w:t xml:space="preserve"> </w:t>
       </w:r>
-      <w:hyperlink r:id="rId86">
+      <w:hyperlink r:id="rId87">
         <w:r>
           <w:rPr>
             <w:rStyle w:val="Hyperlink"/>
@@ -40885,7 +41186,7 @@
         </m:oMath>
       </m:oMathPara>
     </w:p>
-    <w:bookmarkEnd w:id="87"/>
+    <w:bookmarkEnd w:id="88"/>
     <w:p>
       <w:pPr>
         <w:pStyle w:val="FirstParagraph"/>
@@ -40911,7 +41212,7 @@
           <w:rPr>
             <w:rStyle w:val="Hyperlink"/>
           </w:rPr>
-          <w:t xml:space="preserve">Theorem 8</w:t>
+          <w:t xml:space="preserve">Theorem 9</w:t>
         </w:r>
       </w:hyperlink>
       <w:r>
@@ -42054,7 +42355,7 @@
           <w:rPr>
             <w:rStyle w:val="Hyperlink"/>
           </w:rPr>
-          <w:t xml:space="preserve">Theorem 10</w:t>
+          <w:t xml:space="preserve">Theorem 11</w:t>
         </w:r>
       </w:hyperlink>
       <w:r>
@@ -42114,7 +42415,7 @@
         <w:t xml:space="preserve">).</w:t>
       </w:r>
     </w:p>
-    <w:bookmarkStart w:id="88" w:name="exm-vcov-psd"/>
+    <w:bookmarkStart w:id="89" w:name="exm-vcov-psd"/>
     <w:p>
       <w:pPr>
         <w:pStyle w:val="BodyText"/>
@@ -43760,7 +44061,7 @@
           <w:rPr>
             <w:rStyle w:val="Hyperlink"/>
           </w:rPr>
-          <w:t xml:space="preserve">Theorem 8</w:t>
+          <w:t xml:space="preserve">Theorem 9</w:t>
         </w:r>
       </w:hyperlink>
       <w:r>
@@ -43777,7 +44078,7 @@
           <w:rPr>
             <w:rStyle w:val="Hyperlink"/>
           </w:rPr>
-          <w:t xml:space="preserve">Theorem 5</w:t>
+          <w:t xml:space="preserve">Theorem 6</w:t>
         </w:r>
       </w:hyperlink>
       <w:r>
@@ -44037,7 +44338,7 @@
           <w:rPr>
             <w:rStyle w:val="Hyperlink"/>
           </w:rPr>
-          <w:t xml:space="preserve">Theorem 10</w:t>
+          <w:t xml:space="preserve">Theorem 11</w:t>
         </w:r>
       </w:hyperlink>
       <w:r>
@@ -44916,7 +45217,7 @@
         <w:t xml:space="preserve">.</w:t>
       </w:r>
     </w:p>
-    <w:bookmarkEnd w:id="88"/>
+    <w:bookmarkEnd w:id="89"/>
     <w:p>
       <w:pPr>
         <w:pStyle w:val="BodyText"/>
@@ -45050,7 +45351,7 @@
         <w:t xml:space="preserve">has the larger spread.</w:t>
       </w:r>
     </w:p>
-    <w:bookmarkStart w:id="92" w:name="exm-vcov-singular"/>
+    <w:bookmarkStart w:id="93" w:name="exm-vcov-singular"/>
     <w:p>
       <w:pPr>
         <w:pStyle w:val="BodyText"/>
@@ -45790,7 +46091,7 @@
       <w:r>
         <w:t xml:space="preserve"> </w:t>
       </w:r>
-      <w:hyperlink r:id="rId89">
+      <w:hyperlink r:id="rId90">
         <w:r>
           <w:rPr>
             <w:rStyle w:val="Hyperlink"/>
@@ -45807,7 +46108,7 @@
       <w:r>
         <w:t xml:space="preserve"> </w:t>
       </w:r>
-      <w:hyperlink r:id="rId90">
+      <w:hyperlink r:id="rId91">
         <w:r>
           <w:rPr>
             <w:rStyle w:val="Hyperlink"/>
@@ -45871,7 +46172,7 @@
       <w:r>
         <w:t xml:space="preserve"> </w:t>
       </w:r>
-      <w:hyperlink r:id="rId91">
+      <w:hyperlink r:id="rId92">
         <w:r>
           <w:rPr>
             <w:rStyle w:val="Hyperlink"/>
@@ -45883,8 +46184,8 @@
         <w:t xml:space="preserve">.</w:t>
       </w:r>
     </w:p>
-    <w:bookmarkEnd w:id="92"/>
-    <w:bookmarkStart w:id="94" w:name="cor-vcov-indpt-diagonal"/>
+    <w:bookmarkEnd w:id="93"/>
+    <w:bookmarkStart w:id="95" w:name="cor-vcov-indpt-diagonal"/>
     <w:p>
       <w:pPr>
         <w:pStyle w:val="BodyText"/>
@@ -46135,7 +46436,7 @@
       <w:r>
         <w:t xml:space="preserve"> </w:t>
       </w:r>
-      <w:hyperlink r:id="rId62">
+      <w:hyperlink r:id="rId63">
         <w:r>
           <w:rPr>
             <w:rStyle w:val="Hyperlink"/>
@@ -46223,7 +46524,7 @@
       <w:r>
         <w:t xml:space="preserve"> </w:t>
       </w:r>
-      <w:hyperlink r:id="rId93">
+      <w:hyperlink r:id="rId94">
         <w:r>
           <w:rPr>
             <w:rStyle w:val="Hyperlink"/>
@@ -46335,7 +46636,7 @@
         <w:t xml:space="preserve">.</w:t>
       </w:r>
     </w:p>
-    <w:bookmarkEnd w:id="94"/>
+    <w:bookmarkEnd w:id="95"/>
     <w:p>
       <w:pPr>
         <w:pStyle w:val="BodyText"/>
@@ -46361,7 +46662,7 @@
           <w:rPr>
             <w:rStyle w:val="Hyperlink"/>
           </w:rPr>
-          <w:t xml:space="preserve">Theorem 8</w:t>
+          <w:t xml:space="preserve">Theorem 9</w:t>
         </w:r>
       </w:hyperlink>
       <w:r>
@@ -46660,7 +46961,7 @@
           <w:rPr>
             <w:rStyle w:val="Hyperlink"/>
           </w:rPr>
-          <w:t xml:space="preserve">Theorem 6</w:t>
+          <w:t xml:space="preserve">Theorem 7</w:t>
         </w:r>
       </w:hyperlink>
       <w:r>
@@ -46822,7 +47123,7 @@
         <w:t xml:space="preserve">.</w:t>
       </w:r>
     </w:p>
-    <w:bookmarkStart w:id="95" w:name="thm-cor-bounds"/>
+    <w:bookmarkStart w:id="96" w:name="thm-cor-bounds"/>
     <w:p>
       <w:pPr>
         <w:pStyle w:val="BodyText"/>
@@ -46832,7 +47133,7 @@
           <w:b/>
           <w:bCs/>
         </w:rPr>
-        <w:t xml:space="preserve">Theorem 12 (Correlation lies between</w:t>
+        <w:t xml:space="preserve">Theorem 13 (Correlation lies between</w:t>
       </w:r>
       <w:r>
         <w:rPr>
@@ -47071,7 +47372,7 @@
         </m:oMath>
       </m:oMathPara>
     </w:p>
-    <w:bookmarkEnd w:id="95"/>
+    <w:bookmarkEnd w:id="96"/>
     <w:p>
       <w:pPr>
         <w:pStyle w:val="FirstParagraph"/>
@@ -48293,7 +48594,7 @@
         <w:t xml:space="preserve">.</w:t>
       </w:r>
     </w:p>
-    <w:bookmarkStart w:id="103" w:name="exm-cor-auto"/>
+    <w:bookmarkStart w:id="104" w:name="exm-cor-auto"/>
     <w:p>
       <w:pPr>
         <w:pStyle w:val="BodyText"/>
@@ -48357,7 +48658,7 @@
       <w:r>
         <w:t xml:space="preserve"> </w:t>
       </w:r>
-      <w:hyperlink r:id="rId96">
+      <w:hyperlink r:id="rId97">
         <w:r>
           <w:rPr>
             <w:rStyle w:val="VerbatimChar"/>
@@ -48389,7 +48690,7 @@
       <w:r>
         <w:t xml:space="preserve"> </w:t>
       </w:r>
-      <w:hyperlink r:id="rId97">
+      <w:hyperlink r:id="rId98">
         <w:r>
           <w:rPr>
             <w:rStyle w:val="VerbatimChar"/>
@@ -48421,7 +48722,7 @@
       <w:r>
         <w:t xml:space="preserve"> </w:t>
       </w:r>
-      <w:hyperlink r:id="rId98">
+      <w:hyperlink r:id="rId99">
         <w:r>
           <w:rPr>
             <w:rStyle w:val="VerbatimChar"/>
@@ -50142,7 +50443,7 @@
       <w:tr>
         <w:tc>
           <w:tcPr/>
-          <w:bookmarkStart w:id="102" w:name="fig-cor-auto"/>
+          <w:bookmarkStart w:id="103" w:name="fig-cor-auto"/>
           <w:p>
             <w:pPr>
               <w:pStyle w:val="Compact"/>
@@ -50153,18 +50454,18 @@
                 <wp:inline>
                   <wp:extent cx="4620126" cy="3234088"/>
                   <wp:effectExtent b="0" l="0" r="0" t="0"/>
-                  <wp:docPr descr="" title="" id="100" name="Picture"/>
+                  <wp:docPr descr="" title="" id="101" name="Picture"/>
                   <a:graphic>
                     <a:graphicData uri="http://schemas.openxmlformats.org/drawingml/2006/picture">
                       <pic:pic>
                         <pic:nvPicPr>
-                          <pic:cNvPr descr="variance-covariance_files/figure-docx/fig-cor-auto-1.png" id="101" name="Picture"/>
+                          <pic:cNvPr descr="variance-covariance_files/figure-docx/fig-cor-auto-1.png" id="102" name="Picture"/>
                           <pic:cNvPicPr>
                             <a:picLocks noChangeArrowheads="1" noChangeAspect="1"/>
                           </pic:cNvPicPr>
                         </pic:nvPicPr>
                         <pic:blipFill>
-                          <a:blip r:embed="rId99"/>
+                          <a:blip r:embed="rId100"/>
                           <a:stretch>
                             <a:fillRect/>
                           </a:stretch>
@@ -50204,7 +50505,7 @@
               <w:t xml:space="preserve">Figure 1: Miles per gallon against horsepower for the cars in the Auto data. Cars with more horsepower tend to have lower fuel economy.</w:t>
             </w:r>
           </w:p>
-          <w:bookmarkEnd w:id="102"/>
+          <w:bookmarkEnd w:id="103"/>
         </w:tc>
       </w:tr>
     </w:tbl>
@@ -50311,7 +50612,7 @@
           <w:rPr>
             <w:rStyle w:val="Hyperlink"/>
           </w:rPr>
-          <w:t xml:space="preserve">Theorem 12</w:t>
+          <w:t xml:space="preserve">Theorem 13</w:t>
         </w:r>
       </w:hyperlink>
       <w:r>
@@ -50351,7 +50652,7 @@
         <w:t xml:space="preserve">deviations by the same count, which cancels.</w:t>
       </w:r>
     </w:p>
-    <w:bookmarkEnd w:id="103"/>
+    <w:bookmarkEnd w:id="104"/>
     <w:p>
       <w:pPr>
         <w:pStyle w:val="BodyText"/>
@@ -50362,7 +50663,7 @@
       <w:r>
         <w:t xml:space="preserve"> </w:t>
       </w:r>
-      <w:hyperlink r:id="rId104">
+      <w:hyperlink r:id="rId105">
         <w:r>
           <w:rPr>
             <w:rStyle w:val="Hyperlink"/>
@@ -50379,7 +50680,7 @@
       <w:r>
         <w:t xml:space="preserve"> </w:t>
       </w:r>
-      <w:hyperlink r:id="rId105">
+      <w:hyperlink r:id="rId106">
         <w:r>
           <w:rPr>
             <w:rStyle w:val="Hyperlink"/>
@@ -50409,8 +50710,8 @@
         <w:t xml:space="preserve">.</w:t>
       </w:r>
     </w:p>
-    <w:bookmarkEnd w:id="106"/>
-    <w:bookmarkStart w:id="115" w:name="references"/>
+    <w:bookmarkEnd w:id="107"/>
+    <w:bookmarkStart w:id="116" w:name="references"/>
     <w:p>
       <w:pPr>
         <w:pStyle w:val="Heading2"/>
@@ -50419,8 +50720,8 @@
         <w:t xml:space="preserve">References</w:t>
       </w:r>
     </w:p>
-    <w:bookmarkStart w:id="114" w:name="refs"/>
-    <w:bookmarkStart w:id="108" w:name="ref-fiveminuteai_probstat"/>
+    <w:bookmarkStart w:id="115" w:name="refs"/>
+    <w:bookmarkStart w:id="109" w:name="ref-fiveminuteai_probstat"/>
     <w:p>
       <w:pPr>
         <w:pStyle w:val="Bibliography"/>
@@ -50444,7 +50745,7 @@
       <w:r>
         <w:t xml:space="preserve"> </w:t>
       </w:r>
-      <w:hyperlink r:id="rId107">
+      <w:hyperlink r:id="rId108">
         <w:r>
           <w:rPr>
             <w:rStyle w:val="Hyperlink"/>
@@ -50456,8 +50757,8 @@
         <w:t xml:space="preserve">.</w:t>
       </w:r>
     </w:p>
-    <w:bookmarkEnd w:id="108"/>
-    <w:bookmarkStart w:id="109" w:name="ref-billingsley1995probability"/>
+    <w:bookmarkEnd w:id="109"/>
+    <w:bookmarkStart w:id="110" w:name="ref-billingsley1995probability"/>
     <w:p>
       <w:pPr>
         <w:pStyle w:val="Bibliography"/>
@@ -50479,8 +50780,8 @@
         <w:t xml:space="preserve">. 3rd ed. Wiley Series in Probability and Mathematical Statistics. Wiley.</w:t>
       </w:r>
     </w:p>
-    <w:bookmarkEnd w:id="109"/>
-    <w:bookmarkStart w:id="111" w:name="ref-CaseBerg01"/>
+    <w:bookmarkEnd w:id="110"/>
+    <w:bookmarkStart w:id="112" w:name="ref-CaseBerg01"/>
     <w:p>
       <w:pPr>
         <w:pStyle w:val="Bibliography"/>
@@ -50504,7 +50805,7 @@
       <w:r>
         <w:t xml:space="preserve"> </w:t>
       </w:r>
-      <w:hyperlink r:id="rId110">
+      <w:hyperlink r:id="rId111">
         <w:r>
           <w:rPr>
             <w:rStyle w:val="Hyperlink"/>
@@ -50516,8 +50817,8 @@
         <w:t xml:space="preserve">.</w:t>
       </w:r>
     </w:p>
-    <w:bookmarkEnd w:id="111"/>
-    <w:bookmarkStart w:id="113" w:name="ref-james2021islr2e"/>
+    <w:bookmarkEnd w:id="112"/>
+    <w:bookmarkStart w:id="114" w:name="ref-james2021islr2e"/>
     <w:p>
       <w:pPr>
         <w:pStyle w:val="Bibliography"/>
@@ -50555,7 +50856,7 @@
       <w:r>
         <w:t xml:space="preserve"> </w:t>
       </w:r>
-      <w:hyperlink r:id="rId112">
+      <w:hyperlink r:id="rId113">
         <w:r>
           <w:rPr>
             <w:rStyle w:val="Hyperlink"/>
@@ -50567,9 +50868,9 @@
         <w:t xml:space="preserve">.</w:t>
       </w:r>
     </w:p>
-    <w:bookmarkEnd w:id="113"/>
     <w:bookmarkEnd w:id="114"/>
     <w:bookmarkEnd w:id="115"/>
+    <w:bookmarkEnd w:id="116"/>
     <w:sectPr>
       <w:footnotePr>
         <w:numRestart w:val="eachSect"/>

</xml_diff>

<commit_message>
Deploying to gh-pages from @ Morrison-Lab/pds@c891e4f93f7484a8f44ffbeb8603f4b51b6eecf7 🚀
</commit_message>
<xml_diff>
--- a/variance-covariance.docx
+++ b/variance-covariance.docx
@@ -15,7 +15,7 @@
         <w:pStyle w:val="Date"/>
       </w:pPr>
       <w:r>
-        <w:t xml:space="preserve">Last modified: 2026-10-15 01:21:20 (PDT)</w:t>
+        <w:t xml:space="preserve">Last modified: 2026-10-15 01:30:39 (PDT)</w:t>
       </w:r>
     </w:p>
     <w:bookmarkStart w:id="27" w:name="sec-deviation"/>
@@ -13313,16 +13313,2704 @@
     </w:p>
     <w:bookmarkEnd w:id="50"/>
     <w:bookmarkEnd w:id="51"/>
-    <w:bookmarkStart w:id="59" w:name="sec-bias-variance-prediction"/>
+    <w:bookmarkStart w:id="58" w:name="sec-best-constant-prediction"/>
     <w:p>
       <w:pPr>
         <w:pStyle w:val="Heading2"/>
       </w:pPr>
       <w:r>
-        <w:t xml:space="preserve">3 Bias, variance, and prediction error</w:t>
+        <w:t xml:space="preserve">3 The best constant prediction</w:t>
       </w:r>
     </w:p>
-    <w:bookmarkStart w:id="52" w:name="exr-prediction-error"/>
+    <w:bookmarkStart w:id="53" w:name="thm-constant-prediction-decompose"/>
+    <w:p>
+      <w:pPr>
+        <w:pStyle w:val="FirstParagraph"/>
+      </w:pPr>
+      <w:r>
+        <w:rPr>
+          <w:b/>
+          <w:bCs/>
+        </w:rPr>
+        <w:t xml:space="preserve">Theorem 5 (Expected squared error of a constant prediction)</w:t>
+      </w:r>
+      <w:r>
+        <w:t xml:space="preserve"> </w:t>
+      </w:r>
+      <w:r>
+        <w:t xml:space="preserve">Let</w:t>
+      </w:r>
+      <w:r>
+        <w:t xml:space="preserve"> </w:t>
+      </w:r>
+      <m:oMath>
+        <m:r>
+          <m:t>Y</m:t>
+        </m:r>
+      </m:oMath>
+      <w:r>
+        <w:t xml:space="preserve"> </w:t>
+      </w:r>
+      <w:r>
+        <w:t xml:space="preserve">be a random variable with mean</w:t>
+      </w:r>
+      <w:r>
+        <w:t xml:space="preserve"> </w:t>
+      </w:r>
+      <m:oMath>
+        <m:r>
+          <m:t>μ</m:t>
+        </m:r>
+      </m:oMath>
+      <w:r>
+        <w:t xml:space="preserve"> </w:t>
+      </w:r>
+      <w:r>
+        <w:t xml:space="preserve">and finite variance.</w:t>
+      </w:r>
+      <w:r>
+        <w:t xml:space="preserve"> </w:t>
+      </w:r>
+      <w:r>
+        <w:t xml:space="preserve">Then for every number</w:t>
+      </w:r>
+      <w:r>
+        <w:t xml:space="preserve"> </w:t>
+      </w:r>
+      <m:oMath>
+        <m:r>
+          <m:t>c</m:t>
+        </m:r>
+      </m:oMath>
+      <w:r>
+        <w:t xml:space="preserve">,</w:t>
+      </w:r>
+    </w:p>
+    <w:p>
+      <w:pPr>
+        <w:pStyle w:val="BodyText"/>
+      </w:pPr>
+      <w:bookmarkStart w:id="52" w:name="eq-constant-prediction-decompose"/>
+      <m:oMathPara>
+        <m:oMathParaPr>
+          <m:jc m:val="center"/>
+        </m:oMathParaPr>
+        <m:oMath>
+          <m:r>
+            <m:rPr>
+              <m:sty m:val="p"/>
+            </m:rPr>
+            <m:t>E</m:t>
+          </m:r>
+          <m:r>
+            <m:t>​</m:t>
+          </m:r>
+          <m:d>
+            <m:dPr>
+              <m:begChr m:val="["/>
+              <m:sepChr m:val=""/>
+              <m:endChr m:val="]"/>
+              <m:grow/>
+            </m:dPr>
+            <m:e>
+              <m:r>
+                <m:t>​</m:t>
+              </m:r>
+              <m:sSup>
+                <m:e>
+                  <m:d>
+                    <m:dPr>
+                      <m:begChr m:val="("/>
+                      <m:sepChr m:val=""/>
+                      <m:endChr m:val=")"/>
+                      <m:grow/>
+                    </m:dPr>
+                    <m:e>
+                      <m:r>
+                        <m:t>Y</m:t>
+                      </m:r>
+                      <m:r>
+                        <m:rPr>
+                          <m:sty m:val="p"/>
+                        </m:rPr>
+                        <m:t>−</m:t>
+                      </m:r>
+                      <m:r>
+                        <m:t>c</m:t>
+                      </m:r>
+                    </m:e>
+                  </m:d>
+                </m:e>
+                <m:sup>
+                  <m:r>
+                    <m:t>2</m:t>
+                  </m:r>
+                </m:sup>
+              </m:sSup>
+              <m:r>
+                <m:t>​</m:t>
+              </m:r>
+            </m:e>
+          </m:d>
+          <m:r>
+            <m:t>​</m:t>
+          </m:r>
+          <m:r>
+            <m:rPr>
+              <m:sty m:val="p"/>
+            </m:rPr>
+            <m:t>=</m:t>
+          </m:r>
+          <m:r>
+            <m:rPr>
+              <m:sty m:val="p"/>
+            </m:rPr>
+            <m:t>Var</m:t>
+          </m:r>
+          <m:r>
+            <m:t>​</m:t>
+          </m:r>
+          <m:d>
+            <m:dPr>
+              <m:begChr m:val="("/>
+              <m:sepChr m:val=""/>
+              <m:endChr m:val=")"/>
+              <m:grow/>
+            </m:dPr>
+            <m:e>
+              <m:r>
+                <m:t>Y</m:t>
+              </m:r>
+            </m:e>
+          </m:d>
+          <m:r>
+            <m:t>​</m:t>
+          </m:r>
+          <m:r>
+            <m:rPr>
+              <m:sty m:val="p"/>
+            </m:rPr>
+            <m:t>+</m:t>
+          </m:r>
+          <m:r>
+            <m:t>​</m:t>
+          </m:r>
+          <m:sSup>
+            <m:e>
+              <m:d>
+                <m:dPr>
+                  <m:begChr m:val="("/>
+                  <m:sepChr m:val=""/>
+                  <m:endChr m:val=")"/>
+                  <m:grow/>
+                </m:dPr>
+                <m:e>
+                  <m:r>
+                    <m:t>μ</m:t>
+                  </m:r>
+                  <m:r>
+                    <m:rPr>
+                      <m:sty m:val="p"/>
+                    </m:rPr>
+                    <m:t>−</m:t>
+                  </m:r>
+                  <m:r>
+                    <m:t>c</m:t>
+                  </m:r>
+                </m:e>
+              </m:d>
+            </m:e>
+            <m:sup>
+              <m:r>
+                <m:t>2</m:t>
+              </m:r>
+            </m:sup>
+          </m:sSup>
+          <m:r>
+            <m:t>​</m:t>
+          </m:r>
+          <m:r>
+            <m:rPr>
+              <m:sty m:val="p"/>
+            </m:rPr>
+            <m:t>.</m:t>
+          </m:r>
+          <m:r>
+            <m:t>  </m:t>
+          </m:r>
+          <m:r>
+            <m:rPr>
+              <m:sty m:val="p"/>
+            </m:rPr>
+            <m:t>(</m:t>
+          </m:r>
+          <m:r>
+            <m:t>2</m:t>
+          </m:r>
+          <m:r>
+            <m:rPr>
+              <m:sty m:val="p"/>
+            </m:rPr>
+            <m:t>)</m:t>
+          </m:r>
+        </m:oMath>
+      </m:oMathPara>
+      <w:bookmarkEnd w:id="52"/>
+    </w:p>
+    <w:bookmarkEnd w:id="53"/>
+    <w:p>
+      <w:pPr>
+        <w:pStyle w:val="FirstParagraph"/>
+      </w:pPr>
+      <w:r>
+        <w:rPr>
+          <w:i/>
+          <w:iCs/>
+        </w:rPr>
+        <w:t xml:space="preserve">Proof</w:t>
+      </w:r>
+      <w:r>
+        <w:t xml:space="preserve">. </w:t>
+      </w:r>
+      <w:r>
+        <w:t xml:space="preserve">Add and subtract</w:t>
+      </w:r>
+      <w:r>
+        <w:t xml:space="preserve"> </w:t>
+      </w:r>
+      <m:oMath>
+        <m:r>
+          <m:t>μ</m:t>
+        </m:r>
+      </m:oMath>
+      <w:r>
+        <w:t xml:space="preserve"> </w:t>
+      </w:r>
+      <w:r>
+        <w:t xml:space="preserve">inside the square,</w:t>
+      </w:r>
+      <w:r>
+        <w:t xml:space="preserve"> </w:t>
+      </w:r>
+      <w:r>
+        <w:t xml:space="preserve">expand it,</w:t>
+      </w:r>
+      <w:r>
+        <w:t xml:space="preserve"> </w:t>
+      </w:r>
+      <w:r>
+        <w:t xml:space="preserve">and take the expectation term by term:</w:t>
+      </w:r>
+    </w:p>
+    <w:p>
+      <w:pPr>
+        <w:pStyle w:val="BodyText"/>
+      </w:pPr>
+      <m:oMathPara>
+        <m:oMathParaPr>
+          <m:jc m:val="center"/>
+        </m:oMathParaPr>
+        <m:oMath>
+          <m:eqArr>
+            <m:e>
+              <m:r>
+                <m:rPr>
+                  <m:sty m:val="p"/>
+                </m:rPr>
+                <m:t>E</m:t>
+              </m:r>
+              <m:r>
+                <m:t>​</m:t>
+              </m:r>
+              <m:d>
+                <m:dPr>
+                  <m:begChr m:val="["/>
+                  <m:sepChr m:val=""/>
+                  <m:endChr m:val="]"/>
+                  <m:grow/>
+                </m:dPr>
+                <m:e>
+                  <m:r>
+                    <m:t>​</m:t>
+                  </m:r>
+                  <m:sSup>
+                    <m:e>
+                      <m:d>
+                        <m:dPr>
+                          <m:begChr m:val="("/>
+                          <m:sepChr m:val=""/>
+                          <m:endChr m:val=")"/>
+                          <m:grow/>
+                        </m:dPr>
+                        <m:e>
+                          <m:r>
+                            <m:t>Y</m:t>
+                          </m:r>
+                          <m:r>
+                            <m:rPr>
+                              <m:sty m:val="p"/>
+                            </m:rPr>
+                            <m:t>−</m:t>
+                          </m:r>
+                          <m:r>
+                            <m:t>c</m:t>
+                          </m:r>
+                        </m:e>
+                      </m:d>
+                    </m:e>
+                    <m:sup>
+                      <m:r>
+                        <m:t>2</m:t>
+                      </m:r>
+                    </m:sup>
+                  </m:sSup>
+                  <m:r>
+                    <m:t>​</m:t>
+                  </m:r>
+                </m:e>
+              </m:d>
+              <m:r>
+                <m:t>​</m:t>
+              </m:r>
+              <m:r>
+                <m:t>&amp;</m:t>
+              </m:r>
+              <m:r>
+                <m:rPr>
+                  <m:sty m:val="p"/>
+                </m:rPr>
+                <m:t>=</m:t>
+              </m:r>
+              <m:r>
+                <m:rPr>
+                  <m:sty m:val="p"/>
+                </m:rPr>
+                <m:t>E</m:t>
+              </m:r>
+              <m:r>
+                <m:t>​</m:t>
+              </m:r>
+              <m:d>
+                <m:dPr>
+                  <m:begChr m:val="["/>
+                  <m:sepChr m:val=""/>
+                  <m:endChr m:val="]"/>
+                  <m:grow/>
+                </m:dPr>
+                <m:e>
+                  <m:r>
+                    <m:t>​</m:t>
+                  </m:r>
+                  <m:sSup>
+                    <m:e>
+                      <m:d>
+                        <m:dPr>
+                          <m:begChr m:val="("/>
+                          <m:sepChr m:val=""/>
+                          <m:endChr m:val=")"/>
+                          <m:grow/>
+                        </m:dPr>
+                        <m:e>
+                          <m:r>
+                            <m:rPr>
+                              <m:sty m:val="p"/>
+                            </m:rPr>
+                            <m:t>(</m:t>
+                          </m:r>
+                          <m:r>
+                            <m:t>Y</m:t>
+                          </m:r>
+                          <m:r>
+                            <m:rPr>
+                              <m:sty m:val="p"/>
+                            </m:rPr>
+                            <m:t>−</m:t>
+                          </m:r>
+                          <m:r>
+                            <m:t>μ</m:t>
+                          </m:r>
+                          <m:r>
+                            <m:rPr>
+                              <m:sty m:val="p"/>
+                            </m:rPr>
+                            <m:t>)</m:t>
+                          </m:r>
+                          <m:r>
+                            <m:rPr>
+                              <m:sty m:val="p"/>
+                            </m:rPr>
+                            <m:t>+</m:t>
+                          </m:r>
+                          <m:r>
+                            <m:rPr>
+                              <m:sty m:val="p"/>
+                            </m:rPr>
+                            <m:t>(</m:t>
+                          </m:r>
+                          <m:r>
+                            <m:t>μ</m:t>
+                          </m:r>
+                          <m:r>
+                            <m:rPr>
+                              <m:sty m:val="p"/>
+                            </m:rPr>
+                            <m:t>−</m:t>
+                          </m:r>
+                          <m:r>
+                            <m:t>c</m:t>
+                          </m:r>
+                          <m:r>
+                            <m:rPr>
+                              <m:sty m:val="p"/>
+                            </m:rPr>
+                            <m:t>)</m:t>
+                          </m:r>
+                        </m:e>
+                      </m:d>
+                    </m:e>
+                    <m:sup>
+                      <m:r>
+                        <m:t>2</m:t>
+                      </m:r>
+                    </m:sup>
+                  </m:sSup>
+                  <m:r>
+                    <m:t>​</m:t>
+                  </m:r>
+                </m:e>
+              </m:d>
+              <m:r>
+                <m:t>​</m:t>
+              </m:r>
+              <m:r>
+                <m:t>&amp;</m:t>
+              </m:r>
+              <m:r>
+                <m:t>&amp;</m:t>
+              </m:r>
+              <m:r>
+                <m:rPr>
+                  <m:nor/>
+                  <m:sty m:val="p"/>
+                </m:rPr>
+                <m:t>(add and subtract </m:t>
+              </m:r>
+              <m:r>
+                <m:t>μ</m:t>
+              </m:r>
+              <m:r>
+                <m:rPr>
+                  <m:nor/>
+                  <m:sty m:val="p"/>
+                </m:rPr>
+                <m:t>)</m:t>
+              </m:r>
+            </m:e>
+            <m:e>
+              <m:r>
+                <m:t>&amp;</m:t>
+              </m:r>
+              <m:r>
+                <m:rPr>
+                  <m:sty m:val="p"/>
+                </m:rPr>
+                <m:t>=</m:t>
+              </m:r>
+              <m:r>
+                <m:rPr>
+                  <m:sty m:val="p"/>
+                </m:rPr>
+                <m:t>E</m:t>
+              </m:r>
+              <m:r>
+                <m:t>​</m:t>
+              </m:r>
+              <m:d>
+                <m:dPr>
+                  <m:begChr m:val="["/>
+                  <m:sepChr m:val=""/>
+                  <m:endChr m:val="]"/>
+                  <m:grow/>
+                </m:dPr>
+                <m:e>
+                  <m:r>
+                    <m:t>​</m:t>
+                  </m:r>
+                  <m:sSup>
+                    <m:e>
+                      <m:d>
+                        <m:dPr>
+                          <m:begChr m:val="("/>
+                          <m:sepChr m:val=""/>
+                          <m:endChr m:val=")"/>
+                          <m:grow/>
+                        </m:dPr>
+                        <m:e>
+                          <m:r>
+                            <m:t>Y</m:t>
+                          </m:r>
+                          <m:r>
+                            <m:rPr>
+                              <m:sty m:val="p"/>
+                            </m:rPr>
+                            <m:t>−</m:t>
+                          </m:r>
+                          <m:r>
+                            <m:t>μ</m:t>
+                          </m:r>
+                        </m:e>
+                      </m:d>
+                    </m:e>
+                    <m:sup>
+                      <m:r>
+                        <m:t>2</m:t>
+                      </m:r>
+                    </m:sup>
+                  </m:sSup>
+                  <m:r>
+                    <m:t>​</m:t>
+                  </m:r>
+                  <m:r>
+                    <m:rPr>
+                      <m:sty m:val="p"/>
+                    </m:rPr>
+                    <m:t>+</m:t>
+                  </m:r>
+                  <m:r>
+                    <m:t>2</m:t>
+                  </m:r>
+                  <m:r>
+                    <m:rPr>
+                      <m:sty m:val="p"/>
+                    </m:rPr>
+                    <m:t>(</m:t>
+                  </m:r>
+                  <m:r>
+                    <m:t>μ</m:t>
+                  </m:r>
+                  <m:r>
+                    <m:rPr>
+                      <m:sty m:val="p"/>
+                    </m:rPr>
+                    <m:t>−</m:t>
+                  </m:r>
+                  <m:r>
+                    <m:t>c</m:t>
+                  </m:r>
+                  <m:r>
+                    <m:rPr>
+                      <m:sty m:val="p"/>
+                    </m:rPr>
+                    <m:t>)</m:t>
+                  </m:r>
+                  <m:r>
+                    <m:rPr>
+                      <m:sty m:val="p"/>
+                    </m:rPr>
+                    <m:t>(</m:t>
+                  </m:r>
+                  <m:r>
+                    <m:t>Y</m:t>
+                  </m:r>
+                  <m:r>
+                    <m:rPr>
+                      <m:sty m:val="p"/>
+                    </m:rPr>
+                    <m:t>−</m:t>
+                  </m:r>
+                  <m:r>
+                    <m:t>μ</m:t>
+                  </m:r>
+                  <m:r>
+                    <m:rPr>
+                      <m:sty m:val="p"/>
+                    </m:rPr>
+                    <m:t>)</m:t>
+                  </m:r>
+                  <m:r>
+                    <m:rPr>
+                      <m:sty m:val="p"/>
+                    </m:rPr>
+                    <m:t>+</m:t>
+                  </m:r>
+                  <m:r>
+                    <m:t>​</m:t>
+                  </m:r>
+                  <m:sSup>
+                    <m:e>
+                      <m:d>
+                        <m:dPr>
+                          <m:begChr m:val="("/>
+                          <m:sepChr m:val=""/>
+                          <m:endChr m:val=")"/>
+                          <m:grow/>
+                        </m:dPr>
+                        <m:e>
+                          <m:r>
+                            <m:t>μ</m:t>
+                          </m:r>
+                          <m:r>
+                            <m:rPr>
+                              <m:sty m:val="p"/>
+                            </m:rPr>
+                            <m:t>−</m:t>
+                          </m:r>
+                          <m:r>
+                            <m:t>c</m:t>
+                          </m:r>
+                        </m:e>
+                      </m:d>
+                    </m:e>
+                    <m:sup>
+                      <m:r>
+                        <m:t>2</m:t>
+                      </m:r>
+                    </m:sup>
+                  </m:sSup>
+                  <m:r>
+                    <m:t>​</m:t>
+                  </m:r>
+                </m:e>
+              </m:d>
+              <m:r>
+                <m:t>​</m:t>
+              </m:r>
+              <m:r>
+                <m:t>&amp;</m:t>
+              </m:r>
+              <m:r>
+                <m:t>&amp;</m:t>
+              </m:r>
+              <m:r>
+                <m:rPr>
+                  <m:nor/>
+                  <m:sty m:val="p"/>
+                </m:rPr>
+                <m:t>(expand the square of a sum)</m:t>
+              </m:r>
+            </m:e>
+            <m:e>
+              <m:r>
+                <m:t>&amp;</m:t>
+              </m:r>
+              <m:r>
+                <m:rPr>
+                  <m:sty m:val="p"/>
+                </m:rPr>
+                <m:t>=</m:t>
+              </m:r>
+              <m:r>
+                <m:rPr>
+                  <m:sty m:val="p"/>
+                </m:rPr>
+                <m:t>E</m:t>
+              </m:r>
+              <m:r>
+                <m:t>​</m:t>
+              </m:r>
+              <m:d>
+                <m:dPr>
+                  <m:begChr m:val="["/>
+                  <m:sepChr m:val=""/>
+                  <m:endChr m:val="]"/>
+                  <m:grow/>
+                </m:dPr>
+                <m:e>
+                  <m:r>
+                    <m:t>​</m:t>
+                  </m:r>
+                  <m:sSup>
+                    <m:e>
+                      <m:d>
+                        <m:dPr>
+                          <m:begChr m:val="("/>
+                          <m:sepChr m:val=""/>
+                          <m:endChr m:val=")"/>
+                          <m:grow/>
+                        </m:dPr>
+                        <m:e>
+                          <m:r>
+                            <m:t>Y</m:t>
+                          </m:r>
+                          <m:r>
+                            <m:rPr>
+                              <m:sty m:val="p"/>
+                            </m:rPr>
+                            <m:t>−</m:t>
+                          </m:r>
+                          <m:r>
+                            <m:t>μ</m:t>
+                          </m:r>
+                        </m:e>
+                      </m:d>
+                    </m:e>
+                    <m:sup>
+                      <m:r>
+                        <m:t>2</m:t>
+                      </m:r>
+                    </m:sup>
+                  </m:sSup>
+                  <m:r>
+                    <m:t>​</m:t>
+                  </m:r>
+                </m:e>
+              </m:d>
+              <m:r>
+                <m:t>​</m:t>
+              </m:r>
+              <m:r>
+                <m:rPr>
+                  <m:sty m:val="p"/>
+                </m:rPr>
+                <m:t>+</m:t>
+              </m:r>
+              <m:r>
+                <m:t>2</m:t>
+              </m:r>
+              <m:r>
+                <m:rPr>
+                  <m:sty m:val="p"/>
+                </m:rPr>
+                <m:t>(</m:t>
+              </m:r>
+              <m:r>
+                <m:t>μ</m:t>
+              </m:r>
+              <m:r>
+                <m:rPr>
+                  <m:sty m:val="p"/>
+                </m:rPr>
+                <m:t>−</m:t>
+              </m:r>
+              <m:r>
+                <m:t>c</m:t>
+              </m:r>
+              <m:r>
+                <m:rPr>
+                  <m:sty m:val="p"/>
+                </m:rPr>
+                <m:t>)</m:t>
+              </m:r>
+              <m:r>
+                <m:rPr>
+                  <m:sty m:val="p"/>
+                </m:rPr>
+                <m:t>E</m:t>
+              </m:r>
+              <m:r>
+                <m:t>​</m:t>
+              </m:r>
+              <m:d>
+                <m:dPr>
+                  <m:begChr m:val="["/>
+                  <m:sepChr m:val=""/>
+                  <m:endChr m:val="]"/>
+                  <m:grow/>
+                </m:dPr>
+                <m:e>
+                  <m:r>
+                    <m:t>Y</m:t>
+                  </m:r>
+                  <m:r>
+                    <m:rPr>
+                      <m:sty m:val="p"/>
+                    </m:rPr>
+                    <m:t>−</m:t>
+                  </m:r>
+                  <m:r>
+                    <m:t>μ</m:t>
+                  </m:r>
+                </m:e>
+              </m:d>
+              <m:r>
+                <m:t>​</m:t>
+              </m:r>
+              <m:r>
+                <m:rPr>
+                  <m:sty m:val="p"/>
+                </m:rPr>
+                <m:t>+</m:t>
+              </m:r>
+              <m:r>
+                <m:t>​</m:t>
+              </m:r>
+              <m:sSup>
+                <m:e>
+                  <m:d>
+                    <m:dPr>
+                      <m:begChr m:val="("/>
+                      <m:sepChr m:val=""/>
+                      <m:endChr m:val=")"/>
+                      <m:grow/>
+                    </m:dPr>
+                    <m:e>
+                      <m:r>
+                        <m:t>μ</m:t>
+                      </m:r>
+                      <m:r>
+                        <m:rPr>
+                          <m:sty m:val="p"/>
+                        </m:rPr>
+                        <m:t>−</m:t>
+                      </m:r>
+                      <m:r>
+                        <m:t>c</m:t>
+                      </m:r>
+                    </m:e>
+                  </m:d>
+                </m:e>
+                <m:sup>
+                  <m:r>
+                    <m:t>2</m:t>
+                  </m:r>
+                </m:sup>
+              </m:sSup>
+              <m:r>
+                <m:t>​</m:t>
+              </m:r>
+              <m:r>
+                <m:t>&amp;</m:t>
+              </m:r>
+              <m:r>
+                <m:t>&amp;</m:t>
+              </m:r>
+              <m:r>
+                <m:rPr>
+                  <m:nor/>
+                  <m:sty m:val="p"/>
+                </m:rPr>
+                <m:t>(linearity of expectation; </m:t>
+              </m:r>
+              <m:r>
+                <m:t>μ</m:t>
+              </m:r>
+              <m:r>
+                <m:rPr>
+                  <m:nor/>
+                  <m:sty m:val="p"/>
+                </m:rPr>
+                <m:t> and </m:t>
+              </m:r>
+              <m:r>
+                <m:t>c</m:t>
+              </m:r>
+              <m:r>
+                <m:rPr>
+                  <m:nor/>
+                  <m:sty m:val="p"/>
+                </m:rPr>
+                <m:t> are constants)</m:t>
+              </m:r>
+            </m:e>
+            <m:e>
+              <m:r>
+                <m:t>&amp;</m:t>
+              </m:r>
+              <m:r>
+                <m:rPr>
+                  <m:sty m:val="p"/>
+                </m:rPr>
+                <m:t>=</m:t>
+              </m:r>
+              <m:r>
+                <m:rPr>
+                  <m:sty m:val="p"/>
+                </m:rPr>
+                <m:t>Var</m:t>
+              </m:r>
+              <m:r>
+                <m:t>​</m:t>
+              </m:r>
+              <m:d>
+                <m:dPr>
+                  <m:begChr m:val="("/>
+                  <m:sepChr m:val=""/>
+                  <m:endChr m:val=")"/>
+                  <m:grow/>
+                </m:dPr>
+                <m:e>
+                  <m:r>
+                    <m:t>Y</m:t>
+                  </m:r>
+                </m:e>
+              </m:d>
+              <m:r>
+                <m:t>​</m:t>
+              </m:r>
+              <m:r>
+                <m:rPr>
+                  <m:sty m:val="p"/>
+                </m:rPr>
+                <m:t>+</m:t>
+              </m:r>
+              <m:r>
+                <m:t>2</m:t>
+              </m:r>
+              <m:r>
+                <m:rPr>
+                  <m:sty m:val="p"/>
+                </m:rPr>
+                <m:t>(</m:t>
+              </m:r>
+              <m:r>
+                <m:t>μ</m:t>
+              </m:r>
+              <m:r>
+                <m:rPr>
+                  <m:sty m:val="p"/>
+                </m:rPr>
+                <m:t>−</m:t>
+              </m:r>
+              <m:r>
+                <m:t>c</m:t>
+              </m:r>
+              <m:r>
+                <m:rPr>
+                  <m:sty m:val="p"/>
+                </m:rPr>
+                <m:t>)</m:t>
+              </m:r>
+              <m:r>
+                <m:rPr>
+                  <m:sty m:val="p"/>
+                </m:rPr>
+                <m:t>E</m:t>
+              </m:r>
+              <m:r>
+                <m:t>​</m:t>
+              </m:r>
+              <m:d>
+                <m:dPr>
+                  <m:begChr m:val="["/>
+                  <m:sepChr m:val=""/>
+                  <m:endChr m:val="]"/>
+                  <m:grow/>
+                </m:dPr>
+                <m:e>
+                  <m:r>
+                    <m:t>Y</m:t>
+                  </m:r>
+                  <m:r>
+                    <m:rPr>
+                      <m:sty m:val="p"/>
+                    </m:rPr>
+                    <m:t>−</m:t>
+                  </m:r>
+                  <m:r>
+                    <m:t>μ</m:t>
+                  </m:r>
+                </m:e>
+              </m:d>
+              <m:r>
+                <m:t>​</m:t>
+              </m:r>
+              <m:r>
+                <m:rPr>
+                  <m:sty m:val="p"/>
+                </m:rPr>
+                <m:t>+</m:t>
+              </m:r>
+              <m:r>
+                <m:t>​</m:t>
+              </m:r>
+              <m:sSup>
+                <m:e>
+                  <m:d>
+                    <m:dPr>
+                      <m:begChr m:val="("/>
+                      <m:sepChr m:val=""/>
+                      <m:endChr m:val=")"/>
+                      <m:grow/>
+                    </m:dPr>
+                    <m:e>
+                      <m:r>
+                        <m:t>μ</m:t>
+                      </m:r>
+                      <m:r>
+                        <m:rPr>
+                          <m:sty m:val="p"/>
+                        </m:rPr>
+                        <m:t>−</m:t>
+                      </m:r>
+                      <m:r>
+                        <m:t>c</m:t>
+                      </m:r>
+                    </m:e>
+                  </m:d>
+                </m:e>
+                <m:sup>
+                  <m:r>
+                    <m:t>2</m:t>
+                  </m:r>
+                </m:sup>
+              </m:sSup>
+              <m:r>
+                <m:t>​</m:t>
+              </m:r>
+              <m:r>
+                <m:t>&amp;</m:t>
+              </m:r>
+              <m:r>
+                <m:t>&amp;</m:t>
+              </m:r>
+              <m:r>
+                <m:rPr>
+                  <m:nor/>
+                  <m:sty m:val="p"/>
+                </m:rPr>
+                <m:t>(variance as expected squared deviation)</m:t>
+              </m:r>
+            </m:e>
+            <m:e>
+              <m:r>
+                <m:t>&amp;</m:t>
+              </m:r>
+              <m:r>
+                <m:rPr>
+                  <m:sty m:val="p"/>
+                </m:rPr>
+                <m:t>=</m:t>
+              </m:r>
+              <m:r>
+                <m:rPr>
+                  <m:sty m:val="p"/>
+                </m:rPr>
+                <m:t>Var</m:t>
+              </m:r>
+              <m:r>
+                <m:t>​</m:t>
+              </m:r>
+              <m:d>
+                <m:dPr>
+                  <m:begChr m:val="("/>
+                  <m:sepChr m:val=""/>
+                  <m:endChr m:val=")"/>
+                  <m:grow/>
+                </m:dPr>
+                <m:e>
+                  <m:r>
+                    <m:t>Y</m:t>
+                  </m:r>
+                </m:e>
+              </m:d>
+              <m:r>
+                <m:t>​</m:t>
+              </m:r>
+              <m:r>
+                <m:rPr>
+                  <m:sty m:val="p"/>
+                </m:rPr>
+                <m:t>+</m:t>
+              </m:r>
+              <m:r>
+                <m:t>2</m:t>
+              </m:r>
+              <m:r>
+                <m:rPr>
+                  <m:sty m:val="p"/>
+                </m:rPr>
+                <m:t>(</m:t>
+              </m:r>
+              <m:r>
+                <m:t>μ</m:t>
+              </m:r>
+              <m:r>
+                <m:rPr>
+                  <m:sty m:val="p"/>
+                </m:rPr>
+                <m:t>−</m:t>
+              </m:r>
+              <m:r>
+                <m:t>c</m:t>
+              </m:r>
+              <m:r>
+                <m:rPr>
+                  <m:sty m:val="p"/>
+                </m:rPr>
+                <m:t>)</m:t>
+              </m:r>
+              <m:r>
+                <m:rPr>
+                  <m:sty m:val="p"/>
+                </m:rPr>
+                <m:t>⋅</m:t>
+              </m:r>
+              <m:r>
+                <m:t>0</m:t>
+              </m:r>
+              <m:r>
+                <m:rPr>
+                  <m:sty m:val="p"/>
+                </m:rPr>
+                <m:t>+</m:t>
+              </m:r>
+              <m:r>
+                <m:t>​</m:t>
+              </m:r>
+              <m:sSup>
+                <m:e>
+                  <m:d>
+                    <m:dPr>
+                      <m:begChr m:val="("/>
+                      <m:sepChr m:val=""/>
+                      <m:endChr m:val=")"/>
+                      <m:grow/>
+                    </m:dPr>
+                    <m:e>
+                      <m:r>
+                        <m:t>μ</m:t>
+                      </m:r>
+                      <m:r>
+                        <m:rPr>
+                          <m:sty m:val="p"/>
+                        </m:rPr>
+                        <m:t>−</m:t>
+                      </m:r>
+                      <m:r>
+                        <m:t>c</m:t>
+                      </m:r>
+                    </m:e>
+                  </m:d>
+                </m:e>
+                <m:sup>
+                  <m:r>
+                    <m:t>2</m:t>
+                  </m:r>
+                </m:sup>
+              </m:sSup>
+              <m:r>
+                <m:t>​</m:t>
+              </m:r>
+              <m:r>
+                <m:t>&amp;</m:t>
+              </m:r>
+              <m:r>
+                <m:t>&amp;</m:t>
+              </m:r>
+              <m:r>
+                <m:rPr>
+                  <m:nor/>
+                  <m:sty m:val="p"/>
+                </m:rPr>
+                <m:t>(</m:t>
+              </m:r>
+              <m:r>
+                <m:rPr>
+                  <m:sty m:val="p"/>
+                </m:rPr>
+                <m:t>E</m:t>
+              </m:r>
+              <m:r>
+                <m:t>​</m:t>
+              </m:r>
+              <m:d>
+                <m:dPr>
+                  <m:begChr m:val="["/>
+                  <m:sepChr m:val=""/>
+                  <m:endChr m:val="]"/>
+                  <m:grow/>
+                </m:dPr>
+                <m:e>
+                  <m:r>
+                    <m:t>Y</m:t>
+                  </m:r>
+                  <m:r>
+                    <m:rPr>
+                      <m:sty m:val="p"/>
+                    </m:rPr>
+                    <m:t>−</m:t>
+                  </m:r>
+                  <m:r>
+                    <m:t>μ</m:t>
+                  </m:r>
+                </m:e>
+              </m:d>
+              <m:r>
+                <m:t>​</m:t>
+              </m:r>
+              <m:r>
+                <m:rPr>
+                  <m:sty m:val="p"/>
+                </m:rPr>
+                <m:t>=</m:t>
+              </m:r>
+              <m:r>
+                <m:rPr>
+                  <m:sty m:val="p"/>
+                </m:rPr>
+                <m:t>E</m:t>
+              </m:r>
+              <m:r>
+                <m:t>​</m:t>
+              </m:r>
+              <m:d>
+                <m:dPr>
+                  <m:begChr m:val="["/>
+                  <m:sepChr m:val=""/>
+                  <m:endChr m:val="]"/>
+                  <m:grow/>
+                </m:dPr>
+                <m:e>
+                  <m:r>
+                    <m:t>Y</m:t>
+                  </m:r>
+                </m:e>
+              </m:d>
+              <m:r>
+                <m:t>​</m:t>
+              </m:r>
+              <m:r>
+                <m:rPr>
+                  <m:sty m:val="p"/>
+                </m:rPr>
+                <m:t>−</m:t>
+              </m:r>
+              <m:r>
+                <m:t>μ</m:t>
+              </m:r>
+              <m:r>
+                <m:rPr>
+                  <m:sty m:val="p"/>
+                </m:rPr>
+                <m:t>=</m:t>
+              </m:r>
+              <m:r>
+                <m:t>0</m:t>
+              </m:r>
+              <m:r>
+                <m:rPr>
+                  <m:nor/>
+                  <m:sty m:val="p"/>
+                </m:rPr>
+                <m:t>)</m:t>
+              </m:r>
+            </m:e>
+            <m:e>
+              <m:r>
+                <m:t>&amp;</m:t>
+              </m:r>
+              <m:r>
+                <m:rPr>
+                  <m:sty m:val="p"/>
+                </m:rPr>
+                <m:t>=</m:t>
+              </m:r>
+              <m:r>
+                <m:rPr>
+                  <m:sty m:val="p"/>
+                </m:rPr>
+                <m:t>Var</m:t>
+              </m:r>
+              <m:r>
+                <m:t>​</m:t>
+              </m:r>
+              <m:d>
+                <m:dPr>
+                  <m:begChr m:val="("/>
+                  <m:sepChr m:val=""/>
+                  <m:endChr m:val=")"/>
+                  <m:grow/>
+                </m:dPr>
+                <m:e>
+                  <m:r>
+                    <m:t>Y</m:t>
+                  </m:r>
+                </m:e>
+              </m:d>
+              <m:r>
+                <m:t>​</m:t>
+              </m:r>
+              <m:r>
+                <m:rPr>
+                  <m:sty m:val="p"/>
+                </m:rPr>
+                <m:t>+</m:t>
+              </m:r>
+              <m:r>
+                <m:t>​</m:t>
+              </m:r>
+              <m:sSup>
+                <m:e>
+                  <m:d>
+                    <m:dPr>
+                      <m:begChr m:val="("/>
+                      <m:sepChr m:val=""/>
+                      <m:endChr m:val=")"/>
+                      <m:grow/>
+                    </m:dPr>
+                    <m:e>
+                      <m:r>
+                        <m:t>μ</m:t>
+                      </m:r>
+                      <m:r>
+                        <m:rPr>
+                          <m:sty m:val="p"/>
+                        </m:rPr>
+                        <m:t>−</m:t>
+                      </m:r>
+                      <m:r>
+                        <m:t>c</m:t>
+                      </m:r>
+                    </m:e>
+                  </m:d>
+                </m:e>
+                <m:sup>
+                  <m:r>
+                    <m:t>2</m:t>
+                  </m:r>
+                </m:sup>
+              </m:sSup>
+              <m:r>
+                <m:t>​</m:t>
+              </m:r>
+              <m:r>
+                <m:t>&amp;</m:t>
+              </m:r>
+              <m:r>
+                <m:t>&amp;</m:t>
+              </m:r>
+              <m:r>
+                <m:rPr>
+                  <m:nor/>
+                  <m:sty m:val="p"/>
+                </m:rPr>
+                <m:t>(zero times a number)</m:t>
+              </m:r>
+            </m:e>
+          </m:eqArr>
+        </m:oMath>
+      </m:oMathPara>
+    </w:p>
+    <w:bookmarkStart w:id="55" w:name="cor-best-constant"/>
+    <w:p>
+      <w:pPr>
+        <w:pStyle w:val="FirstParagraph"/>
+      </w:pPr>
+      <w:r>
+        <w:rPr>
+          <w:b/>
+          <w:bCs/>
+        </w:rPr>
+        <w:t xml:space="preserve">Corollary 1 (The mean is the best constant prediction under squared error)</w:t>
+      </w:r>
+      <w:r>
+        <w:t xml:space="preserve"> </w:t>
+      </w:r>
+      <w:r>
+        <w:t xml:space="preserve">Under the assumptions of</w:t>
+      </w:r>
+      <w:r>
+        <w:t xml:space="preserve"> </w:t>
+      </w:r>
+      <w:hyperlink w:anchor="thm-constant-prediction-decompose">
+        <w:r>
+          <w:rPr>
+            <w:rStyle w:val="Hyperlink"/>
+          </w:rPr>
+          <w:t xml:space="preserve">Theorem 5</w:t>
+        </w:r>
+      </w:hyperlink>
+      <w:r>
+        <w:t xml:space="preserve">,</w:t>
+      </w:r>
+    </w:p>
+    <w:p>
+      <w:pPr>
+        <w:pStyle w:val="BodyText"/>
+      </w:pPr>
+      <m:oMathPara>
+        <m:oMathParaPr>
+          <m:jc m:val="center"/>
+        </m:oMathParaPr>
+        <m:oMath>
+          <m:r>
+            <m:rPr>
+              <m:sty m:val="p"/>
+            </m:rPr>
+            <m:t>arg</m:t>
+          </m:r>
+          <m:limLow>
+            <m:e>
+              <m:r>
+                <m:rPr>
+                  <m:sty m:val="p"/>
+                </m:rPr>
+                <m:t>min</m:t>
+              </m:r>
+            </m:e>
+            <m:lim>
+              <m:r>
+                <m:t>c</m:t>
+              </m:r>
+              <m:r>
+                <m:rPr>
+                  <m:sty m:val="p"/>
+                </m:rPr>
+                <m:t>∈</m:t>
+              </m:r>
+              <m:r>
+                <m:rPr>
+                  <m:scr m:val="double-struck"/>
+                  <m:sty m:val="p"/>
+                </m:rPr>
+                <m:t>R</m:t>
+              </m:r>
+            </m:lim>
+          </m:limLow>
+          <m:r>
+            <m:rPr>
+              <m:sty m:val="p"/>
+            </m:rPr>
+            <m:t>E</m:t>
+          </m:r>
+          <m:r>
+            <m:t>​</m:t>
+          </m:r>
+          <m:d>
+            <m:dPr>
+              <m:begChr m:val="["/>
+              <m:sepChr m:val=""/>
+              <m:endChr m:val="]"/>
+              <m:grow/>
+            </m:dPr>
+            <m:e>
+              <m:r>
+                <m:t>​</m:t>
+              </m:r>
+              <m:sSup>
+                <m:e>
+                  <m:d>
+                    <m:dPr>
+                      <m:begChr m:val="("/>
+                      <m:sepChr m:val=""/>
+                      <m:endChr m:val=")"/>
+                      <m:grow/>
+                    </m:dPr>
+                    <m:e>
+                      <m:r>
+                        <m:t>Y</m:t>
+                      </m:r>
+                      <m:r>
+                        <m:rPr>
+                          <m:sty m:val="p"/>
+                        </m:rPr>
+                        <m:t>−</m:t>
+                      </m:r>
+                      <m:r>
+                        <m:t>c</m:t>
+                      </m:r>
+                    </m:e>
+                  </m:d>
+                </m:e>
+                <m:sup>
+                  <m:r>
+                    <m:t>2</m:t>
+                  </m:r>
+                </m:sup>
+              </m:sSup>
+              <m:r>
+                <m:t>​</m:t>
+              </m:r>
+            </m:e>
+          </m:d>
+          <m:r>
+            <m:t>​</m:t>
+          </m:r>
+          <m:r>
+            <m:rPr>
+              <m:sty m:val="p"/>
+            </m:rPr>
+            <m:t>=</m:t>
+          </m:r>
+          <m:r>
+            <m:t>​</m:t>
+          </m:r>
+          <m:d>
+            <m:dPr>
+              <m:begChr m:val="{"/>
+              <m:sepChr m:val=""/>
+              <m:endChr m:val="}"/>
+              <m:grow/>
+            </m:dPr>
+            <m:e>
+              <m:r>
+                <m:t>μ</m:t>
+              </m:r>
+            </m:e>
+          </m:d>
+          <m:r>
+            <m:t>​</m:t>
+          </m:r>
+          <m:r>
+            <m:t> </m:t>
+          </m:r>
+          <m:r>
+            <m:rPr>
+              <m:nor/>
+              <m:sty m:val="p"/>
+            </m:rPr>
+            <m:t>and</m:t>
+          </m:r>
+          <m:r>
+            <m:t> </m:t>
+          </m:r>
+          <m:limLow>
+            <m:e>
+              <m:r>
+                <m:rPr>
+                  <m:sty m:val="p"/>
+                </m:rPr>
+                <m:t>min</m:t>
+              </m:r>
+            </m:e>
+            <m:lim>
+              <m:r>
+                <m:t>c</m:t>
+              </m:r>
+              <m:r>
+                <m:rPr>
+                  <m:sty m:val="p"/>
+                </m:rPr>
+                <m:t>∈</m:t>
+              </m:r>
+              <m:r>
+                <m:rPr>
+                  <m:scr m:val="double-struck"/>
+                  <m:sty m:val="p"/>
+                </m:rPr>
+                <m:t>R</m:t>
+              </m:r>
+            </m:lim>
+          </m:limLow>
+          <m:r>
+            <m:rPr>
+              <m:sty m:val="p"/>
+            </m:rPr>
+            <m:t>E</m:t>
+          </m:r>
+          <m:r>
+            <m:t>​</m:t>
+          </m:r>
+          <m:d>
+            <m:dPr>
+              <m:begChr m:val="["/>
+              <m:sepChr m:val=""/>
+              <m:endChr m:val="]"/>
+              <m:grow/>
+            </m:dPr>
+            <m:e>
+              <m:r>
+                <m:t>​</m:t>
+              </m:r>
+              <m:sSup>
+                <m:e>
+                  <m:d>
+                    <m:dPr>
+                      <m:begChr m:val="("/>
+                      <m:sepChr m:val=""/>
+                      <m:endChr m:val=")"/>
+                      <m:grow/>
+                    </m:dPr>
+                    <m:e>
+                      <m:r>
+                        <m:t>Y</m:t>
+                      </m:r>
+                      <m:r>
+                        <m:rPr>
+                          <m:sty m:val="p"/>
+                        </m:rPr>
+                        <m:t>−</m:t>
+                      </m:r>
+                      <m:r>
+                        <m:t>c</m:t>
+                      </m:r>
+                    </m:e>
+                  </m:d>
+                </m:e>
+                <m:sup>
+                  <m:r>
+                    <m:t>2</m:t>
+                  </m:r>
+                </m:sup>
+              </m:sSup>
+              <m:r>
+                <m:t>​</m:t>
+              </m:r>
+            </m:e>
+          </m:d>
+          <m:r>
+            <m:t>​</m:t>
+          </m:r>
+          <m:r>
+            <m:rPr>
+              <m:sty m:val="p"/>
+            </m:rPr>
+            <m:t>=</m:t>
+          </m:r>
+          <m:r>
+            <m:rPr>
+              <m:sty m:val="p"/>
+            </m:rPr>
+            <m:t>Var</m:t>
+          </m:r>
+          <m:r>
+            <m:t>​</m:t>
+          </m:r>
+          <m:d>
+            <m:dPr>
+              <m:begChr m:val="("/>
+              <m:sepChr m:val=""/>
+              <m:endChr m:val=")"/>
+              <m:grow/>
+            </m:dPr>
+            <m:e>
+              <m:r>
+                <m:t>Y</m:t>
+              </m:r>
+            </m:e>
+          </m:d>
+          <m:r>
+            <m:t>​</m:t>
+          </m:r>
+          <m:r>
+            <m:rPr>
+              <m:sty m:val="p"/>
+            </m:rPr>
+            <m:t>,</m:t>
+          </m:r>
+        </m:oMath>
+      </m:oMathPara>
+    </w:p>
+    <w:p>
+      <w:pPr>
+        <w:pStyle w:val="FirstParagraph"/>
+      </w:pPr>
+      <w:r>
+        <w:t xml:space="preserve">where</w:t>
+      </w:r>
+      <w:r>
+        <w:t xml:space="preserve"> </w:t>
+      </w:r>
+      <m:oMath>
+        <m:r>
+          <m:rPr>
+            <m:sty m:val="p"/>
+          </m:rPr>
+          <m:t>arg</m:t>
+        </m:r>
+        <m:r>
+          <m:rPr>
+            <m:sty m:val="p"/>
+          </m:rPr>
+          <m:t>min</m:t>
+        </m:r>
+      </m:oMath>
+      <w:r>
+        <w:t xml:space="preserve"> </w:t>
+      </w:r>
+      <w:r>
+        <w:t xml:space="preserve">is the</w:t>
+      </w:r>
+      <w:r>
+        <w:t xml:space="preserve"> </w:t>
+      </w:r>
+      <w:hyperlink r:id="rId54">
+        <w:r>
+          <w:rPr>
+            <w:rStyle w:val="Hyperlink"/>
+          </w:rPr>
+          <w:t xml:space="preserve">set of minimizers</w:t>
+        </w:r>
+      </w:hyperlink>
+      <w:r>
+        <w:t xml:space="preserve">.</w:t>
+      </w:r>
+    </w:p>
+    <w:bookmarkEnd w:id="55"/>
+    <w:p>
+      <w:pPr>
+        <w:pStyle w:val="BodyText"/>
+      </w:pPr>
+      <w:r>
+        <w:rPr>
+          <w:i/>
+          <w:iCs/>
+        </w:rPr>
+        <w:t xml:space="preserve">Proof</w:t>
+      </w:r>
+      <w:r>
+        <w:t xml:space="preserve">. </w:t>
+      </w:r>
+      <w:r>
+        <w:t xml:space="preserve">In</w:t>
+      </w:r>
+      <w:r>
+        <w:t xml:space="preserve"> </w:t>
+      </w:r>
+      <w:hyperlink w:anchor="eq-constant-prediction-decompose">
+        <w:r>
+          <w:rPr>
+            <w:rStyle w:val="Hyperlink"/>
+          </w:rPr>
+          <w:t xml:space="preserve">Equation 2</w:t>
+        </w:r>
+      </w:hyperlink>
+      <w:r>
+        <w:t xml:space="preserve"> </w:t>
+      </w:r>
+      <w:r>
+        <w:t xml:space="preserve">the first term,</w:t>
+      </w:r>
+      <w:r>
+        <w:t xml:space="preserve"> </w:t>
+      </w:r>
+      <m:oMath>
+        <m:r>
+          <m:rPr>
+            <m:sty m:val="p"/>
+          </m:rPr>
+          <m:t>Var</m:t>
+        </m:r>
+        <m:r>
+          <m:t>​</m:t>
+        </m:r>
+        <m:d>
+          <m:dPr>
+            <m:begChr m:val="("/>
+            <m:sepChr m:val=""/>
+            <m:endChr m:val=")"/>
+            <m:grow/>
+          </m:dPr>
+          <m:e>
+            <m:r>
+              <m:t>Y</m:t>
+            </m:r>
+          </m:e>
+        </m:d>
+        <m:r>
+          <m:t>​</m:t>
+        </m:r>
+      </m:oMath>
+      <w:r>
+        <w:t xml:space="preserve">, does not depend on</w:t>
+      </w:r>
+      <w:r>
+        <w:t xml:space="preserve"> </w:t>
+      </w:r>
+      <m:oMath>
+        <m:r>
+          <m:t>c</m:t>
+        </m:r>
+      </m:oMath>
+      <w:r>
+        <w:t xml:space="preserve">.</w:t>
+      </w:r>
+      <w:r>
+        <w:t xml:space="preserve"> </w:t>
+      </w:r>
+      <w:r>
+        <w:t xml:space="preserve">The second term,</w:t>
+      </w:r>
+      <w:r>
+        <w:t xml:space="preserve"> </w:t>
+      </w:r>
+      <m:oMath>
+        <m:r>
+          <m:t>​</m:t>
+        </m:r>
+        <m:sSup>
+          <m:e>
+            <m:d>
+              <m:dPr>
+                <m:begChr m:val="("/>
+                <m:sepChr m:val=""/>
+                <m:endChr m:val=")"/>
+                <m:grow/>
+              </m:dPr>
+              <m:e>
+                <m:r>
+                  <m:t>μ</m:t>
+                </m:r>
+                <m:r>
+                  <m:rPr>
+                    <m:sty m:val="p"/>
+                  </m:rPr>
+                  <m:t>−</m:t>
+                </m:r>
+                <m:r>
+                  <m:t>c</m:t>
+                </m:r>
+              </m:e>
+            </m:d>
+          </m:e>
+          <m:sup>
+            <m:r>
+              <m:t>2</m:t>
+            </m:r>
+          </m:sup>
+        </m:sSup>
+        <m:r>
+          <m:t>​</m:t>
+        </m:r>
+      </m:oMath>
+      <w:r>
+        <w:t xml:space="preserve">, is a square, so it is never negative,</w:t>
+      </w:r>
+      <w:r>
+        <w:t xml:space="preserve"> </w:t>
+      </w:r>
+      <w:r>
+        <w:t xml:space="preserve">and it is zero exactly when</w:t>
+      </w:r>
+      <w:r>
+        <w:t xml:space="preserve"> </w:t>
+      </w:r>
+      <m:oMath>
+        <m:r>
+          <m:t>c</m:t>
+        </m:r>
+        <m:r>
+          <m:rPr>
+            <m:sty m:val="p"/>
+          </m:rPr>
+          <m:t>=</m:t>
+        </m:r>
+        <m:r>
+          <m:t>μ</m:t>
+        </m:r>
+      </m:oMath>
+      <w:r>
+        <w:t xml:space="preserve">.</w:t>
+      </w:r>
+      <w:r>
+        <w:t xml:space="preserve"> </w:t>
+      </w:r>
+      <w:r>
+        <w:t xml:space="preserve">So</w:t>
+      </w:r>
+      <w:r>
+        <w:t xml:space="preserve"> </w:t>
+      </w:r>
+      <m:oMath>
+        <m:r>
+          <m:t>c</m:t>
+        </m:r>
+        <m:r>
+          <m:rPr>
+            <m:sty m:val="p"/>
+          </m:rPr>
+          <m:t>=</m:t>
+        </m:r>
+        <m:r>
+          <m:t>μ</m:t>
+        </m:r>
+      </m:oMath>
+      <w:r>
+        <w:t xml:space="preserve"> </w:t>
+      </w:r>
+      <w:r>
+        <w:t xml:space="preserve">minimizes the expected squared error and no other number does,</w:t>
+      </w:r>
+      <w:r>
+        <w:t xml:space="preserve"> </w:t>
+      </w:r>
+      <w:r>
+        <w:t xml:space="preserve">and at</w:t>
+      </w:r>
+      <w:r>
+        <w:t xml:space="preserve"> </w:t>
+      </w:r>
+      <m:oMath>
+        <m:r>
+          <m:t>c</m:t>
+        </m:r>
+        <m:r>
+          <m:rPr>
+            <m:sty m:val="p"/>
+          </m:rPr>
+          <m:t>=</m:t>
+        </m:r>
+        <m:r>
+          <m:t>μ</m:t>
+        </m:r>
+      </m:oMath>
+      <w:r>
+        <w:t xml:space="preserve"> </w:t>
+      </w:r>
+      <w:r>
+        <w:t xml:space="preserve">the expected squared error is</w:t>
+      </w:r>
+      <w:r>
+        <w:t xml:space="preserve"> </w:t>
+      </w:r>
+      <m:oMath>
+        <m:r>
+          <m:rPr>
+            <m:sty m:val="p"/>
+          </m:rPr>
+          <m:t>Var</m:t>
+        </m:r>
+        <m:r>
+          <m:t>​</m:t>
+        </m:r>
+        <m:d>
+          <m:dPr>
+            <m:begChr m:val="("/>
+            <m:sepChr m:val=""/>
+            <m:endChr m:val=")"/>
+            <m:grow/>
+          </m:dPr>
+          <m:e>
+            <m:r>
+              <m:t>Y</m:t>
+            </m:r>
+          </m:e>
+        </m:d>
+        <m:r>
+          <m:t>​</m:t>
+        </m:r>
+      </m:oMath>
+      <w:r>
+        <w:t xml:space="preserve">.</w:t>
+      </w:r>
+    </w:p>
+    <w:bookmarkStart w:id="57" w:name="exm-best-constant-auto"/>
+    <w:p>
+      <w:pPr>
+        <w:pStyle w:val="BodyText"/>
+      </w:pPr>
+      <w:r>
+        <w:rPr>
+          <w:b/>
+          <w:bCs/>
+        </w:rPr>
+        <w:t xml:space="preserve">Example 9 (The best constant prediction of fuel economy)</w:t>
+      </w:r>
+      <w:r>
+        <w:t xml:space="preserve"> </w:t>
+      </w:r>
+      <w:r>
+        <w:t xml:space="preserve">Take the 392 cars in the Auto data</w:t>
+      </w:r>
+      <w:r>
+        <w:t xml:space="preserve"> </w:t>
+      </w:r>
+      <w:hyperlink r:id="rId56">
+        <w:r>
+          <w:rPr>
+            <w:rStyle w:val="Hyperlink"/>
+          </w:rPr>
+          <w:t xml:space="preserve">described on the limit theorems page</w:t>
+        </w:r>
+      </w:hyperlink>
+      <w:r>
+        <w:t xml:space="preserve"> </w:t>
+      </w:r>
+      <w:r>
+        <w:t xml:space="preserve">as the whole population,</w:t>
+      </w:r>
+      <w:r>
+        <w:t xml:space="preserve"> </w:t>
+      </w:r>
+      <w:r>
+        <w:t xml:space="preserve">and predict the fuel economy (</w:t>
+      </w:r>
+      <w:r>
+        <w:rPr>
+          <w:rStyle w:val="VerbatimChar"/>
+        </w:rPr>
+        <w:t xml:space="preserve">mpg</w:t>
+      </w:r>
+      <w:r>
+        <w:t xml:space="preserve">) of a car drawn at random with one number</w:t>
+      </w:r>
+      <w:r>
+        <w:t xml:space="preserve"> </w:t>
+      </w:r>
+      <m:oMath>
+        <m:r>
+          <m:t>c</m:t>
+        </m:r>
+      </m:oMath>
+      <w:r>
+        <w:t xml:space="preserve">.</w:t>
+      </w:r>
+      <w:r>
+        <w:t xml:space="preserve"> </w:t>
+      </w:r>
+      <w:r>
+        <w:t xml:space="preserve">The code below computes the expected squared error of three constants,</w:t>
+      </w:r>
+      <w:r>
+        <w:t xml:space="preserve"> </w:t>
+      </w:r>
+      <w:r>
+        <w:t xml:space="preserve">and sets each beside the right side of</w:t>
+      </w:r>
+      <w:r>
+        <w:t xml:space="preserve"> </w:t>
+      </w:r>
+      <w:hyperlink w:anchor="eq-constant-prediction-decompose">
+        <w:r>
+          <w:rPr>
+            <w:rStyle w:val="Hyperlink"/>
+          </w:rPr>
+          <w:t xml:space="preserve">Equation 2</w:t>
+        </w:r>
+      </w:hyperlink>
+      <w:r>
+        <w:t xml:space="preserve">.</w:t>
+      </w:r>
+    </w:p>
+    <w:p>
+      <w:pPr>
+        <w:pStyle w:val="SourceCode"/>
+      </w:pPr>
+      <w:r>
+        <w:rPr>
+          <w:rStyle w:val="NormalTok"/>
+        </w:rPr>
+        <w:t xml:space="preserve">mpg </w:t>
+      </w:r>
+      <w:r>
+        <w:rPr>
+          <w:rStyle w:val="OtherTok"/>
+        </w:rPr>
+        <w:t xml:space="preserve">&lt;-</w:t>
+      </w:r>
+      <w:r>
+        <w:rPr>
+          <w:rStyle w:val="NormalTok"/>
+        </w:rPr>
+        <w:t xml:space="preserve"> </w:t>
+      </w:r>
+      <w:r>
+        <w:rPr>
+          <w:rStyle w:val="FunctionTok"/>
+        </w:rPr>
+        <w:t xml:space="preserve">read.csv</w:t>
+      </w:r>
+      <w:r>
+        <w:rPr>
+          <w:rStyle w:val="NormalTok"/>
+        </w:rPr>
+        <w:t xml:space="preserve">(</w:t>
+      </w:r>
+      <w:r>
+        <w:rPr>
+          <w:rStyle w:val="StringTok"/>
+        </w:rPr>
+        <w:t xml:space="preserve">"data/auto.csv"</w:t>
+      </w:r>
+      <w:r>
+        <w:rPr>
+          <w:rStyle w:val="NormalTok"/>
+        </w:rPr>
+        <w:t xml:space="preserve">)</w:t>
+      </w:r>
+      <w:r>
+        <w:rPr>
+          <w:rStyle w:val="SpecialCharTok"/>
+        </w:rPr>
+        <w:t xml:space="preserve">$</w:t>
+      </w:r>
+      <w:r>
+        <w:rPr>
+          <w:rStyle w:val="NormalTok"/>
+        </w:rPr>
+        <w:t xml:space="preserve">mpg</w:t>
+      </w:r>
+      <w:r>
+        <w:br/>
+      </w:r>
+      <w:r>
+        <w:rPr>
+          <w:rStyle w:val="NormalTok"/>
+        </w:rPr>
+        <w:t xml:space="preserve">mu </w:t>
+      </w:r>
+      <w:r>
+        <w:rPr>
+          <w:rStyle w:val="OtherTok"/>
+        </w:rPr>
+        <w:t xml:space="preserve">&lt;-</w:t>
+      </w:r>
+      <w:r>
+        <w:rPr>
+          <w:rStyle w:val="NormalTok"/>
+        </w:rPr>
+        <w:t xml:space="preserve"> </w:t>
+      </w:r>
+      <w:r>
+        <w:rPr>
+          <w:rStyle w:val="FunctionTok"/>
+        </w:rPr>
+        <w:t xml:space="preserve">mean</w:t>
+      </w:r>
+      <w:r>
+        <w:rPr>
+          <w:rStyle w:val="NormalTok"/>
+        </w:rPr>
+        <w:t xml:space="preserve">(mpg)</w:t>
+      </w:r>
+      <w:r>
+        <w:br/>
+      </w:r>
+      <w:r>
+        <w:rPr>
+          <w:rStyle w:val="NormalTok"/>
+        </w:rPr>
+        <w:t xml:space="preserve">sigma2 </w:t>
+      </w:r>
+      <w:r>
+        <w:rPr>
+          <w:rStyle w:val="OtherTok"/>
+        </w:rPr>
+        <w:t xml:space="preserve">&lt;-</w:t>
+      </w:r>
+      <w:r>
+        <w:rPr>
+          <w:rStyle w:val="NormalTok"/>
+        </w:rPr>
+        <w:t xml:space="preserve"> </w:t>
+      </w:r>
+      <w:r>
+        <w:rPr>
+          <w:rStyle w:val="FunctionTok"/>
+        </w:rPr>
+        <w:t xml:space="preserve">mean</w:t>
+      </w:r>
+      <w:r>
+        <w:rPr>
+          <w:rStyle w:val="NormalTok"/>
+        </w:rPr>
+        <w:t xml:space="preserve">((mpg </w:t>
+      </w:r>
+      <w:r>
+        <w:rPr>
+          <w:rStyle w:val="SpecialCharTok"/>
+        </w:rPr>
+        <w:t xml:space="preserve">-</w:t>
+      </w:r>
+      <w:r>
+        <w:rPr>
+          <w:rStyle w:val="NormalTok"/>
+        </w:rPr>
+        <w:t xml:space="preserve"> mu)</w:t>
+      </w:r>
+      <w:r>
+        <w:rPr>
+          <w:rStyle w:val="SpecialCharTok"/>
+        </w:rPr>
+        <w:t xml:space="preserve">^</w:t>
+      </w:r>
+      <w:r>
+        <w:rPr>
+          <w:rStyle w:val="DecValTok"/>
+        </w:rPr>
+        <w:t xml:space="preserve">2</w:t>
+      </w:r>
+      <w:r>
+        <w:rPr>
+          <w:rStyle w:val="NormalTok"/>
+        </w:rPr>
+        <w:t xml:space="preserve">)</w:t>
+      </w:r>
+      <w:r>
+        <w:br/>
+      </w:r>
+      <w:r>
+        <w:br/>
+      </w:r>
+      <w:r>
+        <w:rPr>
+          <w:rStyle w:val="NormalTok"/>
+        </w:rPr>
+        <w:t xml:space="preserve">c_values </w:t>
+      </w:r>
+      <w:r>
+        <w:rPr>
+          <w:rStyle w:val="OtherTok"/>
+        </w:rPr>
+        <w:t xml:space="preserve">&lt;-</w:t>
+      </w:r>
+      <w:r>
+        <w:rPr>
+          <w:rStyle w:val="NormalTok"/>
+        </w:rPr>
+        <w:t xml:space="preserve"> </w:t>
+      </w:r>
+      <w:r>
+        <w:rPr>
+          <w:rStyle w:val="FunctionTok"/>
+        </w:rPr>
+        <w:t xml:space="preserve">c</w:t>
+      </w:r>
+      <w:r>
+        <w:rPr>
+          <w:rStyle w:val="NormalTok"/>
+        </w:rPr>
+        <w:t xml:space="preserve">(</w:t>
+      </w:r>
+      <w:r>
+        <w:rPr>
+          <w:rStyle w:val="AttributeTok"/>
+        </w:rPr>
+        <w:t xml:space="preserve">mean =</w:t>
+      </w:r>
+      <w:r>
+        <w:rPr>
+          <w:rStyle w:val="NormalTok"/>
+        </w:rPr>
+        <w:t xml:space="preserve"> mu, </w:t>
+      </w:r>
+      <w:r>
+        <w:rPr>
+          <w:rStyle w:val="AttributeTok"/>
+        </w:rPr>
+        <w:t xml:space="preserve">median =</w:t>
+      </w:r>
+      <w:r>
+        <w:rPr>
+          <w:rStyle w:val="NormalTok"/>
+        </w:rPr>
+        <w:t xml:space="preserve"> </w:t>
+      </w:r>
+      <w:r>
+        <w:rPr>
+          <w:rStyle w:val="FunctionTok"/>
+        </w:rPr>
+        <w:t xml:space="preserve">median</w:t>
+      </w:r>
+      <w:r>
+        <w:rPr>
+          <w:rStyle w:val="NormalTok"/>
+        </w:rPr>
+        <w:t xml:space="preserve">(mpg), </w:t>
+      </w:r>
+      <w:r>
+        <w:rPr>
+          <w:rStyle w:val="AttributeTok"/>
+        </w:rPr>
+        <w:t xml:space="preserve">twenty =</w:t>
+      </w:r>
+      <w:r>
+        <w:rPr>
+          <w:rStyle w:val="NormalTok"/>
+        </w:rPr>
+        <w:t xml:space="preserve"> </w:t>
+      </w:r>
+      <w:r>
+        <w:rPr>
+          <w:rStyle w:val="DecValTok"/>
+        </w:rPr>
+        <w:t xml:space="preserve">20</w:t>
+      </w:r>
+      <w:r>
+        <w:rPr>
+          <w:rStyle w:val="NormalTok"/>
+        </w:rPr>
+        <w:t xml:space="preserve">)</w:t>
+      </w:r>
+      <w:r>
+        <w:br/>
+      </w:r>
+      <w:r>
+        <w:rPr>
+          <w:rStyle w:val="FunctionTok"/>
+        </w:rPr>
+        <w:t xml:space="preserve">data.frame</w:t>
+      </w:r>
+      <w:r>
+        <w:rPr>
+          <w:rStyle w:val="NormalTok"/>
+        </w:rPr>
+        <w:t xml:space="preserve">(</w:t>
+      </w:r>
+      <w:r>
+        <w:br/>
+      </w:r>
+      <w:r>
+        <w:rPr>
+          <w:rStyle w:val="NormalTok"/>
+        </w:rPr>
+        <w:t xml:space="preserve">  </w:t>
+      </w:r>
+      <w:r>
+        <w:rPr>
+          <w:rStyle w:val="AttributeTok"/>
+        </w:rPr>
+        <w:t xml:space="preserve">c =</w:t>
+      </w:r>
+      <w:r>
+        <w:rPr>
+          <w:rStyle w:val="NormalTok"/>
+        </w:rPr>
+        <w:t xml:space="preserve"> c_values,</w:t>
+      </w:r>
+      <w:r>
+        <w:br/>
+      </w:r>
+      <w:r>
+        <w:rPr>
+          <w:rStyle w:val="NormalTok"/>
+        </w:rPr>
+        <w:t xml:space="preserve">  </w:t>
+      </w:r>
+      <w:r>
+        <w:rPr>
+          <w:rStyle w:val="AttributeTok"/>
+        </w:rPr>
+        <w:t xml:space="preserve">expected_squared_error =</w:t>
+      </w:r>
+      <w:r>
+        <w:rPr>
+          <w:rStyle w:val="NormalTok"/>
+        </w:rPr>
+        <w:t xml:space="preserve"> </w:t>
+      </w:r>
+      <w:r>
+        <w:rPr>
+          <w:rStyle w:val="FunctionTok"/>
+        </w:rPr>
+        <w:t xml:space="preserve">sapply</w:t>
+      </w:r>
+      <w:r>
+        <w:rPr>
+          <w:rStyle w:val="NormalTok"/>
+        </w:rPr>
+        <w:t xml:space="preserve">(c_values, </w:t>
+      </w:r>
+      <w:r>
+        <w:rPr>
+          <w:rStyle w:val="ControlFlowTok"/>
+        </w:rPr>
+        <w:t xml:space="preserve">function</w:t>
+      </w:r>
+      <w:r>
+        <w:rPr>
+          <w:rStyle w:val="NormalTok"/>
+        </w:rPr>
+        <w:t xml:space="preserve">(cc) </w:t>
+      </w:r>
+      <w:r>
+        <w:rPr>
+          <w:rStyle w:val="FunctionTok"/>
+        </w:rPr>
+        <w:t xml:space="preserve">mean</w:t>
+      </w:r>
+      <w:r>
+        <w:rPr>
+          <w:rStyle w:val="NormalTok"/>
+        </w:rPr>
+        <w:t xml:space="preserve">((mpg </w:t>
+      </w:r>
+      <w:r>
+        <w:rPr>
+          <w:rStyle w:val="SpecialCharTok"/>
+        </w:rPr>
+        <w:t xml:space="preserve">-</w:t>
+      </w:r>
+      <w:r>
+        <w:rPr>
+          <w:rStyle w:val="NormalTok"/>
+        </w:rPr>
+        <w:t xml:space="preserve"> cc)</w:t>
+      </w:r>
+      <w:r>
+        <w:rPr>
+          <w:rStyle w:val="SpecialCharTok"/>
+        </w:rPr>
+        <w:t xml:space="preserve">^</w:t>
+      </w:r>
+      <w:r>
+        <w:rPr>
+          <w:rStyle w:val="DecValTok"/>
+        </w:rPr>
+        <w:t xml:space="preserve">2</w:t>
+      </w:r>
+      <w:r>
+        <w:rPr>
+          <w:rStyle w:val="NormalTok"/>
+        </w:rPr>
+        <w:t xml:space="preserve">)),</w:t>
+      </w:r>
+      <w:r>
+        <w:br/>
+      </w:r>
+      <w:r>
+        <w:rPr>
+          <w:rStyle w:val="NormalTok"/>
+        </w:rPr>
+        <w:t xml:space="preserve">  </w:t>
+      </w:r>
+      <w:r>
+        <w:rPr>
+          <w:rStyle w:val="AttributeTok"/>
+        </w:rPr>
+        <w:t xml:space="preserve">decomposition =</w:t>
+      </w:r>
+      <w:r>
+        <w:rPr>
+          <w:rStyle w:val="NormalTok"/>
+        </w:rPr>
+        <w:t xml:space="preserve"> sigma2 </w:t>
+      </w:r>
+      <w:r>
+        <w:rPr>
+          <w:rStyle w:val="SpecialCharTok"/>
+        </w:rPr>
+        <w:t xml:space="preserve">+</w:t>
+      </w:r>
+      <w:r>
+        <w:rPr>
+          <w:rStyle w:val="NormalTok"/>
+        </w:rPr>
+        <w:t xml:space="preserve"> (mu </w:t>
+      </w:r>
+      <w:r>
+        <w:rPr>
+          <w:rStyle w:val="SpecialCharTok"/>
+        </w:rPr>
+        <w:t xml:space="preserve">-</w:t>
+      </w:r>
+      <w:r>
+        <w:rPr>
+          <w:rStyle w:val="NormalTok"/>
+        </w:rPr>
+        <w:t xml:space="preserve"> c_values)</w:t>
+      </w:r>
+      <w:r>
+        <w:rPr>
+          <w:rStyle w:val="SpecialCharTok"/>
+        </w:rPr>
+        <w:t xml:space="preserve">^</w:t>
+      </w:r>
+      <w:r>
+        <w:rPr>
+          <w:rStyle w:val="DecValTok"/>
+        </w:rPr>
+        <w:t xml:space="preserve">2</w:t>
+      </w:r>
+      <w:r>
+        <w:br/>
+      </w:r>
+      <w:r>
+        <w:rPr>
+          <w:rStyle w:val="NormalTok"/>
+        </w:rPr>
+        <w:t xml:space="preserve">)</w:t>
+      </w:r>
+      <w:r>
+        <w:br/>
+      </w:r>
+      <w:r>
+        <w:rPr>
+          <w:rStyle w:val="CommentTok"/>
+        </w:rPr>
+        <w:t xml:space="preserve">#&gt; # A tibble: 3 × 3</w:t>
+      </w:r>
+      <w:r>
+        <w:br/>
+      </w:r>
+      <w:r>
+        <w:rPr>
+          <w:rStyle w:val="CommentTok"/>
+        </w:rPr>
+        <w:t xml:space="preserve">#&gt;       c expected_squared_error decomposition</w:t>
+      </w:r>
+      <w:r>
+        <w:br/>
+      </w:r>
+      <w:r>
+        <w:rPr>
+          <w:rStyle w:val="CommentTok"/>
+        </w:rPr>
+        <w:t xml:space="preserve">#&gt;   &lt;dbl&gt;                  &lt;dbl&gt;         &lt;dbl&gt;</w:t>
+      </w:r>
+      <w:r>
+        <w:br/>
+      </w:r>
+      <w:r>
+        <w:rPr>
+          <w:rStyle w:val="CommentTok"/>
+        </w:rPr>
+        <w:t xml:space="preserve">#&gt; 1  23.4                   60.8          60.8</w:t>
+      </w:r>
+      <w:r>
+        <w:br/>
+      </w:r>
+      <w:r>
+        <w:rPr>
+          <w:rStyle w:val="CommentTok"/>
+        </w:rPr>
+        <w:t xml:space="preserve">#&gt; 2  22.8                   61.2          61.2</w:t>
+      </w:r>
+      <w:r>
+        <w:br/>
+      </w:r>
+      <w:r>
+        <w:rPr>
+          <w:rStyle w:val="CommentTok"/>
+        </w:rPr>
+        <w:t xml:space="preserve">#&gt; 3  20                     72.6          72.6</w:t>
+      </w:r>
+    </w:p>
+    <w:p>
+      <w:pPr>
+        <w:pStyle w:val="FirstParagraph"/>
+      </w:pPr>
+      <w:r>
+        <w:t xml:space="preserve">The two columns agree, as</w:t>
+      </w:r>
+      <w:r>
+        <w:t xml:space="preserve"> </w:t>
+      </w:r>
+      <w:hyperlink w:anchor="thm-constant-prediction-decompose">
+        <w:r>
+          <w:rPr>
+            <w:rStyle w:val="Hyperlink"/>
+          </w:rPr>
+          <w:t xml:space="preserve">Theorem 5</w:t>
+        </w:r>
+      </w:hyperlink>
+      <w:r>
+        <w:t xml:space="preserve"> </w:t>
+      </w:r>
+      <w:r>
+        <w:t xml:space="preserve">says.</w:t>
+      </w:r>
+      <w:r>
+        <w:t xml:space="preserve"> </w:t>
+      </w:r>
+      <w:r>
+        <w:t xml:space="preserve">The mean, 23.45, has the smallest expected squared error, 60.76,</w:t>
+      </w:r>
+      <w:r>
+        <w:t xml:space="preserve"> </w:t>
+      </w:r>
+      <w:r>
+        <w:t xml:space="preserve">which is the variance of</w:t>
+      </w:r>
+      <w:r>
+        <w:t xml:space="preserve"> </w:t>
+      </w:r>
+      <w:r>
+        <w:rPr>
+          <w:rStyle w:val="VerbatimChar"/>
+        </w:rPr>
+        <w:t xml:space="preserve">mpg</w:t>
+      </w:r>
+      <w:r>
+        <w:t xml:space="preserve"> </w:t>
+      </w:r>
+      <w:r>
+        <w:t xml:space="preserve">over these cars (divisor the number of cars, not one fewer), as</w:t>
+      </w:r>
+      <w:r>
+        <w:t xml:space="preserve"> </w:t>
+      </w:r>
+      <w:hyperlink w:anchor="cor-best-constant">
+        <w:r>
+          <w:rPr>
+            <w:rStyle w:val="Hyperlink"/>
+          </w:rPr>
+          <w:t xml:space="preserve">Corollary 1</w:t>
+        </w:r>
+      </w:hyperlink>
+      <w:r>
+        <w:t xml:space="preserve"> </w:t>
+      </w:r>
+      <w:r>
+        <w:t xml:space="preserve">says;</w:t>
+      </w:r>
+      <w:r>
+        <w:t xml:space="preserve"> </w:t>
+      </w:r>
+      <w:r>
+        <w:t xml:space="preserve">the median and</w:t>
+      </w:r>
+      <w:r>
+        <w:t xml:space="preserve"> </w:t>
+      </w:r>
+      <m:oMath>
+        <m:r>
+          <m:t>c</m:t>
+        </m:r>
+        <m:r>
+          <m:rPr>
+            <m:sty m:val="p"/>
+          </m:rPr>
+          <m:t>=</m:t>
+        </m:r>
+        <m:r>
+          <m:t>20</m:t>
+        </m:r>
+      </m:oMath>
+      <w:r>
+        <w:t xml:space="preserve"> </w:t>
+      </w:r>
+      <w:r>
+        <w:t xml:space="preserve">are each worse by</w:t>
+      </w:r>
+      <w:r>
+        <w:t xml:space="preserve"> </w:t>
+      </w:r>
+      <m:oMath>
+        <m:r>
+          <m:t>​</m:t>
+        </m:r>
+        <m:sSup>
+          <m:e>
+            <m:d>
+              <m:dPr>
+                <m:begChr m:val="("/>
+                <m:sepChr m:val=""/>
+                <m:endChr m:val=")"/>
+                <m:grow/>
+              </m:dPr>
+              <m:e>
+                <m:r>
+                  <m:t>μ</m:t>
+                </m:r>
+                <m:r>
+                  <m:rPr>
+                    <m:sty m:val="p"/>
+                  </m:rPr>
+                  <m:t>−</m:t>
+                </m:r>
+                <m:r>
+                  <m:t>c</m:t>
+                </m:r>
+              </m:e>
+            </m:d>
+          </m:e>
+          <m:sup>
+            <m:r>
+              <m:t>2</m:t>
+            </m:r>
+          </m:sup>
+        </m:sSup>
+        <m:r>
+          <m:t>​</m:t>
+        </m:r>
+      </m:oMath>
+      <w:r>
+        <w:t xml:space="preserve">.</w:t>
+      </w:r>
+    </w:p>
+    <w:bookmarkEnd w:id="57"/>
+    <w:bookmarkEnd w:id="58"/>
+    <w:bookmarkStart w:id="66" w:name="sec-bias-variance-prediction"/>
+    <w:p>
+      <w:pPr>
+        <w:pStyle w:val="Heading2"/>
+      </w:pPr>
+      <w:r>
+        <w:t xml:space="preserve">4 Bias, variance, and prediction error</w:t>
+      </w:r>
+    </w:p>
+    <w:bookmarkStart w:id="59" w:name="exr-prediction-error"/>
     <w:p>
       <w:pPr>
         <w:pStyle w:val="FirstParagraph"/>
@@ -14028,8 +16716,8 @@
         <w:t xml:space="preserve">and which cannot?</w:t>
       </w:r>
     </w:p>
-    <w:bookmarkEnd w:id="52"/>
-    <w:bookmarkStart w:id="53" w:name="sol-prediction-error"/>
+    <w:bookmarkEnd w:id="59"/>
+    <w:bookmarkStart w:id="60" w:name="sol-prediction-error"/>
     <w:p>
       <w:pPr>
         <w:pStyle w:val="FirstParagraph"/>
@@ -14321,8 +17009,8 @@
         <w:t xml:space="preserve">in the new response.</w:t>
       </w:r>
     </w:p>
-    <w:bookmarkEnd w:id="53"/>
-    <w:bookmarkStart w:id="55" w:name="def-prediction-bias"/>
+    <w:bookmarkEnd w:id="60"/>
+    <w:bookmarkStart w:id="62" w:name="def-prediction-bias"/>
     <w:p>
       <w:pPr>
         <w:pStyle w:val="FirstParagraph"/>
@@ -14431,7 +17119,7 @@
       <w:r>
         <w:t xml:space="preserve"> </w:t>
       </w:r>
-      <w:hyperlink r:id="rId54">
+      <w:hyperlink r:id="rId61">
         <w:r>
           <w:rPr>
             <w:rStyle w:val="Hyperlink"/>
@@ -14781,7 +17469,7 @@
         </m:oMath>
       </m:oMathPara>
     </w:p>
-    <w:bookmarkEnd w:id="55"/>
+    <w:bookmarkEnd w:id="62"/>
     <w:p>
       <w:pPr>
         <w:pStyle w:val="FirstParagraph"/>
@@ -14815,7 +17503,7 @@
         <w:t xml:space="preserve">the bias reflects the error introduced by approximating a real-world relationship by a model.</w:t>
       </w:r>
     </w:p>
-    <w:bookmarkStart w:id="56" w:name="exm-prediction-bias"/>
+    <w:bookmarkStart w:id="63" w:name="exm-prediction-bias"/>
     <w:p>
       <w:pPr>
         <w:pStyle w:val="BodyText"/>
@@ -14825,7 +17513,7 @@
           <w:b/>
           <w:bCs/>
         </w:rPr>
-        <w:t xml:space="preserve">Example 9 (Computing the bias of a prediction)</w:t>
+        <w:t xml:space="preserve">Example 10 (Computing the bias of a prediction)</w:t>
       </w:r>
       <w:r>
         <w:t xml:space="preserve"> </w:t>
@@ -15125,8 +17813,8 @@
         <w:t xml:space="preserve">.</w:t>
       </w:r>
     </w:p>
-    <w:bookmarkEnd w:id="56"/>
-    <w:bookmarkStart w:id="57" w:name="thm-prediction-error"/>
+    <w:bookmarkEnd w:id="63"/>
+    <w:bookmarkStart w:id="64" w:name="thm-prediction-error"/>
     <w:p>
       <w:pPr>
         <w:pStyle w:val="BodyText"/>
@@ -15136,7 +17824,7 @@
           <w:b/>
           <w:bCs/>
         </w:rPr>
-        <w:t xml:space="preserve">Theorem 5 (Expected squared prediction error)</w:t>
+        <w:t xml:space="preserve">Theorem 6 (Expected squared prediction error)</w:t>
       </w:r>
       <w:r>
         <w:t xml:space="preserve"> </w:t>
@@ -15774,7 +18462,7 @@
         </m:oMath>
       </m:oMathPara>
     </w:p>
-    <w:bookmarkEnd w:id="57"/>
+    <w:bookmarkEnd w:id="64"/>
     <w:p>
       <w:pPr>
         <w:pStyle w:val="FirstParagraph"/>
@@ -17255,7 +19943,7 @@
         <w:t xml:space="preserve">Adding the three terms gives the claim.</w:t>
       </w:r>
     </w:p>
-    <w:bookmarkStart w:id="58" w:name="def-irreducible-error"/>
+    <w:bookmarkStart w:id="65" w:name="def-irreducible-error"/>
     <w:p>
       <w:pPr>
         <w:pStyle w:val="BodyText"/>
@@ -17281,7 +19969,7 @@
           <w:rPr>
             <w:rStyle w:val="Hyperlink"/>
           </w:rPr>
-          <w:t xml:space="preserve">Theorem 5</w:t>
+          <w:t xml:space="preserve">Theorem 6</w:t>
         </w:r>
       </w:hyperlink>
       <w:r>
@@ -17457,7 +20145,7 @@
         <w:t xml:space="preserve">.</w:t>
       </w:r>
     </w:p>
-    <w:bookmarkEnd w:id="58"/>
+    <w:bookmarkEnd w:id="65"/>
     <w:p>
       <w:pPr>
         <w:pStyle w:val="BodyText"/>
@@ -17485,17 +20173,17 @@
         <w:t xml:space="preserve">.</w:t>
       </w:r>
     </w:p>
-    <w:bookmarkEnd w:id="59"/>
-    <w:bookmarkStart w:id="107" w:name="covariance"/>
+    <w:bookmarkEnd w:id="66"/>
+    <w:bookmarkStart w:id="114" w:name="covariance"/>
     <w:p>
       <w:pPr>
         <w:pStyle w:val="Heading2"/>
       </w:pPr>
       <w:r>
-        <w:t xml:space="preserve">4 Covariance</w:t>
+        <w:t xml:space="preserve">5 Covariance</w:t>
       </w:r>
     </w:p>
-    <w:bookmarkStart w:id="60" w:name="def-cov"/>
+    <w:bookmarkStart w:id="67" w:name="def-cov"/>
     <w:p>
       <w:pPr>
         <w:pStyle w:val="FirstParagraph"/>
@@ -17851,8 +20539,8 @@
         </m:oMath>
       </m:oMathPara>
     </w:p>
-    <w:bookmarkEnd w:id="60"/>
-    <w:bookmarkStart w:id="61" w:name="thm-alt-cov"/>
+    <w:bookmarkEnd w:id="67"/>
+    <w:bookmarkStart w:id="68" w:name="thm-alt-cov"/>
     <w:p>
       <w:pPr>
         <w:pStyle w:val="FirstParagraph"/>
@@ -17862,7 +20550,7 @@
           <w:b/>
           <w:bCs/>
         </w:rPr>
-        <w:t xml:space="preserve">Theorem 6 (Alternative formula for covariance)</w:t>
+        <w:t xml:space="preserve">Theorem 7 (Alternative formula for covariance)</w:t>
       </w:r>
     </w:p>
     <w:p>
@@ -18001,7 +20689,7 @@
         </m:oMath>
       </m:oMathPara>
     </w:p>
-    <w:bookmarkEnd w:id="61"/>
+    <w:bookmarkEnd w:id="68"/>
     <w:p>
       <w:pPr>
         <w:pStyle w:val="FirstParagraph"/>
@@ -18820,7 +21508,7 @@
         </m:oMath>
       </m:oMathPara>
     </w:p>
-    <w:bookmarkStart w:id="62" w:name="exm-alt-cov"/>
+    <w:bookmarkStart w:id="69" w:name="exm-alt-cov"/>
     <w:p>
       <w:pPr>
         <w:pStyle w:val="FirstParagraph"/>
@@ -18830,7 +21518,7 @@
           <w:b/>
           <w:bCs/>
         </w:rPr>
-        <w:t xml:space="preserve">Example 10 (Covariance of a binary exposure and outcome)</w:t>
+        <w:t xml:space="preserve">Example 11 (Covariance of a binary exposure and outcome)</w:t>
       </w:r>
       <w:r>
         <w:t xml:space="preserve"> </w:t>
@@ -19288,8 +21976,8 @@
         </m:oMath>
       </m:oMathPara>
     </w:p>
-    <w:bookmarkEnd w:id="62"/>
-    <w:bookmarkStart w:id="64" w:name="thm-indpt-uncorrelated"/>
+    <w:bookmarkEnd w:id="69"/>
+    <w:bookmarkStart w:id="71" w:name="thm-indpt-uncorrelated"/>
     <w:p>
       <w:pPr>
         <w:pStyle w:val="FirstParagraph"/>
@@ -19299,7 +21987,7 @@
           <w:b/>
           <w:bCs/>
         </w:rPr>
-        <w:t xml:space="preserve">Theorem 7 (Independent random variables have zero covariance)</w:t>
+        <w:t xml:space="preserve">Theorem 8 (Independent random variables have zero covariance)</w:t>
       </w:r>
       <w:r>
         <w:t xml:space="preserve"> </w:t>
@@ -19338,7 +22026,7 @@
       <w:r>
         <w:t xml:space="preserve"> </w:t>
       </w:r>
-      <w:hyperlink r:id="rId63">
+      <w:hyperlink r:id="rId70">
         <w:r>
           <w:rPr>
             <w:rStyle w:val="Hyperlink"/>
@@ -19634,7 +22322,7 @@
         <w:t xml:space="preserve">.</w:t>
       </w:r>
     </w:p>
-    <w:bookmarkEnd w:id="64"/>
+    <w:bookmarkEnd w:id="71"/>
     <w:p>
       <w:pPr>
         <w:pStyle w:val="BodyText"/>
@@ -19784,7 +22472,7 @@
       <w:r>
         <w:t xml:space="preserve"> </w:t>
       </w:r>
-      <w:hyperlink r:id="rId65">
+      <w:hyperlink r:id="rId72">
         <w:r>
           <w:rPr>
             <w:rStyle w:val="Hyperlink"/>
@@ -19798,7 +22486,7 @@
       <w:r>
         <w:t xml:space="preserve">(</w:t>
       </w:r>
-      <w:hyperlink r:id="rId66">
+      <w:hyperlink r:id="rId73">
         <w:r>
           <w:rPr>
             <w:rStyle w:val="Hyperlink"/>
@@ -19980,7 +22668,7 @@
       <w:r>
         <w:t xml:space="preserve"> </w:t>
       </w:r>
-      <w:hyperlink r:id="rId63">
+      <w:hyperlink r:id="rId70">
         <w:r>
           <w:rPr>
             <w:rStyle w:val="Hyperlink"/>
@@ -22486,7 +25174,7 @@
         </m:oMath>
       </m:oMathPara>
     </w:p>
-    <w:bookmarkStart w:id="68" w:name="exm-indpt-uncorrelated"/>
+    <w:bookmarkStart w:id="75" w:name="exm-indpt-uncorrelated"/>
     <w:p>
       <w:pPr>
         <w:pStyle w:val="FirstParagraph"/>
@@ -22496,7 +25184,7 @@
           <w:b/>
           <w:bCs/>
         </w:rPr>
-        <w:t xml:space="preserve">Example 11 (Two independent coin flips)</w:t>
+        <w:t xml:space="preserve">Example 12 (Two independent coin flips)</w:t>
       </w:r>
       <w:r>
         <w:t xml:space="preserve"> </w:t>
@@ -22553,7 +25241,7 @@
       <w:r>
         <w:t xml:space="preserve"> </w:t>
       </w:r>
-      <w:hyperlink r:id="rId67">
+      <w:hyperlink r:id="rId74">
         <w:r>
           <w:rPr>
             <w:rStyle w:val="Hyperlink"/>
@@ -23124,7 +25812,7 @@
           <w:rPr>
             <w:rStyle w:val="Hyperlink"/>
           </w:rPr>
-          <w:t xml:space="preserve">Theorem 7</w:t>
+          <w:t xml:space="preserve">Theorem 8</w:t>
         </w:r>
       </w:hyperlink>
       <w:r>
@@ -23134,8 +25822,8 @@
         <w:t xml:space="preserve">requires.</w:t>
       </w:r>
     </w:p>
-    <w:bookmarkEnd w:id="68"/>
-    <w:bookmarkStart w:id="69" w:name="exm-uncorrelated-not-indpt"/>
+    <w:bookmarkEnd w:id="75"/>
+    <w:bookmarkStart w:id="76" w:name="exm-uncorrelated-not-indpt"/>
     <w:p>
       <w:pPr>
         <w:pStyle w:val="BodyText"/>
@@ -23145,7 +25833,7 @@
           <w:b/>
           <w:bCs/>
         </w:rPr>
-        <w:t xml:space="preserve">Example 12 (Zero covariance without independence)</w:t>
+        <w:t xml:space="preserve">Example 13 (Zero covariance without independence)</w:t>
       </w:r>
       <w:r>
         <w:t xml:space="preserve"> </w:t>
@@ -23161,7 +25849,7 @@
           <w:rPr>
             <w:rStyle w:val="Hyperlink"/>
           </w:rPr>
-          <w:t xml:space="preserve">Theorem 7</w:t>
+          <w:t xml:space="preserve">Theorem 8</w:t>
         </w:r>
       </w:hyperlink>
       <w:r>
@@ -24359,8 +27047,8 @@
         </m:oMath>
       </m:oMathPara>
     </w:p>
-    <w:bookmarkEnd w:id="69"/>
-    <w:bookmarkStart w:id="70" w:name="def-correlation"/>
+    <w:bookmarkEnd w:id="76"/>
+    <w:bookmarkStart w:id="77" w:name="def-correlation"/>
     <w:p>
       <w:pPr>
         <w:pStyle w:val="FirstParagraph"/>
@@ -24632,7 +27320,7 @@
         </m:oMath>
       </m:oMathPara>
     </w:p>
-    <w:bookmarkEnd w:id="70"/>
+    <w:bookmarkEnd w:id="77"/>
     <w:p>
       <w:pPr>
         <w:pStyle w:val="FirstParagraph"/>
@@ -24688,7 +27376,7 @@
         <w:t xml:space="preserve">the sample (Pearson) correlation coefficient computed from data estimates it.</w:t>
       </w:r>
     </w:p>
-    <w:bookmarkStart w:id="71" w:name="exm-correlation"/>
+    <w:bookmarkStart w:id="78" w:name="exm-correlation"/>
     <w:p>
       <w:pPr>
         <w:pStyle w:val="BodyText"/>
@@ -24698,7 +27386,7 @@
           <w:b/>
           <w:bCs/>
         </w:rPr>
-        <w:t xml:space="preserve">Example 13 (Correlation of a binary exposure and outcome)</w:t>
+        <w:t xml:space="preserve">Example 14 (Correlation of a binary exposure and outcome)</w:t>
       </w:r>
       <w:r>
         <w:t xml:space="preserve"> </w:t>
@@ -24714,7 +27402,7 @@
           <w:rPr>
             <w:rStyle w:val="Hyperlink"/>
           </w:rPr>
-          <w:t xml:space="preserve">Example 10</w:t>
+          <w:t xml:space="preserve">Example 11</w:t>
         </w:r>
       </w:hyperlink>
       <w:r>
@@ -25335,8 +28023,8 @@
         </m:oMath>
       </m:oMathPara>
     </w:p>
-    <w:bookmarkEnd w:id="71"/>
-    <w:bookmarkStart w:id="72" w:name="def-uncorrelated"/>
+    <w:bookmarkEnd w:id="78"/>
+    <w:bookmarkStart w:id="79" w:name="def-uncorrelated"/>
     <w:p>
       <w:pPr>
         <w:pStyle w:val="FirstParagraph"/>
@@ -25585,7 +28273,7 @@
         </m:oMath>
       </m:oMathPara>
     </w:p>
-    <w:bookmarkEnd w:id="72"/>
+    <w:bookmarkEnd w:id="79"/>
     <w:p>
       <w:pPr>
         <w:pStyle w:val="FirstParagraph"/>
@@ -25605,7 +28293,7 @@
           <w:rPr>
             <w:rStyle w:val="Hyperlink"/>
           </w:rPr>
-          <w:t xml:space="preserve">Theorem 7</w:t>
+          <w:t xml:space="preserve">Theorem 8</w:t>
         </w:r>
       </w:hyperlink>
       <w:r>
@@ -25628,7 +28316,7 @@
           <w:rPr>
             <w:rStyle w:val="Hyperlink"/>
           </w:rPr>
-          <w:t xml:space="preserve">Example 12</w:t>
+          <w:t xml:space="preserve">Example 13</w:t>
         </w:r>
       </w:hyperlink>
       <w:r>
@@ -25638,7 +28326,7 @@
         <w:t xml:space="preserve">shows the converse fails.</w:t>
       </w:r>
     </w:p>
-    <w:bookmarkStart w:id="73" w:name="exm-uncorrelated"/>
+    <w:bookmarkStart w:id="80" w:name="exm-uncorrelated"/>
     <w:p>
       <w:pPr>
         <w:pStyle w:val="BodyText"/>
@@ -25648,7 +28336,7 @@
           <w:b/>
           <w:bCs/>
         </w:rPr>
-        <w:t xml:space="preserve">Example 14 (Correlated and uncorrelated pairs)</w:t>
+        <w:t xml:space="preserve">Example 15 (Correlated and uncorrelated pairs)</w:t>
       </w:r>
       <w:r>
         <w:t xml:space="preserve"> </w:t>
@@ -25664,7 +28352,7 @@
           <w:rPr>
             <w:rStyle w:val="Hyperlink"/>
           </w:rPr>
-          <w:t xml:space="preserve">Example 12</w:t>
+          <w:t xml:space="preserve">Example 13</w:t>
         </w:r>
       </w:hyperlink>
       <w:r>
@@ -25787,7 +28475,7 @@
           <w:rPr>
             <w:rStyle w:val="Hyperlink"/>
           </w:rPr>
-          <w:t xml:space="preserve">Example 10</w:t>
+          <w:t xml:space="preserve">Example 11</w:t>
         </w:r>
       </w:hyperlink>
       <w:r>
@@ -25860,8 +28548,8 @@
         <w:t xml:space="preserve">so the binary exposure and outcome are not uncorrelated.</w:t>
       </w:r>
     </w:p>
-    <w:bookmarkEnd w:id="73"/>
-    <w:bookmarkStart w:id="74" w:name="cor-uncorrelated-cor-zero"/>
+    <w:bookmarkEnd w:id="80"/>
+    <w:bookmarkStart w:id="81" w:name="cor-uncorrelated-cor-zero"/>
     <w:p>
       <w:pPr>
         <w:pStyle w:val="BodyText"/>
@@ -25871,7 +28559,7 @@
           <w:b/>
           <w:bCs/>
         </w:rPr>
-        <w:t xml:space="preserve">Corollary 1 (Uncorrelated means zero correlation)</w:t>
+        <w:t xml:space="preserve">Corollary 2 (Uncorrelated means zero correlation)</w:t>
       </w:r>
       <w:r>
         <w:t xml:space="preserve"> </w:t>
@@ -26024,7 +28712,7 @@
         <w:t xml:space="preserve">.</w:t>
       </w:r>
     </w:p>
-    <w:bookmarkEnd w:id="74"/>
+    <w:bookmarkEnd w:id="81"/>
     <w:p>
       <w:pPr>
         <w:pStyle w:val="BodyText"/>
@@ -26424,7 +29112,7 @@
         <w:t xml:space="preserve">.</w:t>
       </w:r>
     </w:p>
-    <w:bookmarkStart w:id="75" w:name="def-cond-cov"/>
+    <w:bookmarkStart w:id="82" w:name="def-cond-cov"/>
     <w:p>
       <w:pPr>
         <w:pStyle w:val="BodyText"/>
@@ -26876,8 +29564,8 @@
         <w:t xml:space="preserve">.</w:t>
       </w:r>
     </w:p>
-    <w:bookmarkEnd w:id="75"/>
-    <w:bookmarkStart w:id="76" w:name="exm-cond-cov"/>
+    <w:bookmarkEnd w:id="82"/>
+    <w:bookmarkStart w:id="83" w:name="exm-cond-cov"/>
     <w:p>
       <w:pPr>
         <w:pStyle w:val="BodyText"/>
@@ -26887,7 +29575,7 @@
           <w:b/>
           <w:bCs/>
         </w:rPr>
-        <w:t xml:space="preserve">Example 15 (Conditional covariance of a variable with itself)</w:t>
+        <w:t xml:space="preserve">Example 16 (Conditional covariance of a variable with itself)</w:t>
       </w:r>
       <w:r>
         <w:t xml:space="preserve"> </w:t>
@@ -27148,8 +29836,8 @@
         <w:t xml:space="preserve">.</w:t>
       </w:r>
     </w:p>
-    <w:bookmarkEnd w:id="76"/>
-    <w:bookmarkStart w:id="77" w:name="thm-total-cov"/>
+    <w:bookmarkEnd w:id="83"/>
+    <w:bookmarkStart w:id="84" w:name="thm-total-cov"/>
     <w:p>
       <w:pPr>
         <w:pStyle w:val="BodyText"/>
@@ -27159,7 +29847,7 @@
           <w:b/>
           <w:bCs/>
         </w:rPr>
-        <w:t xml:space="preserve">Theorem 8 (Law of total covariance)</w:t>
+        <w:t xml:space="preserve">Theorem 9 (Law of total covariance)</w:t>
       </w:r>
       <w:r>
         <w:t xml:space="preserve"> </w:t>
@@ -27534,7 +30222,7 @@
         </m:oMath>
       </m:oMathPara>
     </w:p>
-    <w:bookmarkEnd w:id="77"/>
+    <w:bookmarkEnd w:id="84"/>
     <w:p>
       <w:pPr>
         <w:pStyle w:val="FirstParagraph"/>
@@ -30650,7 +33338,7 @@
         <w:t xml:space="preserve">.</w:t>
       </w:r>
     </w:p>
-    <w:bookmarkStart w:id="78" w:name="lem-cov-xx"/>
+    <w:bookmarkStart w:id="85" w:name="lem-cov-xx"/>
     <w:p>
       <w:pPr>
         <w:pStyle w:val="BodyText"/>
@@ -30814,7 +33502,7 @@
         </m:oMath>
       </m:oMathPara>
     </w:p>
-    <w:bookmarkEnd w:id="78"/>
+    <w:bookmarkEnd w:id="85"/>
     <w:p>
       <w:pPr>
         <w:pStyle w:val="FirstParagraph"/>
@@ -31216,7 +33904,7 @@
         </m:oMath>
       </m:oMathPara>
     </w:p>
-    <w:bookmarkStart w:id="79" w:name="def-cov-vec-x"/>
+    <w:bookmarkStart w:id="86" w:name="def-cov-vec-x"/>
     <w:p>
       <w:pPr>
         <w:pStyle w:val="FirstParagraph"/>
@@ -31567,8 +34255,8 @@
         </m:oMath>
       </m:oMathPara>
     </w:p>
-    <w:bookmarkEnd w:id="79"/>
-    <w:bookmarkStart w:id="80" w:name="thm-vcov-elements"/>
+    <w:bookmarkEnd w:id="86"/>
+    <w:bookmarkStart w:id="87" w:name="thm-vcov-elements"/>
     <w:p>
       <w:pPr>
         <w:pStyle w:val="FirstParagraph"/>
@@ -31578,7 +34266,7 @@
           <w:b/>
           <w:bCs/>
         </w:rPr>
-        <w:t xml:space="preserve">Theorem 9 (Elements of the variance-covariance matrix are pairwise covariances)</w:t>
+        <w:t xml:space="preserve">Theorem 10 (Elements of the variance-covariance matrix are pairwise covariances)</w:t>
       </w:r>
       <w:r>
         <w:t xml:space="preserve"> </w:t>
@@ -32429,7 +35117,7 @@
         </m:oMath>
       </m:oMathPara>
     </w:p>
-    <w:bookmarkEnd w:id="80"/>
+    <w:bookmarkEnd w:id="87"/>
     <w:p>
       <w:pPr>
         <w:pStyle w:val="FirstParagraph"/>
@@ -34694,7 +37382,7 @@
       <w:r>
         <w:t xml:space="preserve"> </w:t>
       </w:r>
-      <w:hyperlink r:id="rId81">
+      <w:hyperlink r:id="rId88">
         <w:r>
           <w:rPr>
             <w:rStyle w:val="Hyperlink"/>
@@ -34758,7 +37446,7 @@
         <w:t xml:space="preserve">.</w:t>
       </w:r>
     </w:p>
-    <w:bookmarkStart w:id="82" w:name="thm-vcov-vec"/>
+    <w:bookmarkStart w:id="89" w:name="thm-vcov-vec"/>
     <w:p>
       <w:pPr>
         <w:pStyle w:val="FirstParagraph"/>
@@ -34768,7 +37456,7 @@
           <w:b/>
           <w:bCs/>
         </w:rPr>
-        <w:t xml:space="preserve">Theorem 10 (Alternate expression for variance of a random vector)</w:t>
+        <w:t xml:space="preserve">Theorem 11 (Alternate expression for variance of a random vector)</w:t>
       </w:r>
     </w:p>
     <w:p>
@@ -34964,7 +37652,7 @@
         </m:oMath>
       </m:oMathPara>
     </w:p>
-    <w:bookmarkEnd w:id="82"/>
+    <w:bookmarkEnd w:id="89"/>
     <w:p>
       <w:pPr>
         <w:pStyle w:val="FirstParagraph"/>
@@ -35967,7 +38655,7 @@
         </m:oMath>
       </m:oMathPara>
     </w:p>
-    <w:bookmarkStart w:id="83" w:name="thm-var-lincom"/>
+    <w:bookmarkStart w:id="90" w:name="thm-var-lincom"/>
     <w:p>
       <w:pPr>
         <w:pStyle w:val="FirstParagraph"/>
@@ -35977,7 +38665,7 @@
           <w:b/>
           <w:bCs/>
         </w:rPr>
-        <w:t xml:space="preserve">Theorem 11 (Variance of a linear combination)</w:t>
+        <w:t xml:space="preserve">Theorem 12 (Variance of a linear combination)</w:t>
       </w:r>
       <w:r>
         <w:t xml:space="preserve"> </w:t>
@@ -36519,7 +39207,7 @@
         </m:oMath>
       </m:oMathPara>
     </w:p>
-    <w:bookmarkEnd w:id="83"/>
+    <w:bookmarkEnd w:id="90"/>
     <w:p>
       <w:pPr>
         <w:pStyle w:val="FirstParagraph"/>
@@ -37979,7 +40667,7 @@
         </m:oMath>
       </m:oMathPara>
     </w:p>
-    <w:bookmarkStart w:id="84" w:name="cor-var-lincom2"/>
+    <w:bookmarkStart w:id="91" w:name="cor-var-lincom2"/>
     <w:p>
       <w:pPr>
         <w:pStyle w:val="FirstParagraph"/>
@@ -37989,7 +40677,7 @@
           <w:b/>
           <w:bCs/>
         </w:rPr>
-        <w:t xml:space="preserve">Corollary 2 (Variance of a sum of two random variables)</w:t>
+        <w:t xml:space="preserve">Corollary 3 (Variance of a sum of two random variables)</w:t>
       </w:r>
       <w:r>
         <w:t xml:space="preserve"> </w:t>
@@ -38256,7 +40944,7 @@
         </m:oMath>
       </m:oMathPara>
     </w:p>
-    <w:bookmarkEnd w:id="84"/>
+    <w:bookmarkEnd w:id="91"/>
     <w:p>
       <w:pPr>
         <w:pStyle w:val="FirstParagraph"/>
@@ -38282,7 +40970,7 @@
           <w:rPr>
             <w:rStyle w:val="Hyperlink"/>
           </w:rPr>
-          <w:t xml:space="preserve">Theorem 11</w:t>
+          <w:t xml:space="preserve">Theorem 12</w:t>
         </w:r>
       </w:hyperlink>
       <w:r>
@@ -39786,7 +42474,7 @@
         </m:oMath>
       </m:oMathPara>
     </w:p>
-    <w:bookmarkStart w:id="85" w:name="cor-var-sum-indpt"/>
+    <w:bookmarkStart w:id="92" w:name="cor-var-sum-indpt"/>
     <w:p>
       <w:pPr>
         <w:pStyle w:val="FirstParagraph"/>
@@ -39796,7 +42484,7 @@
           <w:b/>
           <w:bCs/>
         </w:rPr>
-        <w:t xml:space="preserve">Corollary 3 (Variance of a sum of independent random variables)</w:t>
+        <w:t xml:space="preserve">Corollary 4 (Variance of a sum of independent random variables)</w:t>
       </w:r>
       <w:r>
         <w:t xml:space="preserve"> </w:t>
@@ -39835,7 +42523,7 @@
       <w:r>
         <w:t xml:space="preserve"> </w:t>
       </w:r>
-      <w:hyperlink r:id="rId63">
+      <w:hyperlink r:id="rId70">
         <w:r>
           <w:rPr>
             <w:rStyle w:val="Hyperlink"/>
@@ -40078,7 +42766,7 @@
         </m:oMath>
       </m:oMathPara>
     </w:p>
-    <w:bookmarkEnd w:id="85"/>
+    <w:bookmarkEnd w:id="92"/>
     <w:p>
       <w:pPr>
         <w:pStyle w:val="FirstParagraph"/>
@@ -40104,7 +42792,7 @@
           <w:rPr>
             <w:rStyle w:val="Hyperlink"/>
           </w:rPr>
-          <w:t xml:space="preserve">Theorem 7</w:t>
+          <w:t xml:space="preserve">Theorem 8</w:t>
         </w:r>
       </w:hyperlink>
       <w:r>
@@ -40175,7 +42863,7 @@
           <w:rPr>
             <w:rStyle w:val="Hyperlink"/>
           </w:rPr>
-          <w:t xml:space="preserve">Corollary 2</w:t>
+          <w:t xml:space="preserve">Corollary 3</w:t>
         </w:r>
       </w:hyperlink>
       <w:r>
@@ -40727,7 +43415,7 @@
           <w:rPr>
             <w:rStyle w:val="Hyperlink"/>
           </w:rPr>
-          <w:t xml:space="preserve">Corollary 2</w:t>
+          <w:t xml:space="preserve">Corollary 3</w:t>
         </w:r>
       </w:hyperlink>
       <w:r>
@@ -40762,7 +43450,7 @@
           <w:rPr>
             <w:rStyle w:val="Hyperlink"/>
           </w:rPr>
-          <w:t xml:space="preserve">Corollary 3</w:t>
+          <w:t xml:space="preserve">Corollary 4</w:t>
         </w:r>
       </w:hyperlink>
       <w:r>
@@ -40772,7 +43460,7 @@
         <w:t xml:space="preserve">is the case where that term is 0.</w:t>
       </w:r>
     </w:p>
-    <w:bookmarkStart w:id="88" w:name="thm-vcov-psd"/>
+    <w:bookmarkStart w:id="95" w:name="thm-vcov-psd"/>
     <w:p>
       <w:pPr>
         <w:pStyle w:val="BodyText"/>
@@ -40782,7 +43470,7 @@
           <w:b/>
           <w:bCs/>
         </w:rPr>
-        <w:t xml:space="preserve">Theorem 12 (A variance matrix is symmetric and positive semidefinite)</w:t>
+        <w:t xml:space="preserve">Theorem 13 (A variance matrix is symmetric and positive semidefinite)</w:t>
       </w:r>
       <w:r>
         <w:t xml:space="preserve"> </w:t>
@@ -41025,7 +43713,7 @@
       <w:r>
         <w:t xml:space="preserve"> </w:t>
       </w:r>
-      <w:hyperlink r:id="rId86">
+      <w:hyperlink r:id="rId93">
         <w:r>
           <w:rPr>
             <w:rStyle w:val="Hyperlink"/>
@@ -41042,7 +43730,7 @@
       <w:r>
         <w:t xml:space="preserve"> </w:t>
       </w:r>
-      <w:hyperlink r:id="rId87">
+      <w:hyperlink r:id="rId94">
         <w:r>
           <w:rPr>
             <w:rStyle w:val="Hyperlink"/>
@@ -41186,7 +43874,7 @@
         </m:oMath>
       </m:oMathPara>
     </w:p>
-    <w:bookmarkEnd w:id="88"/>
+    <w:bookmarkEnd w:id="95"/>
     <w:p>
       <w:pPr>
         <w:pStyle w:val="FirstParagraph"/>
@@ -41212,7 +43900,7 @@
           <w:rPr>
             <w:rStyle w:val="Hyperlink"/>
           </w:rPr>
-          <w:t xml:space="preserve">Theorem 9</w:t>
+          <w:t xml:space="preserve">Theorem 10</w:t>
         </w:r>
       </w:hyperlink>
       <w:r>
@@ -42355,7 +45043,7 @@
           <w:rPr>
             <w:rStyle w:val="Hyperlink"/>
           </w:rPr>
-          <w:t xml:space="preserve">Theorem 11</w:t>
+          <w:t xml:space="preserve">Theorem 12</w:t>
         </w:r>
       </w:hyperlink>
       <w:r>
@@ -42415,7 +45103,7 @@
         <w:t xml:space="preserve">).</w:t>
       </w:r>
     </w:p>
-    <w:bookmarkStart w:id="89" w:name="exm-vcov-psd"/>
+    <w:bookmarkStart w:id="96" w:name="exm-vcov-psd"/>
     <w:p>
       <w:pPr>
         <w:pStyle w:val="BodyText"/>
@@ -42425,7 +45113,7 @@
           <w:b/>
           <w:bCs/>
         </w:rPr>
-        <w:t xml:space="preserve">Example 16 (Two variance matrices that differ only in sign)</w:t>
+        <w:t xml:space="preserve">Example 17 (Two variance matrices that differ only in sign)</w:t>
       </w:r>
       <w:r>
         <w:t xml:space="preserve"> </w:t>
@@ -44061,7 +46749,7 @@
           <w:rPr>
             <w:rStyle w:val="Hyperlink"/>
           </w:rPr>
-          <w:t xml:space="preserve">Theorem 9</w:t>
+          <w:t xml:space="preserve">Theorem 10</w:t>
         </w:r>
       </w:hyperlink>
       <w:r>
@@ -44078,7 +46766,7 @@
           <w:rPr>
             <w:rStyle w:val="Hyperlink"/>
           </w:rPr>
-          <w:t xml:space="preserve">Theorem 6</w:t>
+          <w:t xml:space="preserve">Theorem 7</w:t>
         </w:r>
       </w:hyperlink>
       <w:r>
@@ -44338,7 +47026,7 @@
           <w:rPr>
             <w:rStyle w:val="Hyperlink"/>
           </w:rPr>
-          <w:t xml:space="preserve">Theorem 11</w:t>
+          <w:t xml:space="preserve">Theorem 12</w:t>
         </w:r>
       </w:hyperlink>
       <w:r>
@@ -45217,7 +47905,7 @@
         <w:t xml:space="preserve">.</w:t>
       </w:r>
     </w:p>
-    <w:bookmarkEnd w:id="89"/>
+    <w:bookmarkEnd w:id="96"/>
     <w:p>
       <w:pPr>
         <w:pStyle w:val="BodyText"/>
@@ -45351,7 +48039,7 @@
         <w:t xml:space="preserve">has the larger spread.</w:t>
       </w:r>
     </w:p>
-    <w:bookmarkStart w:id="93" w:name="exm-vcov-singular"/>
+    <w:bookmarkStart w:id="100" w:name="exm-vcov-singular"/>
     <w:p>
       <w:pPr>
         <w:pStyle w:val="BodyText"/>
@@ -45361,7 +48049,7 @@
           <w:b/>
           <w:bCs/>
         </w:rPr>
-        <w:t xml:space="preserve">Example 17 (A variance matrix that is not positive definite)</w:t>
+        <w:t xml:space="preserve">Example 18 (A variance matrix that is not positive definite)</w:t>
       </w:r>
       <w:r>
         <w:t xml:space="preserve"> </w:t>
@@ -46091,7 +48779,7 @@
       <w:r>
         <w:t xml:space="preserve"> </w:t>
       </w:r>
-      <w:hyperlink r:id="rId90">
+      <w:hyperlink r:id="rId97">
         <w:r>
           <w:rPr>
             <w:rStyle w:val="Hyperlink"/>
@@ -46108,7 +48796,7 @@
       <w:r>
         <w:t xml:space="preserve"> </w:t>
       </w:r>
-      <w:hyperlink r:id="rId91">
+      <w:hyperlink r:id="rId98">
         <w:r>
           <w:rPr>
             <w:rStyle w:val="Hyperlink"/>
@@ -46172,7 +48860,7 @@
       <w:r>
         <w:t xml:space="preserve"> </w:t>
       </w:r>
-      <w:hyperlink r:id="rId92">
+      <w:hyperlink r:id="rId99">
         <w:r>
           <w:rPr>
             <w:rStyle w:val="Hyperlink"/>
@@ -46184,8 +48872,8 @@
         <w:t xml:space="preserve">.</w:t>
       </w:r>
     </w:p>
-    <w:bookmarkEnd w:id="93"/>
-    <w:bookmarkStart w:id="95" w:name="cor-vcov-indpt-diagonal"/>
+    <w:bookmarkEnd w:id="100"/>
+    <w:bookmarkStart w:id="102" w:name="cor-vcov-indpt-diagonal"/>
     <w:p>
       <w:pPr>
         <w:pStyle w:val="BodyText"/>
@@ -46195,7 +48883,7 @@
           <w:b/>
           <w:bCs/>
         </w:rPr>
-        <w:t xml:space="preserve">Corollary 4 (Independent components give a diagonal variance matrix)</w:t>
+        <w:t xml:space="preserve">Corollary 5 (Independent components give a diagonal variance matrix)</w:t>
       </w:r>
       <w:r>
         <w:t xml:space="preserve"> </w:t>
@@ -46436,7 +49124,7 @@
       <w:r>
         <w:t xml:space="preserve"> </w:t>
       </w:r>
-      <w:hyperlink r:id="rId63">
+      <w:hyperlink r:id="rId70">
         <w:r>
           <w:rPr>
             <w:rStyle w:val="Hyperlink"/>
@@ -46524,7 +49212,7 @@
       <w:r>
         <w:t xml:space="preserve"> </w:t>
       </w:r>
-      <w:hyperlink r:id="rId94">
+      <w:hyperlink r:id="rId101">
         <w:r>
           <w:rPr>
             <w:rStyle w:val="Hyperlink"/>
@@ -46636,7 +49324,7 @@
         <w:t xml:space="preserve">.</w:t>
       </w:r>
     </w:p>
-    <w:bookmarkEnd w:id="95"/>
+    <w:bookmarkEnd w:id="102"/>
     <w:p>
       <w:pPr>
         <w:pStyle w:val="BodyText"/>
@@ -46662,7 +49350,7 @@
           <w:rPr>
             <w:rStyle w:val="Hyperlink"/>
           </w:rPr>
-          <w:t xml:space="preserve">Theorem 9</w:t>
+          <w:t xml:space="preserve">Theorem 10</w:t>
         </w:r>
       </w:hyperlink>
       <w:r>
@@ -46961,7 +49649,7 @@
           <w:rPr>
             <w:rStyle w:val="Hyperlink"/>
           </w:rPr>
-          <w:t xml:space="preserve">Theorem 7</w:t>
+          <w:t xml:space="preserve">Theorem 8</w:t>
         </w:r>
       </w:hyperlink>
       <w:r>
@@ -47123,7 +49811,7 @@
         <w:t xml:space="preserve">.</w:t>
       </w:r>
     </w:p>
-    <w:bookmarkStart w:id="96" w:name="thm-cor-bounds"/>
+    <w:bookmarkStart w:id="103" w:name="thm-cor-bounds"/>
     <w:p>
       <w:pPr>
         <w:pStyle w:val="BodyText"/>
@@ -47133,7 +49821,7 @@
           <w:b/>
           <w:bCs/>
         </w:rPr>
-        <w:t xml:space="preserve">Theorem 13 (Correlation lies between</w:t>
+        <w:t xml:space="preserve">Theorem 14 (Correlation lies between</w:t>
       </w:r>
       <w:r>
         <w:rPr>
@@ -47372,7 +50060,7 @@
         </m:oMath>
       </m:oMathPara>
     </w:p>
-    <w:bookmarkEnd w:id="96"/>
+    <w:bookmarkEnd w:id="103"/>
     <w:p>
       <w:pPr>
         <w:pStyle w:val="FirstParagraph"/>
@@ -47594,7 +50282,7 @@
           <w:rPr>
             <w:rStyle w:val="Hyperlink"/>
           </w:rPr>
-          <w:t xml:space="preserve">Corollary 2</w:t>
+          <w:t xml:space="preserve">Corollary 3</w:t>
         </w:r>
       </w:hyperlink>
       <w:r>
@@ -48594,7 +51282,7 @@
         <w:t xml:space="preserve">.</w:t>
       </w:r>
     </w:p>
-    <w:bookmarkStart w:id="104" w:name="exm-cor-auto"/>
+    <w:bookmarkStart w:id="111" w:name="exm-cor-auto"/>
     <w:p>
       <w:pPr>
         <w:pStyle w:val="BodyText"/>
@@ -48604,7 +51292,7 @@
           <w:b/>
           <w:bCs/>
         </w:rPr>
-        <w:t xml:space="preserve">Example 18 (Correlation of horsepower and fuel economy)</w:t>
+        <w:t xml:space="preserve">Example 19 (Correlation of horsepower and fuel economy)</w:t>
       </w:r>
       <w:r>
         <w:t xml:space="preserve"> </w:t>
@@ -48658,7 +51346,7 @@
       <w:r>
         <w:t xml:space="preserve"> </w:t>
       </w:r>
-      <w:hyperlink r:id="rId97">
+      <w:hyperlink r:id="rId104">
         <w:r>
           <w:rPr>
             <w:rStyle w:val="VerbatimChar"/>
@@ -48690,7 +51378,7 @@
       <w:r>
         <w:t xml:space="preserve"> </w:t>
       </w:r>
-      <w:hyperlink r:id="rId98">
+      <w:hyperlink r:id="rId105">
         <w:r>
           <w:rPr>
             <w:rStyle w:val="VerbatimChar"/>
@@ -48722,7 +51410,7 @@
       <w:r>
         <w:t xml:space="preserve"> </w:t>
       </w:r>
-      <w:hyperlink r:id="rId99">
+      <w:hyperlink r:id="rId106">
         <w:r>
           <w:rPr>
             <w:rStyle w:val="VerbatimChar"/>
@@ -50443,7 +53131,7 @@
       <w:tr>
         <w:tc>
           <w:tcPr/>
-          <w:bookmarkStart w:id="103" w:name="fig-cor-auto"/>
+          <w:bookmarkStart w:id="110" w:name="fig-cor-auto"/>
           <w:p>
             <w:pPr>
               <w:pStyle w:val="Compact"/>
@@ -50454,18 +53142,18 @@
                 <wp:inline>
                   <wp:extent cx="4620126" cy="3234088"/>
                   <wp:effectExtent b="0" l="0" r="0" t="0"/>
-                  <wp:docPr descr="" title="" id="101" name="Picture"/>
+                  <wp:docPr descr="" title="" id="108" name="Picture"/>
                   <a:graphic>
                     <a:graphicData uri="http://schemas.openxmlformats.org/drawingml/2006/picture">
                       <pic:pic>
                         <pic:nvPicPr>
-                          <pic:cNvPr descr="variance-covariance_files/figure-docx/fig-cor-auto-1.png" id="102" name="Picture"/>
+                          <pic:cNvPr descr="variance-covariance_files/figure-docx/fig-cor-auto-1.png" id="109" name="Picture"/>
                           <pic:cNvPicPr>
                             <a:picLocks noChangeArrowheads="1" noChangeAspect="1"/>
                           </pic:cNvPicPr>
                         </pic:nvPicPr>
                         <pic:blipFill>
-                          <a:blip r:embed="rId100"/>
+                          <a:blip r:embed="rId107"/>
                           <a:stretch>
                             <a:fillRect/>
                           </a:stretch>
@@ -50505,7 +53193,7 @@
               <w:t xml:space="preserve">Figure 1: Miles per gallon against horsepower for the cars in the Auto data. Cars with more horsepower tend to have lower fuel economy.</w:t>
             </w:r>
           </w:p>
-          <w:bookmarkEnd w:id="103"/>
+          <w:bookmarkEnd w:id="110"/>
         </w:tc>
       </w:tr>
     </w:tbl>
@@ -50612,7 +53300,7 @@
           <w:rPr>
             <w:rStyle w:val="Hyperlink"/>
           </w:rPr>
-          <w:t xml:space="preserve">Theorem 13</w:t>
+          <w:t xml:space="preserve">Theorem 14</w:t>
         </w:r>
       </w:hyperlink>
       <w:r>
@@ -50652,7 +53340,7 @@
         <w:t xml:space="preserve">deviations by the same count, which cancels.</w:t>
       </w:r>
     </w:p>
-    <w:bookmarkEnd w:id="104"/>
+    <w:bookmarkEnd w:id="111"/>
     <w:p>
       <w:pPr>
         <w:pStyle w:val="BodyText"/>
@@ -50663,7 +53351,7 @@
       <w:r>
         <w:t xml:space="preserve"> </w:t>
       </w:r>
-      <w:hyperlink r:id="rId105">
+      <w:hyperlink r:id="rId112">
         <w:r>
           <w:rPr>
             <w:rStyle w:val="Hyperlink"/>
@@ -50680,7 +53368,7 @@
       <w:r>
         <w:t xml:space="preserve"> </w:t>
       </w:r>
-      <w:hyperlink r:id="rId106">
+      <w:hyperlink r:id="rId113">
         <w:r>
           <w:rPr>
             <w:rStyle w:val="Hyperlink"/>
@@ -50710,8 +53398,8 @@
         <w:t xml:space="preserve">.</w:t>
       </w:r>
     </w:p>
-    <w:bookmarkEnd w:id="107"/>
-    <w:bookmarkStart w:id="116" w:name="references"/>
+    <w:bookmarkEnd w:id="114"/>
+    <w:bookmarkStart w:id="123" w:name="references"/>
     <w:p>
       <w:pPr>
         <w:pStyle w:val="Heading2"/>
@@ -50720,8 +53408,8 @@
         <w:t xml:space="preserve">References</w:t>
       </w:r>
     </w:p>
-    <w:bookmarkStart w:id="115" w:name="refs"/>
-    <w:bookmarkStart w:id="109" w:name="ref-fiveminuteai_probstat"/>
+    <w:bookmarkStart w:id="122" w:name="refs"/>
+    <w:bookmarkStart w:id="116" w:name="ref-fiveminuteai_probstat"/>
     <w:p>
       <w:pPr>
         <w:pStyle w:val="Bibliography"/>
@@ -50745,7 +53433,7 @@
       <w:r>
         <w:t xml:space="preserve"> </w:t>
       </w:r>
-      <w:hyperlink r:id="rId108">
+      <w:hyperlink r:id="rId115">
         <w:r>
           <w:rPr>
             <w:rStyle w:val="Hyperlink"/>
@@ -50757,8 +53445,8 @@
         <w:t xml:space="preserve">.</w:t>
       </w:r>
     </w:p>
-    <w:bookmarkEnd w:id="109"/>
-    <w:bookmarkStart w:id="110" w:name="ref-billingsley1995probability"/>
+    <w:bookmarkEnd w:id="116"/>
+    <w:bookmarkStart w:id="117" w:name="ref-billingsley1995probability"/>
     <w:p>
       <w:pPr>
         <w:pStyle w:val="Bibliography"/>
@@ -50780,8 +53468,8 @@
         <w:t xml:space="preserve">. 3rd ed. Wiley Series in Probability and Mathematical Statistics. Wiley.</w:t>
       </w:r>
     </w:p>
-    <w:bookmarkEnd w:id="110"/>
-    <w:bookmarkStart w:id="112" w:name="ref-CaseBerg01"/>
+    <w:bookmarkEnd w:id="117"/>
+    <w:bookmarkStart w:id="119" w:name="ref-CaseBerg01"/>
     <w:p>
       <w:pPr>
         <w:pStyle w:val="Bibliography"/>
@@ -50805,7 +53493,7 @@
       <w:r>
         <w:t xml:space="preserve"> </w:t>
       </w:r>
-      <w:hyperlink r:id="rId111">
+      <w:hyperlink r:id="rId118">
         <w:r>
           <w:rPr>
             <w:rStyle w:val="Hyperlink"/>
@@ -50817,8 +53505,8 @@
         <w:t xml:space="preserve">.</w:t>
       </w:r>
     </w:p>
-    <w:bookmarkEnd w:id="112"/>
-    <w:bookmarkStart w:id="114" w:name="ref-james2021islr2e"/>
+    <w:bookmarkEnd w:id="119"/>
+    <w:bookmarkStart w:id="121" w:name="ref-james2021islr2e"/>
     <w:p>
       <w:pPr>
         <w:pStyle w:val="Bibliography"/>
@@ -50856,7 +53544,7 @@
       <w:r>
         <w:t xml:space="preserve"> </w:t>
       </w:r>
-      <w:hyperlink r:id="rId113">
+      <w:hyperlink r:id="rId120">
         <w:r>
           <w:rPr>
             <w:rStyle w:val="Hyperlink"/>
@@ -50868,9 +53556,9 @@
         <w:t xml:space="preserve">.</w:t>
       </w:r>
     </w:p>
-    <w:bookmarkEnd w:id="114"/>
-    <w:bookmarkEnd w:id="115"/>
-    <w:bookmarkEnd w:id="116"/>
+    <w:bookmarkEnd w:id="121"/>
+    <w:bookmarkEnd w:id="122"/>
+    <w:bookmarkEnd w:id="123"/>
     <w:sectPr>
       <w:footnotePr>
         <w:numRestart w:val="eachSect"/>

</xml_diff>

<commit_message>
Deploying to gh-pages from @ Morrison-Lab/pds@61008fc6afcf218788e9425af7e99d42fe15843a 🚀
</commit_message>
<xml_diff>
--- a/variance-covariance.docx
+++ b/variance-covariance.docx
@@ -15,7 +15,7 @@
         <w:pStyle w:val="Date"/>
       </w:pPr>
       <w:r>
-        <w:t xml:space="preserve">Last modified: 2026-10-19 03:40:33 (PDT)</w:t>
+        <w:t xml:space="preserve">Last modified: 2026-10-19 04:07:38 (PDT)</w:t>
       </w:r>
     </w:p>
     <w:bookmarkStart w:id="27" w:name="sec-deviation"/>
@@ -3628,32 +3628,21 @@
         <w:t xml:space="preserve">. </w:t>
       </w:r>
       <w:r>
-        <w:t xml:space="preserve">By</w:t>
-      </w:r>
-      <w:r>
-        <w:t xml:space="preserve"> </w:t>
-      </w:r>
-      <w:hyperlink r:id="rId31">
-        <w:r>
-          <w:rPr>
-            <w:rStyle w:val="Hyperlink"/>
-          </w:rPr>
-          <w:t xml:space="preserve">linearity of expectation</w:t>
-        </w:r>
-      </w:hyperlink>
-      <w:r>
-        <w:t xml:space="preserve">,</w:t>
-      </w:r>
-      <w:r>
-        <w:t xml:space="preserve"> </w:t>
-      </w:r>
-      <w:r>
-        <w:t xml:space="preserve">with</w:t>
+        <w:t xml:space="preserve">Let</w:t>
       </w:r>
       <w:r>
         <w:t xml:space="preserve"> </w:t>
       </w:r>
       <m:oMath>
+        <m:r>
+          <m:t>μ</m:t>
+        </m:r>
+        <m:r>
+          <m:rPr>
+            <m:sty m:val="p"/>
+          </m:rPr>
+          <m:t>=</m:t>
+        </m:r>
         <m:r>
           <m:rPr>
             <m:sty m:val="p"/>
@@ -3684,7 +3673,72 @@
         <w:t xml:space="preserve"> </w:t>
       </w:r>
       <w:r>
-        <w:t xml:space="preserve">treated as a constant:</w:t>
+        <w:t xml:space="preserve">be the</w:t>
+      </w:r>
+      <w:r>
+        <w:t xml:space="preserve"> </w:t>
+      </w:r>
+      <w:hyperlink r:id="rId11">
+        <w:r>
+          <w:rPr>
+            <w:rStyle w:val="Hyperlink"/>
+          </w:rPr>
+          <w:t xml:space="preserve">population mean</w:t>
+        </w:r>
+      </w:hyperlink>
+      <w:r>
+        <w:t xml:space="preserve"> </w:t>
+      </w:r>
+      <w:r>
+        <w:t xml:space="preserve">of</w:t>
+      </w:r>
+      <w:r>
+        <w:t xml:space="preserve"> </w:t>
+      </w:r>
+      <m:oMath>
+        <m:r>
+          <m:t>X</m:t>
+        </m:r>
+      </m:oMath>
+      <w:r>
+        <w:t xml:space="preserve">.</w:t>
+      </w:r>
+      <w:r>
+        <w:t xml:space="preserve"> </w:t>
+      </w:r>
+      <w:r>
+        <w:t xml:space="preserve">It is a constant, so</w:t>
+      </w:r>
+      <w:r>
+        <w:t xml:space="preserve"> </w:t>
+      </w:r>
+      <w:hyperlink r:id="rId31">
+        <w:r>
+          <w:rPr>
+            <w:rStyle w:val="Hyperlink"/>
+          </w:rPr>
+          <w:t xml:space="preserve">linearity of expectation</w:t>
+        </w:r>
+      </w:hyperlink>
+      <w:r>
+        <w:t xml:space="preserve"> </w:t>
+      </w:r>
+      <w:r>
+        <w:t xml:space="preserve">applies with</w:t>
+      </w:r>
+      <w:r>
+        <w:t xml:space="preserve"> </w:t>
+      </w:r>
+      <m:oMath>
+        <m:r>
+          <m:t>μ</m:t>
+        </m:r>
+      </m:oMath>
+      <w:r>
+        <w:t xml:space="preserve"> </w:t>
+      </w:r>
+      <w:r>
+        <w:t xml:space="preserve">as a coefficient:</w:t>
       </w:r>
     </w:p>
     <w:p>
@@ -3863,29 +3917,7 @@
                     <m:t>−</m:t>
                   </m:r>
                   <m:r>
-                    <m:rPr>
-                      <m:sty m:val="p"/>
-                    </m:rPr>
-                    <m:t>E</m:t>
-                  </m:r>
-                  <m:r>
-                    <m:t>​</m:t>
-                  </m:r>
-                  <m:d>
-                    <m:dPr>
-                      <m:begChr m:val="["/>
-                      <m:sepChr m:val=""/>
-                      <m:endChr m:val="]"/>
-                      <m:grow/>
-                    </m:dPr>
-                    <m:e>
-                      <m:r>
-                        <m:t>X</m:t>
-                      </m:r>
-                    </m:e>
-                  </m:d>
-                  <m:r>
-                    <m:t>​</m:t>
+                    <m:t>μ</m:t>
                   </m:r>
                   <m:sSup>
                     <m:e>
@@ -3918,7 +3950,17 @@
                   <m:nor/>
                   <m:sty m:val="p"/>
                 </m:rPr>
-                <m:t>(definition of deviation from mean)</m:t>
+                <m:t>(definition of deviation from the population mean </m:t>
+              </m:r>
+              <m:r>
+                <m:t>μ</m:t>
+              </m:r>
+              <m:r>
+                <m:rPr>
+                  <m:nor/>
+                  <m:sty m:val="p"/>
+                </m:rPr>
+                <m:t>)</m:t>
               </m:r>
             </m:e>
             <m:e>
@@ -3973,29 +4015,7 @@
                     <m:t>X</m:t>
                   </m:r>
                   <m:r>
-                    <m:rPr>
-                      <m:sty m:val="p"/>
-                    </m:rPr>
-                    <m:t>E</m:t>
-                  </m:r>
-                  <m:r>
-                    <m:t>​</m:t>
-                  </m:r>
-                  <m:d>
-                    <m:dPr>
-                      <m:begChr m:val="["/>
-                      <m:sepChr m:val=""/>
-                      <m:endChr m:val="]"/>
-                      <m:grow/>
-                    </m:dPr>
-                    <m:e>
-                      <m:r>
-                        <m:t>X</m:t>
-                      </m:r>
-                    </m:e>
-                  </m:d>
-                  <m:r>
-                    <m:t>​</m:t>
+                    <m:t>μ</m:t>
                   </m:r>
                   <m:r>
                     <m:rPr>
@@ -4017,29 +4037,7 @@
                         </m:dPr>
                         <m:e>
                           <m:r>
-                            <m:rPr>
-                              <m:sty m:val="p"/>
-                            </m:rPr>
-                            <m:t>E</m:t>
-                          </m:r>
-                          <m:r>
-                            <m:t>​</m:t>
-                          </m:r>
-                          <m:d>
-                            <m:dPr>
-                              <m:begChr m:val="["/>
-                              <m:sepChr m:val=""/>
-                              <m:endChr m:val="]"/>
-                              <m:grow/>
-                            </m:dPr>
-                            <m:e>
-                              <m:r>
-                                <m:t>X</m:t>
-                              </m:r>
-                            </m:e>
-                          </m:d>
-                          <m:r>
-                            <m:t>​</m:t>
+                            <m:t>μ</m:t>
                           </m:r>
                         </m:e>
                       </m:d>
@@ -4126,6 +4124,9 @@
                 <m:t>2</m:t>
               </m:r>
               <m:r>
+                <m:t>μ</m:t>
+              </m:r>
+              <m:r>
                 <m:rPr>
                   <m:sty m:val="p"/>
                 </m:rPr>
@@ -4154,6 +4155,74 @@
                 <m:rPr>
                   <m:sty m:val="p"/>
                 </m:rPr>
+                <m:t>+</m:t>
+              </m:r>
+              <m:sSup>
+                <m:e>
+                  <m:r>
+                    <m:t>​</m:t>
+                  </m:r>
+                  <m:d>
+                    <m:dPr>
+                      <m:begChr m:val="("/>
+                      <m:sepChr m:val=""/>
+                      <m:endChr m:val=")"/>
+                      <m:grow/>
+                    </m:dPr>
+                    <m:e>
+                      <m:r>
+                        <m:t>μ</m:t>
+                      </m:r>
+                    </m:e>
+                  </m:d>
+                  <m:r>
+                    <m:t>​</m:t>
+                  </m:r>
+                </m:e>
+                <m:sup>
+                  <m:r>
+                    <m:t>2</m:t>
+                  </m:r>
+                </m:sup>
+              </m:sSup>
+              <m:r>
+                <m:t>&amp;</m:t>
+              </m:r>
+              <m:r>
+                <m:t>&amp;</m:t>
+              </m:r>
+              <m:r>
+                <m:rPr>
+                  <m:nor/>
+                  <m:sty m:val="p"/>
+                </m:rPr>
+                <m:t>(linearity of expectation; </m:t>
+              </m:r>
+              <m:r>
+                <m:t>μ</m:t>
+              </m:r>
+              <m:r>
+                <m:rPr>
+                  <m:nor/>
+                  <m:sty m:val="p"/>
+                </m:rPr>
+                <m:t> is a constant)</m:t>
+              </m:r>
+            </m:e>
+            <m:e>
+              <m:r>
+                <m:t>&amp;</m:t>
+              </m:r>
+              <m:r>
+                <m:rPr>
+                  <m:sty m:val="p"/>
+                </m:rPr>
+                <m:t>=</m:t>
+              </m:r>
+              <m:r>
+                <m:rPr>
+                  <m:sty m:val="p"/>
+                </m:rPr>
                 <m:t>E</m:t>
               </m:r>
               <m:r>
@@ -4167,9 +4236,18 @@
                   <m:grow/>
                 </m:dPr>
                 <m:e>
-                  <m:r>
-                    <m:t>X</m:t>
-                  </m:r>
+                  <m:sSup>
+                    <m:e>
+                      <m:r>
+                        <m:t>X</m:t>
+                      </m:r>
+                    </m:e>
+                    <m:sup>
+                      <m:r>
+                        <m:t>2</m:t>
+                      </m:r>
+                    </m:sup>
+                  </m:sSup>
                 </m:e>
               </m:d>
               <m:r>
@@ -4179,7 +4257,269 @@
                 <m:rPr>
                   <m:sty m:val="p"/>
                 </m:rPr>
+                <m:t>−</m:t>
+              </m:r>
+              <m:r>
+                <m:t>2</m:t>
+              </m:r>
+              <m:sSup>
+                <m:e>
+                  <m:r>
+                    <m:t>​</m:t>
+                  </m:r>
+                  <m:d>
+                    <m:dPr>
+                      <m:begChr m:val="("/>
+                      <m:sepChr m:val=""/>
+                      <m:endChr m:val=")"/>
+                      <m:grow/>
+                    </m:dPr>
+                    <m:e>
+                      <m:r>
+                        <m:t>μ</m:t>
+                      </m:r>
+                    </m:e>
+                  </m:d>
+                  <m:r>
+                    <m:t>​</m:t>
+                  </m:r>
+                </m:e>
+                <m:sup>
+                  <m:r>
+                    <m:t>2</m:t>
+                  </m:r>
+                </m:sup>
+              </m:sSup>
+              <m:r>
+                <m:rPr>
+                  <m:sty m:val="p"/>
+                </m:rPr>
                 <m:t>+</m:t>
+              </m:r>
+              <m:sSup>
+                <m:e>
+                  <m:r>
+                    <m:t>​</m:t>
+                  </m:r>
+                  <m:d>
+                    <m:dPr>
+                      <m:begChr m:val="("/>
+                      <m:sepChr m:val=""/>
+                      <m:endChr m:val=")"/>
+                      <m:grow/>
+                    </m:dPr>
+                    <m:e>
+                      <m:r>
+                        <m:t>μ</m:t>
+                      </m:r>
+                    </m:e>
+                  </m:d>
+                  <m:r>
+                    <m:t>​</m:t>
+                  </m:r>
+                </m:e>
+                <m:sup>
+                  <m:r>
+                    <m:t>2</m:t>
+                  </m:r>
+                </m:sup>
+              </m:sSup>
+              <m:r>
+                <m:t>&amp;</m:t>
+              </m:r>
+              <m:r>
+                <m:t>&amp;</m:t>
+              </m:r>
+              <m:r>
+                <m:rPr>
+                  <m:nor/>
+                  <m:sty m:val="p"/>
+                </m:rPr>
+                <m:t>(</m:t>
+              </m:r>
+              <m:r>
+                <m:rPr>
+                  <m:sty m:val="p"/>
+                </m:rPr>
+                <m:t>E</m:t>
+              </m:r>
+              <m:r>
+                <m:t>​</m:t>
+              </m:r>
+              <m:d>
+                <m:dPr>
+                  <m:begChr m:val="["/>
+                  <m:sepChr m:val=""/>
+                  <m:endChr m:val="]"/>
+                  <m:grow/>
+                </m:dPr>
+                <m:e>
+                  <m:r>
+                    <m:t>X</m:t>
+                  </m:r>
+                </m:e>
+              </m:d>
+              <m:r>
+                <m:t>​</m:t>
+              </m:r>
+              <m:r>
+                <m:rPr>
+                  <m:sty m:val="p"/>
+                </m:rPr>
+                <m:t>=</m:t>
+              </m:r>
+              <m:r>
+                <m:t>μ</m:t>
+              </m:r>
+              <m:r>
+                <m:rPr>
+                  <m:nor/>
+                  <m:sty m:val="p"/>
+                </m:rPr>
+                <m:t>)</m:t>
+              </m:r>
+            </m:e>
+            <m:e>
+              <m:r>
+                <m:t>&amp;</m:t>
+              </m:r>
+              <m:r>
+                <m:rPr>
+                  <m:sty m:val="p"/>
+                </m:rPr>
+                <m:t>=</m:t>
+              </m:r>
+              <m:r>
+                <m:rPr>
+                  <m:sty m:val="p"/>
+                </m:rPr>
+                <m:t>E</m:t>
+              </m:r>
+              <m:r>
+                <m:t>​</m:t>
+              </m:r>
+              <m:d>
+                <m:dPr>
+                  <m:begChr m:val="["/>
+                  <m:sepChr m:val=""/>
+                  <m:endChr m:val="]"/>
+                  <m:grow/>
+                </m:dPr>
+                <m:e>
+                  <m:sSup>
+                    <m:e>
+                      <m:r>
+                        <m:t>X</m:t>
+                      </m:r>
+                    </m:e>
+                    <m:sup>
+                      <m:r>
+                        <m:t>2</m:t>
+                      </m:r>
+                    </m:sup>
+                  </m:sSup>
+                </m:e>
+              </m:d>
+              <m:r>
+                <m:t>​</m:t>
+              </m:r>
+              <m:r>
+                <m:rPr>
+                  <m:sty m:val="p"/>
+                </m:rPr>
+                <m:t>−</m:t>
+              </m:r>
+              <m:sSup>
+                <m:e>
+                  <m:r>
+                    <m:t>​</m:t>
+                  </m:r>
+                  <m:d>
+                    <m:dPr>
+                      <m:begChr m:val="("/>
+                      <m:sepChr m:val=""/>
+                      <m:endChr m:val=")"/>
+                      <m:grow/>
+                    </m:dPr>
+                    <m:e>
+                      <m:r>
+                        <m:t>μ</m:t>
+                      </m:r>
+                    </m:e>
+                  </m:d>
+                  <m:r>
+                    <m:t>​</m:t>
+                  </m:r>
+                </m:e>
+                <m:sup>
+                  <m:r>
+                    <m:t>2</m:t>
+                  </m:r>
+                </m:sup>
+              </m:sSup>
+              <m:r>
+                <m:t>&amp;</m:t>
+              </m:r>
+              <m:r>
+                <m:t>&amp;</m:t>
+              </m:r>
+              <m:r>
+                <m:rPr>
+                  <m:nor/>
+                  <m:sty m:val="p"/>
+                </m:rPr>
+                <m:t>(combine like terms)</m:t>
+              </m:r>
+            </m:e>
+            <m:e>
+              <m:r>
+                <m:t>&amp;</m:t>
+              </m:r>
+              <m:r>
+                <m:rPr>
+                  <m:sty m:val="p"/>
+                </m:rPr>
+                <m:t>=</m:t>
+              </m:r>
+              <m:r>
+                <m:rPr>
+                  <m:sty m:val="p"/>
+                </m:rPr>
+                <m:t>E</m:t>
+              </m:r>
+              <m:r>
+                <m:t>​</m:t>
+              </m:r>
+              <m:d>
+                <m:dPr>
+                  <m:begChr m:val="["/>
+                  <m:sepChr m:val=""/>
+                  <m:endChr m:val="]"/>
+                  <m:grow/>
+                </m:dPr>
+                <m:e>
+                  <m:sSup>
+                    <m:e>
+                      <m:r>
+                        <m:t>X</m:t>
+                      </m:r>
+                    </m:e>
+                    <m:sup>
+                      <m:r>
+                        <m:t>2</m:t>
+                      </m:r>
+                    </m:sup>
+                  </m:sSup>
+                </m:e>
+              </m:d>
+              <m:r>
+                <m:t>​</m:t>
+              </m:r>
+              <m:r>
+                <m:rPr>
+                  <m:sty m:val="p"/>
+                </m:rPr>
+                <m:t>−</m:t>
               </m:r>
               <m:sSup>
                 <m:e>
@@ -4242,7 +4582,16 @@
                   <m:nor/>
                   <m:sty m:val="p"/>
                 </m:rPr>
-                <m:t>(linearity of expectation; </m:t>
+                <m:t>(</m:t>
+              </m:r>
+              <m:r>
+                <m:t>μ</m:t>
+              </m:r>
+              <m:r>
+                <m:rPr>
+                  <m:sty m:val="p"/>
+                </m:rPr>
+                <m:t>=</m:t>
               </m:r>
               <m:r>
                 <m:rPr>
@@ -4274,121 +4623,7 @@
                   <m:nor/>
                   <m:sty m:val="p"/>
                 </m:rPr>
-                <m:t> is a constant)</m:t>
-              </m:r>
-            </m:e>
-            <m:e>
-              <m:r>
-                <m:t>&amp;</m:t>
-              </m:r>
-              <m:r>
-                <m:rPr>
-                  <m:sty m:val="p"/>
-                </m:rPr>
-                <m:t>=</m:t>
-              </m:r>
-              <m:r>
-                <m:rPr>
-                  <m:sty m:val="p"/>
-                </m:rPr>
-                <m:t>E</m:t>
-              </m:r>
-              <m:r>
-                <m:t>​</m:t>
-              </m:r>
-              <m:d>
-                <m:dPr>
-                  <m:begChr m:val="["/>
-                  <m:sepChr m:val=""/>
-                  <m:endChr m:val="]"/>
-                  <m:grow/>
-                </m:dPr>
-                <m:e>
-                  <m:sSup>
-                    <m:e>
-                      <m:r>
-                        <m:t>X</m:t>
-                      </m:r>
-                    </m:e>
-                    <m:sup>
-                      <m:r>
-                        <m:t>2</m:t>
-                      </m:r>
-                    </m:sup>
-                  </m:sSup>
-                </m:e>
-              </m:d>
-              <m:r>
-                <m:t>​</m:t>
-              </m:r>
-              <m:r>
-                <m:rPr>
-                  <m:sty m:val="p"/>
-                </m:rPr>
-                <m:t>−</m:t>
-              </m:r>
-              <m:sSup>
-                <m:e>
-                  <m:r>
-                    <m:t>​</m:t>
-                  </m:r>
-                  <m:d>
-                    <m:dPr>
-                      <m:begChr m:val="("/>
-                      <m:sepChr m:val=""/>
-                      <m:endChr m:val=")"/>
-                      <m:grow/>
-                    </m:dPr>
-                    <m:e>
-                      <m:r>
-                        <m:rPr>
-                          <m:sty m:val="p"/>
-                        </m:rPr>
-                        <m:t>E</m:t>
-                      </m:r>
-                      <m:r>
-                        <m:t>​</m:t>
-                      </m:r>
-                      <m:d>
-                        <m:dPr>
-                          <m:begChr m:val="["/>
-                          <m:sepChr m:val=""/>
-                          <m:endChr m:val="]"/>
-                          <m:grow/>
-                        </m:dPr>
-                        <m:e>
-                          <m:r>
-                            <m:t>X</m:t>
-                          </m:r>
-                        </m:e>
-                      </m:d>
-                      <m:r>
-                        <m:t>​</m:t>
-                      </m:r>
-                    </m:e>
-                  </m:d>
-                  <m:r>
-                    <m:t>​</m:t>
-                  </m:r>
-                </m:e>
-                <m:sup>
-                  <m:r>
-                    <m:t>2</m:t>
-                  </m:r>
-                </m:sup>
-              </m:sSup>
-              <m:r>
-                <m:t>&amp;</m:t>
-              </m:r>
-              <m:r>
-                <m:t>&amp;</m:t>
-              </m:r>
-              <m:r>
-                <m:rPr>
-                  <m:nor/>
-                  <m:sty m:val="p"/>
-                </m:rPr>
-                <m:t>(combine like terms)</m:t>
+                <m:t>)</m:t>
               </m:r>
             </m:e>
           </m:eqArr>
@@ -19603,7 +19838,163 @@
         <w:t xml:space="preserve">. </w:t>
       </w:r>
       <w:r>
-        <w:t xml:space="preserve">By</w:t>
+        <w:t xml:space="preserve">Let</w:t>
+      </w:r>
+      <w:r>
+        <w:t xml:space="preserve"> </w:t>
+      </w:r>
+      <m:oMath>
+        <m:sSub>
+          <m:e>
+            <m:r>
+              <m:t>μ</m:t>
+            </m:r>
+          </m:e>
+          <m:sub>
+            <m:r>
+              <m:t>X</m:t>
+            </m:r>
+          </m:sub>
+        </m:sSub>
+        <m:r>
+          <m:rPr>
+            <m:sty m:val="p"/>
+          </m:rPr>
+          <m:t>=</m:t>
+        </m:r>
+        <m:r>
+          <m:rPr>
+            <m:sty m:val="p"/>
+          </m:rPr>
+          <m:t>E</m:t>
+        </m:r>
+        <m:r>
+          <m:t>​</m:t>
+        </m:r>
+        <m:d>
+          <m:dPr>
+            <m:begChr m:val="["/>
+            <m:sepChr m:val=""/>
+            <m:endChr m:val="]"/>
+            <m:grow/>
+          </m:dPr>
+          <m:e>
+            <m:r>
+              <m:t>X</m:t>
+            </m:r>
+          </m:e>
+        </m:d>
+        <m:r>
+          <m:t>​</m:t>
+        </m:r>
+      </m:oMath>
+      <w:r>
+        <w:t xml:space="preserve"> </w:t>
+      </w:r>
+      <w:r>
+        <w:t xml:space="preserve">and</w:t>
+      </w:r>
+      <w:r>
+        <w:t xml:space="preserve"> </w:t>
+      </w:r>
+      <m:oMath>
+        <m:sSub>
+          <m:e>
+            <m:r>
+              <m:t>μ</m:t>
+            </m:r>
+          </m:e>
+          <m:sub>
+            <m:r>
+              <m:t>Y</m:t>
+            </m:r>
+          </m:sub>
+        </m:sSub>
+        <m:r>
+          <m:rPr>
+            <m:sty m:val="p"/>
+          </m:rPr>
+          <m:t>=</m:t>
+        </m:r>
+        <m:r>
+          <m:rPr>
+            <m:sty m:val="p"/>
+          </m:rPr>
+          <m:t>E</m:t>
+        </m:r>
+        <m:r>
+          <m:t>​</m:t>
+        </m:r>
+        <m:d>
+          <m:dPr>
+            <m:begChr m:val="["/>
+            <m:sepChr m:val=""/>
+            <m:endChr m:val="]"/>
+            <m:grow/>
+          </m:dPr>
+          <m:e>
+            <m:r>
+              <m:t>Y</m:t>
+            </m:r>
+          </m:e>
+        </m:d>
+        <m:r>
+          <m:t>​</m:t>
+        </m:r>
+      </m:oMath>
+      <w:r>
+        <w:t xml:space="preserve"> </w:t>
+      </w:r>
+      <w:r>
+        <w:t xml:space="preserve">be the</w:t>
+      </w:r>
+      <w:r>
+        <w:t xml:space="preserve"> </w:t>
+      </w:r>
+      <w:hyperlink r:id="rId11">
+        <w:r>
+          <w:rPr>
+            <w:rStyle w:val="Hyperlink"/>
+          </w:rPr>
+          <w:t xml:space="preserve">population means</w:t>
+        </w:r>
+      </w:hyperlink>
+      <w:r>
+        <w:t xml:space="preserve"> </w:t>
+      </w:r>
+      <w:r>
+        <w:t xml:space="preserve">of</w:t>
+      </w:r>
+      <w:r>
+        <w:t xml:space="preserve"> </w:t>
+      </w:r>
+      <m:oMath>
+        <m:r>
+          <m:t>X</m:t>
+        </m:r>
+      </m:oMath>
+      <w:r>
+        <w:t xml:space="preserve"> </w:t>
+      </w:r>
+      <w:r>
+        <w:t xml:space="preserve">and</w:t>
+      </w:r>
+      <w:r>
+        <w:t xml:space="preserve"> </w:t>
+      </w:r>
+      <m:oMath>
+        <m:r>
+          <m:t>Y</m:t>
+        </m:r>
+      </m:oMath>
+      <w:r>
+        <w:t xml:space="preserve">.</w:t>
+      </w:r>
+      <w:r>
+        <w:t xml:space="preserve"> </w:t>
+      </w:r>
+      <w:r>
+        <w:t xml:space="preserve">They are constants, so</w:t>
       </w:r>
       <w:r>
         <w:t xml:space="preserve"> </w:t>
@@ -19617,7 +20008,10 @@
         </w:r>
       </w:hyperlink>
       <w:r>
-        <w:t xml:space="preserve">,</w:t>
+        <w:t xml:space="preserve"> </w:t>
+      </w:r>
+      <w:r>
+        <w:t xml:space="preserve">applies with them as coefficients,</w:t>
       </w:r>
       <w:r>
         <w:t xml:space="preserve"> </w:t>
@@ -19739,31 +20133,18 @@
                     </m:rPr>
                     <m:t>−</m:t>
                   </m:r>
-                  <m:r>
-                    <m:rPr>
-                      <m:sty m:val="p"/>
-                    </m:rPr>
-                    <m:t>E</m:t>
-                  </m:r>
-                  <m:r>
-                    <m:t>​</m:t>
-                  </m:r>
-                  <m:d>
-                    <m:dPr>
-                      <m:begChr m:val="["/>
-                      <m:sepChr m:val=""/>
-                      <m:endChr m:val="]"/>
-                      <m:grow/>
-                    </m:dPr>
+                  <m:sSub>
                     <m:e>
                       <m:r>
+                        <m:t>μ</m:t>
+                      </m:r>
+                    </m:e>
+                    <m:sub>
+                      <m:r>
                         <m:t>X</m:t>
                       </m:r>
-                    </m:e>
-                  </m:d>
-                  <m:r>
-                    <m:t>​</m:t>
-                  </m:r>
+                    </m:sub>
+                  </m:sSub>
                   <m:r>
                     <m:rPr>
                       <m:sty m:val="p"/>
@@ -19785,31 +20166,18 @@
                     </m:rPr>
                     <m:t>−</m:t>
                   </m:r>
-                  <m:r>
-                    <m:rPr>
-                      <m:sty m:val="p"/>
-                    </m:rPr>
-                    <m:t>E</m:t>
-                  </m:r>
-                  <m:r>
-                    <m:t>​</m:t>
-                  </m:r>
-                  <m:d>
-                    <m:dPr>
-                      <m:begChr m:val="["/>
-                      <m:sepChr m:val=""/>
-                      <m:endChr m:val="]"/>
-                      <m:grow/>
-                    </m:dPr>
+                  <m:sSub>
                     <m:e>
                       <m:r>
+                        <m:t>μ</m:t>
+                      </m:r>
+                    </m:e>
+                    <m:sub>
+                      <m:r>
                         <m:t>Y</m:t>
                       </m:r>
-                    </m:e>
-                  </m:d>
-                  <m:r>
-                    <m:t>​</m:t>
-                  </m:r>
+                    </m:sub>
+                  </m:sSub>
                   <m:r>
                     <m:rPr>
                       <m:sty m:val="p"/>
@@ -19832,7 +20200,44 @@
                   <m:nor/>
                   <m:sty m:val="p"/>
                 </m:rPr>
-                <m:t>(definition of covariance)</m:t>
+                <m:t>(definition of covariance, with population means </m:t>
+              </m:r>
+              <m:sSub>
+                <m:e>
+                  <m:r>
+                    <m:t>μ</m:t>
+                  </m:r>
+                </m:e>
+                <m:sub>
+                  <m:r>
+                    <m:t>X</m:t>
+                  </m:r>
+                </m:sub>
+              </m:sSub>
+              <m:r>
+                <m:rPr>
+                  <m:sty m:val="p"/>
+                </m:rPr>
+                <m:t>,</m:t>
+              </m:r>
+              <m:sSub>
+                <m:e>
+                  <m:r>
+                    <m:t>μ</m:t>
+                  </m:r>
+                </m:e>
+                <m:sub>
+                  <m:r>
+                    <m:t>Y</m:t>
+                  </m:r>
+                </m:sub>
+              </m:sSub>
+              <m:r>
+                <m:rPr>
+                  <m:nor/>
+                  <m:sty m:val="p"/>
+                </m:rPr>
+                <m:t>)</m:t>
               </m:r>
             </m:e>
             <m:e>
@@ -19877,31 +20282,18 @@
                   <m:r>
                     <m:t>X</m:t>
                   </m:r>
-                  <m:r>
-                    <m:rPr>
-                      <m:sty m:val="p"/>
-                    </m:rPr>
-                    <m:t>E</m:t>
-                  </m:r>
-                  <m:r>
-                    <m:t>​</m:t>
-                  </m:r>
-                  <m:d>
-                    <m:dPr>
-                      <m:begChr m:val="["/>
-                      <m:sepChr m:val=""/>
-                      <m:endChr m:val="]"/>
-                      <m:grow/>
-                    </m:dPr>
+                  <m:sSub>
                     <m:e>
                       <m:r>
+                        <m:t>μ</m:t>
+                      </m:r>
+                    </m:e>
+                    <m:sub>
+                      <m:r>
                         <m:t>Y</m:t>
                       </m:r>
-                    </m:e>
-                  </m:d>
-                  <m:r>
-                    <m:t>​</m:t>
-                  </m:r>
+                    </m:sub>
+                  </m:sSub>
                   <m:r>
                     <m:rPr>
                       <m:sty m:val="p"/>
@@ -19911,87 +20303,48 @@
                   <m:r>
                     <m:t>Y</m:t>
                   </m:r>
-                  <m:r>
-                    <m:rPr>
-                      <m:sty m:val="p"/>
-                    </m:rPr>
-                    <m:t>E</m:t>
-                  </m:r>
-                  <m:r>
-                    <m:t>​</m:t>
-                  </m:r>
-                  <m:d>
-                    <m:dPr>
-                      <m:begChr m:val="["/>
-                      <m:sepChr m:val=""/>
-                      <m:endChr m:val="]"/>
-                      <m:grow/>
-                    </m:dPr>
+                  <m:sSub>
                     <m:e>
                       <m:r>
+                        <m:t>μ</m:t>
+                      </m:r>
+                    </m:e>
+                    <m:sub>
+                      <m:r>
                         <m:t>X</m:t>
                       </m:r>
-                    </m:e>
-                  </m:d>
-                  <m:r>
-                    <m:t>​</m:t>
-                  </m:r>
+                    </m:sub>
+                  </m:sSub>
                   <m:r>
                     <m:rPr>
                       <m:sty m:val="p"/>
                     </m:rPr>
                     <m:t>+</m:t>
                   </m:r>
-                  <m:r>
-                    <m:rPr>
-                      <m:sty m:val="p"/>
-                    </m:rPr>
-                    <m:t>E</m:t>
-                  </m:r>
-                  <m:r>
-                    <m:t>​</m:t>
-                  </m:r>
-                  <m:d>
-                    <m:dPr>
-                      <m:begChr m:val="["/>
-                      <m:sepChr m:val=""/>
-                      <m:endChr m:val="]"/>
-                      <m:grow/>
-                    </m:dPr>
+                  <m:sSub>
                     <m:e>
                       <m:r>
+                        <m:t>μ</m:t>
+                      </m:r>
+                    </m:e>
+                    <m:sub>
+                      <m:r>
                         <m:t>X</m:t>
                       </m:r>
+                    </m:sub>
+                  </m:sSub>
+                  <m:sSub>
+                    <m:e>
+                      <m:r>
+                        <m:t>μ</m:t>
+                      </m:r>
                     </m:e>
-                  </m:d>
-                  <m:r>
-                    <m:t>​</m:t>
-                  </m:r>
-                  <m:r>
-                    <m:rPr>
-                      <m:sty m:val="p"/>
-                    </m:rPr>
-                    <m:t>E</m:t>
-                  </m:r>
-                  <m:r>
-                    <m:t>​</m:t>
-                  </m:r>
-                  <m:d>
-                    <m:dPr>
-                      <m:begChr m:val="["/>
-                      <m:sepChr m:val=""/>
-                      <m:endChr m:val="]"/>
-                      <m:grow/>
-                    </m:dPr>
-                    <m:e>
+                    <m:sub>
                       <m:r>
                         <m:t>Y</m:t>
                       </m:r>
-                    </m:e>
-                  </m:d>
-                  <m:r>
-                    <m:t>​</m:t>
-                  </m:r>
+                    </m:sub>
+                  </m:sSub>
                 </m:e>
               </m:d>
               <m:r>
@@ -20055,6 +20408,18 @@
                 </m:rPr>
                 <m:t>−</m:t>
               </m:r>
+              <m:sSub>
+                <m:e>
+                  <m:r>
+                    <m:t>μ</m:t>
+                  </m:r>
+                </m:e>
+                <m:sub>
+                  <m:r>
+                    <m:t>Y</m:t>
+                  </m:r>
+                </m:sub>
+              </m:sSub>
               <m:r>
                 <m:rPr>
                   <m:sty m:val="p"/>
@@ -20084,6 +20449,24 @@
                 <m:rPr>
                   <m:sty m:val="p"/>
                 </m:rPr>
+                <m:t>−</m:t>
+              </m:r>
+              <m:sSub>
+                <m:e>
+                  <m:r>
+                    <m:t>μ</m:t>
+                  </m:r>
+                </m:e>
+                <m:sub>
+                  <m:r>
+                    <m:t>X</m:t>
+                  </m:r>
+                </m:sub>
+              </m:sSub>
+              <m:r>
+                <m:rPr>
+                  <m:sty m:val="p"/>
+                </m:rPr>
                 <m:t>E</m:t>
               </m:r>
               <m:r>
@@ -20109,7 +20492,92 @@
                 <m:rPr>
                   <m:sty m:val="p"/>
                 </m:rPr>
-                <m:t>−</m:t>
+                <m:t>+</m:t>
+              </m:r>
+              <m:sSub>
+                <m:e>
+                  <m:r>
+                    <m:t>μ</m:t>
+                  </m:r>
+                </m:e>
+                <m:sub>
+                  <m:r>
+                    <m:t>X</m:t>
+                  </m:r>
+                </m:sub>
+              </m:sSub>
+              <m:sSub>
+                <m:e>
+                  <m:r>
+                    <m:t>μ</m:t>
+                  </m:r>
+                </m:e>
+                <m:sub>
+                  <m:r>
+                    <m:t>Y</m:t>
+                  </m:r>
+                </m:sub>
+              </m:sSub>
+              <m:r>
+                <m:t>&amp;</m:t>
+              </m:r>
+              <m:r>
+                <m:t>&amp;</m:t>
+              </m:r>
+              <m:r>
+                <m:rPr>
+                  <m:nor/>
+                  <m:sty m:val="p"/>
+                </m:rPr>
+                <m:t>(linearity of expectation; </m:t>
+              </m:r>
+              <m:sSub>
+                <m:e>
+                  <m:r>
+                    <m:t>μ</m:t>
+                  </m:r>
+                </m:e>
+                <m:sub>
+                  <m:r>
+                    <m:t>X</m:t>
+                  </m:r>
+                </m:sub>
+              </m:sSub>
+              <m:r>
+                <m:rPr>
+                  <m:sty m:val="p"/>
+                </m:rPr>
+                <m:t>,</m:t>
+              </m:r>
+              <m:sSub>
+                <m:e>
+                  <m:r>
+                    <m:t>μ</m:t>
+                  </m:r>
+                </m:e>
+                <m:sub>
+                  <m:r>
+                    <m:t>Y</m:t>
+                  </m:r>
+                </m:sub>
+              </m:sSub>
+              <m:r>
+                <m:rPr>
+                  <m:nor/>
+                  <m:sty m:val="p"/>
+                </m:rPr>
+                <m:t> are constants)</m:t>
+              </m:r>
+            </m:e>
+            <m:e>
+              <m:r>
+                <m:t>&amp;</m:t>
+              </m:r>
+              <m:r>
+                <m:rPr>
+                  <m:sty m:val="p"/>
+                </m:rPr>
+                <m:t>=</m:t>
               </m:r>
               <m:r>
                 <m:rPr>
@@ -20129,12 +20597,118 @@
                 </m:dPr>
                 <m:e>
                   <m:r>
+                    <m:t>X</m:t>
+                  </m:r>
+                  <m:r>
                     <m:t>Y</m:t>
                   </m:r>
                 </m:e>
               </m:d>
               <m:r>
                 <m:t>​</m:t>
+              </m:r>
+              <m:r>
+                <m:rPr>
+                  <m:sty m:val="p"/>
+                </m:rPr>
+                <m:t>−</m:t>
+              </m:r>
+              <m:sSub>
+                <m:e>
+                  <m:r>
+                    <m:t>μ</m:t>
+                  </m:r>
+                </m:e>
+                <m:sub>
+                  <m:r>
+                    <m:t>Y</m:t>
+                  </m:r>
+                </m:sub>
+              </m:sSub>
+              <m:sSub>
+                <m:e>
+                  <m:r>
+                    <m:t>μ</m:t>
+                  </m:r>
+                </m:e>
+                <m:sub>
+                  <m:r>
+                    <m:t>X</m:t>
+                  </m:r>
+                </m:sub>
+              </m:sSub>
+              <m:r>
+                <m:rPr>
+                  <m:sty m:val="p"/>
+                </m:rPr>
+                <m:t>−</m:t>
+              </m:r>
+              <m:sSub>
+                <m:e>
+                  <m:r>
+                    <m:t>μ</m:t>
+                  </m:r>
+                </m:e>
+                <m:sub>
+                  <m:r>
+                    <m:t>X</m:t>
+                  </m:r>
+                </m:sub>
+              </m:sSub>
+              <m:sSub>
+                <m:e>
+                  <m:r>
+                    <m:t>μ</m:t>
+                  </m:r>
+                </m:e>
+                <m:sub>
+                  <m:r>
+                    <m:t>Y</m:t>
+                  </m:r>
+                </m:sub>
+              </m:sSub>
+              <m:r>
+                <m:rPr>
+                  <m:sty m:val="p"/>
+                </m:rPr>
+                <m:t>+</m:t>
+              </m:r>
+              <m:sSub>
+                <m:e>
+                  <m:r>
+                    <m:t>μ</m:t>
+                  </m:r>
+                </m:e>
+                <m:sub>
+                  <m:r>
+                    <m:t>X</m:t>
+                  </m:r>
+                </m:sub>
+              </m:sSub>
+              <m:sSub>
+                <m:e>
+                  <m:r>
+                    <m:t>μ</m:t>
+                  </m:r>
+                </m:e>
+                <m:sub>
+                  <m:r>
+                    <m:t>Y</m:t>
+                  </m:r>
+                </m:sub>
+              </m:sSub>
+              <m:r>
+                <m:t>&amp;</m:t>
+              </m:r>
+              <m:r>
+                <m:t>&amp;</m:t>
+              </m:r>
+              <m:r>
+                <m:rPr>
+                  <m:nor/>
+                  <m:sty m:val="p"/>
+                </m:rPr>
+                <m:t>(</m:t>
               </m:r>
               <m:r>
                 <m:rPr>
@@ -20165,7 +20739,26 @@
                 <m:rPr>
                   <m:sty m:val="p"/>
                 </m:rPr>
-                <m:t>+</m:t>
+                <m:t>=</m:t>
+              </m:r>
+              <m:sSub>
+                <m:e>
+                  <m:r>
+                    <m:t>μ</m:t>
+                  </m:r>
+                </m:e>
+                <m:sub>
+                  <m:r>
+                    <m:t>X</m:t>
+                  </m:r>
+                </m:sub>
+              </m:sSub>
+              <m:r>
+                <m:rPr>
+                  <m:nor/>
+                  <m:sty m:val="p"/>
+                </m:rPr>
+                <m:t> and </m:t>
               </m:r>
               <m:r>
                 <m:rPr>
@@ -20185,12 +20778,48 @@
                 </m:dPr>
                 <m:e>
                   <m:r>
-                    <m:t>X</m:t>
+                    <m:t>Y</m:t>
                   </m:r>
                 </m:e>
               </m:d>
               <m:r>
                 <m:t>​</m:t>
+              </m:r>
+              <m:r>
+                <m:rPr>
+                  <m:sty m:val="p"/>
+                </m:rPr>
+                <m:t>=</m:t>
+              </m:r>
+              <m:sSub>
+                <m:e>
+                  <m:r>
+                    <m:t>μ</m:t>
+                  </m:r>
+                </m:e>
+                <m:sub>
+                  <m:r>
+                    <m:t>Y</m:t>
+                  </m:r>
+                </m:sub>
+              </m:sSub>
+              <m:r>
+                <m:rPr>
+                  <m:nor/>
+                  <m:sty m:val="p"/>
+                </m:rPr>
+                <m:t>)</m:t>
+              </m:r>
+            </m:e>
+            <m:e>
+              <m:r>
+                <m:t>&amp;</m:t>
+              </m:r>
+              <m:r>
+                <m:rPr>
+                  <m:sty m:val="p"/>
+                </m:rPr>
+                <m:t>=</m:t>
               </m:r>
               <m:r>
                 <m:rPr>
@@ -20210,6 +20839,9 @@
                 </m:dPr>
                 <m:e>
                   <m:r>
+                    <m:t>X</m:t>
+                  </m:r>
+                  <m:r>
                     <m:t>Y</m:t>
                   </m:r>
                 </m:e>
@@ -20218,6 +20850,36 @@
                 <m:t>​</m:t>
               </m:r>
               <m:r>
+                <m:rPr>
+                  <m:sty m:val="p"/>
+                </m:rPr>
+                <m:t>−</m:t>
+              </m:r>
+              <m:sSub>
+                <m:e>
+                  <m:r>
+                    <m:t>μ</m:t>
+                  </m:r>
+                </m:e>
+                <m:sub>
+                  <m:r>
+                    <m:t>X</m:t>
+                  </m:r>
+                </m:sub>
+              </m:sSub>
+              <m:sSub>
+                <m:e>
+                  <m:r>
+                    <m:t>μ</m:t>
+                  </m:r>
+                </m:e>
+                <m:sub>
+                  <m:r>
+                    <m:t>Y</m:t>
+                  </m:r>
+                </m:sub>
+              </m:sSub>
+              <m:r>
                 <m:t>&amp;</m:t>
               </m:r>
               <m:r>
@@ -20228,7 +20890,18 @@
                   <m:nor/>
                   <m:sty m:val="p"/>
                 </m:rPr>
-                <m:t>(linearity of expectation; </m:t>
+                <m:t>(combine like terms)</m:t>
+              </m:r>
+            </m:e>
+            <m:e>
+              <m:r>
+                <m:t>&amp;</m:t>
+              </m:r>
+              <m:r>
+                <m:rPr>
+                  <m:sty m:val="p"/>
+                </m:rPr>
+                <m:t>=</m:t>
               </m:r>
               <m:r>
                 <m:rPr>
@@ -20250,6 +20923,9 @@
                   <m:r>
                     <m:t>X</m:t>
                   </m:r>
+                  <m:r>
+                    <m:t>Y</m:t>
+                  </m:r>
                 </m:e>
               </m:d>
               <m:r>
@@ -20259,7 +20935,7 @@
                 <m:rPr>
                   <m:sty m:val="p"/>
                 </m:rPr>
-                <m:t>,</m:t>
+                <m:t>−</m:t>
               </m:r>
               <m:r>
                 <m:rPr>
@@ -20279,30 +20955,12 @@
                 </m:dPr>
                 <m:e>
                   <m:r>
-                    <m:t>Y</m:t>
+                    <m:t>X</m:t>
                   </m:r>
                 </m:e>
               </m:d>
               <m:r>
                 <m:t>​</m:t>
-              </m:r>
-              <m:r>
-                <m:rPr>
-                  <m:nor/>
-                  <m:sty m:val="p"/>
-                </m:rPr>
-                <m:t> are constants)</m:t>
-              </m:r>
-            </m:e>
-            <m:e>
-              <m:r>
-                <m:t>&amp;</m:t>
-              </m:r>
-              <m:r>
-                <m:rPr>
-                  <m:sty m:val="p"/>
-                </m:rPr>
-                <m:t>=</m:t>
               </m:r>
               <m:r>
                 <m:rPr>
@@ -20322,9 +20980,6 @@
                 </m:dPr>
                 <m:e>
                   <m:r>
-                    <m:t>X</m:t>
-                  </m:r>
-                  <m:r>
                     <m:t>Y</m:t>
                   </m:r>
                 </m:e>
@@ -20333,10 +20988,35 @@
                 <m:t>​</m:t>
               </m:r>
               <m:r>
-                <m:rPr>
-                  <m:sty m:val="p"/>
-                </m:rPr>
-                <m:t>−</m:t>
+                <m:t>&amp;</m:t>
+              </m:r>
+              <m:r>
+                <m:t>&amp;</m:t>
+              </m:r>
+              <m:r>
+                <m:rPr>
+                  <m:nor/>
+                  <m:sty m:val="p"/>
+                </m:rPr>
+                <m:t>(</m:t>
+              </m:r>
+              <m:sSub>
+                <m:e>
+                  <m:r>
+                    <m:t>μ</m:t>
+                  </m:r>
+                </m:e>
+                <m:sub>
+                  <m:r>
+                    <m:t>X</m:t>
+                  </m:r>
+                </m:sub>
+              </m:sSub>
+              <m:r>
+                <m:rPr>
+                  <m:sty m:val="p"/>
+                </m:rPr>
+                <m:t>=</m:t>
               </m:r>
               <m:r>
                 <m:rPr>
@@ -20365,6 +21045,31 @@
               </m:r>
               <m:r>
                 <m:rPr>
+                  <m:nor/>
+                  <m:sty m:val="p"/>
+                </m:rPr>
+                <m:t> and </m:t>
+              </m:r>
+              <m:sSub>
+                <m:e>
+                  <m:r>
+                    <m:t>μ</m:t>
+                  </m:r>
+                </m:e>
+                <m:sub>
+                  <m:r>
+                    <m:t>Y</m:t>
+                  </m:r>
+                </m:sub>
+              </m:sSub>
+              <m:r>
+                <m:rPr>
+                  <m:sty m:val="p"/>
+                </m:rPr>
+                <m:t>=</m:t>
+              </m:r>
+              <m:r>
+                <m:rPr>
                   <m:sty m:val="p"/>
                 </m:rPr>
                 <m:t>E</m:t>
@@ -20389,17 +21094,11 @@
                 <m:t>​</m:t>
               </m:r>
               <m:r>
-                <m:t>&amp;</m:t>
-              </m:r>
-              <m:r>
-                <m:t>&amp;</m:t>
-              </m:r>
-              <m:r>
                 <m:rPr>
                   <m:nor/>
                   <m:sty m:val="p"/>
                 </m:rPr>
-                <m:t>(combine like terms)</m:t>
+                <m:t>)</m:t>
               </m:r>
             </m:e>
           </m:eqArr>
@@ -34492,31 +35191,18 @@
                         </m:rPr>
                         <m:t>−</m:t>
                       </m:r>
-                      <m:r>
-                        <m:rPr>
-                          <m:sty m:val="p"/>
-                        </m:rPr>
-                        <m:t>E</m:t>
-                      </m:r>
-                      <m:r>
-                        <m:t>​</m:t>
-                      </m:r>
-                      <m:d>
-                        <m:dPr>
-                          <m:begChr m:val="["/>
-                          <m:sepChr m:val=""/>
-                          <m:endChr m:val="]"/>
-                          <m:grow/>
-                        </m:dPr>
+                      <m:sSub>
                         <m:e>
+                          <m:r>
+                            <m:t>μ</m:t>
+                          </m:r>
+                        </m:e>
+                        <m:sub>
                           <m:r>
                             <m:t>X</m:t>
                           </m:r>
-                        </m:e>
-                      </m:d>
-                      <m:r>
-                        <m:t>​</m:t>
-                      </m:r>
+                        </m:sub>
+                      </m:sSub>
                       <m:r>
                         <m:rPr>
                           <m:sty m:val="p"/>
@@ -34547,31 +35233,18 @@
                         </m:rPr>
                         <m:t>−</m:t>
                       </m:r>
-                      <m:r>
-                        <m:rPr>
-                          <m:sty m:val="p"/>
-                        </m:rPr>
-                        <m:t>E</m:t>
-                      </m:r>
-                      <m:r>
-                        <m:t>​</m:t>
-                      </m:r>
-                      <m:d>
-                        <m:dPr>
-                          <m:begChr m:val="["/>
-                          <m:sepChr m:val=""/>
-                          <m:endChr m:val="]"/>
-                          <m:grow/>
-                        </m:dPr>
+                      <m:sSub>
                         <m:e>
+                          <m:r>
+                            <m:t>μ</m:t>
+                          </m:r>
+                        </m:e>
+                        <m:sub>
                           <m:r>
                             <m:t>Y</m:t>
                           </m:r>
-                        </m:e>
-                      </m:d>
-                      <m:r>
-                        <m:t>​</m:t>
-                      </m:r>
+                        </m:sub>
+                      </m:sSub>
                       <m:r>
                         <m:rPr>
                           <m:sty m:val="p"/>
@@ -34608,7 +35281,106 @@
                   <m:nor/>
                   <m:sty m:val="p"/>
                 </m:rPr>
-                <m:t>(linearity of expectation)</m:t>
+                <m:t>(linearity of expectation, with population means </m:t>
+              </m:r>
+              <m:sSub>
+                <m:e>
+                  <m:r>
+                    <m:t>μ</m:t>
+                  </m:r>
+                </m:e>
+                <m:sub>
+                  <m:r>
+                    <m:t>X</m:t>
+                  </m:r>
+                </m:sub>
+              </m:sSub>
+              <m:r>
+                <m:rPr>
+                  <m:sty m:val="p"/>
+                </m:rPr>
+                <m:t>=</m:t>
+              </m:r>
+              <m:r>
+                <m:rPr>
+                  <m:sty m:val="p"/>
+                </m:rPr>
+                <m:t>E</m:t>
+              </m:r>
+              <m:r>
+                <m:t>​</m:t>
+              </m:r>
+              <m:d>
+                <m:dPr>
+                  <m:begChr m:val="["/>
+                  <m:sepChr m:val=""/>
+                  <m:endChr m:val="]"/>
+                  <m:grow/>
+                </m:dPr>
+                <m:e>
+                  <m:r>
+                    <m:t>X</m:t>
+                  </m:r>
+                </m:e>
+              </m:d>
+              <m:r>
+                <m:t>​</m:t>
+              </m:r>
+              <m:r>
+                <m:rPr>
+                  <m:sty m:val="p"/>
+                </m:rPr>
+                <m:t>,</m:t>
+              </m:r>
+              <m:sSub>
+                <m:e>
+                  <m:r>
+                    <m:t>μ</m:t>
+                  </m:r>
+                </m:e>
+                <m:sub>
+                  <m:r>
+                    <m:t>Y</m:t>
+                  </m:r>
+                </m:sub>
+              </m:sSub>
+              <m:r>
+                <m:rPr>
+                  <m:sty m:val="p"/>
+                </m:rPr>
+                <m:t>=</m:t>
+              </m:r>
+              <m:r>
+                <m:rPr>
+                  <m:sty m:val="p"/>
+                </m:rPr>
+                <m:t>E</m:t>
+              </m:r>
+              <m:r>
+                <m:t>​</m:t>
+              </m:r>
+              <m:d>
+                <m:dPr>
+                  <m:begChr m:val="["/>
+                  <m:sepChr m:val=""/>
+                  <m:endChr m:val="]"/>
+                  <m:grow/>
+                </m:dPr>
+                <m:e>
+                  <m:r>
+                    <m:t>Y</m:t>
+                  </m:r>
+                </m:e>
+              </m:d>
+              <m:r>
+                <m:t>​</m:t>
+              </m:r>
+              <m:r>
+                <m:rPr>
+                  <m:nor/>
+                  <m:sty m:val="p"/>
+                </m:rPr>
+                <m:t>)</m:t>
               </m:r>
             </m:e>
             <m:e>
@@ -34665,31 +35437,18 @@
                     </m:rPr>
                     <m:t>−</m:t>
                   </m:r>
-                  <m:r>
-                    <m:rPr>
-                      <m:sty m:val="p"/>
-                    </m:rPr>
-                    <m:t>E</m:t>
-                  </m:r>
-                  <m:r>
-                    <m:t>​</m:t>
-                  </m:r>
-                  <m:d>
-                    <m:dPr>
-                      <m:begChr m:val="["/>
-                      <m:sepChr m:val=""/>
-                      <m:endChr m:val="]"/>
-                      <m:grow/>
-                    </m:dPr>
+                  <m:sSub>
                     <m:e>
                       <m:r>
+                        <m:t>μ</m:t>
+                      </m:r>
+                    </m:e>
+                    <m:sub>
+                      <m:r>
                         <m:t>X</m:t>
                       </m:r>
-                    </m:e>
-                  </m:d>
-                  <m:r>
-                    <m:t>​</m:t>
-                  </m:r>
+                    </m:sub>
+                  </m:sSub>
                   <m:sSup>
                     <m:e>
                       <m:r>
@@ -34753,31 +35512,18 @@
                     </m:rPr>
                     <m:t>−</m:t>
                   </m:r>
-                  <m:r>
-                    <m:rPr>
-                      <m:sty m:val="p"/>
-                    </m:rPr>
-                    <m:t>E</m:t>
-                  </m:r>
-                  <m:r>
-                    <m:t>​</m:t>
-                  </m:r>
-                  <m:d>
-                    <m:dPr>
-                      <m:begChr m:val="["/>
-                      <m:sepChr m:val=""/>
-                      <m:endChr m:val="]"/>
-                      <m:grow/>
-                    </m:dPr>
+                  <m:sSub>
                     <m:e>
                       <m:r>
+                        <m:t>μ</m:t>
+                      </m:r>
+                    </m:e>
+                    <m:sub>
+                      <m:r>
                         <m:t>X</m:t>
                       </m:r>
-                    </m:e>
-                  </m:d>
-                  <m:r>
-                    <m:t>​</m:t>
-                  </m:r>
+                    </m:sub>
+                  </m:sSub>
                   <m:r>
                     <m:rPr>
                       <m:sty m:val="p"/>
@@ -34799,31 +35545,18 @@
                     </m:rPr>
                     <m:t>−</m:t>
                   </m:r>
-                  <m:r>
-                    <m:rPr>
-                      <m:sty m:val="p"/>
-                    </m:rPr>
-                    <m:t>E</m:t>
-                  </m:r>
-                  <m:r>
-                    <m:t>​</m:t>
-                  </m:r>
-                  <m:d>
-                    <m:dPr>
-                      <m:begChr m:val="["/>
-                      <m:sepChr m:val=""/>
-                      <m:endChr m:val="]"/>
-                      <m:grow/>
-                    </m:dPr>
+                  <m:sSub>
                     <m:e>
                       <m:r>
+                        <m:t>μ</m:t>
+                      </m:r>
+                    </m:e>
+                    <m:sub>
+                      <m:r>
                         <m:t>Y</m:t>
                       </m:r>
-                    </m:e>
-                  </m:d>
-                  <m:r>
-                    <m:t>​</m:t>
-                  </m:r>
+                    </m:sub>
+                  </m:sSub>
                   <m:r>
                     <m:rPr>
                       <m:sty m:val="p"/>
@@ -34863,31 +35596,18 @@
                     </m:rPr>
                     <m:t>−</m:t>
                   </m:r>
-                  <m:r>
-                    <m:rPr>
-                      <m:sty m:val="p"/>
-                    </m:rPr>
-                    <m:t>E</m:t>
-                  </m:r>
-                  <m:r>
-                    <m:t>​</m:t>
-                  </m:r>
-                  <m:d>
-                    <m:dPr>
-                      <m:begChr m:val="["/>
-                      <m:sepChr m:val=""/>
-                      <m:endChr m:val="]"/>
-                      <m:grow/>
-                    </m:dPr>
+                  <m:sSub>
                     <m:e>
                       <m:r>
+                        <m:t>μ</m:t>
+                      </m:r>
+                    </m:e>
+                    <m:sub>
+                      <m:r>
                         <m:t>Y</m:t>
                       </m:r>
-                    </m:e>
-                  </m:d>
-                  <m:r>
-                    <m:t>​</m:t>
-                  </m:r>
+                    </m:sub>
+                  </m:sSub>
                   <m:sSup>
                     <m:e>
                       <m:r>
@@ -34976,31 +35696,18 @@
                     </m:rPr>
                     <m:t>−</m:t>
                   </m:r>
-                  <m:r>
-                    <m:rPr>
-                      <m:sty m:val="p"/>
-                    </m:rPr>
-                    <m:t>E</m:t>
-                  </m:r>
-                  <m:r>
-                    <m:t>​</m:t>
-                  </m:r>
-                  <m:d>
-                    <m:dPr>
-                      <m:begChr m:val="["/>
-                      <m:sepChr m:val=""/>
-                      <m:endChr m:val="]"/>
-                      <m:grow/>
-                    </m:dPr>
+                  <m:sSub>
                     <m:e>
                       <m:r>
+                        <m:t>μ</m:t>
+                      </m:r>
+                    </m:e>
+                    <m:sub>
+                      <m:r>
                         <m:t>X</m:t>
                       </m:r>
-                    </m:e>
-                  </m:d>
-                  <m:r>
-                    <m:t>​</m:t>
-                  </m:r>
+                    </m:sub>
+                  </m:sSub>
                   <m:sSup>
                     <m:e>
                       <m:r>
@@ -35086,31 +35793,18 @@
                     </m:rPr>
                     <m:t>−</m:t>
                   </m:r>
-                  <m:r>
-                    <m:rPr>
-                      <m:sty m:val="p"/>
-                    </m:rPr>
-                    <m:t>E</m:t>
-                  </m:r>
-                  <m:r>
-                    <m:t>​</m:t>
-                  </m:r>
-                  <m:d>
-                    <m:dPr>
-                      <m:begChr m:val="["/>
-                      <m:sepChr m:val=""/>
-                      <m:endChr m:val="]"/>
-                      <m:grow/>
-                    </m:dPr>
+                  <m:sSub>
                     <m:e>
                       <m:r>
+                        <m:t>μ</m:t>
+                      </m:r>
+                    </m:e>
+                    <m:sub>
+                      <m:r>
                         <m:t>X</m:t>
                       </m:r>
-                    </m:e>
-                  </m:d>
-                  <m:r>
-                    <m:t>​</m:t>
-                  </m:r>
+                    </m:sub>
+                  </m:sSub>
                   <m:r>
                     <m:rPr>
                       <m:sty m:val="p"/>
@@ -35132,31 +35826,18 @@
                     </m:rPr>
                     <m:t>−</m:t>
                   </m:r>
-                  <m:r>
-                    <m:rPr>
-                      <m:sty m:val="p"/>
-                    </m:rPr>
-                    <m:t>E</m:t>
-                  </m:r>
-                  <m:r>
-                    <m:t>​</m:t>
-                  </m:r>
-                  <m:d>
-                    <m:dPr>
-                      <m:begChr m:val="["/>
-                      <m:sepChr m:val=""/>
-                      <m:endChr m:val="]"/>
-                      <m:grow/>
-                    </m:dPr>
+                  <m:sSub>
                     <m:e>
                       <m:r>
+                        <m:t>μ</m:t>
+                      </m:r>
+                    </m:e>
+                    <m:sub>
+                      <m:r>
                         <m:t>Y</m:t>
                       </m:r>
-                    </m:e>
-                  </m:d>
-                  <m:r>
-                    <m:t>​</m:t>
-                  </m:r>
+                    </m:sub>
+                  </m:sSub>
                   <m:r>
                     <m:rPr>
                       <m:sty m:val="p"/>
@@ -35218,31 +35899,18 @@
                     </m:rPr>
                     <m:t>−</m:t>
                   </m:r>
-                  <m:r>
-                    <m:rPr>
-                      <m:sty m:val="p"/>
-                    </m:rPr>
-                    <m:t>E</m:t>
-                  </m:r>
-                  <m:r>
-                    <m:t>​</m:t>
-                  </m:r>
-                  <m:d>
-                    <m:dPr>
-                      <m:begChr m:val="["/>
-                      <m:sepChr m:val=""/>
-                      <m:endChr m:val="]"/>
-                      <m:grow/>
-                    </m:dPr>
+                  <m:sSub>
                     <m:e>
                       <m:r>
+                        <m:t>μ</m:t>
+                      </m:r>
+                    </m:e>
+                    <m:sub>
+                      <m:r>
                         <m:t>Y</m:t>
                       </m:r>
-                    </m:e>
-                  </m:d>
-                  <m:r>
-                    <m:t>​</m:t>
-                  </m:r>
+                    </m:sub>
+                  </m:sSub>
                   <m:sSup>
                     <m:e>
                       <m:r>

</xml_diff>

<commit_message>
Deploying to gh-pages from @ Morrison-Lab/pds@df92b8cf7a67d228eca02fc9d4735059c29884dc 🚀
</commit_message>
<xml_diff>
--- a/variance-covariance.docx
+++ b/variance-covariance.docx
@@ -15,7 +15,7 @@
         <w:pStyle w:val="Date"/>
       </w:pPr>
       <w:r>
-        <w:t xml:space="preserve">Last modified: 2026-10-26 11:59:37 (PDT)</w:t>
+        <w:t xml:space="preserve">Last modified: 2026-10-26 13:14:30 (PDT)</w:t>
       </w:r>
     </w:p>
     <w:bookmarkStart w:id="27" w:name="sec-deviation"/>
@@ -2714,7 +2714,7 @@
     </w:p>
     <w:bookmarkEnd w:id="26"/>
     <w:bookmarkEnd w:id="27"/>
-    <w:bookmarkStart w:id="51" w:name="variance-and-related-characteristics"/>
+    <w:bookmarkStart w:id="62" w:name="variance-and-related-characteristics"/>
     <w:p>
       <w:pPr>
         <w:pStyle w:val="Heading2"/>
@@ -5179,9 +5179,1501 @@
       <w:r>
         <w:t xml:space="preserve">.</w:t>
       </w:r>
+      <w:r>
+        <w:t xml:space="preserve"> </w:t>
+      </w:r>
+      <w:hyperlink w:anchor="fig-bernoulli-variance">
+        <w:r>
+          <w:rPr>
+            <w:rStyle w:val="Hyperlink"/>
+          </w:rPr>
+          <w:t xml:space="preserve">Figure 1</w:t>
+        </w:r>
+      </w:hyperlink>
+      <w:r>
+        <w:t xml:space="preserve"> </w:t>
+      </w:r>
+      <w:r>
+        <w:t xml:space="preserve">graphs</w:t>
+      </w:r>
+      <w:r>
+        <w:t xml:space="preserve"> </w:t>
+      </w:r>
+      <m:oMath>
+        <m:r>
+          <m:rPr>
+            <m:sty m:val="p"/>
+          </m:rPr>
+          <m:t>Var</m:t>
+        </m:r>
+        <m:r>
+          <m:t>​</m:t>
+        </m:r>
+        <m:d>
+          <m:dPr>
+            <m:begChr m:val="("/>
+            <m:sepChr m:val=""/>
+            <m:endChr m:val=")"/>
+            <m:grow/>
+          </m:dPr>
+          <m:e>
+            <m:r>
+              <m:t>X</m:t>
+            </m:r>
+          </m:e>
+        </m:d>
+        <m:r>
+          <m:t>​</m:t>
+        </m:r>
+      </m:oMath>
+      <w:r>
+        <w:t xml:space="preserve"> </w:t>
+      </w:r>
+      <w:r>
+        <w:t xml:space="preserve">against</w:t>
+      </w:r>
+      <w:r>
+        <w:t xml:space="preserve"> </w:t>
+      </w:r>
+      <m:oMath>
+        <m:r>
+          <m:t>π</m:t>
+        </m:r>
+      </m:oMath>
+      <w:r>
+        <w:t xml:space="preserve">.</w:t>
+      </w:r>
     </w:p>
     <w:bookmarkEnd w:id="33"/>
-    <w:bookmarkStart w:id="35" w:name="def-cond-variance"/>
+    <w:tbl>
+      <w:tblPr>
+        <w:tblStyle w:val="Table"/>
+        <w:tblW w:type="pct" w:w="5000"/>
+        <w:tblLayout w:type="fixed"/>
+        <w:tblLook w:firstRow="0" w:lastRow="0" w:firstColumn="0" w:lastColumn="0" w:noHBand="0" w:noVBand="0" w:val="0000"/>
+      </w:tblPr>
+      <w:tblGrid>
+        <w:gridCol w:w="7920"/>
+      </w:tblGrid>
+      <w:tr>
+        <w:tc>
+          <w:tcPr/>
+          <w:bookmarkStart w:id="44" w:name="fig-bernoulli-variance"/>
+          <w:p>
+            <w:pPr>
+              <w:pStyle w:val="Heading4"/>
+              <w:jc w:val="center"/>
+            </w:pPr>
+            <w:r>
+              <w:t xml:space="preserve">Python</w:t>
+            </w:r>
+          </w:p>
+          <w:p>
+            <w:pPr>
+              <w:pStyle w:val="SourceCode"/>
+              <w:jc w:val="center"/>
+            </w:pPr>
+            <w:r>
+              <w:rPr>
+                <w:rStyle w:val="ImportTok"/>
+              </w:rPr>
+              <w:t xml:space="preserve">import</w:t>
+            </w:r>
+            <w:r>
+              <w:rPr>
+                <w:rStyle w:val="NormalTok"/>
+              </w:rPr>
+              <w:t xml:space="preserve"> numpy </w:t>
+            </w:r>
+            <w:r>
+              <w:rPr>
+                <w:rStyle w:val="ImportTok"/>
+              </w:rPr>
+              <w:t xml:space="preserve">as</w:t>
+            </w:r>
+            <w:r>
+              <w:rPr>
+                <w:rStyle w:val="NormalTok"/>
+              </w:rPr>
+              <w:t xml:space="preserve"> np</w:t>
+            </w:r>
+            <w:r>
+              <w:br/>
+            </w:r>
+            <w:r>
+              <w:rPr>
+                <w:rStyle w:val="ImportTok"/>
+              </w:rPr>
+              <w:t xml:space="preserve">import</w:t>
+            </w:r>
+            <w:r>
+              <w:rPr>
+                <w:rStyle w:val="NormalTok"/>
+              </w:rPr>
+              <w:t xml:space="preserve"> matplotlib.pyplot </w:t>
+            </w:r>
+            <w:r>
+              <w:rPr>
+                <w:rStyle w:val="ImportTok"/>
+              </w:rPr>
+              <w:t xml:space="preserve">as</w:t>
+            </w:r>
+            <w:r>
+              <w:rPr>
+                <w:rStyle w:val="NormalTok"/>
+              </w:rPr>
+              <w:t xml:space="preserve"> plt</w:t>
+            </w:r>
+            <w:r>
+              <w:br/>
+            </w:r>
+            <w:r>
+              <w:br/>
+            </w:r>
+            <w:r>
+              <w:rPr>
+                <w:rStyle w:val="NormalTok"/>
+              </w:rPr>
+              <w:t xml:space="preserve">prob </w:t>
+            </w:r>
+            <w:r>
+              <w:rPr>
+                <w:rStyle w:val="OperatorTok"/>
+              </w:rPr>
+              <w:t xml:space="preserve">=</w:t>
+            </w:r>
+            <w:r>
+              <w:rPr>
+                <w:rStyle w:val="NormalTok"/>
+              </w:rPr>
+              <w:t xml:space="preserve"> np.linspace(</w:t>
+            </w:r>
+            <w:r>
+              <w:rPr>
+                <w:rStyle w:val="DecValTok"/>
+              </w:rPr>
+              <w:t xml:space="preserve">0</w:t>
+            </w:r>
+            <w:r>
+              <w:rPr>
+                <w:rStyle w:val="NormalTok"/>
+              </w:rPr>
+              <w:t xml:space="preserve">, </w:t>
+            </w:r>
+            <w:r>
+              <w:rPr>
+                <w:rStyle w:val="DecValTok"/>
+              </w:rPr>
+              <w:t xml:space="preserve">1</w:t>
+            </w:r>
+            <w:r>
+              <w:rPr>
+                <w:rStyle w:val="NormalTok"/>
+              </w:rPr>
+              <w:t xml:space="preserve">, </w:t>
+            </w:r>
+            <w:r>
+              <w:rPr>
+                <w:rStyle w:val="DecValTok"/>
+              </w:rPr>
+              <w:t xml:space="preserve">201</w:t>
+            </w:r>
+            <w:r>
+              <w:rPr>
+                <w:rStyle w:val="NormalTok"/>
+              </w:rPr>
+              <w:t xml:space="preserve">)</w:t>
+            </w:r>
+            <w:r>
+              <w:br/>
+            </w:r>
+            <w:r>
+              <w:rPr>
+                <w:rStyle w:val="NormalTok"/>
+              </w:rPr>
+              <w:t xml:space="preserve">variance </w:t>
+            </w:r>
+            <w:r>
+              <w:rPr>
+                <w:rStyle w:val="OperatorTok"/>
+              </w:rPr>
+              <w:t xml:space="preserve">=</w:t>
+            </w:r>
+            <w:r>
+              <w:rPr>
+                <w:rStyle w:val="NormalTok"/>
+              </w:rPr>
+              <w:t xml:space="preserve"> prob </w:t>
+            </w:r>
+            <w:r>
+              <w:rPr>
+                <w:rStyle w:val="OperatorTok"/>
+              </w:rPr>
+              <w:t xml:space="preserve">*</w:t>
+            </w:r>
+            <w:r>
+              <w:rPr>
+                <w:rStyle w:val="NormalTok"/>
+              </w:rPr>
+              <w:t xml:space="preserve"> (</w:t>
+            </w:r>
+            <w:r>
+              <w:rPr>
+                <w:rStyle w:val="DecValTok"/>
+              </w:rPr>
+              <w:t xml:space="preserve">1</w:t>
+            </w:r>
+            <w:r>
+              <w:rPr>
+                <w:rStyle w:val="NormalTok"/>
+              </w:rPr>
+              <w:t xml:space="preserve"> </w:t>
+            </w:r>
+            <w:r>
+              <w:rPr>
+                <w:rStyle w:val="OperatorTok"/>
+              </w:rPr>
+              <w:t xml:space="preserve">-</w:t>
+            </w:r>
+            <w:r>
+              <w:rPr>
+                <w:rStyle w:val="NormalTok"/>
+              </w:rPr>
+              <w:t xml:space="preserve"> prob)</w:t>
+            </w:r>
+            <w:r>
+              <w:br/>
+            </w:r>
+            <w:r>
+              <w:br/>
+            </w:r>
+            <w:r>
+              <w:rPr>
+                <w:rStyle w:val="NormalTok"/>
+              </w:rPr>
+              <w:t xml:space="preserve">fig, ax </w:t>
+            </w:r>
+            <w:r>
+              <w:rPr>
+                <w:rStyle w:val="OperatorTok"/>
+              </w:rPr>
+              <w:t xml:space="preserve">=</w:t>
+            </w:r>
+            <w:r>
+              <w:rPr>
+                <w:rStyle w:val="NormalTok"/>
+              </w:rPr>
+              <w:t xml:space="preserve"> plt.subplots(figsize</w:t>
+            </w:r>
+            <w:r>
+              <w:rPr>
+                <w:rStyle w:val="OperatorTok"/>
+              </w:rPr>
+              <w:t xml:space="preserve">=</w:t>
+            </w:r>
+            <w:r>
+              <w:rPr>
+                <w:rStyle w:val="NormalTok"/>
+              </w:rPr>
+              <w:t xml:space="preserve">(</w:t>
+            </w:r>
+            <w:r>
+              <w:rPr>
+                <w:rStyle w:val="DecValTok"/>
+              </w:rPr>
+              <w:t xml:space="preserve">6</w:t>
+            </w:r>
+            <w:r>
+              <w:rPr>
+                <w:rStyle w:val="NormalTok"/>
+              </w:rPr>
+              <w:t xml:space="preserve">, </w:t>
+            </w:r>
+            <w:r>
+              <w:rPr>
+                <w:rStyle w:val="FloatTok"/>
+              </w:rPr>
+              <w:t xml:space="preserve">3.5</w:t>
+            </w:r>
+            <w:r>
+              <w:rPr>
+                <w:rStyle w:val="NormalTok"/>
+              </w:rPr>
+              <w:t xml:space="preserve">), layout</w:t>
+            </w:r>
+            <w:r>
+              <w:rPr>
+                <w:rStyle w:val="OperatorTok"/>
+              </w:rPr>
+              <w:t xml:space="preserve">=</w:t>
+            </w:r>
+            <w:r>
+              <w:rPr>
+                <w:rStyle w:val="StringTok"/>
+              </w:rPr>
+              <w:t xml:space="preserve">"constrained"</w:t>
+            </w:r>
+            <w:r>
+              <w:rPr>
+                <w:rStyle w:val="NormalTok"/>
+              </w:rPr>
+              <w:t xml:space="preserve">)</w:t>
+            </w:r>
+            <w:r>
+              <w:br/>
+            </w:r>
+            <w:r>
+              <w:rPr>
+                <w:rStyle w:val="NormalTok"/>
+              </w:rPr>
+              <w:t xml:space="preserve">ax.plot(prob, variance, color</w:t>
+            </w:r>
+            <w:r>
+              <w:rPr>
+                <w:rStyle w:val="OperatorTok"/>
+              </w:rPr>
+              <w:t xml:space="preserve">=</w:t>
+            </w:r>
+            <w:r>
+              <w:rPr>
+                <w:rStyle w:val="StringTok"/>
+              </w:rPr>
+              <w:t xml:space="preserve">"#1f77b4"</w:t>
+            </w:r>
+            <w:r>
+              <w:rPr>
+                <w:rStyle w:val="NormalTok"/>
+              </w:rPr>
+              <w:t xml:space="preserve">)</w:t>
+            </w:r>
+            <w:r>
+              <w:br/>
+            </w:r>
+            <w:r>
+              <w:rPr>
+                <w:rStyle w:val="NormalTok"/>
+              </w:rPr>
+              <w:t xml:space="preserve">ax.plot(</w:t>
+            </w:r>
+            <w:r>
+              <w:rPr>
+                <w:rStyle w:val="FloatTok"/>
+              </w:rPr>
+              <w:t xml:space="preserve">0.5</w:t>
+            </w:r>
+            <w:r>
+              <w:rPr>
+                <w:rStyle w:val="NormalTok"/>
+              </w:rPr>
+              <w:t xml:space="preserve">, </w:t>
+            </w:r>
+            <w:r>
+              <w:rPr>
+                <w:rStyle w:val="FloatTok"/>
+              </w:rPr>
+              <w:t xml:space="preserve">0.5</w:t>
+            </w:r>
+            <w:r>
+              <w:rPr>
+                <w:rStyle w:val="NormalTok"/>
+              </w:rPr>
+              <w:t xml:space="preserve"> </w:t>
+            </w:r>
+            <w:r>
+              <w:rPr>
+                <w:rStyle w:val="OperatorTok"/>
+              </w:rPr>
+              <w:t xml:space="preserve">*</w:t>
+            </w:r>
+            <w:r>
+              <w:rPr>
+                <w:rStyle w:val="NormalTok"/>
+              </w:rPr>
+              <w:t xml:space="preserve"> (</w:t>
+            </w:r>
+            <w:r>
+              <w:rPr>
+                <w:rStyle w:val="DecValTok"/>
+              </w:rPr>
+              <w:t xml:space="preserve">1</w:t>
+            </w:r>
+            <w:r>
+              <w:rPr>
+                <w:rStyle w:val="NormalTok"/>
+              </w:rPr>
+              <w:t xml:space="preserve"> </w:t>
+            </w:r>
+            <w:r>
+              <w:rPr>
+                <w:rStyle w:val="OperatorTok"/>
+              </w:rPr>
+              <w:t xml:space="preserve">-</w:t>
+            </w:r>
+            <w:r>
+              <w:rPr>
+                <w:rStyle w:val="NormalTok"/>
+              </w:rPr>
+              <w:t xml:space="preserve"> </w:t>
+            </w:r>
+            <w:r>
+              <w:rPr>
+                <w:rStyle w:val="FloatTok"/>
+              </w:rPr>
+              <w:t xml:space="preserve">0.5</w:t>
+            </w:r>
+            <w:r>
+              <w:rPr>
+                <w:rStyle w:val="NormalTok"/>
+              </w:rPr>
+              <w:t xml:space="preserve">), </w:t>
+            </w:r>
+            <w:r>
+              <w:rPr>
+                <w:rStyle w:val="StringTok"/>
+              </w:rPr>
+              <w:t xml:space="preserve">"o"</w:t>
+            </w:r>
+            <w:r>
+              <w:rPr>
+                <w:rStyle w:val="NormalTok"/>
+              </w:rPr>
+              <w:t xml:space="preserve">, color</w:t>
+            </w:r>
+            <w:r>
+              <w:rPr>
+                <w:rStyle w:val="OperatorTok"/>
+              </w:rPr>
+              <w:t xml:space="preserve">=</w:t>
+            </w:r>
+            <w:r>
+              <w:rPr>
+                <w:rStyle w:val="StringTok"/>
+              </w:rPr>
+              <w:t xml:space="preserve">"#ff7f0e"</w:t>
+            </w:r>
+            <w:r>
+              <w:rPr>
+                <w:rStyle w:val="NormalTok"/>
+              </w:rPr>
+              <w:t xml:space="preserve">)</w:t>
+            </w:r>
+            <w:r>
+              <w:br/>
+            </w:r>
+            <w:r>
+              <w:rPr>
+                <w:rStyle w:val="NormalTok"/>
+              </w:rPr>
+              <w:t xml:space="preserve">ax.set_xlabel(</w:t>
+            </w:r>
+            <w:r>
+              <w:rPr>
+                <w:rStyle w:val="StringTok"/>
+              </w:rPr>
+              <w:t xml:space="preserve">"probability of a 1"</w:t>
+            </w:r>
+            <w:r>
+              <w:rPr>
+                <w:rStyle w:val="NormalTok"/>
+              </w:rPr>
+              <w:t xml:space="preserve">)</w:t>
+            </w:r>
+            <w:r>
+              <w:br/>
+            </w:r>
+            <w:r>
+              <w:rPr>
+                <w:rStyle w:val="NormalTok"/>
+              </w:rPr>
+              <w:t xml:space="preserve">ax.set_ylabel(</w:t>
+            </w:r>
+            <w:r>
+              <w:rPr>
+                <w:rStyle w:val="StringTok"/>
+              </w:rPr>
+              <w:t xml:space="preserve">"variance"</w:t>
+            </w:r>
+            <w:r>
+              <w:rPr>
+                <w:rStyle w:val="NormalTok"/>
+              </w:rPr>
+              <w:t xml:space="preserve">)</w:t>
+            </w:r>
+            <w:r>
+              <w:br/>
+            </w:r>
+            <w:r>
+              <w:rPr>
+                <w:rStyle w:val="NormalTok"/>
+              </w:rPr>
+              <w:t xml:space="preserve">plt.show()</w:t>
+            </w:r>
+          </w:p>
+          <w:p>
+            <w:pPr>
+              <w:jc w:val="center"/>
+            </w:pPr>
+            <w:r>
+              <w:drawing>
+                <wp:inline>
+                  <wp:extent cx="5334000" cy="3111500"/>
+                  <wp:effectExtent b="0" l="0" r="0" t="0"/>
+                  <wp:docPr descr="" title="" id="35" name="Picture"/>
+                  <a:graphic>
+                    <a:graphicData uri="http://schemas.openxmlformats.org/drawingml/2006/picture">
+                      <pic:pic>
+                        <pic:nvPicPr>
+                          <pic:cNvPr descr="variance-covariance_files/figure-docx/bernoulli-variance-py-1.png" id="36" name="Picture"/>
+                          <pic:cNvPicPr>
+                            <a:picLocks noChangeArrowheads="1" noChangeAspect="1"/>
+                          </pic:cNvPicPr>
+                        </pic:nvPicPr>
+                        <pic:blipFill>
+                          <a:blip r:embed="rId34"/>
+                          <a:stretch>
+                            <a:fillRect/>
+                          </a:stretch>
+                        </pic:blipFill>
+                        <pic:spPr bwMode="auto">
+                          <a:xfrm>
+                            <a:off x="0" y="0"/>
+                            <a:ext cx="5334000" cy="3111500"/>
+                          </a:xfrm>
+                          <a:prstGeom prst="rect">
+                            <a:avLst/>
+                          </a:prstGeom>
+                          <a:noFill/>
+                          <a:ln w="9525">
+                            <a:noFill/>
+                            <a:headEnd/>
+                            <a:tailEnd/>
+                          </a:ln>
+                        </pic:spPr>
+                      </pic:pic>
+                    </a:graphicData>
+                  </a:graphic>
+                </wp:inline>
+              </w:drawing>
+            </w:r>
+          </w:p>
+          <w:p>
+            <w:pPr>
+              <w:pStyle w:val="Heading4"/>
+              <w:jc w:val="center"/>
+            </w:pPr>
+            <w:r>
+              <w:t xml:space="preserve">R</w:t>
+            </w:r>
+          </w:p>
+          <w:p>
+            <w:pPr>
+              <w:pStyle w:val="SourceCode"/>
+              <w:jc w:val="center"/>
+            </w:pPr>
+            <w:r>
+              <w:rPr>
+                <w:rStyle w:val="FunctionTok"/>
+              </w:rPr>
+              <w:t xml:space="preserve">library</w:t>
+            </w:r>
+            <w:r>
+              <w:rPr>
+                <w:rStyle w:val="NormalTok"/>
+              </w:rPr>
+              <w:t xml:space="preserve">(ggplot2)</w:t>
+            </w:r>
+            <w:r>
+              <w:br/>
+            </w:r>
+            <w:r>
+              <w:br/>
+            </w:r>
+            <w:r>
+              <w:rPr>
+                <w:rStyle w:val="NormalTok"/>
+              </w:rPr>
+              <w:t xml:space="preserve">prob </w:t>
+            </w:r>
+            <w:r>
+              <w:rPr>
+                <w:rStyle w:val="OtherTok"/>
+              </w:rPr>
+              <w:t xml:space="preserve">&lt;-</w:t>
+            </w:r>
+            <w:r>
+              <w:rPr>
+                <w:rStyle w:val="NormalTok"/>
+              </w:rPr>
+              <w:t xml:space="preserve"> </w:t>
+            </w:r>
+            <w:r>
+              <w:rPr>
+                <w:rStyle w:val="FunctionTok"/>
+              </w:rPr>
+              <w:t xml:space="preserve">seq</w:t>
+            </w:r>
+            <w:r>
+              <w:rPr>
+                <w:rStyle w:val="NormalTok"/>
+              </w:rPr>
+              <w:t xml:space="preserve">(</w:t>
+            </w:r>
+            <w:r>
+              <w:rPr>
+                <w:rStyle w:val="DecValTok"/>
+              </w:rPr>
+              <w:t xml:space="preserve">0</w:t>
+            </w:r>
+            <w:r>
+              <w:rPr>
+                <w:rStyle w:val="NormalTok"/>
+              </w:rPr>
+              <w:t xml:space="preserve">, </w:t>
+            </w:r>
+            <w:r>
+              <w:rPr>
+                <w:rStyle w:val="DecValTok"/>
+              </w:rPr>
+              <w:t xml:space="preserve">1</w:t>
+            </w:r>
+            <w:r>
+              <w:rPr>
+                <w:rStyle w:val="NormalTok"/>
+              </w:rPr>
+              <w:t xml:space="preserve">, </w:t>
+            </w:r>
+            <w:r>
+              <w:rPr>
+                <w:rStyle w:val="AttributeTok"/>
+              </w:rPr>
+              <w:t xml:space="preserve">length.out =</w:t>
+            </w:r>
+            <w:r>
+              <w:rPr>
+                <w:rStyle w:val="NormalTok"/>
+              </w:rPr>
+              <w:t xml:space="preserve"> </w:t>
+            </w:r>
+            <w:r>
+              <w:rPr>
+                <w:rStyle w:val="DecValTok"/>
+              </w:rPr>
+              <w:t xml:space="preserve">201</w:t>
+            </w:r>
+            <w:r>
+              <w:rPr>
+                <w:rStyle w:val="NormalTok"/>
+              </w:rPr>
+              <w:t xml:space="preserve">)</w:t>
+            </w:r>
+            <w:r>
+              <w:br/>
+            </w:r>
+            <w:r>
+              <w:rPr>
+                <w:rStyle w:val="NormalTok"/>
+              </w:rPr>
+              <w:t xml:space="preserve">bernoulli </w:t>
+            </w:r>
+            <w:r>
+              <w:rPr>
+                <w:rStyle w:val="OtherTok"/>
+              </w:rPr>
+              <w:t xml:space="preserve">&lt;-</w:t>
+            </w:r>
+            <w:r>
+              <w:rPr>
+                <w:rStyle w:val="NormalTok"/>
+              </w:rPr>
+              <w:t xml:space="preserve"> </w:t>
+            </w:r>
+            <w:r>
+              <w:rPr>
+                <w:rStyle w:val="FunctionTok"/>
+              </w:rPr>
+              <w:t xml:space="preserve">data.frame</w:t>
+            </w:r>
+            <w:r>
+              <w:rPr>
+                <w:rStyle w:val="NormalTok"/>
+              </w:rPr>
+              <w:t xml:space="preserve">(</w:t>
+            </w:r>
+            <w:r>
+              <w:rPr>
+                <w:rStyle w:val="AttributeTok"/>
+              </w:rPr>
+              <w:t xml:space="preserve">prob =</w:t>
+            </w:r>
+            <w:r>
+              <w:rPr>
+                <w:rStyle w:val="NormalTok"/>
+              </w:rPr>
+              <w:t xml:space="preserve"> prob, </w:t>
+            </w:r>
+            <w:r>
+              <w:rPr>
+                <w:rStyle w:val="AttributeTok"/>
+              </w:rPr>
+              <w:t xml:space="preserve">variance =</w:t>
+            </w:r>
+            <w:r>
+              <w:rPr>
+                <w:rStyle w:val="NormalTok"/>
+              </w:rPr>
+              <w:t xml:space="preserve"> prob </w:t>
+            </w:r>
+            <w:r>
+              <w:rPr>
+                <w:rStyle w:val="SpecialCharTok"/>
+              </w:rPr>
+              <w:t xml:space="preserve">*</w:t>
+            </w:r>
+            <w:r>
+              <w:rPr>
+                <w:rStyle w:val="NormalTok"/>
+              </w:rPr>
+              <w:t xml:space="preserve"> (</w:t>
+            </w:r>
+            <w:r>
+              <w:rPr>
+                <w:rStyle w:val="DecValTok"/>
+              </w:rPr>
+              <w:t xml:space="preserve">1</w:t>
+            </w:r>
+            <w:r>
+              <w:rPr>
+                <w:rStyle w:val="NormalTok"/>
+              </w:rPr>
+              <w:t xml:space="preserve"> </w:t>
+            </w:r>
+            <w:r>
+              <w:rPr>
+                <w:rStyle w:val="SpecialCharTok"/>
+              </w:rPr>
+              <w:t xml:space="preserve">-</w:t>
+            </w:r>
+            <w:r>
+              <w:rPr>
+                <w:rStyle w:val="NormalTok"/>
+              </w:rPr>
+              <w:t xml:space="preserve"> prob))</w:t>
+            </w:r>
+            <w:r>
+              <w:br/>
+            </w:r>
+            <w:r>
+              <w:rPr>
+                <w:rStyle w:val="NormalTok"/>
+              </w:rPr>
+              <w:t xml:space="preserve">mid </w:t>
+            </w:r>
+            <w:r>
+              <w:rPr>
+                <w:rStyle w:val="OtherTok"/>
+              </w:rPr>
+              <w:t xml:space="preserve">&lt;-</w:t>
+            </w:r>
+            <w:r>
+              <w:rPr>
+                <w:rStyle w:val="NormalTok"/>
+              </w:rPr>
+              <w:t xml:space="preserve"> </w:t>
+            </w:r>
+            <w:r>
+              <w:rPr>
+                <w:rStyle w:val="FunctionTok"/>
+              </w:rPr>
+              <w:t xml:space="preserve">data.frame</w:t>
+            </w:r>
+            <w:r>
+              <w:rPr>
+                <w:rStyle w:val="NormalTok"/>
+              </w:rPr>
+              <w:t xml:space="preserve">(</w:t>
+            </w:r>
+            <w:r>
+              <w:rPr>
+                <w:rStyle w:val="AttributeTok"/>
+              </w:rPr>
+              <w:t xml:space="preserve">prob =</w:t>
+            </w:r>
+            <w:r>
+              <w:rPr>
+                <w:rStyle w:val="NormalTok"/>
+              </w:rPr>
+              <w:t xml:space="preserve"> </w:t>
+            </w:r>
+            <w:r>
+              <w:rPr>
+                <w:rStyle w:val="FloatTok"/>
+              </w:rPr>
+              <w:t xml:space="preserve">0.5</w:t>
+            </w:r>
+            <w:r>
+              <w:rPr>
+                <w:rStyle w:val="NormalTok"/>
+              </w:rPr>
+              <w:t xml:space="preserve">, </w:t>
+            </w:r>
+            <w:r>
+              <w:rPr>
+                <w:rStyle w:val="AttributeTok"/>
+              </w:rPr>
+              <w:t xml:space="preserve">variance =</w:t>
+            </w:r>
+            <w:r>
+              <w:rPr>
+                <w:rStyle w:val="NormalTok"/>
+              </w:rPr>
+              <w:t xml:space="preserve"> </w:t>
+            </w:r>
+            <w:r>
+              <w:rPr>
+                <w:rStyle w:val="FloatTok"/>
+              </w:rPr>
+              <w:t xml:space="preserve">0.5</w:t>
+            </w:r>
+            <w:r>
+              <w:rPr>
+                <w:rStyle w:val="NormalTok"/>
+              </w:rPr>
+              <w:t xml:space="preserve"> </w:t>
+            </w:r>
+            <w:r>
+              <w:rPr>
+                <w:rStyle w:val="SpecialCharTok"/>
+              </w:rPr>
+              <w:t xml:space="preserve">*</w:t>
+            </w:r>
+            <w:r>
+              <w:rPr>
+                <w:rStyle w:val="NormalTok"/>
+              </w:rPr>
+              <w:t xml:space="preserve"> (</w:t>
+            </w:r>
+            <w:r>
+              <w:rPr>
+                <w:rStyle w:val="DecValTok"/>
+              </w:rPr>
+              <w:t xml:space="preserve">1</w:t>
+            </w:r>
+            <w:r>
+              <w:rPr>
+                <w:rStyle w:val="NormalTok"/>
+              </w:rPr>
+              <w:t xml:space="preserve"> </w:t>
+            </w:r>
+            <w:r>
+              <w:rPr>
+                <w:rStyle w:val="SpecialCharTok"/>
+              </w:rPr>
+              <w:t xml:space="preserve">-</w:t>
+            </w:r>
+            <w:r>
+              <w:rPr>
+                <w:rStyle w:val="NormalTok"/>
+              </w:rPr>
+              <w:t xml:space="preserve"> </w:t>
+            </w:r>
+            <w:r>
+              <w:rPr>
+                <w:rStyle w:val="FloatTok"/>
+              </w:rPr>
+              <w:t xml:space="preserve">0.5</w:t>
+            </w:r>
+            <w:r>
+              <w:rPr>
+                <w:rStyle w:val="NormalTok"/>
+              </w:rPr>
+              <w:t xml:space="preserve">))</w:t>
+            </w:r>
+            <w:r>
+              <w:br/>
+            </w:r>
+            <w:r>
+              <w:br/>
+            </w:r>
+            <w:r>
+              <w:rPr>
+                <w:rStyle w:val="FunctionTok"/>
+              </w:rPr>
+              <w:t xml:space="preserve">ggplot</w:t>
+            </w:r>
+            <w:r>
+              <w:rPr>
+                <w:rStyle w:val="NormalTok"/>
+              </w:rPr>
+              <w:t xml:space="preserve">(bernoulli, </w:t>
+            </w:r>
+            <w:r>
+              <w:rPr>
+                <w:rStyle w:val="FunctionTok"/>
+              </w:rPr>
+              <w:t xml:space="preserve">aes</w:t>
+            </w:r>
+            <w:r>
+              <w:rPr>
+                <w:rStyle w:val="NormalTok"/>
+              </w:rPr>
+              <w:t xml:space="preserve">(</w:t>
+            </w:r>
+            <w:r>
+              <w:rPr>
+                <w:rStyle w:val="AttributeTok"/>
+              </w:rPr>
+              <w:t xml:space="preserve">x =</w:t>
+            </w:r>
+            <w:r>
+              <w:rPr>
+                <w:rStyle w:val="NormalTok"/>
+              </w:rPr>
+              <w:t xml:space="preserve"> prob, </w:t>
+            </w:r>
+            <w:r>
+              <w:rPr>
+                <w:rStyle w:val="AttributeTok"/>
+              </w:rPr>
+              <w:t xml:space="preserve">y =</w:t>
+            </w:r>
+            <w:r>
+              <w:rPr>
+                <w:rStyle w:val="NormalTok"/>
+              </w:rPr>
+              <w:t xml:space="preserve"> variance)) </w:t>
+            </w:r>
+            <w:r>
+              <w:rPr>
+                <w:rStyle w:val="SpecialCharTok"/>
+              </w:rPr>
+              <w:t xml:space="preserve">+</w:t>
+            </w:r>
+            <w:r>
+              <w:br/>
+            </w:r>
+            <w:r>
+              <w:rPr>
+                <w:rStyle w:val="NormalTok"/>
+              </w:rPr>
+              <w:t xml:space="preserve">  </w:t>
+            </w:r>
+            <w:r>
+              <w:rPr>
+                <w:rStyle w:val="FunctionTok"/>
+              </w:rPr>
+              <w:t xml:space="preserve">geom_line</w:t>
+            </w:r>
+            <w:r>
+              <w:rPr>
+                <w:rStyle w:val="NormalTok"/>
+              </w:rPr>
+              <w:t xml:space="preserve">(</w:t>
+            </w:r>
+            <w:r>
+              <w:rPr>
+                <w:rStyle w:val="AttributeTok"/>
+              </w:rPr>
+              <w:t xml:space="preserve">colour =</w:t>
+            </w:r>
+            <w:r>
+              <w:rPr>
+                <w:rStyle w:val="NormalTok"/>
+              </w:rPr>
+              <w:t xml:space="preserve"> </w:t>
+            </w:r>
+            <w:r>
+              <w:rPr>
+                <w:rStyle w:val="StringTok"/>
+              </w:rPr>
+              <w:t xml:space="preserve">"#1f77b4"</w:t>
+            </w:r>
+            <w:r>
+              <w:rPr>
+                <w:rStyle w:val="NormalTok"/>
+              </w:rPr>
+              <w:t xml:space="preserve">) </w:t>
+            </w:r>
+            <w:r>
+              <w:rPr>
+                <w:rStyle w:val="SpecialCharTok"/>
+              </w:rPr>
+              <w:t xml:space="preserve">+</w:t>
+            </w:r>
+            <w:r>
+              <w:br/>
+            </w:r>
+            <w:r>
+              <w:rPr>
+                <w:rStyle w:val="NormalTok"/>
+              </w:rPr>
+              <w:t xml:space="preserve">  </w:t>
+            </w:r>
+            <w:r>
+              <w:rPr>
+                <w:rStyle w:val="FunctionTok"/>
+              </w:rPr>
+              <w:t xml:space="preserve">geom_point</w:t>
+            </w:r>
+            <w:r>
+              <w:rPr>
+                <w:rStyle w:val="NormalTok"/>
+              </w:rPr>
+              <w:t xml:space="preserve">(</w:t>
+            </w:r>
+            <w:r>
+              <w:rPr>
+                <w:rStyle w:val="AttributeTok"/>
+              </w:rPr>
+              <w:t xml:space="preserve">data =</w:t>
+            </w:r>
+            <w:r>
+              <w:rPr>
+                <w:rStyle w:val="NormalTok"/>
+              </w:rPr>
+              <w:t xml:space="preserve"> mid, </w:t>
+            </w:r>
+            <w:r>
+              <w:rPr>
+                <w:rStyle w:val="AttributeTok"/>
+              </w:rPr>
+              <w:t xml:space="preserve">colour =</w:t>
+            </w:r>
+            <w:r>
+              <w:rPr>
+                <w:rStyle w:val="NormalTok"/>
+              </w:rPr>
+              <w:t xml:space="preserve"> </w:t>
+            </w:r>
+            <w:r>
+              <w:rPr>
+                <w:rStyle w:val="StringTok"/>
+              </w:rPr>
+              <w:t xml:space="preserve">"#ff7f0e"</w:t>
+            </w:r>
+            <w:r>
+              <w:rPr>
+                <w:rStyle w:val="NormalTok"/>
+              </w:rPr>
+              <w:t xml:space="preserve">, </w:t>
+            </w:r>
+            <w:r>
+              <w:rPr>
+                <w:rStyle w:val="AttributeTok"/>
+              </w:rPr>
+              <w:t xml:space="preserve">size =</w:t>
+            </w:r>
+            <w:r>
+              <w:rPr>
+                <w:rStyle w:val="NormalTok"/>
+              </w:rPr>
+              <w:t xml:space="preserve"> </w:t>
+            </w:r>
+            <w:r>
+              <w:rPr>
+                <w:rStyle w:val="DecValTok"/>
+              </w:rPr>
+              <w:t xml:space="preserve">2</w:t>
+            </w:r>
+            <w:r>
+              <w:rPr>
+                <w:rStyle w:val="NormalTok"/>
+              </w:rPr>
+              <w:t xml:space="preserve">) </w:t>
+            </w:r>
+            <w:r>
+              <w:rPr>
+                <w:rStyle w:val="SpecialCharTok"/>
+              </w:rPr>
+              <w:t xml:space="preserve">+</w:t>
+            </w:r>
+            <w:r>
+              <w:br/>
+            </w:r>
+            <w:r>
+              <w:rPr>
+                <w:rStyle w:val="NormalTok"/>
+              </w:rPr>
+              <w:t xml:space="preserve">  </w:t>
+            </w:r>
+            <w:r>
+              <w:rPr>
+                <w:rStyle w:val="FunctionTok"/>
+              </w:rPr>
+              <w:t xml:space="preserve">labs</w:t>
+            </w:r>
+            <w:r>
+              <w:rPr>
+                <w:rStyle w:val="NormalTok"/>
+              </w:rPr>
+              <w:t xml:space="preserve">(</w:t>
+            </w:r>
+            <w:r>
+              <w:rPr>
+                <w:rStyle w:val="AttributeTok"/>
+              </w:rPr>
+              <w:t xml:space="preserve">x =</w:t>
+            </w:r>
+            <w:r>
+              <w:rPr>
+                <w:rStyle w:val="NormalTok"/>
+              </w:rPr>
+              <w:t xml:space="preserve"> </w:t>
+            </w:r>
+            <w:r>
+              <w:rPr>
+                <w:rStyle w:val="StringTok"/>
+              </w:rPr>
+              <w:t xml:space="preserve">"probability of a 1"</w:t>
+            </w:r>
+            <w:r>
+              <w:rPr>
+                <w:rStyle w:val="NormalTok"/>
+              </w:rPr>
+              <w:t xml:space="preserve">, </w:t>
+            </w:r>
+            <w:r>
+              <w:rPr>
+                <w:rStyle w:val="AttributeTok"/>
+              </w:rPr>
+              <w:t xml:space="preserve">y =</w:t>
+            </w:r>
+            <w:r>
+              <w:rPr>
+                <w:rStyle w:val="NormalTok"/>
+              </w:rPr>
+              <w:t xml:space="preserve"> </w:t>
+            </w:r>
+            <w:r>
+              <w:rPr>
+                <w:rStyle w:val="StringTok"/>
+              </w:rPr>
+              <w:t xml:space="preserve">"variance"</w:t>
+            </w:r>
+            <w:r>
+              <w:rPr>
+                <w:rStyle w:val="NormalTok"/>
+              </w:rPr>
+              <w:t xml:space="preserve">) </w:t>
+            </w:r>
+            <w:r>
+              <w:rPr>
+                <w:rStyle w:val="SpecialCharTok"/>
+              </w:rPr>
+              <w:t xml:space="preserve">+</w:t>
+            </w:r>
+            <w:r>
+              <w:br/>
+            </w:r>
+            <w:r>
+              <w:rPr>
+                <w:rStyle w:val="NormalTok"/>
+              </w:rPr>
+              <w:t xml:space="preserve">  </w:t>
+            </w:r>
+            <w:r>
+              <w:rPr>
+                <w:rStyle w:val="FunctionTok"/>
+              </w:rPr>
+              <w:t xml:space="preserve">theme_minimal</w:t>
+            </w:r>
+            <w:r>
+              <w:rPr>
+                <w:rStyle w:val="NormalTok"/>
+              </w:rPr>
+              <w:t xml:space="preserve">()</w:t>
+            </w:r>
+          </w:p>
+          <w:p>
+            <w:pPr>
+              <w:jc w:val="center"/>
+            </w:pPr>
+            <w:r>
+              <w:drawing>
+                <wp:inline>
+                  <wp:extent cx="5334000" cy="3111500"/>
+                  <wp:effectExtent b="0" l="0" r="0" t="0"/>
+                  <wp:docPr descr="" title="" id="38" name="Picture"/>
+                  <a:graphic>
+                    <a:graphicData uri="http://schemas.openxmlformats.org/drawingml/2006/picture">
+                      <pic:pic>
+                        <pic:nvPicPr>
+                          <pic:cNvPr descr="variance-covariance_files/figure-docx/bernoulli-variance-r-1.png" id="39" name="Picture"/>
+                          <pic:cNvPicPr>
+                            <a:picLocks noChangeArrowheads="1" noChangeAspect="1"/>
+                          </pic:cNvPicPr>
+                        </pic:nvPicPr>
+                        <pic:blipFill>
+                          <a:blip r:embed="rId37"/>
+                          <a:stretch>
+                            <a:fillRect/>
+                          </a:stretch>
+                        </pic:blipFill>
+                        <pic:spPr bwMode="auto">
+                          <a:xfrm>
+                            <a:off x="0" y="0"/>
+                            <a:ext cx="5334000" cy="3111500"/>
+                          </a:xfrm>
+                          <a:prstGeom prst="rect">
+                            <a:avLst/>
+                          </a:prstGeom>
+                          <a:noFill/>
+                          <a:ln w="9525">
+                            <a:noFill/>
+                            <a:headEnd/>
+                            <a:tailEnd/>
+                          </a:ln>
+                        </pic:spPr>
+                      </pic:pic>
+                    </a:graphicData>
+                  </a:graphic>
+                </wp:inline>
+              </w:drawing>
+            </w:r>
+          </w:p>
+          <w:p>
+            <w:pPr>
+              <w:jc w:val="center"/>
+            </w:pPr>
+            <w:pPr>
+              <w:jc w:val="left"/>
+              <w:spacing w:before="200"/>
+              <w:pStyle w:val="ImageCaption"/>
+            </w:pPr>
+            <w:r>
+              <w:t xml:space="preserve">Figure 1: The</w:t>
+            </w:r>
+            <w:r>
+              <w:t xml:space="preserve"> </w:t>
+            </w:r>
+            <w:hyperlink w:anchor="def-variance">
+              <w:r>
+                <w:rPr>
+                  <w:rStyle w:val="Hyperlink"/>
+                </w:rPr>
+                <w:t xml:space="preserve">variance</w:t>
+              </w:r>
+            </w:hyperlink>
+            <w:r>
+              <w:t xml:space="preserve"> </w:t>
+            </w:r>
+            <m:oMath>
+              <m:r>
+                <m:t>π</m:t>
+              </m:r>
+              <m:r>
+                <m:rPr>
+                  <m:sty m:val="p"/>
+                </m:rPr>
+                <m:t>(</m:t>
+              </m:r>
+              <m:r>
+                <m:t>1</m:t>
+              </m:r>
+              <m:r>
+                <m:rPr>
+                  <m:sty m:val="p"/>
+                </m:rPr>
+                <m:t>−</m:t>
+              </m:r>
+              <m:r>
+                <m:t>π</m:t>
+              </m:r>
+              <m:r>
+                <m:rPr>
+                  <m:sty m:val="p"/>
+                </m:rPr>
+                <m:t>)</m:t>
+              </m:r>
+            </m:oMath>
+            <w:r>
+              <w:t xml:space="preserve"> </w:t>
+            </w:r>
+            <w:r>
+              <w:t xml:space="preserve">of a</w:t>
+            </w:r>
+            <w:r>
+              <w:t xml:space="preserve"> </w:t>
+            </w:r>
+            <w:hyperlink r:id="rId40">
+              <w:r>
+                <w:rPr>
+                  <w:rStyle w:val="Hyperlink"/>
+                </w:rPr>
+                <w:t xml:space="preserve">Bernoulli</w:t>
+              </w:r>
+            </w:hyperlink>
+            <w:r>
+              <w:t xml:space="preserve"> </w:t>
+            </w:r>
+            <w:hyperlink r:id="rId41">
+              <w:r>
+                <w:rPr>
+                  <w:rStyle w:val="Hyperlink"/>
+                </w:rPr>
+                <w:t xml:space="preserve">random variable</w:t>
+              </w:r>
+            </w:hyperlink>
+            <w:r>
+              <w:t xml:space="preserve">,</w:t>
+            </w:r>
+            <w:r>
+              <w:t xml:space="preserve"> </w:t>
+            </w:r>
+            <w:r>
+              <w:t xml:space="preserve">against its</w:t>
+            </w:r>
+            <w:r>
+              <w:t xml:space="preserve"> </w:t>
+            </w:r>
+            <w:hyperlink r:id="rId42">
+              <w:r>
+                <w:rPr>
+                  <w:rStyle w:val="Hyperlink"/>
+                </w:rPr>
+                <w:t xml:space="preserve">probability</w:t>
+              </w:r>
+            </w:hyperlink>
+            <w:r>
+              <w:t xml:space="preserve"> </w:t>
+            </w:r>
+            <m:oMath>
+              <m:r>
+                <m:t>π</m:t>
+              </m:r>
+            </m:oMath>
+            <w:r>
+              <w:t xml:space="preserve">.</w:t>
+            </w:r>
+            <w:r>
+              <w:t xml:space="preserve"> </w:t>
+            </w:r>
+            <w:r>
+              <w:t xml:space="preserve">It is 0 at</w:t>
+            </w:r>
+            <w:r>
+              <w:t xml:space="preserve"> </w:t>
+            </w:r>
+            <m:oMath>
+              <m:r>
+                <m:t>π</m:t>
+              </m:r>
+              <m:r>
+                <m:rPr>
+                  <m:sty m:val="p"/>
+                </m:rPr>
+                <m:t>=</m:t>
+              </m:r>
+              <m:r>
+                <m:t>0</m:t>
+              </m:r>
+            </m:oMath>
+            <w:r>
+              <w:t xml:space="preserve"> </w:t>
+            </w:r>
+            <w:r>
+              <w:t xml:space="preserve">and</w:t>
+            </w:r>
+            <w:r>
+              <w:t xml:space="preserve"> </w:t>
+            </w:r>
+            <m:oMath>
+              <m:r>
+                <m:t>π</m:t>
+              </m:r>
+              <m:r>
+                <m:rPr>
+                  <m:sty m:val="p"/>
+                </m:rPr>
+                <m:t>=</m:t>
+              </m:r>
+              <m:r>
+                <m:t>1</m:t>
+              </m:r>
+            </m:oMath>
+            <w:r>
+              <w:t xml:space="preserve">, where the</w:t>
+            </w:r>
+            <w:r>
+              <w:t xml:space="preserve"> </w:t>
+            </w:r>
+            <w:hyperlink r:id="rId43">
+              <w:r>
+                <w:rPr>
+                  <w:rStyle w:val="Hyperlink"/>
+                </w:rPr>
+                <w:t xml:space="preserve">outcome</w:t>
+              </w:r>
+            </w:hyperlink>
+            <w:r>
+              <w:t xml:space="preserve"> </w:t>
+            </w:r>
+            <w:r>
+              <w:t xml:space="preserve">is certain.</w:t>
+            </w:r>
+            <w:r>
+              <w:t xml:space="preserve"> </w:t>
+            </w:r>
+            <w:r>
+              <w:t xml:space="preserve">It is largest,</w:t>
+            </w:r>
+            <w:r>
+              <w:t xml:space="preserve"> </w:t>
+            </w:r>
+            <m:oMath>
+              <m:r>
+                <m:t>1</m:t>
+              </m:r>
+              <m:r>
+                <m:rPr>
+                  <m:sty m:val="p"/>
+                </m:rPr>
+                <m:t>/</m:t>
+              </m:r>
+              <m:r>
+                <m:t>4</m:t>
+              </m:r>
+            </m:oMath>
+            <w:r>
+              <w:t xml:space="preserve">, at</w:t>
+            </w:r>
+            <w:r>
+              <w:t xml:space="preserve"> </w:t>
+            </w:r>
+            <m:oMath>
+              <m:r>
+                <m:t>π</m:t>
+              </m:r>
+              <m:r>
+                <m:rPr>
+                  <m:sty m:val="p"/>
+                </m:rPr>
+                <m:t>=</m:t>
+              </m:r>
+              <m:r>
+                <m:t>1</m:t>
+              </m:r>
+              <m:r>
+                <m:rPr>
+                  <m:sty m:val="p"/>
+                </m:rPr>
+                <m:t>/</m:t>
+              </m:r>
+              <m:r>
+                <m:t>2</m:t>
+              </m:r>
+            </m:oMath>
+            <w:r>
+              <w:t xml:space="preserve"> </w:t>
+            </w:r>
+            <w:r>
+              <w:t xml:space="preserve">(dot), where the outcome is least predictable.</w:t>
+            </w:r>
+          </w:p>
+          <w:bookmarkEnd w:id="44"/>
+        </w:tc>
+      </w:tr>
+    </w:tbl>
+    <w:bookmarkStart w:id="46" w:name="def-cond-variance"/>
     <w:p>
       <w:pPr>
         <w:pStyle w:val="BodyText"/>
@@ -5566,7 +7058,7 @@
       <w:r>
         <w:t xml:space="preserve"> </w:t>
       </w:r>
-      <w:hyperlink r:id="rId34">
+      <w:hyperlink r:id="rId45">
         <w:r>
           <w:rPr>
             <w:rStyle w:val="Hyperlink"/>
@@ -5673,8 +7165,8 @@
         <w:t xml:space="preserve">.</w:t>
       </w:r>
     </w:p>
-    <w:bookmarkEnd w:id="35"/>
-    <w:bookmarkStart w:id="37" w:name="exm-cond-variance"/>
+    <w:bookmarkEnd w:id="46"/>
+    <w:bookmarkStart w:id="48" w:name="exm-cond-variance"/>
     <w:p>
       <w:pPr>
         <w:pStyle w:val="BodyText"/>
@@ -5997,7 +7489,7 @@
       <w:r>
         <w:t xml:space="preserve"> </w:t>
       </w:r>
-      <w:hyperlink r:id="rId36">
+      <w:hyperlink r:id="rId47">
         <w:r>
           <w:rPr>
             <w:rStyle w:val="Hyperlink"/>
@@ -6748,8 +8240,8 @@
         </m:oMath>
       </m:oMathPara>
     </w:p>
-    <w:bookmarkEnd w:id="37"/>
-    <w:bookmarkStart w:id="38" w:name="def-homosked"/>
+    <w:bookmarkEnd w:id="48"/>
+    <w:bookmarkStart w:id="49" w:name="def-homosked"/>
     <w:p>
       <w:pPr>
         <w:pStyle w:val="FirstParagraph"/>
@@ -6991,8 +8483,8 @@
         <w:t xml:space="preserve">.</w:t>
       </w:r>
     </w:p>
-    <w:bookmarkEnd w:id="38"/>
-    <w:bookmarkStart w:id="39" w:name="exm-homosked"/>
+    <w:bookmarkEnd w:id="49"/>
+    <w:bookmarkStart w:id="50" w:name="exm-homosked"/>
     <w:p>
       <w:pPr>
         <w:pStyle w:val="BodyText"/>
@@ -7541,8 +9033,8 @@
         <w:t xml:space="preserve">.</w:t>
       </w:r>
     </w:p>
-    <w:bookmarkEnd w:id="39"/>
-    <w:bookmarkStart w:id="40" w:name="def-heterosked"/>
+    <w:bookmarkEnd w:id="50"/>
+    <w:bookmarkStart w:id="51" w:name="def-heterosked"/>
     <w:p>
       <w:pPr>
         <w:pStyle w:val="BodyText"/>
@@ -7704,8 +9196,8 @@
         <w:t xml:space="preserve">.</w:t>
       </w:r>
     </w:p>
-    <w:bookmarkEnd w:id="40"/>
-    <w:bookmarkStart w:id="41" w:name="exm-heterosked"/>
+    <w:bookmarkEnd w:id="51"/>
+    <w:bookmarkStart w:id="52" w:name="exm-heterosked"/>
     <w:p>
       <w:pPr>
         <w:pStyle w:val="BodyText"/>
@@ -8151,8 +9643,8 @@
         <w:t xml:space="preserve">.</w:t>
       </w:r>
     </w:p>
-    <w:bookmarkEnd w:id="41"/>
-    <w:bookmarkStart w:id="42" w:name="thm-total-variance"/>
+    <w:bookmarkEnd w:id="52"/>
+    <w:bookmarkStart w:id="53" w:name="thm-total-variance"/>
     <w:p>
       <w:pPr>
         <w:pStyle w:val="BodyText"/>
@@ -8417,7 +9909,7 @@
         </m:oMath>
       </m:oMathPara>
     </w:p>
-    <w:bookmarkEnd w:id="42"/>
+    <w:bookmarkEnd w:id="53"/>
     <w:p>
       <w:pPr>
         <w:pStyle w:val="FirstParagraph"/>
@@ -9236,7 +10728,7 @@
       <w:r>
         <w:t xml:space="preserve"> </w:t>
       </w:r>
-      <w:hyperlink r:id="rId43">
+      <w:hyperlink r:id="rId54">
         <w:r>
           <w:rPr>
             <w:rStyle w:val="Hyperlink"/>
@@ -9281,7 +10773,7 @@
       <w:r>
         <w:t xml:space="preserve">(</w:t>
       </w:r>
-      <w:hyperlink r:id="rId44">
+      <w:hyperlink r:id="rId55">
         <w:r>
           <w:rPr>
             <w:rStyle w:val="Hyperlink"/>
@@ -9307,7 +10799,7 @@
       <w:r>
         <w:t xml:space="preserve"> </w:t>
       </w:r>
-      <w:hyperlink r:id="rId45">
+      <w:hyperlink r:id="rId56">
         <w:r>
           <w:rPr>
             <w:rStyle w:val="Hyperlink"/>
@@ -9361,7 +10853,7 @@
       <w:r>
         <w:t xml:space="preserve"> </w:t>
       </w:r>
-      <w:hyperlink r:id="rId46">
+      <w:hyperlink r:id="rId57">
         <w:r>
           <w:rPr>
             <w:rStyle w:val="Hyperlink"/>
@@ -11902,7 +13394,7 @@
         <w:t xml:space="preserve">.</w:t>
       </w:r>
     </w:p>
-    <w:bookmarkStart w:id="47" w:name="exm-total-variance"/>
+    <w:bookmarkStart w:id="58" w:name="exm-total-variance"/>
     <w:p>
       <w:pPr>
         <w:pStyle w:val="BodyText"/>
@@ -12874,8 +14366,8 @@
         </m:oMath>
       </m:oMathPara>
     </w:p>
-    <w:bookmarkEnd w:id="47"/>
-    <w:bookmarkStart w:id="48" w:name="def-precision"/>
+    <w:bookmarkEnd w:id="58"/>
+    <w:bookmarkStart w:id="59" w:name="def-precision"/>
     <w:p>
       <w:pPr>
         <w:pStyle w:val="FirstParagraph"/>
@@ -13148,8 +14640,8 @@
         </m:oMath>
       </m:oMathPara>
     </w:p>
-    <w:bookmarkEnd w:id="48"/>
-    <w:bookmarkStart w:id="49" w:name="def-sd"/>
+    <w:bookmarkEnd w:id="59"/>
+    <w:bookmarkStart w:id="60" w:name="def-sd"/>
     <w:p>
       <w:pPr>
         <w:pStyle w:val="FirstParagraph"/>
@@ -13315,7 +14807,7 @@
         </m:oMath>
       </m:oMathPara>
     </w:p>
-    <w:bookmarkEnd w:id="49"/>
+    <w:bookmarkEnd w:id="60"/>
     <w:p>
       <w:pPr>
         <w:pStyle w:val="FirstParagraph"/>
@@ -13371,7 +14863,7 @@
         <w:t xml:space="preserve">which is why it is often the preferred measure of spread when reporting results.</w:t>
       </w:r>
     </w:p>
-    <w:bookmarkStart w:id="50" w:name="exm-sd"/>
+    <w:bookmarkStart w:id="61" w:name="exm-sd"/>
     <w:p>
       <w:pPr>
         <w:pStyle w:val="BodyText"/>
@@ -13658,9 +15150,9 @@
         </m:oMath>
       </m:oMathPara>
     </w:p>
-    <w:bookmarkEnd w:id="50"/>
-    <w:bookmarkEnd w:id="51"/>
-    <w:bookmarkStart w:id="58" w:name="sec-best-constant-prediction"/>
+    <w:bookmarkEnd w:id="61"/>
+    <w:bookmarkEnd w:id="62"/>
+    <w:bookmarkStart w:id="69" w:name="sec-best-constant-prediction"/>
     <w:p>
       <w:pPr>
         <w:pStyle w:val="Heading2"/>
@@ -13669,7 +15161,7 @@
         <w:t xml:space="preserve">3 The best constant prediction</w:t>
       </w:r>
     </w:p>
-    <w:bookmarkStart w:id="53" w:name="thm-constant-prediction-decompose"/>
+    <w:bookmarkStart w:id="64" w:name="thm-constant-prediction-decompose"/>
     <w:p>
       <w:pPr>
         <w:pStyle w:val="FirstParagraph"/>
@@ -13737,7 +15229,7 @@
       <w:pPr>
         <w:pStyle w:val="BodyText"/>
       </w:pPr>
-      <w:bookmarkStart w:id="52" w:name="eq-constant-prediction-decompose"/>
+      <w:bookmarkStart w:id="63" w:name="eq-constant-prediction-decompose"/>
       <m:oMathPara>
         <m:oMathParaPr>
           <m:jc m:val="center"/>
@@ -13903,9 +15395,9 @@
           </m:r>
         </m:oMath>
       </m:oMathPara>
-      <w:bookmarkEnd w:id="52"/>
+      <w:bookmarkEnd w:id="63"/>
     </w:p>
-    <w:bookmarkEnd w:id="53"/>
+    <w:bookmarkEnd w:id="64"/>
     <w:p>
       <w:pPr>
         <w:pStyle w:val="FirstParagraph"/>
@@ -15037,7 +16529,7 @@
         </m:oMath>
       </m:oMathPara>
     </w:p>
-    <w:bookmarkStart w:id="55" w:name="cor-best-constant"/>
+    <w:bookmarkStart w:id="66" w:name="cor-best-constant"/>
     <w:p>
       <w:pPr>
         <w:pStyle w:val="FirstParagraph"/>
@@ -15372,7 +16864,7 @@
       <w:r>
         <w:t xml:space="preserve"> </w:t>
       </w:r>
-      <w:hyperlink r:id="rId54">
+      <w:hyperlink r:id="rId65">
         <w:r>
           <w:rPr>
             <w:rStyle w:val="Hyperlink"/>
@@ -15384,7 +16876,7 @@
         <w:t xml:space="preserve">.</w:t>
       </w:r>
     </w:p>
-    <w:bookmarkEnd w:id="55"/>
+    <w:bookmarkEnd w:id="66"/>
     <w:p>
       <w:pPr>
         <w:pStyle w:val="BodyText"/>
@@ -15632,7 +17124,7 @@
         <w:t xml:space="preserve">.</w:t>
       </w:r>
     </w:p>
-    <w:bookmarkStart w:id="57" w:name="exm-best-constant-auto"/>
+    <w:bookmarkStart w:id="68" w:name="exm-best-constant-auto"/>
     <w:p>
       <w:pPr>
         <w:pStyle w:val="BodyText"/>
@@ -15653,7 +17145,7 @@
       <w:r>
         <w:t xml:space="preserve"> </w:t>
       </w:r>
-      <w:hyperlink r:id="rId56">
+      <w:hyperlink r:id="rId67">
         <w:r>
           <w:rPr>
             <w:rStyle w:val="Hyperlink"/>
@@ -16357,9 +17849,9 @@
         <w:t xml:space="preserve">.</w:t>
       </w:r>
     </w:p>
-    <w:bookmarkEnd w:id="57"/>
-    <w:bookmarkEnd w:id="58"/>
-    <w:bookmarkStart w:id="62" w:name="sec-bias-variance-prediction"/>
+    <w:bookmarkEnd w:id="68"/>
+    <w:bookmarkEnd w:id="69"/>
+    <w:bookmarkStart w:id="73" w:name="sec-bias-variance-prediction"/>
     <w:p>
       <w:pPr>
         <w:pStyle w:val="Heading2"/>
@@ -16368,7 +17860,7 @@
         <w:t xml:space="preserve">4 Independent noise plus a random variable</w:t>
       </w:r>
     </w:p>
-    <w:bookmarkStart w:id="59" w:name="thm-second-moment-noise-sum"/>
+    <w:bookmarkStart w:id="70" w:name="thm-second-moment-noise-sum"/>
     <w:p>
       <w:pPr>
         <w:pStyle w:val="FirstParagraph"/>
@@ -16771,7 +18263,7 @@
         </m:oMath>
       </m:oMathPara>
     </w:p>
-    <w:bookmarkEnd w:id="59"/>
+    <w:bookmarkEnd w:id="70"/>
     <w:p>
       <w:pPr>
         <w:pStyle w:val="FirstParagraph"/>
@@ -19408,7 +20900,7 @@
       <w:r>
         <w:t xml:space="preserve"> </w:t>
       </w:r>
-      <w:hyperlink r:id="rId60">
+      <w:hyperlink r:id="rId71">
         <w:r>
           <w:rPr>
             <w:rStyle w:val="Hyperlink"/>
@@ -19428,7 +20920,7 @@
       <w:r>
         <w:t xml:space="preserve"> </w:t>
       </w:r>
-      <w:hyperlink r:id="rId61">
+      <w:hyperlink r:id="rId72">
         <w:r>
           <w:rPr>
             <w:rStyle w:val="Hyperlink"/>
@@ -19440,8 +20932,8 @@
         <w:t xml:space="preserve">.</w:t>
       </w:r>
     </w:p>
-    <w:bookmarkEnd w:id="62"/>
-    <w:bookmarkStart w:id="110" w:name="covariance"/>
+    <w:bookmarkEnd w:id="73"/>
+    <w:bookmarkStart w:id="121" w:name="covariance"/>
     <w:p>
       <w:pPr>
         <w:pStyle w:val="Heading2"/>
@@ -19450,7 +20942,7 @@
         <w:t xml:space="preserve">5 Covariance</w:t>
       </w:r>
     </w:p>
-    <w:bookmarkStart w:id="63" w:name="def-cov"/>
+    <w:bookmarkStart w:id="74" w:name="def-cov"/>
     <w:p>
       <w:pPr>
         <w:pStyle w:val="FirstParagraph"/>
@@ -19817,8 +21309,8 @@
         </m:oMath>
       </m:oMathPara>
     </w:p>
-    <w:bookmarkEnd w:id="63"/>
-    <w:bookmarkStart w:id="64" w:name="thm-alt-cov"/>
+    <w:bookmarkEnd w:id="74"/>
+    <w:bookmarkStart w:id="75" w:name="thm-alt-cov"/>
     <w:p>
       <w:pPr>
         <w:pStyle w:val="FirstParagraph"/>
@@ -19970,7 +21462,7 @@
         </m:oMath>
       </m:oMathPara>
     </w:p>
-    <w:bookmarkEnd w:id="64"/>
+    <w:bookmarkEnd w:id="75"/>
     <w:p>
       <w:pPr>
         <w:pStyle w:val="FirstParagraph"/>
@@ -21269,7 +22761,7 @@
         </m:oMath>
       </m:oMathPara>
     </w:p>
-    <w:bookmarkStart w:id="65" w:name="exm-alt-cov"/>
+    <w:bookmarkStart w:id="76" w:name="exm-alt-cov"/>
     <w:p>
       <w:pPr>
         <w:pStyle w:val="FirstParagraph"/>
@@ -21744,8 +23236,8 @@
         </m:oMath>
       </m:oMathPara>
     </w:p>
-    <w:bookmarkEnd w:id="65"/>
-    <w:bookmarkStart w:id="67" w:name="thm-indpt-uncorrelated"/>
+    <w:bookmarkEnd w:id="76"/>
+    <w:bookmarkStart w:id="78" w:name="thm-indpt-uncorrelated"/>
     <w:p>
       <w:pPr>
         <w:pStyle w:val="FirstParagraph"/>
@@ -21794,7 +23286,7 @@
       <w:r>
         <w:t xml:space="preserve"> </w:t>
       </w:r>
-      <w:hyperlink r:id="rId66">
+      <w:hyperlink r:id="rId77">
         <w:r>
           <w:rPr>
             <w:rStyle w:val="Hyperlink"/>
@@ -22095,7 +23587,7 @@
         <w:t xml:space="preserve">.</w:t>
       </w:r>
     </w:p>
-    <w:bookmarkEnd w:id="67"/>
+    <w:bookmarkEnd w:id="78"/>
     <w:p>
       <w:pPr>
         <w:pStyle w:val="BodyText"/>
@@ -22245,7 +23737,7 @@
       <w:r>
         <w:t xml:space="preserve"> </w:t>
       </w:r>
-      <w:hyperlink r:id="rId68">
+      <w:hyperlink r:id="rId79">
         <w:r>
           <w:rPr>
             <w:rStyle w:val="Hyperlink"/>
@@ -22259,7 +23751,7 @@
       <w:r>
         <w:t xml:space="preserve">(</w:t>
       </w:r>
-      <w:hyperlink r:id="rId69">
+      <w:hyperlink r:id="rId80">
         <w:r>
           <w:rPr>
             <w:rStyle w:val="Hyperlink"/>
@@ -22441,7 +23933,7 @@
       <w:r>
         <w:t xml:space="preserve"> </w:t>
       </w:r>
-      <w:hyperlink r:id="rId66">
+      <w:hyperlink r:id="rId77">
         <w:r>
           <w:rPr>
             <w:rStyle w:val="Hyperlink"/>
@@ -24965,7 +26457,7 @@
         </m:oMath>
       </m:oMathPara>
     </w:p>
-    <w:bookmarkStart w:id="71" w:name="exm-indpt-uncorrelated"/>
+    <w:bookmarkStart w:id="82" w:name="exm-indpt-uncorrelated"/>
     <w:p>
       <w:pPr>
         <w:pStyle w:val="FirstParagraph"/>
@@ -25032,7 +26524,7 @@
       <w:r>
         <w:t xml:space="preserve"> </w:t>
       </w:r>
-      <w:hyperlink r:id="rId70">
+      <w:hyperlink r:id="rId81">
         <w:r>
           <w:rPr>
             <w:rStyle w:val="Hyperlink"/>
@@ -25617,8 +27109,8 @@
         <w:t xml:space="preserve">requires.</w:t>
       </w:r>
     </w:p>
-    <w:bookmarkEnd w:id="71"/>
-    <w:bookmarkStart w:id="72" w:name="exm-uncorrelated-not-indpt"/>
+    <w:bookmarkEnd w:id="82"/>
+    <w:bookmarkStart w:id="83" w:name="exm-uncorrelated-not-indpt"/>
     <w:p>
       <w:pPr>
         <w:pStyle w:val="BodyText"/>
@@ -26855,8 +28347,8 @@
         </m:oMath>
       </m:oMathPara>
     </w:p>
-    <w:bookmarkEnd w:id="72"/>
-    <w:bookmarkStart w:id="73" w:name="def-correlation"/>
+    <w:bookmarkEnd w:id="83"/>
+    <w:bookmarkStart w:id="84" w:name="def-correlation"/>
     <w:p>
       <w:pPr>
         <w:pStyle w:val="FirstParagraph"/>
@@ -27128,7 +28620,7 @@
         </m:oMath>
       </m:oMathPara>
     </w:p>
-    <w:bookmarkEnd w:id="73"/>
+    <w:bookmarkEnd w:id="84"/>
     <w:p>
       <w:pPr>
         <w:pStyle w:val="FirstParagraph"/>
@@ -27184,7 +28676,7 @@
         <w:t xml:space="preserve">the sample (Pearson) correlation coefficient computed from data estimates it.</w:t>
       </w:r>
     </w:p>
-    <w:bookmarkStart w:id="74" w:name="exm-correlation"/>
+    <w:bookmarkStart w:id="85" w:name="exm-correlation"/>
     <w:p>
       <w:pPr>
         <w:pStyle w:val="BodyText"/>
@@ -27831,8 +29323,8 @@
         </m:oMath>
       </m:oMathPara>
     </w:p>
-    <w:bookmarkEnd w:id="74"/>
-    <w:bookmarkStart w:id="75" w:name="def-uncorrelated"/>
+    <w:bookmarkEnd w:id="85"/>
+    <w:bookmarkStart w:id="86" w:name="def-uncorrelated"/>
     <w:p>
       <w:pPr>
         <w:pStyle w:val="FirstParagraph"/>
@@ -28083,7 +29575,7 @@
         </m:oMath>
       </m:oMathPara>
     </w:p>
-    <w:bookmarkEnd w:id="75"/>
+    <w:bookmarkEnd w:id="86"/>
     <w:p>
       <w:pPr>
         <w:pStyle w:val="FirstParagraph"/>
@@ -28136,7 +29628,7 @@
         <w:t xml:space="preserve">shows the converse fails.</w:t>
       </w:r>
     </w:p>
-    <w:bookmarkStart w:id="76" w:name="exm-uncorrelated"/>
+    <w:bookmarkStart w:id="87" w:name="exm-uncorrelated"/>
     <w:p>
       <w:pPr>
         <w:pStyle w:val="BodyText"/>
@@ -28358,8 +29850,8 @@
         <w:t xml:space="preserve">so the binary exposure and outcome are not uncorrelated.</w:t>
       </w:r>
     </w:p>
-    <w:bookmarkEnd w:id="76"/>
-    <w:bookmarkStart w:id="77" w:name="cor-uncorrelated-cor-zero"/>
+    <w:bookmarkEnd w:id="87"/>
+    <w:bookmarkStart w:id="88" w:name="cor-uncorrelated-cor-zero"/>
     <w:p>
       <w:pPr>
         <w:pStyle w:val="BodyText"/>
@@ -28522,7 +30014,7 @@
         <w:t xml:space="preserve">.</w:t>
       </w:r>
     </w:p>
-    <w:bookmarkEnd w:id="77"/>
+    <w:bookmarkEnd w:id="88"/>
     <w:p>
       <w:pPr>
         <w:pStyle w:val="BodyText"/>
@@ -28922,7 +30414,7 @@
         <w:t xml:space="preserve">.</w:t>
       </w:r>
     </w:p>
-    <w:bookmarkStart w:id="78" w:name="def-cond-cov"/>
+    <w:bookmarkStart w:id="89" w:name="def-cond-cov"/>
     <w:p>
       <w:pPr>
         <w:pStyle w:val="BodyText"/>
@@ -29377,8 +30869,8 @@
         <w:t xml:space="preserve">.</w:t>
       </w:r>
     </w:p>
-    <w:bookmarkEnd w:id="78"/>
-    <w:bookmarkStart w:id="79" w:name="exm-cond-cov"/>
+    <w:bookmarkEnd w:id="89"/>
+    <w:bookmarkStart w:id="90" w:name="exm-cond-cov"/>
     <w:p>
       <w:pPr>
         <w:pStyle w:val="BodyText"/>
@@ -29649,8 +31141,8 @@
         <w:t xml:space="preserve">.</w:t>
       </w:r>
     </w:p>
-    <w:bookmarkEnd w:id="79"/>
-    <w:bookmarkStart w:id="80" w:name="thm-total-cov"/>
+    <w:bookmarkEnd w:id="90"/>
+    <w:bookmarkStart w:id="91" w:name="thm-total-cov"/>
     <w:p>
       <w:pPr>
         <w:pStyle w:val="BodyText"/>
@@ -30040,7 +31532,7 @@
         </m:oMath>
       </m:oMathPara>
     </w:p>
-    <w:bookmarkEnd w:id="80"/>
+    <w:bookmarkEnd w:id="91"/>
     <w:p>
       <w:pPr>
         <w:pStyle w:val="FirstParagraph"/>
@@ -31625,7 +33117,7 @@
       <w:r>
         <w:t xml:space="preserve"> </w:t>
       </w:r>
-      <w:hyperlink r:id="rId43">
+      <w:hyperlink r:id="rId54">
         <w:r>
           <w:rPr>
             <w:rStyle w:val="Hyperlink"/>
@@ -31656,7 +33148,7 @@
       <w:r>
         <w:t xml:space="preserve">(</w:t>
       </w:r>
-      <w:hyperlink r:id="rId45">
+      <w:hyperlink r:id="rId56">
         <w:r>
           <w:rPr>
             <w:rStyle w:val="Hyperlink"/>
@@ -31855,7 +33347,7 @@
       <w:r>
         <w:t xml:space="preserve"> </w:t>
       </w:r>
-      <w:hyperlink r:id="rId46">
+      <w:hyperlink r:id="rId57">
         <w:r>
           <w:rPr>
             <w:rStyle w:val="Hyperlink"/>
@@ -33180,7 +34672,7 @@
         <w:t xml:space="preserve">.</w:t>
       </w:r>
     </w:p>
-    <w:bookmarkStart w:id="81" w:name="lem-cov-xx"/>
+    <w:bookmarkStart w:id="92" w:name="lem-cov-xx"/>
     <w:p>
       <w:pPr>
         <w:pStyle w:val="BodyText"/>
@@ -33345,7 +34837,7 @@
         </m:oMath>
       </m:oMathPara>
     </w:p>
-    <w:bookmarkEnd w:id="81"/>
+    <w:bookmarkEnd w:id="92"/>
     <w:p>
       <w:pPr>
         <w:pStyle w:val="FirstParagraph"/>
@@ -33752,7 +35244,7 @@
         </m:oMath>
       </m:oMathPara>
     </w:p>
-    <w:bookmarkStart w:id="82" w:name="def-cov-vec-x"/>
+    <w:bookmarkStart w:id="93" w:name="def-cov-vec-x"/>
     <w:p>
       <w:pPr>
         <w:pStyle w:val="FirstParagraph"/>
@@ -33853,8 +35345,8 @@
     $$</w:t>
       </w:r>
     </w:p>
-    <w:bookmarkEnd w:id="82"/>
-    <w:bookmarkStart w:id="83" w:name="thm-vcov-elements"/>
+    <w:bookmarkEnd w:id="93"/>
+    <w:bookmarkStart w:id="94" w:name="thm-vcov-elements"/>
     <w:p>
       <w:pPr>
         <w:pStyle w:val="FirstParagraph"/>
@@ -34031,7 +35523,7 @@
     $$</w:t>
       </w:r>
     </w:p>
-    <w:bookmarkEnd w:id="83"/>
+    <w:bookmarkEnd w:id="94"/>
     <w:p>
       <w:pPr>
         <w:pStyle w:val="FirstParagraph"/>
@@ -34262,7 +35754,7 @@
       <w:r>
         <w:t xml:space="preserve"> </w:t>
       </w:r>
-      <w:hyperlink r:id="rId84">
+      <w:hyperlink r:id="rId95">
         <w:r>
           <w:rPr>
             <w:rStyle w:val="Hyperlink"/>
@@ -34326,7 +35818,7 @@
         <w:t xml:space="preserve">.</w:t>
       </w:r>
     </w:p>
-    <w:bookmarkStart w:id="85" w:name="thm-vcov-vec"/>
+    <w:bookmarkStart w:id="96" w:name="thm-vcov-vec"/>
     <w:p>
       <w:pPr>
         <w:pStyle w:val="FirstParagraph"/>
@@ -34352,7 +35844,7 @@
     $$</w:t>
       </w:r>
     </w:p>
-    <w:bookmarkEnd w:id="85"/>
+    <w:bookmarkEnd w:id="96"/>
     <w:p>
       <w:pPr>
         <w:pStyle w:val="FirstParagraph"/>
@@ -34403,7 +35895,7 @@
     $$</w:t>
       </w:r>
     </w:p>
-    <w:bookmarkStart w:id="86" w:name="thm-var-lincom"/>
+    <w:bookmarkStart w:id="97" w:name="thm-var-lincom"/>
     <w:p>
       <w:pPr>
         <w:pStyle w:val="FirstParagraph"/>
@@ -34464,7 +35956,7 @@
     $$</w:t>
       </w:r>
     </w:p>
-    <w:bookmarkEnd w:id="86"/>
+    <w:bookmarkEnd w:id="97"/>
     <w:p>
       <w:pPr>
         <w:pStyle w:val="FirstParagraph"/>
@@ -34596,7 +36088,7 @@
     $$</w:t>
       </w:r>
     </w:p>
-    <w:bookmarkStart w:id="87" w:name="cor-var-lincom2"/>
+    <w:bookmarkStart w:id="98" w:name="cor-var-lincom2"/>
     <w:p>
       <w:pPr>
         <w:pStyle w:val="FirstParagraph"/>
@@ -34873,7 +36365,7 @@
         </m:oMath>
       </m:oMathPara>
     </w:p>
-    <w:bookmarkEnd w:id="87"/>
+    <w:bookmarkEnd w:id="98"/>
     <w:p>
       <w:pPr>
         <w:pStyle w:val="FirstParagraph"/>
@@ -36381,7 +37873,7 @@
         </m:oMath>
       </m:oMathPara>
     </w:p>
-    <w:bookmarkStart w:id="88" w:name="cor-var-sum-indpt"/>
+    <w:bookmarkStart w:id="99" w:name="cor-var-sum-indpt"/>
     <w:p>
       <w:pPr>
         <w:pStyle w:val="FirstParagraph"/>
@@ -36430,7 +37922,7 @@
       <w:r>
         <w:t xml:space="preserve"> </w:t>
       </w:r>
-      <w:hyperlink r:id="rId66">
+      <w:hyperlink r:id="rId77">
         <w:r>
           <w:rPr>
             <w:rStyle w:val="Hyperlink"/>
@@ -36675,7 +38167,7 @@
         </m:oMath>
       </m:oMathPara>
     </w:p>
-    <w:bookmarkEnd w:id="88"/>
+    <w:bookmarkEnd w:id="99"/>
     <w:p>
       <w:pPr>
         <w:pStyle w:val="FirstParagraph"/>
@@ -37369,7 +38861,7 @@
         <w:t xml:space="preserve">is the case where that term is 0.</w:t>
       </w:r>
     </w:p>
-    <w:bookmarkStart w:id="91" w:name="thm-vcov-psd"/>
+    <w:bookmarkStart w:id="102" w:name="thm-vcov-psd"/>
     <w:p>
       <w:pPr>
         <w:pStyle w:val="BodyText"/>
@@ -37511,7 +39003,7 @@
       <w:r>
         <w:t xml:space="preserve"> </w:t>
       </w:r>
-      <w:hyperlink r:id="rId89">
+      <w:hyperlink r:id="rId100">
         <w:r>
           <w:rPr>
             <w:rStyle w:val="Hyperlink"/>
@@ -37528,7 +39020,7 @@
       <w:r>
         <w:t xml:space="preserve"> </w:t>
       </w:r>
-      <w:hyperlink r:id="rId90">
+      <w:hyperlink r:id="rId101">
         <w:r>
           <w:rPr>
             <w:rStyle w:val="Hyperlink"/>
@@ -37586,7 +39078,7 @@
         <w:t xml:space="preserve">$${\mathord{\smash[b]{\underset{\raise.3ex\hbox{$\scriptstyle\sim$}}{a}}\vphantom{a}}}^{\top} {\operatorname{Var}\mathopen{}\left(\mathord{\smash[b]{\underset{\raise.3ex\hbox{$\scriptstyle\sim$}}{X}}\vphantom{X}}\right)\mathclose{}} \mathord{\smash[b]{\underset{\raise.3ex\hbox{$\scriptstyle\sim$}}{a}}\vphantom{a}}\ge 0$$</w:t>
       </w:r>
     </w:p>
-    <w:bookmarkEnd w:id="91"/>
+    <w:bookmarkEnd w:id="102"/>
     <w:p>
       <w:pPr>
         <w:pStyle w:val="FirstParagraph"/>
@@ -38408,7 +39900,7 @@
         <w:t xml:space="preserve">).</w:t>
       </w:r>
     </w:p>
-    <w:bookmarkStart w:id="92" w:name="exm-vcov-psd"/>
+    <w:bookmarkStart w:id="103" w:name="exm-vcov-psd"/>
     <w:p>
       <w:pPr>
         <w:pStyle w:val="BodyText"/>
@@ -40774,7 +42266,7 @@
         <w:t xml:space="preserve">.</w:t>
       </w:r>
     </w:p>
-    <w:bookmarkEnd w:id="92"/>
+    <w:bookmarkEnd w:id="103"/>
     <w:p>
       <w:pPr>
         <w:pStyle w:val="BodyText"/>
@@ -40908,7 +42400,7 @@
         <w:t xml:space="preserve">has the larger spread.</w:t>
       </w:r>
     </w:p>
-    <w:bookmarkStart w:id="96" w:name="exm-vcov-singular"/>
+    <w:bookmarkStart w:id="107" w:name="exm-vcov-singular"/>
     <w:p>
       <w:pPr>
         <w:pStyle w:val="BodyText"/>
@@ -41196,7 +42688,7 @@
       <w:r>
         <w:t xml:space="preserve"> </w:t>
       </w:r>
-      <w:hyperlink r:id="rId93">
+      <w:hyperlink r:id="rId104">
         <w:r>
           <w:rPr>
             <w:rStyle w:val="Hyperlink"/>
@@ -41213,7 +42705,7 @@
       <w:r>
         <w:t xml:space="preserve"> </w:t>
       </w:r>
-      <w:hyperlink r:id="rId94">
+      <w:hyperlink r:id="rId105">
         <w:r>
           <w:rPr>
             <w:rStyle w:val="Hyperlink"/>
@@ -41268,7 +42760,7 @@
       <w:r>
         <w:t xml:space="preserve"> </w:t>
       </w:r>
-      <w:hyperlink r:id="rId95">
+      <w:hyperlink r:id="rId106">
         <w:r>
           <w:rPr>
             <w:rStyle w:val="Hyperlink"/>
@@ -41280,8 +42772,8 @@
         <w:t xml:space="preserve">.</w:t>
       </w:r>
     </w:p>
-    <w:bookmarkEnd w:id="96"/>
-    <w:bookmarkStart w:id="98" w:name="cor-vcov-indpt-diagonal"/>
+    <w:bookmarkEnd w:id="107"/>
+    <w:bookmarkStart w:id="109" w:name="cor-vcov-indpt-diagonal"/>
     <w:p>
       <w:pPr>
         <w:pStyle w:val="BodyText"/>
@@ -41452,7 +42944,7 @@
       <w:r>
         <w:t xml:space="preserve"> </w:t>
       </w:r>
-      <w:hyperlink r:id="rId66">
+      <w:hyperlink r:id="rId77">
         <w:r>
           <w:rPr>
             <w:rStyle w:val="Hyperlink"/>
@@ -41509,7 +43001,7 @@
       <w:r>
         <w:t xml:space="preserve"> </w:t>
       </w:r>
-      <w:hyperlink r:id="rId97">
+      <w:hyperlink r:id="rId108">
         <w:r>
           <w:rPr>
             <w:rStyle w:val="Hyperlink"/>
@@ -41621,7 +43113,7 @@
         <w:t xml:space="preserve">.</w:t>
       </w:r>
     </w:p>
-    <w:bookmarkEnd w:id="98"/>
+    <w:bookmarkEnd w:id="109"/>
     <w:p>
       <w:pPr>
         <w:pStyle w:val="BodyText"/>
@@ -42077,7 +43569,7 @@
         <w:t xml:space="preserve">.</w:t>
       </w:r>
     </w:p>
-    <w:bookmarkStart w:id="99" w:name="thm-cor-bounds"/>
+    <w:bookmarkStart w:id="110" w:name="thm-cor-bounds"/>
     <w:p>
       <w:pPr>
         <w:pStyle w:val="BodyText"/>
@@ -42326,7 +43818,7 @@
         </m:oMath>
       </m:oMathPara>
     </w:p>
-    <w:bookmarkEnd w:id="99"/>
+    <w:bookmarkEnd w:id="110"/>
     <w:p>
       <w:pPr>
         <w:pStyle w:val="FirstParagraph"/>
@@ -43548,7 +45040,7 @@
         <w:t xml:space="preserve">.</w:t>
       </w:r>
     </w:p>
-    <w:bookmarkStart w:id="107" w:name="exm-cor-auto"/>
+    <w:bookmarkStart w:id="118" w:name="exm-cor-auto"/>
     <w:p>
       <w:pPr>
         <w:pStyle w:val="BodyText"/>
@@ -43612,7 +45104,7 @@
       <w:r>
         <w:t xml:space="preserve"> </w:t>
       </w:r>
-      <w:hyperlink r:id="rId100">
+      <w:hyperlink r:id="rId111">
         <w:r>
           <w:rPr>
             <w:rStyle w:val="VerbatimChar"/>
@@ -43644,7 +45136,7 @@
       <w:r>
         <w:t xml:space="preserve"> </w:t>
       </w:r>
-      <w:hyperlink r:id="rId101">
+      <w:hyperlink r:id="rId112">
         <w:r>
           <w:rPr>
             <w:rStyle w:val="VerbatimChar"/>
@@ -43676,7 +45168,7 @@
       <w:r>
         <w:t xml:space="preserve"> </w:t>
       </w:r>
-      <w:hyperlink r:id="rId102">
+      <w:hyperlink r:id="rId113">
         <w:r>
           <w:rPr>
             <w:rStyle w:val="VerbatimChar"/>
@@ -45076,7 +46568,7 @@
           <w:rPr>
             <w:rStyle w:val="Hyperlink"/>
           </w:rPr>
-          <w:t xml:space="preserve">Figure 1</w:t>
+          <w:t xml:space="preserve">Figure 2</w:t>
         </w:r>
       </w:hyperlink>
       <w:r>
@@ -45398,7 +46890,7 @@
       <w:tr>
         <w:tc>
           <w:tcPr/>
-          <w:bookmarkStart w:id="106" w:name="fig-cor-auto"/>
+          <w:bookmarkStart w:id="117" w:name="fig-cor-auto"/>
           <w:p>
             <w:pPr>
               <w:pStyle w:val="Compact"/>
@@ -45409,18 +46901,18 @@
                 <wp:inline>
                   <wp:extent cx="4620126" cy="3234088"/>
                   <wp:effectExtent b="0" l="0" r="0" t="0"/>
-                  <wp:docPr descr="" title="" id="104" name="Picture"/>
+                  <wp:docPr descr="" title="" id="115" name="Picture"/>
                   <a:graphic>
                     <a:graphicData uri="http://schemas.openxmlformats.org/drawingml/2006/picture">
                       <pic:pic>
                         <pic:nvPicPr>
-                          <pic:cNvPr descr="variance-covariance_files/figure-docx/fig-cor-auto-1.png" id="105" name="Picture"/>
+                          <pic:cNvPr descr="variance-covariance_files/figure-docx/fig-cor-auto-1.png" id="116" name="Picture"/>
                           <pic:cNvPicPr>
                             <a:picLocks noChangeArrowheads="1" noChangeAspect="1"/>
                           </pic:cNvPicPr>
                         </pic:nvPicPr>
                         <pic:blipFill>
-                          <a:blip r:embed="rId103"/>
+                          <a:blip r:embed="rId114"/>
                           <a:stretch>
                             <a:fillRect/>
                           </a:stretch>
@@ -45457,10 +46949,10 @@
               <w:pStyle w:val="ImageCaption"/>
             </w:pPr>
             <w:r>
-              <w:t xml:space="preserve">Figure 1: Miles per gallon against horsepower for the cars in the Auto data. Cars with more horsepower tend to have lower fuel economy.</w:t>
+              <w:t xml:space="preserve">Figure 2: Miles per gallon against horsepower for the cars in the Auto data. Cars with more horsepower tend to have lower fuel economy.</w:t>
             </w:r>
           </w:p>
-          <w:bookmarkEnd w:id="106"/>
+          <w:bookmarkEnd w:id="117"/>
         </w:tc>
       </w:tr>
     </w:tbl>
@@ -45607,7 +47099,7 @@
         <w:t xml:space="preserve">deviations by the same count, which cancels.</w:t>
       </w:r>
     </w:p>
-    <w:bookmarkEnd w:id="107"/>
+    <w:bookmarkEnd w:id="118"/>
     <w:p>
       <w:pPr>
         <w:pStyle w:val="BodyText"/>
@@ -45618,7 +47110,7 @@
       <w:r>
         <w:t xml:space="preserve"> </w:t>
       </w:r>
-      <w:hyperlink r:id="rId108">
+      <w:hyperlink r:id="rId119">
         <w:r>
           <w:rPr>
             <w:rStyle w:val="Hyperlink"/>
@@ -45635,7 +47127,7 @@
       <w:r>
         <w:t xml:space="preserve"> </w:t>
       </w:r>
-      <w:hyperlink r:id="rId109">
+      <w:hyperlink r:id="rId120">
         <w:r>
           <w:rPr>
             <w:rStyle w:val="Hyperlink"/>
@@ -45665,8 +47157,8 @@
         <w:t xml:space="preserve">.</w:t>
       </w:r>
     </w:p>
-    <w:bookmarkEnd w:id="110"/>
-    <w:bookmarkStart w:id="122" w:name="references"/>
+    <w:bookmarkEnd w:id="121"/>
+    <w:bookmarkStart w:id="133" w:name="references"/>
     <w:p>
       <w:pPr>
         <w:pStyle w:val="Heading2"/>
@@ -45675,8 +47167,8 @@
         <w:t xml:space="preserve">References</w:t>
       </w:r>
     </w:p>
-    <w:bookmarkStart w:id="121" w:name="refs"/>
-    <w:bookmarkStart w:id="111" w:name="ref-wikipedia_errors_and_residuals"/>
+    <w:bookmarkStart w:id="132" w:name="refs"/>
+    <w:bookmarkStart w:id="122" w:name="ref-wikipedia_errors_and_residuals"/>
     <w:p>
       <w:pPr>
         <w:pStyle w:val="Bibliography"/>
@@ -45732,8 +47224,8 @@
         </w:r>
       </w:hyperlink>
     </w:p>
-    <w:bookmarkEnd w:id="111"/>
-    <w:bookmarkStart w:id="113" w:name="ref-wikipedia_variance"/>
+    <w:bookmarkEnd w:id="122"/>
+    <w:bookmarkStart w:id="124" w:name="ref-wikipedia_variance"/>
     <w:p>
       <w:pPr>
         <w:pStyle w:val="Bibliography"/>
@@ -45780,7 +47272,7 @@
       <w:r>
         <w:t xml:space="preserve"> </w:t>
       </w:r>
-      <w:hyperlink r:id="rId112">
+      <w:hyperlink r:id="rId123">
         <w:r>
           <w:rPr>
             <w:rStyle w:val="Hyperlink"/>
@@ -45789,8 +47281,8 @@
         </w:r>
       </w:hyperlink>
     </w:p>
-    <w:bookmarkEnd w:id="113"/>
-    <w:bookmarkStart w:id="115" w:name="ref-wikipedia_covariance"/>
+    <w:bookmarkEnd w:id="124"/>
+    <w:bookmarkStart w:id="126" w:name="ref-wikipedia_covariance"/>
     <w:p>
       <w:pPr>
         <w:pStyle w:val="Bibliography"/>
@@ -45837,7 +47329,7 @@
       <w:r>
         <w:t xml:space="preserve"> </w:t>
       </w:r>
-      <w:hyperlink r:id="rId114">
+      <w:hyperlink r:id="rId125">
         <w:r>
           <w:rPr>
             <w:rStyle w:val="Hyperlink"/>
@@ -45846,8 +47338,8 @@
         </w:r>
       </w:hyperlink>
     </w:p>
-    <w:bookmarkEnd w:id="115"/>
-    <w:bookmarkStart w:id="116" w:name="ref-billingsley1995probability"/>
+    <w:bookmarkEnd w:id="126"/>
+    <w:bookmarkStart w:id="127" w:name="ref-billingsley1995probability"/>
     <w:p>
       <w:pPr>
         <w:pStyle w:val="Bibliography"/>
@@ -45878,8 +47370,8 @@
         <w:t xml:space="preserve">, 3rd ed. in Wiley series in probability and mathematical statistics. New York: Wiley, 1995.</w:t>
       </w:r>
     </w:p>
-    <w:bookmarkEnd w:id="116"/>
-    <w:bookmarkStart w:id="118" w:name="ref-CaseBerg01"/>
+    <w:bookmarkEnd w:id="127"/>
+    <w:bookmarkStart w:id="129" w:name="ref-CaseBerg01"/>
     <w:p>
       <w:pPr>
         <w:pStyle w:val="Bibliography"/>
@@ -45912,7 +47404,7 @@
       <w:r>
         <w:t xml:space="preserve"> </w:t>
       </w:r>
-      <w:hyperlink r:id="rId117">
+      <w:hyperlink r:id="rId128">
         <w:r>
           <w:rPr>
             <w:rStyle w:val="Hyperlink"/>
@@ -45921,8 +47413,8 @@
         </w:r>
       </w:hyperlink>
     </w:p>
-    <w:bookmarkEnd w:id="118"/>
-    <w:bookmarkStart w:id="120" w:name="ref-fiveminuteai_probstat"/>
+    <w:bookmarkEnd w:id="129"/>
+    <w:bookmarkStart w:id="131" w:name="ref-fiveminuteai_probstat"/>
     <w:p>
       <w:pPr>
         <w:pStyle w:val="Bibliography"/>
@@ -45954,7 +47446,7 @@
       <w:r>
         <w:t xml:space="preserve"> </w:t>
       </w:r>
-      <w:hyperlink r:id="rId119">
+      <w:hyperlink r:id="rId130">
         <w:r>
           <w:rPr>
             <w:rStyle w:val="Hyperlink"/>
@@ -45963,9 +47455,9 @@
         </w:r>
       </w:hyperlink>
     </w:p>
-    <w:bookmarkEnd w:id="120"/>
-    <w:bookmarkEnd w:id="121"/>
-    <w:bookmarkEnd w:id="122"/>
+    <w:bookmarkEnd w:id="131"/>
+    <w:bookmarkEnd w:id="132"/>
+    <w:bookmarkEnd w:id="133"/>
     <w:sectPr>
       <w:footnotePr>
         <w:numRestart w:val="eachSect"/>

</xml_diff>

<commit_message>
Deploying to gh-pages from @ Morrison-Lab/pds@ec0679f05bef623762b04988930f4ef88545c314 🚀
</commit_message>
<xml_diff>
--- a/variance-covariance.docx
+++ b/variance-covariance.docx
@@ -15,7 +15,7 @@
         <w:pStyle w:val="Date"/>
       </w:pPr>
       <w:r>
-        <w:t xml:space="preserve">Last modified: 2026-10-26 23:43:51 (PDT)</w:t>
+        <w:t xml:space="preserve">Last modified: 2026-10-27 10:44:58 (PDT)</w:t>
       </w:r>
     </w:p>
     <w:bookmarkStart w:id="27" w:name="sec-deviation"/>
@@ -370,7 +370,11 @@
         </m:oMathParaPr>
         <m:oMath>
           <m:r>
-            <m:t>δ</m:t>
+            <m:rPr>
+              <m:scr m:val="double-struck"/>
+              <m:sty m:val="p"/>
+            </m:rPr>
+            <m:t>d</m:t>
           </m:r>
           <m:r>
             <m:rPr>
@@ -473,7 +477,11 @@
         </m:oMathParaPr>
         <m:oMath>
           <m:r>
-            <m:t>δ</m:t>
+            <m:rPr>
+              <m:scr m:val="double-struck"/>
+              <m:sty m:val="p"/>
+            </m:rPr>
+            <m:t>d</m:t>
           </m:r>
           <m:r>
             <m:rPr>
@@ -617,7 +625,11 @@
       </w:r>
       <m:oMath>
         <m:r>
-          <m:t>δ</m:t>
+          <m:rPr>
+            <m:scr m:val="double-struck"/>
+            <m:sty m:val="p"/>
+          </m:rPr>
+          <m:t>d</m:t>
         </m:r>
         <m:r>
           <m:rPr>
@@ -848,7 +860,11 @@
       </w:r>
       <m:oMath>
         <m:r>
-          <m:t>δ</m:t>
+          <m:rPr>
+            <m:scr m:val="double-struck"/>
+            <m:sty m:val="p"/>
+          </m:rPr>
+          <m:t>d</m:t>
         </m:r>
         <m:r>
           <m:rPr>
@@ -1131,7 +1147,11 @@
           <m:eqArr>
             <m:e>
               <m:r>
-                <m:t>δ</m:t>
+                <m:rPr>
+                  <m:scr m:val="double-struck"/>
+                  <m:sty m:val="p"/>
+                </m:rPr>
+                <m:t>d</m:t>
               </m:r>
               <m:r>
                 <m:rPr>
@@ -1237,7 +1257,11 @@
           <m:eqArr>
             <m:e>
               <m:r>
-                <m:t>δ</m:t>
+                <m:rPr>
+                  <m:scr m:val="double-struck"/>
+                  <m:sty m:val="p"/>
+                </m:rPr>
+                <m:t>d</m:t>
               </m:r>
               <m:r>
                 <m:rPr>
@@ -2945,7 +2969,11 @@
                 <m:t>[</m:t>
               </m:r>
               <m:r>
-                <m:t>δ</m:t>
+                <m:rPr>
+                  <m:scr m:val="double-struck"/>
+                  <m:sty m:val="p"/>
+                </m:rPr>
+                <m:t>d</m:t>
               </m:r>
               <m:r>
                 <m:rPr>
@@ -3144,7 +3172,11 @@
       </w:r>
       <m:oMath>
         <m:r>
-          <m:t>δ</m:t>
+          <m:rPr>
+            <m:scr m:val="double-struck"/>
+            <m:sty m:val="p"/>
+          </m:rPr>
+          <m:t>d</m:t>
         </m:r>
         <m:r>
           <m:rPr>
@@ -3278,7 +3310,11 @@
                 <m:t>[</m:t>
               </m:r>
               <m:r>
-                <m:t>δ</m:t>
+                <m:rPr>
+                  <m:scr m:val="double-struck"/>
+                  <m:sty m:val="p"/>
+                </m:rPr>
+                <m:t>d</m:t>
               </m:r>
               <m:r>
                 <m:rPr>
@@ -3443,7 +3479,11 @@
       </w:r>
       <m:oMath>
         <m:r>
-          <m:t>δ</m:t>
+          <m:rPr>
+            <m:scr m:val="double-struck"/>
+            <m:sty m:val="p"/>
+          </m:rPr>
+          <m:t>d</m:t>
         </m:r>
         <m:r>
           <m:rPr>
@@ -3849,7 +3889,11 @@
                     <m:t>[</m:t>
                   </m:r>
                   <m:r>
-                    <m:t>δ</m:t>
+                    <m:rPr>
+                      <m:scr m:val="double-struck"/>
+                      <m:sty m:val="p"/>
+                    </m:rPr>
+                    <m:t>d</m:t>
                   </m:r>
                   <m:r>
                     <m:rPr>

</xml_diff>

<commit_message>
Deploying to gh-pages from @ Morrison-Lab/pds@addfca4e7eabadfc9f35a7183d4f59f19a0e196e 🚀
</commit_message>
<xml_diff>
--- a/variance-covariance.docx
+++ b/variance-covariance.docx
@@ -15,10 +15,10 @@
         <w:pStyle w:val="Date"/>
       </w:pPr>
       <w:r>
-        <w:t xml:space="preserve">Last modified: 2026-10-27 10:52:35 (PDT)</w:t>
+        <w:t xml:space="preserve">Last modified: 2026-10-28 13:11:09 (PDT)</w:t>
       </w:r>
     </w:p>
-    <w:bookmarkStart w:id="27" w:name="sec-deviation"/>
+    <w:bookmarkStart w:id="28" w:name="sec-deviation"/>
     <w:p>
       <w:pPr>
         <w:pStyle w:val="Heading2"/>
@@ -1331,7 +1331,7 @@
       </m:oMathPara>
     </w:p>
     <w:bookmarkEnd w:id="20"/>
-    <w:bookmarkStart w:id="26" w:name="sec-noise-model"/>
+    <w:bookmarkStart w:id="27" w:name="sec-noise-model"/>
     <w:p>
       <w:pPr>
         <w:pStyle w:val="Heading3"/>
@@ -1961,7 +1961,7 @@
       </w:r>
     </w:p>
     <w:bookmarkEnd w:id="22"/>
-    <w:bookmarkStart w:id="24" w:name="sol-noise-second-moment"/>
+    <w:bookmarkStart w:id="25" w:name="sol-noise-second-moment"/>
     <w:p>
       <w:pPr>
         <w:pStyle w:val="BodyText"/>
@@ -2380,7 +2380,24 @@
         <w:t xml:space="preserve"> </w:t>
       </w:r>
       <w:r>
-        <w:t xml:space="preserve">is the step that produces the irreducible error term</w:t>
+        <w:t xml:space="preserve">is the step that produces the</w:t>
+      </w:r>
+      <w:r>
+        <w:t xml:space="preserve"> </w:t>
+      </w:r>
+      <w:hyperlink r:id="rId24">
+        <w:r>
+          <w:rPr>
+            <w:rStyle w:val="Hyperlink"/>
+          </w:rPr>
+          <w:t xml:space="preserve">residual variance</w:t>
+        </w:r>
+      </w:hyperlink>
+      <w:r>
+        <w:t xml:space="preserve"> </w:t>
+      </w:r>
+      <w:r>
+        <w:t xml:space="preserve">term</w:t>
       </w:r>
       <w:r>
         <w:t xml:space="preserve"> </w:t>
@@ -2436,8 +2453,8 @@
         <w:t xml:space="preserve">is what the fitting objective measures.</w:t>
       </w:r>
     </w:p>
-    <w:bookmarkEnd w:id="24"/>
-    <w:bookmarkStart w:id="25" w:name="thm-noise-second-moment"/>
+    <w:bookmarkEnd w:id="25"/>
+    <w:bookmarkStart w:id="26" w:name="thm-noise-second-moment"/>
     <w:p>
       <w:pPr>
         <w:pStyle w:val="BodyText"/>
@@ -2630,7 +2647,7 @@
         </m:oMath>
       </m:oMathPara>
     </w:p>
-    <w:bookmarkEnd w:id="25"/>
+    <w:bookmarkEnd w:id="26"/>
     <w:p>
       <w:pPr>
         <w:pStyle w:val="FirstParagraph"/>
@@ -2736,9 +2753,9 @@
         <w:t xml:space="preserve">.</w:t>
       </w:r>
     </w:p>
-    <w:bookmarkEnd w:id="26"/>
     <w:bookmarkEnd w:id="27"/>
-    <w:bookmarkStart w:id="62" w:name="variance-and-related-characteristics"/>
+    <w:bookmarkEnd w:id="28"/>
+    <w:bookmarkStart w:id="63" w:name="variance-and-related-characteristics"/>
     <w:p>
       <w:pPr>
         <w:pStyle w:val="Heading2"/>
@@ -2747,7 +2764,7 @@
         <w:t xml:space="preserve">2 Variance and related characteristics</w:t>
       </w:r>
     </w:p>
-    <w:bookmarkStart w:id="28" w:name="def-variance"/>
+    <w:bookmarkStart w:id="29" w:name="def-variance"/>
     <w:p>
       <w:pPr>
         <w:pStyle w:val="FirstParagraph"/>
@@ -3013,8 +3030,8 @@
         </m:oMath>
       </m:oMathPara>
     </w:p>
-    <w:bookmarkEnd w:id="28"/>
-    <w:bookmarkStart w:id="29" w:name="thm-variance-expanded"/>
+    <w:bookmarkEnd w:id="29"/>
+    <w:bookmarkStart w:id="30" w:name="thm-variance-expanded"/>
     <w:p>
       <w:pPr>
         <w:pStyle w:val="FirstParagraph"/>
@@ -3149,7 +3166,7 @@
         </m:oMath>
       </m:oMathPara>
     </w:p>
-    <w:bookmarkEnd w:id="29"/>
+    <w:bookmarkEnd w:id="30"/>
     <w:p>
       <w:pPr>
         <w:pStyle w:val="FirstParagraph"/>
@@ -3528,7 +3545,7 @@
         <w:t xml:space="preserve">.</w:t>
       </w:r>
     </w:p>
-    <w:bookmarkStart w:id="30" w:name="thm-variance"/>
+    <w:bookmarkStart w:id="31" w:name="thm-variance"/>
     <w:p>
       <w:pPr>
         <w:pStyle w:val="BodyText"/>
@@ -3676,7 +3693,7 @@
         </m:oMath>
       </m:oMathPara>
     </w:p>
-    <w:bookmarkEnd w:id="30"/>
+    <w:bookmarkEnd w:id="31"/>
     <w:p>
       <w:pPr>
         <w:pStyle w:val="FirstParagraph"/>
@@ -3777,7 +3794,7 @@
       <w:r>
         <w:t xml:space="preserve"> </w:t>
       </w:r>
-      <w:hyperlink r:id="rId31">
+      <w:hyperlink r:id="rId32">
         <w:r>
           <w:rPr>
             <w:rStyle w:val="Hyperlink"/>
@@ -4710,7 +4727,7 @@
         </m:oMath>
       </m:oMathPara>
     </w:p>
-    <w:bookmarkStart w:id="33" w:name="exm-variance-bernoulli"/>
+    <w:bookmarkStart w:id="34" w:name="exm-variance-bernoulli"/>
     <w:p>
       <w:pPr>
         <w:pStyle w:val="FirstParagraph"/>
@@ -4876,7 +4893,7 @@
       <w:r>
         <w:t xml:space="preserve"> </w:t>
       </w:r>
-      <w:hyperlink r:id="rId32">
+      <w:hyperlink r:id="rId33">
         <w:r>
           <w:rPr>
             <w:rStyle w:val="Hyperlink"/>
@@ -5288,7 +5305,7 @@
         <w:t xml:space="preserve">.</w:t>
       </w:r>
     </w:p>
-    <w:bookmarkEnd w:id="33"/>
+    <w:bookmarkEnd w:id="34"/>
     <w:tbl>
       <w:tblPr>
         <w:tblStyle w:val="Table"/>
@@ -5302,7 +5319,7 @@
       <w:tr>
         <w:tc>
           <w:tcPr/>
-          <w:bookmarkStart w:id="44" w:name="fig-bernoulli-variance"/>
+          <w:bookmarkStart w:id="45" w:name="fig-bernoulli-variance"/>
           <w:p>
             <w:pPr>
               <w:pStyle w:val="Heading4"/>
@@ -5762,18 +5779,18 @@
                 <wp:inline>
                   <wp:extent cx="5334000" cy="3111500"/>
                   <wp:effectExtent b="0" l="0" r="0" t="0"/>
-                  <wp:docPr descr="" title="" id="35" name="Picture"/>
+                  <wp:docPr descr="" title="" id="36" name="Picture"/>
                   <a:graphic>
                     <a:graphicData uri="http://schemas.openxmlformats.org/drawingml/2006/picture">
                       <pic:pic>
                         <pic:nvPicPr>
-                          <pic:cNvPr descr="variance-covariance_files/figure-docx/bernoulli-variance-py-1.png" id="36" name="Picture"/>
+                          <pic:cNvPr descr="variance-covariance_files/figure-docx/bernoulli-variance-py-1.png" id="37" name="Picture"/>
                           <pic:cNvPicPr>
                             <a:picLocks noChangeArrowheads="1" noChangeAspect="1"/>
                           </pic:cNvPicPr>
                         </pic:nvPicPr>
                         <pic:blipFill>
-                          <a:blip r:embed="rId34"/>
+                          <a:blip r:embed="rId35"/>
                           <a:stretch>
                             <a:fillRect/>
                           </a:stretch>
@@ -6436,18 +6453,18 @@
                 <wp:inline>
                   <wp:extent cx="5334000" cy="3111500"/>
                   <wp:effectExtent b="0" l="0" r="0" t="0"/>
-                  <wp:docPr descr="" title="" id="38" name="Picture"/>
+                  <wp:docPr descr="" title="" id="39" name="Picture"/>
                   <a:graphic>
                     <a:graphicData uri="http://schemas.openxmlformats.org/drawingml/2006/picture">
                       <pic:pic>
                         <pic:nvPicPr>
-                          <pic:cNvPr descr="variance-covariance_files/figure-docx/bernoulli-variance-r-1.png" id="39" name="Picture"/>
+                          <pic:cNvPr descr="variance-covariance_files/figure-docx/bernoulli-variance-r-1.png" id="40" name="Picture"/>
                           <pic:cNvPicPr>
                             <a:picLocks noChangeArrowheads="1" noChangeAspect="1"/>
                           </pic:cNvPicPr>
                         </pic:nvPicPr>
                         <pic:blipFill>
-                          <a:blip r:embed="rId37"/>
+                          <a:blip r:embed="rId38"/>
                           <a:stretch>
                             <a:fillRect/>
                           </a:stretch>
@@ -6538,7 +6555,7 @@
             <w:r>
               <w:t xml:space="preserve"> </w:t>
             </w:r>
-            <w:hyperlink r:id="rId40">
+            <w:hyperlink r:id="rId41">
               <w:r>
                 <w:rPr>
                   <w:rStyle w:val="Hyperlink"/>
@@ -6549,7 +6566,7 @@
             <w:r>
               <w:t xml:space="preserve"> </w:t>
             </w:r>
-            <w:hyperlink r:id="rId41">
+            <w:hyperlink r:id="rId42">
               <w:r>
                 <w:rPr>
                   <w:rStyle w:val="Hyperlink"/>
@@ -6569,7 +6586,7 @@
             <w:r>
               <w:t xml:space="preserve"> </w:t>
             </w:r>
-            <w:hyperlink r:id="rId42">
+            <w:hyperlink r:id="rId43">
               <w:r>
                 <w:rPr>
                   <w:rStyle w:val="Hyperlink"/>
@@ -6640,7 +6657,7 @@
             <w:r>
               <w:t xml:space="preserve"> </w:t>
             </w:r>
-            <w:hyperlink r:id="rId43">
+            <w:hyperlink r:id="rId44">
               <w:r>
                 <w:rPr>
                   <w:rStyle w:val="Hyperlink"/>
@@ -6713,11 +6730,11 @@
               <w:t xml:space="preserve">(dot), where the outcome is least predictable.</w:t>
             </w:r>
           </w:p>
-          <w:bookmarkEnd w:id="44"/>
+          <w:bookmarkEnd w:id="45"/>
         </w:tc>
       </w:tr>
     </w:tbl>
-    <w:bookmarkStart w:id="46" w:name="def-cond-variance"/>
+    <w:bookmarkStart w:id="47" w:name="def-cond-variance"/>
     <w:p>
       <w:pPr>
         <w:pStyle w:val="BodyText"/>
@@ -7102,7 +7119,7 @@
       <w:r>
         <w:t xml:space="preserve"> </w:t>
       </w:r>
-      <w:hyperlink r:id="rId45">
+      <w:hyperlink r:id="rId46">
         <w:r>
           <w:rPr>
             <w:rStyle w:val="Hyperlink"/>
@@ -7209,8 +7226,8 @@
         <w:t xml:space="preserve">.</w:t>
       </w:r>
     </w:p>
-    <w:bookmarkEnd w:id="46"/>
-    <w:bookmarkStart w:id="48" w:name="exm-cond-variance"/>
+    <w:bookmarkEnd w:id="47"/>
+    <w:bookmarkStart w:id="49" w:name="exm-cond-variance"/>
     <w:p>
       <w:pPr>
         <w:pStyle w:val="BodyText"/>
@@ -7533,7 +7550,7 @@
       <w:r>
         <w:t xml:space="preserve"> </w:t>
       </w:r>
-      <w:hyperlink r:id="rId47">
+      <w:hyperlink r:id="rId48">
         <w:r>
           <w:rPr>
             <w:rStyle w:val="Hyperlink"/>
@@ -8284,8 +8301,8 @@
         </m:oMath>
       </m:oMathPara>
     </w:p>
-    <w:bookmarkEnd w:id="48"/>
-    <w:bookmarkStart w:id="49" w:name="def-homosked"/>
+    <w:bookmarkEnd w:id="49"/>
+    <w:bookmarkStart w:id="50" w:name="def-homosked"/>
     <w:p>
       <w:pPr>
         <w:pStyle w:val="FirstParagraph"/>
@@ -8527,8 +8544,8 @@
         <w:t xml:space="preserve">.</w:t>
       </w:r>
     </w:p>
-    <w:bookmarkEnd w:id="49"/>
-    <w:bookmarkStart w:id="50" w:name="exm-homosked"/>
+    <w:bookmarkEnd w:id="50"/>
+    <w:bookmarkStart w:id="51" w:name="exm-homosked"/>
     <w:p>
       <w:pPr>
         <w:pStyle w:val="BodyText"/>
@@ -9077,8 +9094,8 @@
         <w:t xml:space="preserve">.</w:t>
       </w:r>
     </w:p>
-    <w:bookmarkEnd w:id="50"/>
-    <w:bookmarkStart w:id="51" w:name="def-heterosked"/>
+    <w:bookmarkEnd w:id="51"/>
+    <w:bookmarkStart w:id="52" w:name="def-heterosked"/>
     <w:p>
       <w:pPr>
         <w:pStyle w:val="BodyText"/>
@@ -9240,8 +9257,8 @@
         <w:t xml:space="preserve">.</w:t>
       </w:r>
     </w:p>
-    <w:bookmarkEnd w:id="51"/>
-    <w:bookmarkStart w:id="52" w:name="exm-heterosked"/>
+    <w:bookmarkEnd w:id="52"/>
+    <w:bookmarkStart w:id="53" w:name="exm-heterosked"/>
     <w:p>
       <w:pPr>
         <w:pStyle w:val="BodyText"/>
@@ -9687,8 +9704,8 @@
         <w:t xml:space="preserve">.</w:t>
       </w:r>
     </w:p>
-    <w:bookmarkEnd w:id="52"/>
-    <w:bookmarkStart w:id="53" w:name="thm-total-variance"/>
+    <w:bookmarkEnd w:id="53"/>
+    <w:bookmarkStart w:id="54" w:name="thm-total-variance"/>
     <w:p>
       <w:pPr>
         <w:pStyle w:val="BodyText"/>
@@ -9953,7 +9970,7 @@
         </m:oMath>
       </m:oMathPara>
     </w:p>
-    <w:bookmarkEnd w:id="53"/>
+    <w:bookmarkEnd w:id="54"/>
     <w:p>
       <w:pPr>
         <w:pStyle w:val="FirstParagraph"/>
@@ -10772,7 +10789,7 @@
       <w:r>
         <w:t xml:space="preserve"> </w:t>
       </w:r>
-      <w:hyperlink r:id="rId54">
+      <w:hyperlink r:id="rId55">
         <w:r>
           <w:rPr>
             <w:rStyle w:val="Hyperlink"/>
@@ -10817,7 +10834,7 @@
       <w:r>
         <w:t xml:space="preserve">(</w:t>
       </w:r>
-      <w:hyperlink r:id="rId55">
+      <w:hyperlink r:id="rId56">
         <w:r>
           <w:rPr>
             <w:rStyle w:val="Hyperlink"/>
@@ -10843,7 +10860,7 @@
       <w:r>
         <w:t xml:space="preserve"> </w:t>
       </w:r>
-      <w:hyperlink r:id="rId56">
+      <w:hyperlink r:id="rId57">
         <w:r>
           <w:rPr>
             <w:rStyle w:val="Hyperlink"/>
@@ -10897,7 +10914,7 @@
       <w:r>
         <w:t xml:space="preserve"> </w:t>
       </w:r>
-      <w:hyperlink r:id="rId57">
+      <w:hyperlink r:id="rId58">
         <w:r>
           <w:rPr>
             <w:rStyle w:val="Hyperlink"/>
@@ -13438,7 +13455,7 @@
         <w:t xml:space="preserve">.</w:t>
       </w:r>
     </w:p>
-    <w:bookmarkStart w:id="58" w:name="exm-total-variance"/>
+    <w:bookmarkStart w:id="59" w:name="exm-total-variance"/>
     <w:p>
       <w:pPr>
         <w:pStyle w:val="BodyText"/>
@@ -14410,8 +14427,8 @@
         </m:oMath>
       </m:oMathPara>
     </w:p>
-    <w:bookmarkEnd w:id="58"/>
-    <w:bookmarkStart w:id="59" w:name="def-precision"/>
+    <w:bookmarkEnd w:id="59"/>
+    <w:bookmarkStart w:id="60" w:name="def-precision"/>
     <w:p>
       <w:pPr>
         <w:pStyle w:val="FirstParagraph"/>
@@ -14684,8 +14701,8 @@
         </m:oMath>
       </m:oMathPara>
     </w:p>
-    <w:bookmarkEnd w:id="59"/>
-    <w:bookmarkStart w:id="60" w:name="def-sd"/>
+    <w:bookmarkEnd w:id="60"/>
+    <w:bookmarkStart w:id="61" w:name="def-sd"/>
     <w:p>
       <w:pPr>
         <w:pStyle w:val="FirstParagraph"/>
@@ -14851,7 +14868,7 @@
         </m:oMath>
       </m:oMathPara>
     </w:p>
-    <w:bookmarkEnd w:id="60"/>
+    <w:bookmarkEnd w:id="61"/>
     <w:p>
       <w:pPr>
         <w:pStyle w:val="FirstParagraph"/>
@@ -14907,7 +14924,7 @@
         <w:t xml:space="preserve">which is why it is often the preferred measure of spread when reporting results.</w:t>
       </w:r>
     </w:p>
-    <w:bookmarkStart w:id="61" w:name="exm-sd"/>
+    <w:bookmarkStart w:id="62" w:name="exm-sd"/>
     <w:p>
       <w:pPr>
         <w:pStyle w:val="BodyText"/>
@@ -15194,9 +15211,9 @@
         </m:oMath>
       </m:oMathPara>
     </w:p>
-    <w:bookmarkEnd w:id="61"/>
     <w:bookmarkEnd w:id="62"/>
-    <w:bookmarkStart w:id="69" w:name="sec-best-constant-prediction"/>
+    <w:bookmarkEnd w:id="63"/>
+    <w:bookmarkStart w:id="70" w:name="sec-best-constant-prediction"/>
     <w:p>
       <w:pPr>
         <w:pStyle w:val="Heading2"/>
@@ -15205,7 +15222,7 @@
         <w:t xml:space="preserve">3 The best constant prediction</w:t>
       </w:r>
     </w:p>
-    <w:bookmarkStart w:id="64" w:name="thm-constant-prediction-decompose"/>
+    <w:bookmarkStart w:id="65" w:name="thm-constant-prediction-decompose"/>
     <w:p>
       <w:pPr>
         <w:pStyle w:val="FirstParagraph"/>
@@ -15273,7 +15290,7 @@
       <w:pPr>
         <w:pStyle w:val="BodyText"/>
       </w:pPr>
-      <w:bookmarkStart w:id="63" w:name="eq-constant-prediction-decompose"/>
+      <w:bookmarkStart w:id="64" w:name="eq-constant-prediction-decompose"/>
       <m:oMathPara>
         <m:oMathParaPr>
           <m:jc m:val="center"/>
@@ -15439,9 +15456,9 @@
           </m:r>
         </m:oMath>
       </m:oMathPara>
-      <w:bookmarkEnd w:id="63"/>
+      <w:bookmarkEnd w:id="64"/>
     </w:p>
-    <w:bookmarkEnd w:id="64"/>
+    <w:bookmarkEnd w:id="65"/>
     <w:p>
       <w:pPr>
         <w:pStyle w:val="FirstParagraph"/>
@@ -16573,7 +16590,7 @@
         </m:oMath>
       </m:oMathPara>
     </w:p>
-    <w:bookmarkStart w:id="66" w:name="cor-best-constant"/>
+    <w:bookmarkStart w:id="67" w:name="cor-best-constant"/>
     <w:p>
       <w:pPr>
         <w:pStyle w:val="FirstParagraph"/>
@@ -16908,7 +16925,7 @@
       <w:r>
         <w:t xml:space="preserve"> </w:t>
       </w:r>
-      <w:hyperlink r:id="rId65">
+      <w:hyperlink r:id="rId66">
         <w:r>
           <w:rPr>
             <w:rStyle w:val="Hyperlink"/>
@@ -16920,7 +16937,7 @@
         <w:t xml:space="preserve">.</w:t>
       </w:r>
     </w:p>
-    <w:bookmarkEnd w:id="66"/>
+    <w:bookmarkEnd w:id="67"/>
     <w:p>
       <w:pPr>
         <w:pStyle w:val="BodyText"/>
@@ -17168,7 +17185,7 @@
         <w:t xml:space="preserve">.</w:t>
       </w:r>
     </w:p>
-    <w:bookmarkStart w:id="68" w:name="exm-best-constant-auto"/>
+    <w:bookmarkStart w:id="69" w:name="exm-best-constant-auto"/>
     <w:p>
       <w:pPr>
         <w:pStyle w:val="BodyText"/>
@@ -17189,7 +17206,7 @@
       <w:r>
         <w:t xml:space="preserve"> </w:t>
       </w:r>
-      <w:hyperlink r:id="rId67">
+      <w:hyperlink r:id="rId68">
         <w:r>
           <w:rPr>
             <w:rStyle w:val="Hyperlink"/>
@@ -17893,8 +17910,8 @@
         <w:t xml:space="preserve">.</w:t>
       </w:r>
     </w:p>
-    <w:bookmarkEnd w:id="68"/>
     <w:bookmarkEnd w:id="69"/>
+    <w:bookmarkEnd w:id="70"/>
     <w:bookmarkStart w:id="73" w:name="sec-bias-variance-prediction"/>
     <w:p>
       <w:pPr>
@@ -17904,7 +17921,7 @@
         <w:t xml:space="preserve">4 Independent noise plus a random variable</w:t>
       </w:r>
     </w:p>
-    <w:bookmarkStart w:id="70" w:name="thm-second-moment-noise-sum"/>
+    <w:bookmarkStart w:id="71" w:name="thm-second-moment-noise-sum"/>
     <w:p>
       <w:pPr>
         <w:pStyle w:val="FirstParagraph"/>
@@ -18307,7 +18324,7 @@
         </m:oMath>
       </m:oMathPara>
     </w:p>
-    <w:bookmarkEnd w:id="70"/>
+    <w:bookmarkEnd w:id="71"/>
     <w:p>
       <w:pPr>
         <w:pStyle w:val="FirstParagraph"/>
@@ -18328,7 +18345,7 @@
       <w:r>
         <w:t xml:space="preserve"> </w:t>
       </w:r>
-      <w:hyperlink r:id="rId31">
+      <w:hyperlink r:id="rId32">
         <w:r>
           <w:rPr>
             <w:rStyle w:val="Hyperlink"/>
@@ -20927,7 +20944,21 @@
         <w:t xml:space="preserve"> </w:t>
       </w:r>
       <w:r>
-        <w:t xml:space="preserve">is the irreducible error.</w:t>
+        <w:t xml:space="preserve">is the</w:t>
+      </w:r>
+      <w:r>
+        <w:t xml:space="preserve"> </w:t>
+      </w:r>
+      <w:hyperlink r:id="rId24">
+        <w:r>
+          <w:rPr>
+            <w:rStyle w:val="Hyperlink"/>
+          </w:rPr>
+          <w:t xml:space="preserve">residual variance</w:t>
+        </w:r>
+      </w:hyperlink>
+      <w:r>
+        <w:t xml:space="preserve">.</w:t>
       </w:r>
       <w:r>
         <w:t xml:space="preserve"> </w:t>
@@ -20944,7 +20975,7 @@
       <w:r>
         <w:t xml:space="preserve"> </w:t>
       </w:r>
-      <w:hyperlink r:id="rId71">
+      <w:hyperlink r:id="rId72">
         <w:r>
           <w:rPr>
             <w:rStyle w:val="Hyperlink"/>
@@ -20959,21 +20990,7 @@
         <w:t xml:space="preserve"> </w:t>
       </w:r>
       <w:r>
-        <w:t xml:space="preserve">with its exercise, worked example and</w:t>
-      </w:r>
-      <w:r>
-        <w:t xml:space="preserve"> </w:t>
-      </w:r>
-      <w:hyperlink r:id="rId72">
-        <w:r>
-          <w:rPr>
-            <w:rStyle w:val="Hyperlink"/>
-          </w:rPr>
-          <w:t xml:space="preserve">irreducible error</w:t>
-        </w:r>
-      </w:hyperlink>
-      <w:r>
-        <w:t xml:space="preserve">.</w:t>
+        <w:t xml:space="preserve">with its exercise, worked example and definition of the residual variance.</w:t>
       </w:r>
     </w:p>
     <w:bookmarkEnd w:id="73"/>
@@ -21685,7 +21702,7 @@
       <w:r>
         <w:t xml:space="preserve"> </w:t>
       </w:r>
-      <w:hyperlink r:id="rId31">
+      <w:hyperlink r:id="rId32">
         <w:r>
           <w:rPr>
             <w:rStyle w:val="Hyperlink"/>
@@ -33161,7 +33178,7 @@
       <w:r>
         <w:t xml:space="preserve"> </w:t>
       </w:r>
-      <w:hyperlink r:id="rId54">
+      <w:hyperlink r:id="rId55">
         <w:r>
           <w:rPr>
             <w:rStyle w:val="Hyperlink"/>
@@ -33192,7 +33209,7 @@
       <w:r>
         <w:t xml:space="preserve">(</w:t>
       </w:r>
-      <w:hyperlink r:id="rId56">
+      <w:hyperlink r:id="rId57">
         <w:r>
           <w:rPr>
             <w:rStyle w:val="Hyperlink"/>
@@ -33391,7 +33408,7 @@
       <w:r>
         <w:t xml:space="preserve"> </w:t>
       </w:r>
-      <w:hyperlink r:id="rId57">
+      <w:hyperlink r:id="rId58">
         <w:r>
           <w:rPr>
             <w:rStyle w:val="Hyperlink"/>

</xml_diff>

<commit_message>
Deploying to gh-pages from @ Morrison-Lab/pds@853b2af51b3086e91ea5e368a24efba61c471c5b 🚀
</commit_message>
<xml_diff>
--- a/variance-covariance.docx
+++ b/variance-covariance.docx
@@ -15,7 +15,7 @@
         <w:pStyle w:val="Date"/>
       </w:pPr>
       <w:r>
-        <w:t xml:space="preserve">Last modified: 2026-10-29 14:22:58 (PDT)</w:t>
+        <w:t xml:space="preserve">Last modified: 2026-10-29 14:37:42 (PDT)</w:t>
       </w:r>
     </w:p>
     <w:bookmarkStart w:id="28" w:name="sec-deviation"/>
@@ -2755,7 +2755,7 @@
     </w:p>
     <w:bookmarkEnd w:id="27"/>
     <w:bookmarkEnd w:id="28"/>
-    <w:bookmarkStart w:id="63" w:name="variance-and-related-characteristics"/>
+    <w:bookmarkStart w:id="65" w:name="variance-and-related-characteristics"/>
     <w:p>
       <w:pPr>
         <w:pStyle w:val="Heading2"/>
@@ -15212,17 +15212,7 @@
       </m:oMathPara>
     </w:p>
     <w:bookmarkEnd w:id="62"/>
-    <w:bookmarkEnd w:id="63"/>
-    <w:bookmarkStart w:id="70" w:name="sec-best-constant-prediction"/>
-    <w:p>
-      <w:pPr>
-        <w:pStyle w:val="Heading2"/>
-      </w:pPr>
-      <w:r>
-        <w:t xml:space="preserve">3 The best constant prediction</w:t>
-      </w:r>
-    </w:p>
-    <w:bookmarkStart w:id="65" w:name="thm-constant-prediction-decompose"/>
+    <w:bookmarkStart w:id="63" w:name="lem-second-moment-variance"/>
     <w:p>
       <w:pPr>
         <w:pStyle w:val="FirstParagraph"/>
@@ -15232,65 +15222,99 @@
           <w:b/>
           <w:bCs/>
         </w:rPr>
-        <w:t xml:space="preserve">Theorem 5 (Expected squared error of a constant prediction)</w:t>
-      </w:r>
-      <w:r>
-        <w:t xml:space="preserve"> </w:t>
-      </w:r>
-      <w:r>
-        <w:t xml:space="preserve">Let</w:t>
-      </w:r>
+        <w:t xml:space="preserve">Lemma 1 (The second moment is the variance plus the squared mean)</w:t>
+      </w:r>
+      <w:r>
+        <w:t xml:space="preserve"> </w:t>
+      </w:r>
+      <w:r>
+        <w:t xml:space="preserve">For any</w:t>
+      </w:r>
+      <w:r>
+        <w:t xml:space="preserve"> </w:t>
+      </w:r>
+      <w:hyperlink r:id="rId42">
+        <w:r>
+          <w:rPr>
+            <w:rStyle w:val="Hyperlink"/>
+          </w:rPr>
+          <w:t xml:space="preserve">random variable</w:t>
+        </w:r>
+      </w:hyperlink>
       <w:r>
         <w:t xml:space="preserve"> </w:t>
       </w:r>
       <m:oMath>
         <m:r>
-          <m:t>Y</m:t>
+          <m:t>Z</m:t>
         </m:r>
       </m:oMath>
       <w:r>
         <w:t xml:space="preserve"> </w:t>
       </w:r>
       <w:r>
-        <w:t xml:space="preserve">be a random variable with mean</w:t>
+        <w:t xml:space="preserve">with</w:t>
       </w:r>
       <w:r>
         <w:t xml:space="preserve"> </w:t>
       </w:r>
       <m:oMath>
         <m:r>
-          <m:t>μ</m:t>
+          <m:rPr>
+            <m:scr m:val="double-struck"/>
+            <m:sty m:val="p"/>
+          </m:rPr>
+          <m:t>E</m:t>
+        </m:r>
+        <m:r>
+          <m:t>​</m:t>
+        </m:r>
+        <m:d>
+          <m:dPr>
+            <m:begChr m:val="["/>
+            <m:sepChr m:val=""/>
+            <m:endChr m:val="]"/>
+            <m:grow/>
+          </m:dPr>
+          <m:e>
+            <m:sSup>
+              <m:e>
+                <m:r>
+                  <m:t>Z</m:t>
+                </m:r>
+              </m:e>
+              <m:sup>
+                <m:r>
+                  <m:t>2</m:t>
+                </m:r>
+              </m:sup>
+            </m:sSup>
+          </m:e>
+        </m:d>
+        <m:r>
+          <m:t>​</m:t>
+        </m:r>
+        <m:r>
+          <m:rPr>
+            <m:sty m:val="p"/>
+          </m:rPr>
+          <m:t>&lt;</m:t>
+        </m:r>
+        <m:r>
+          <m:rPr>
+            <m:sty m:val="p"/>
+          </m:rPr>
+          <m:t>∞</m:t>
         </m:r>
       </m:oMath>
       <w:r>
-        <w:t xml:space="preserve"> </w:t>
-      </w:r>
-      <w:r>
-        <w:t xml:space="preserve">and finite variance.</w:t>
-      </w:r>
-      <w:r>
-        <w:t xml:space="preserve"> </w:t>
-      </w:r>
-      <w:r>
-        <w:t xml:space="preserve">Then for every number</w:t>
-      </w:r>
-      <w:r>
-        <w:t xml:space="preserve"> </w:t>
-      </w:r>
-      <m:oMath>
-        <m:r>
-          <m:t>c</m:t>
-        </m:r>
-      </m:oMath>
-      <w:r>
-        <w:t xml:space="preserve">,</w:t>
+        <w:t xml:space="preserve">:</w:t>
       </w:r>
     </w:p>
     <w:p>
       <w:pPr>
         <w:pStyle w:val="BodyText"/>
       </w:pPr>
-      <w:bookmarkStart w:id="64" w:name="eq-constant-prediction-decompose"/>
       <m:oMathPara>
         <m:oMathParaPr>
           <m:jc m:val="center"/>
@@ -15317,32 +15341,7 @@
               <m:sSup>
                 <m:e>
                   <m:r>
-                    <m:t>​</m:t>
-                  </m:r>
-                  <m:d>
-                    <m:dPr>
-                      <m:begChr m:val="("/>
-                      <m:sepChr m:val=""/>
-                      <m:endChr m:val=")"/>
-                      <m:grow/>
-                    </m:dPr>
-                    <m:e>
-                      <m:r>
-                        <m:t>Y</m:t>
-                      </m:r>
-                      <m:r>
-                        <m:rPr>
-                          <m:sty m:val="p"/>
-                        </m:rPr>
-                        <m:t>−</m:t>
-                      </m:r>
-                      <m:r>
-                        <m:t>c</m:t>
-                      </m:r>
-                    </m:e>
-                  </m:d>
-                  <m:r>
-                    <m:t>​</m:t>
+                    <m:t>Z</m:t>
                   </m:r>
                 </m:e>
                 <m:sup>
@@ -15380,6 +15379,995 @@
             </m:dPr>
             <m:e>
               <m:r>
+                <m:t>Z</m:t>
+              </m:r>
+            </m:e>
+          </m:d>
+          <m:r>
+            <m:t>​</m:t>
+          </m:r>
+          <m:r>
+            <m:rPr>
+              <m:sty m:val="p"/>
+            </m:rPr>
+            <m:t>+</m:t>
+          </m:r>
+          <m:sSup>
+            <m:e>
+              <m:r>
+                <m:t>​</m:t>
+              </m:r>
+              <m:d>
+                <m:dPr>
+                  <m:begChr m:val="("/>
+                  <m:sepChr m:val=""/>
+                  <m:endChr m:val=")"/>
+                  <m:grow/>
+                </m:dPr>
+                <m:e>
+                  <m:r>
+                    <m:rPr>
+                      <m:scr m:val="double-struck"/>
+                      <m:sty m:val="p"/>
+                    </m:rPr>
+                    <m:t>E</m:t>
+                  </m:r>
+                  <m:r>
+                    <m:t>​</m:t>
+                  </m:r>
+                  <m:d>
+                    <m:dPr>
+                      <m:begChr m:val="["/>
+                      <m:sepChr m:val=""/>
+                      <m:endChr m:val="]"/>
+                      <m:grow/>
+                    </m:dPr>
+                    <m:e>
+                      <m:r>
+                        <m:t>Z</m:t>
+                      </m:r>
+                    </m:e>
+                  </m:d>
+                  <m:r>
+                    <m:t>​</m:t>
+                  </m:r>
+                </m:e>
+              </m:d>
+              <m:r>
+                <m:t>​</m:t>
+              </m:r>
+            </m:e>
+            <m:sup>
+              <m:r>
+                <m:t>2</m:t>
+              </m:r>
+            </m:sup>
+          </m:sSup>
+        </m:oMath>
+      </m:oMathPara>
+    </w:p>
+    <w:bookmarkEnd w:id="63"/>
+    <w:p>
+      <w:pPr>
+        <w:pStyle w:val="FirstParagraph"/>
+      </w:pPr>
+      <w:r>
+        <w:rPr>
+          <w:i/>
+          <w:iCs/>
+        </w:rPr>
+        <w:t xml:space="preserve">Proof</w:t>
+      </w:r>
+      <w:r>
+        <w:t xml:space="preserve">. </w:t>
+      </w:r>
+      <w:r>
+        <w:t xml:space="preserve">Add</w:t>
+      </w:r>
+      <w:r>
+        <w:t xml:space="preserve"> </w:t>
+      </w:r>
+      <m:oMath>
+        <m:sSup>
+          <m:e>
+            <m:r>
+              <m:t>​</m:t>
+            </m:r>
+            <m:d>
+              <m:dPr>
+                <m:begChr m:val="("/>
+                <m:sepChr m:val=""/>
+                <m:endChr m:val=")"/>
+                <m:grow/>
+              </m:dPr>
+              <m:e>
+                <m:r>
+                  <m:rPr>
+                    <m:scr m:val="double-struck"/>
+                    <m:sty m:val="p"/>
+                  </m:rPr>
+                  <m:t>E</m:t>
+                </m:r>
+                <m:r>
+                  <m:t>​</m:t>
+                </m:r>
+                <m:d>
+                  <m:dPr>
+                    <m:begChr m:val="["/>
+                    <m:sepChr m:val=""/>
+                    <m:endChr m:val="]"/>
+                    <m:grow/>
+                  </m:dPr>
+                  <m:e>
+                    <m:r>
+                      <m:t>Z</m:t>
+                    </m:r>
+                  </m:e>
+                </m:d>
+                <m:r>
+                  <m:t>​</m:t>
+                </m:r>
+              </m:e>
+            </m:d>
+            <m:r>
+              <m:t>​</m:t>
+            </m:r>
+          </m:e>
+          <m:sup>
+            <m:r>
+              <m:t>2</m:t>
+            </m:r>
+          </m:sup>
+        </m:sSup>
+      </m:oMath>
+      <w:r>
+        <w:t xml:space="preserve"> </w:t>
+      </w:r>
+      <w:r>
+        <w:t xml:space="preserve">to both sides of the</w:t>
+      </w:r>
+      <w:r>
+        <w:t xml:space="preserve"> </w:t>
+      </w:r>
+      <w:hyperlink w:anchor="thm-variance">
+        <w:r>
+          <w:rPr>
+            <w:rStyle w:val="Hyperlink"/>
+          </w:rPr>
+          <w:t xml:space="preserve">simplified expression for variance</w:t>
+        </w:r>
+      </w:hyperlink>
+      <w:r>
+        <w:t xml:space="preserve">,</w:t>
+      </w:r>
+      <w:r>
+        <w:t xml:space="preserve"> </w:t>
+      </w:r>
+      <m:oMath>
+        <m:r>
+          <m:rPr>
+            <m:sty m:val="p"/>
+          </m:rPr>
+          <m:t>Var</m:t>
+        </m:r>
+        <m:r>
+          <m:t>​</m:t>
+        </m:r>
+        <m:d>
+          <m:dPr>
+            <m:begChr m:val="("/>
+            <m:sepChr m:val=""/>
+            <m:endChr m:val=")"/>
+            <m:grow/>
+          </m:dPr>
+          <m:e>
+            <m:r>
+              <m:t>Z</m:t>
+            </m:r>
+          </m:e>
+        </m:d>
+        <m:r>
+          <m:t>​</m:t>
+        </m:r>
+        <m:r>
+          <m:rPr>
+            <m:sty m:val="p"/>
+          </m:rPr>
+          <m:t>=</m:t>
+        </m:r>
+        <m:r>
+          <m:rPr>
+            <m:scr m:val="double-struck"/>
+            <m:sty m:val="p"/>
+          </m:rPr>
+          <m:t>E</m:t>
+        </m:r>
+        <m:r>
+          <m:t>​</m:t>
+        </m:r>
+        <m:d>
+          <m:dPr>
+            <m:begChr m:val="["/>
+            <m:sepChr m:val=""/>
+            <m:endChr m:val="]"/>
+            <m:grow/>
+          </m:dPr>
+          <m:e>
+            <m:sSup>
+              <m:e>
+                <m:r>
+                  <m:t>Z</m:t>
+                </m:r>
+              </m:e>
+              <m:sup>
+                <m:r>
+                  <m:t>2</m:t>
+                </m:r>
+              </m:sup>
+            </m:sSup>
+          </m:e>
+        </m:d>
+        <m:r>
+          <m:t>​</m:t>
+        </m:r>
+        <m:r>
+          <m:rPr>
+            <m:sty m:val="p"/>
+          </m:rPr>
+          <m:t>−</m:t>
+        </m:r>
+        <m:sSup>
+          <m:e>
+            <m:r>
+              <m:t>​</m:t>
+            </m:r>
+            <m:d>
+              <m:dPr>
+                <m:begChr m:val="("/>
+                <m:sepChr m:val=""/>
+                <m:endChr m:val=")"/>
+                <m:grow/>
+              </m:dPr>
+              <m:e>
+                <m:r>
+                  <m:rPr>
+                    <m:scr m:val="double-struck"/>
+                    <m:sty m:val="p"/>
+                  </m:rPr>
+                  <m:t>E</m:t>
+                </m:r>
+                <m:r>
+                  <m:t>​</m:t>
+                </m:r>
+                <m:d>
+                  <m:dPr>
+                    <m:begChr m:val="["/>
+                    <m:sepChr m:val=""/>
+                    <m:endChr m:val="]"/>
+                    <m:grow/>
+                  </m:dPr>
+                  <m:e>
+                    <m:r>
+                      <m:t>Z</m:t>
+                    </m:r>
+                  </m:e>
+                </m:d>
+                <m:r>
+                  <m:t>​</m:t>
+                </m:r>
+              </m:e>
+            </m:d>
+            <m:r>
+              <m:t>​</m:t>
+            </m:r>
+          </m:e>
+          <m:sup>
+            <m:r>
+              <m:t>2</m:t>
+            </m:r>
+          </m:sup>
+        </m:sSup>
+      </m:oMath>
+      <w:r>
+        <w:t xml:space="preserve">.</w:t>
+      </w:r>
+    </w:p>
+    <w:bookmarkStart w:id="64" w:name="exm-second-moment-bernoulli"/>
+    <w:p>
+      <w:pPr>
+        <w:pStyle w:val="BodyText"/>
+      </w:pPr>
+      <w:r>
+        <w:rPr>
+          <w:b/>
+          <w:bCs/>
+        </w:rPr>
+        <w:t xml:space="preserve">Example 9 (The second moment of a Bernoulli random variable)</w:t>
+      </w:r>
+      <w:r>
+        <w:t xml:space="preserve"> </w:t>
+      </w:r>
+      <w:r>
+        <w:t xml:space="preserve">Let</w:t>
+      </w:r>
+      <w:r>
+        <w:t xml:space="preserve"> </w:t>
+      </w:r>
+      <m:oMath>
+        <m:r>
+          <m:t>Z</m:t>
+        </m:r>
+      </m:oMath>
+      <w:r>
+        <w:t xml:space="preserve"> </w:t>
+      </w:r>
+      <w:r>
+        <w:t xml:space="preserve">be a</w:t>
+      </w:r>
+      <w:r>
+        <w:t xml:space="preserve"> </w:t>
+      </w:r>
+      <w:hyperlink r:id="rId41">
+        <w:r>
+          <w:rPr>
+            <w:rStyle w:val="Hyperlink"/>
+          </w:rPr>
+          <w:t xml:space="preserve">Bernoulli</w:t>
+        </w:r>
+      </w:hyperlink>
+      <w:r>
+        <w:t xml:space="preserve"> </w:t>
+      </w:r>
+      <w:hyperlink r:id="rId42">
+        <w:r>
+          <w:rPr>
+            <w:rStyle w:val="Hyperlink"/>
+          </w:rPr>
+          <w:t xml:space="preserve">random variable</w:t>
+        </w:r>
+      </w:hyperlink>
+      <w:r>
+        <w:t xml:space="preserve"> </w:t>
+      </w:r>
+      <w:r>
+        <w:t xml:space="preserve">with success</w:t>
+      </w:r>
+      <w:r>
+        <w:t xml:space="preserve"> </w:t>
+      </w:r>
+      <w:hyperlink r:id="rId43">
+        <w:r>
+          <w:rPr>
+            <w:rStyle w:val="Hyperlink"/>
+          </w:rPr>
+          <w:t xml:space="preserve">probability</w:t>
+        </w:r>
+      </w:hyperlink>
+      <w:r>
+        <w:t xml:space="preserve"> </w:t>
+      </w:r>
+      <m:oMath>
+        <m:r>
+          <m:t>π</m:t>
+        </m:r>
+      </m:oMath>
+      <w:r>
+        <w:t xml:space="preserve">, so</w:t>
+      </w:r>
+      <w:r>
+        <w:t xml:space="preserve"> </w:t>
+      </w:r>
+      <m:oMath>
+        <m:r>
+          <m:t>Z</m:t>
+        </m:r>
+        <m:r>
+          <m:rPr>
+            <m:sty m:val="p"/>
+          </m:rPr>
+          <m:t>∼</m:t>
+        </m:r>
+        <m:r>
+          <m:rPr>
+            <m:sty m:val="p"/>
+          </m:rPr>
+          <m:t>Ber</m:t>
+        </m:r>
+        <m:r>
+          <m:rPr>
+            <m:sty m:val="p"/>
+          </m:rPr>
+          <m:t>(</m:t>
+        </m:r>
+        <m:r>
+          <m:t>π</m:t>
+        </m:r>
+        <m:r>
+          <m:rPr>
+            <m:sty m:val="p"/>
+          </m:rPr>
+          <m:t>)</m:t>
+        </m:r>
+      </m:oMath>
+      <w:r>
+        <w:t xml:space="preserve">.</w:t>
+      </w:r>
+      <w:r>
+        <w:t xml:space="preserve"> </w:t>
+      </w:r>
+      <w:r>
+        <w:t xml:space="preserve">Then</w:t>
+      </w:r>
+      <w:r>
+        <w:t xml:space="preserve"> </w:t>
+      </w:r>
+      <m:oMath>
+        <m:r>
+          <m:rPr>
+            <m:scr m:val="double-struck"/>
+            <m:sty m:val="p"/>
+          </m:rPr>
+          <m:t>E</m:t>
+        </m:r>
+        <m:r>
+          <m:t>​</m:t>
+        </m:r>
+        <m:d>
+          <m:dPr>
+            <m:begChr m:val="["/>
+            <m:sepChr m:val=""/>
+            <m:endChr m:val="]"/>
+            <m:grow/>
+          </m:dPr>
+          <m:e>
+            <m:sSup>
+              <m:e>
+                <m:r>
+                  <m:t>Z</m:t>
+                </m:r>
+              </m:e>
+              <m:sup>
+                <m:r>
+                  <m:t>2</m:t>
+                </m:r>
+              </m:sup>
+            </m:sSup>
+          </m:e>
+        </m:d>
+        <m:r>
+          <m:t>​</m:t>
+        </m:r>
+        <m:r>
+          <m:rPr>
+            <m:sty m:val="p"/>
+          </m:rPr>
+          <m:t>=</m:t>
+        </m:r>
+        <m:r>
+          <m:t>π</m:t>
+        </m:r>
+      </m:oMath>
+      <w:r>
+        <w:t xml:space="preserve"> </w:t>
+      </w:r>
+      <w:r>
+        <w:t xml:space="preserve">directly,</w:t>
+      </w:r>
+      <w:r>
+        <w:t xml:space="preserve"> </w:t>
+      </w:r>
+      <w:r>
+        <w:t xml:space="preserve">because</w:t>
+      </w:r>
+      <w:r>
+        <w:t xml:space="preserve"> </w:t>
+      </w:r>
+      <m:oMath>
+        <m:sSup>
+          <m:e>
+            <m:r>
+              <m:t>Z</m:t>
+            </m:r>
+          </m:e>
+          <m:sup>
+            <m:r>
+              <m:t>2</m:t>
+            </m:r>
+          </m:sup>
+        </m:sSup>
+        <m:r>
+          <m:rPr>
+            <m:sty m:val="p"/>
+          </m:rPr>
+          <m:t>=</m:t>
+        </m:r>
+        <m:r>
+          <m:t>Z</m:t>
+        </m:r>
+      </m:oMath>
+      <w:r>
+        <w:t xml:space="preserve"> </w:t>
+      </w:r>
+      <w:r>
+        <w:t xml:space="preserve">when</w:t>
+      </w:r>
+      <w:r>
+        <w:t xml:space="preserve"> </w:t>
+      </w:r>
+      <m:oMath>
+        <m:r>
+          <m:t>Z</m:t>
+        </m:r>
+      </m:oMath>
+      <w:r>
+        <w:t xml:space="preserve"> </w:t>
+      </w:r>
+      <w:r>
+        <w:t xml:space="preserve">is</w:t>
+      </w:r>
+      <w:r>
+        <w:t xml:space="preserve"> </w:t>
+      </w:r>
+      <m:oMath>
+        <m:r>
+          <m:t>0</m:t>
+        </m:r>
+      </m:oMath>
+      <w:r>
+        <w:t xml:space="preserve"> </w:t>
+      </w:r>
+      <w:r>
+        <w:t xml:space="preserve">or</w:t>
+      </w:r>
+      <w:r>
+        <w:t xml:space="preserve"> </w:t>
+      </w:r>
+      <m:oMath>
+        <m:r>
+          <m:t>1</m:t>
+        </m:r>
+      </m:oMath>
+      <w:r>
+        <w:t xml:space="preserve">.</w:t>
+      </w:r>
+      <w:r>
+        <w:t xml:space="preserve"> </w:t>
+      </w:r>
+      <w:r>
+        <w:t xml:space="preserve">The</w:t>
+      </w:r>
+      <w:r>
+        <w:t xml:space="preserve"> </w:t>
+      </w:r>
+      <w:hyperlink w:anchor="lem-second-moment-variance">
+        <w:r>
+          <w:rPr>
+            <w:rStyle w:val="Hyperlink"/>
+          </w:rPr>
+          <w:t xml:space="preserve">lemma</w:t>
+        </w:r>
+      </w:hyperlink>
+      <w:r>
+        <w:t xml:space="preserve"> </w:t>
+      </w:r>
+      <w:r>
+        <w:t xml:space="preserve">gives the same value</w:t>
+      </w:r>
+      <w:r>
+        <w:t xml:space="preserve"> </w:t>
+      </w:r>
+      <w:r>
+        <w:t xml:space="preserve">from the</w:t>
+      </w:r>
+      <w:r>
+        <w:t xml:space="preserve"> </w:t>
+      </w:r>
+      <w:hyperlink r:id="rId11">
+        <w:r>
+          <w:rPr>
+            <w:rStyle w:val="Hyperlink"/>
+          </w:rPr>
+          <w:t xml:space="preserve">mean</w:t>
+        </w:r>
+      </w:hyperlink>
+      <w:r>
+        <w:t xml:space="preserve"> </w:t>
+      </w:r>
+      <w:r>
+        <w:t xml:space="preserve">and the</w:t>
+      </w:r>
+      <w:r>
+        <w:t xml:space="preserve"> </w:t>
+      </w:r>
+      <w:hyperlink w:anchor="def-variance">
+        <w:r>
+          <w:rPr>
+            <w:rStyle w:val="Hyperlink"/>
+          </w:rPr>
+          <w:t xml:space="preserve">variance</w:t>
+        </w:r>
+      </w:hyperlink>
+      <w:r>
+        <w:t xml:space="preserve">:</w:t>
+      </w:r>
+    </w:p>
+    <w:p>
+      <w:pPr>
+        <w:pStyle w:val="BodyText"/>
+      </w:pPr>
+      <m:oMathPara>
+        <m:oMathParaPr>
+          <m:jc m:val="center"/>
+        </m:oMathParaPr>
+        <m:oMath>
+          <m:eqArr>
+            <m:e>
+              <m:r>
+                <m:rPr>
+                  <m:sty m:val="p"/>
+                </m:rPr>
+                <m:t>Var</m:t>
+              </m:r>
+              <m:r>
+                <m:t>​</m:t>
+              </m:r>
+              <m:d>
+                <m:dPr>
+                  <m:begChr m:val="("/>
+                  <m:sepChr m:val=""/>
+                  <m:endChr m:val=")"/>
+                  <m:grow/>
+                </m:dPr>
+                <m:e>
+                  <m:r>
+                    <m:t>Z</m:t>
+                  </m:r>
+                </m:e>
+              </m:d>
+              <m:r>
+                <m:t>​</m:t>
+              </m:r>
+              <m:r>
+                <m:rPr>
+                  <m:sty m:val="p"/>
+                </m:rPr>
+                <m:t>+</m:t>
+              </m:r>
+              <m:sSup>
+                <m:e>
+                  <m:r>
+                    <m:t>​</m:t>
+                  </m:r>
+                  <m:d>
+                    <m:dPr>
+                      <m:begChr m:val="("/>
+                      <m:sepChr m:val=""/>
+                      <m:endChr m:val=")"/>
+                      <m:grow/>
+                    </m:dPr>
+                    <m:e>
+                      <m:r>
+                        <m:rPr>
+                          <m:scr m:val="double-struck"/>
+                          <m:sty m:val="p"/>
+                        </m:rPr>
+                        <m:t>E</m:t>
+                      </m:r>
+                      <m:r>
+                        <m:t>​</m:t>
+                      </m:r>
+                      <m:d>
+                        <m:dPr>
+                          <m:begChr m:val="["/>
+                          <m:sepChr m:val=""/>
+                          <m:endChr m:val="]"/>
+                          <m:grow/>
+                        </m:dPr>
+                        <m:e>
+                          <m:r>
+                            <m:t>Z</m:t>
+                          </m:r>
+                        </m:e>
+                      </m:d>
+                      <m:r>
+                        <m:t>​</m:t>
+                      </m:r>
+                    </m:e>
+                  </m:d>
+                  <m:r>
+                    <m:t>​</m:t>
+                  </m:r>
+                </m:e>
+                <m:sup>
+                  <m:r>
+                    <m:t>2</m:t>
+                  </m:r>
+                </m:sup>
+              </m:sSup>
+              <m:r>
+                <m:t>&amp;</m:t>
+              </m:r>
+              <m:r>
+                <m:rPr>
+                  <m:sty m:val="p"/>
+                </m:rPr>
+                <m:t>=</m:t>
+              </m:r>
+              <m:r>
+                <m:t>π</m:t>
+              </m:r>
+              <m:r>
+                <m:rPr>
+                  <m:sty m:val="p"/>
+                </m:rPr>
+                <m:t>(</m:t>
+              </m:r>
+              <m:r>
+                <m:t>1</m:t>
+              </m:r>
+              <m:r>
+                <m:rPr>
+                  <m:sty m:val="p"/>
+                </m:rPr>
+                <m:t>−</m:t>
+              </m:r>
+              <m:r>
+                <m:t>π</m:t>
+              </m:r>
+              <m:r>
+                <m:rPr>
+                  <m:sty m:val="p"/>
+                </m:rPr>
+                <m:t>)</m:t>
+              </m:r>
+              <m:r>
+                <m:rPr>
+                  <m:sty m:val="p"/>
+                </m:rPr>
+                <m:t>+</m:t>
+              </m:r>
+              <m:sSup>
+                <m:e>
+                  <m:r>
+                    <m:t>​</m:t>
+                  </m:r>
+                  <m:d>
+                    <m:dPr>
+                      <m:begChr m:val="("/>
+                      <m:sepChr m:val=""/>
+                      <m:endChr m:val=")"/>
+                      <m:grow/>
+                    </m:dPr>
+                    <m:e>
+                      <m:r>
+                        <m:t>π</m:t>
+                      </m:r>
+                    </m:e>
+                  </m:d>
+                  <m:r>
+                    <m:t>​</m:t>
+                  </m:r>
+                </m:e>
+                <m:sup>
+                  <m:r>
+                    <m:t>2</m:t>
+                  </m:r>
+                </m:sup>
+              </m:sSup>
+              <m:r>
+                <m:t>&amp;</m:t>
+              </m:r>
+              <m:r>
+                <m:t>&amp;</m:t>
+              </m:r>
+              <m:r>
+                <m:rPr>
+                  <m:nor/>
+                  <m:sty m:val="p"/>
+                </m:rPr>
+                <m:t>(Bernoulli variance and mean)</m:t>
+              </m:r>
+            </m:e>
+            <m:e>
+              <m:r>
+                <m:t>&amp;</m:t>
+              </m:r>
+              <m:r>
+                <m:rPr>
+                  <m:sty m:val="p"/>
+                </m:rPr>
+                <m:t>=</m:t>
+              </m:r>
+              <m:r>
+                <m:t>π</m:t>
+              </m:r>
+              <m:r>
+                <m:t>&amp;</m:t>
+              </m:r>
+              <m:r>
+                <m:t>&amp;</m:t>
+              </m:r>
+              <m:r>
+                <m:rPr>
+                  <m:nor/>
+                  <m:sty m:val="p"/>
+                </m:rPr>
+                <m:t>(expand and combine like terms)</m:t>
+              </m:r>
+            </m:e>
+          </m:eqArr>
+        </m:oMath>
+      </m:oMathPara>
+    </w:p>
+    <w:bookmarkEnd w:id="64"/>
+    <w:bookmarkEnd w:id="65"/>
+    <w:bookmarkStart w:id="72" w:name="sec-best-constant-prediction"/>
+    <w:p>
+      <w:pPr>
+        <w:pStyle w:val="Heading2"/>
+      </w:pPr>
+      <w:r>
+        <w:t xml:space="preserve">3 The best constant prediction</w:t>
+      </w:r>
+    </w:p>
+    <w:bookmarkStart w:id="67" w:name="thm-constant-prediction-decompose"/>
+    <w:p>
+      <w:pPr>
+        <w:pStyle w:val="FirstParagraph"/>
+      </w:pPr>
+      <w:r>
+        <w:rPr>
+          <w:b/>
+          <w:bCs/>
+        </w:rPr>
+        <w:t xml:space="preserve">Theorem 5 (Expected squared error of a constant prediction)</w:t>
+      </w:r>
+      <w:r>
+        <w:t xml:space="preserve"> </w:t>
+      </w:r>
+      <w:r>
+        <w:t xml:space="preserve">Let</w:t>
+      </w:r>
+      <w:r>
+        <w:t xml:space="preserve"> </w:t>
+      </w:r>
+      <m:oMath>
+        <m:r>
+          <m:t>Y</m:t>
+        </m:r>
+      </m:oMath>
+      <w:r>
+        <w:t xml:space="preserve"> </w:t>
+      </w:r>
+      <w:r>
+        <w:t xml:space="preserve">be a random variable with mean</w:t>
+      </w:r>
+      <w:r>
+        <w:t xml:space="preserve"> </w:t>
+      </w:r>
+      <m:oMath>
+        <m:r>
+          <m:t>μ</m:t>
+        </m:r>
+      </m:oMath>
+      <w:r>
+        <w:t xml:space="preserve"> </w:t>
+      </w:r>
+      <w:r>
+        <w:t xml:space="preserve">and finite variance.</w:t>
+      </w:r>
+      <w:r>
+        <w:t xml:space="preserve"> </w:t>
+      </w:r>
+      <w:r>
+        <w:t xml:space="preserve">Then for every number</w:t>
+      </w:r>
+      <w:r>
+        <w:t xml:space="preserve"> </w:t>
+      </w:r>
+      <m:oMath>
+        <m:r>
+          <m:t>c</m:t>
+        </m:r>
+      </m:oMath>
+      <w:r>
+        <w:t xml:space="preserve">,</w:t>
+      </w:r>
+    </w:p>
+    <w:p>
+      <w:pPr>
+        <w:pStyle w:val="BodyText"/>
+      </w:pPr>
+      <w:bookmarkStart w:id="66" w:name="eq-constant-prediction-decompose"/>
+      <m:oMathPara>
+        <m:oMathParaPr>
+          <m:jc m:val="center"/>
+        </m:oMathParaPr>
+        <m:oMath>
+          <m:r>
+            <m:rPr>
+              <m:scr m:val="double-struck"/>
+              <m:sty m:val="p"/>
+            </m:rPr>
+            <m:t>E</m:t>
+          </m:r>
+          <m:r>
+            <m:t>​</m:t>
+          </m:r>
+          <m:d>
+            <m:dPr>
+              <m:begChr m:val="["/>
+              <m:sepChr m:val=""/>
+              <m:endChr m:val="]"/>
+              <m:grow/>
+            </m:dPr>
+            <m:e>
+              <m:sSup>
+                <m:e>
+                  <m:r>
+                    <m:t>​</m:t>
+                  </m:r>
+                  <m:d>
+                    <m:dPr>
+                      <m:begChr m:val="("/>
+                      <m:sepChr m:val=""/>
+                      <m:endChr m:val=")"/>
+                      <m:grow/>
+                    </m:dPr>
+                    <m:e>
+                      <m:r>
+                        <m:t>Y</m:t>
+                      </m:r>
+                      <m:r>
+                        <m:rPr>
+                          <m:sty m:val="p"/>
+                        </m:rPr>
+                        <m:t>−</m:t>
+                      </m:r>
+                      <m:r>
+                        <m:t>c</m:t>
+                      </m:r>
+                    </m:e>
+                  </m:d>
+                  <m:r>
+                    <m:t>​</m:t>
+                  </m:r>
+                </m:e>
+                <m:sup>
+                  <m:r>
+                    <m:t>2</m:t>
+                  </m:r>
+                </m:sup>
+              </m:sSup>
+            </m:e>
+          </m:d>
+          <m:r>
+            <m:t>​</m:t>
+          </m:r>
+          <m:r>
+            <m:rPr>
+              <m:sty m:val="p"/>
+            </m:rPr>
+            <m:t>=</m:t>
+          </m:r>
+          <m:r>
+            <m:rPr>
+              <m:sty m:val="p"/>
+            </m:rPr>
+            <m:t>Var</m:t>
+          </m:r>
+          <m:r>
+            <m:t>​</m:t>
+          </m:r>
+          <m:d>
+            <m:dPr>
+              <m:begChr m:val="("/>
+              <m:sepChr m:val=""/>
+              <m:endChr m:val=")"/>
+              <m:grow/>
+            </m:dPr>
+            <m:e>
+              <m:r>
                 <m:t>Y</m:t>
               </m:r>
             </m:e>
@@ -15456,9 +16444,9 @@
           </m:r>
         </m:oMath>
       </m:oMathPara>
-      <w:bookmarkEnd w:id="64"/>
+      <w:bookmarkEnd w:id="66"/>
     </w:p>
-    <w:bookmarkEnd w:id="65"/>
+    <w:bookmarkEnd w:id="67"/>
     <w:p>
       <w:pPr>
         <w:pStyle w:val="FirstParagraph"/>
@@ -16590,7 +17578,7 @@
         </m:oMath>
       </m:oMathPara>
     </w:p>
-    <w:bookmarkStart w:id="67" w:name="cor-best-constant"/>
+    <w:bookmarkStart w:id="69" w:name="cor-best-constant"/>
     <w:p>
       <w:pPr>
         <w:pStyle w:val="FirstParagraph"/>
@@ -16925,7 +17913,7 @@
       <w:r>
         <w:t xml:space="preserve"> </w:t>
       </w:r>
-      <w:hyperlink r:id="rId66">
+      <w:hyperlink r:id="rId68">
         <w:r>
           <w:rPr>
             <w:rStyle w:val="Hyperlink"/>
@@ -16937,7 +17925,7 @@
         <w:t xml:space="preserve">.</w:t>
       </w:r>
     </w:p>
-    <w:bookmarkEnd w:id="67"/>
+    <w:bookmarkEnd w:id="69"/>
     <w:p>
       <w:pPr>
         <w:pStyle w:val="BodyText"/>
@@ -17185,7 +18173,7 @@
         <w:t xml:space="preserve">.</w:t>
       </w:r>
     </w:p>
-    <w:bookmarkStart w:id="69" w:name="exm-best-constant-auto"/>
+    <w:bookmarkStart w:id="71" w:name="exm-best-constant-auto"/>
     <w:p>
       <w:pPr>
         <w:pStyle w:val="BodyText"/>
@@ -17195,7 +18183,7 @@
           <w:b/>
           <w:bCs/>
         </w:rPr>
-        <w:t xml:space="preserve">Example 9 (The best constant prediction of fuel economy)</w:t>
+        <w:t xml:space="preserve">Example 10 (The best constant prediction of fuel economy)</w:t>
       </w:r>
       <w:r>
         <w:t xml:space="preserve"> </w:t>
@@ -17206,7 +18194,7 @@
       <w:r>
         <w:t xml:space="preserve"> </w:t>
       </w:r>
-      <w:hyperlink r:id="rId68">
+      <w:hyperlink r:id="rId70">
         <w:r>
           <w:rPr>
             <w:rStyle w:val="Hyperlink"/>
@@ -17910,9 +18898,9 @@
         <w:t xml:space="preserve">.</w:t>
       </w:r>
     </w:p>
-    <w:bookmarkEnd w:id="69"/>
-    <w:bookmarkEnd w:id="70"/>
-    <w:bookmarkStart w:id="73" w:name="sec-bias-variance-prediction"/>
+    <w:bookmarkEnd w:id="71"/>
+    <w:bookmarkEnd w:id="72"/>
+    <w:bookmarkStart w:id="75" w:name="sec-bias-variance-prediction"/>
     <w:p>
       <w:pPr>
         <w:pStyle w:val="Heading2"/>
@@ -17921,7 +18909,7 @@
         <w:t xml:space="preserve">4 Independent noise plus a random variable</w:t>
       </w:r>
     </w:p>
-    <w:bookmarkStart w:id="71" w:name="thm-second-moment-noise-sum"/>
+    <w:bookmarkStart w:id="73" w:name="thm-second-moment-noise-sum"/>
     <w:p>
       <w:pPr>
         <w:pStyle w:val="FirstParagraph"/>
@@ -18324,7 +19312,7 @@
         </m:oMath>
       </m:oMathPara>
     </w:p>
-    <w:bookmarkEnd w:id="71"/>
+    <w:bookmarkEnd w:id="73"/>
     <w:p>
       <w:pPr>
         <w:pStyle w:val="FirstParagraph"/>
@@ -20975,7 +21963,7 @@
       <w:r>
         <w:t xml:space="preserve"> </w:t>
       </w:r>
-      <w:hyperlink r:id="rId72">
+      <w:hyperlink r:id="rId74">
         <w:r>
           <w:rPr>
             <w:rStyle w:val="Hyperlink"/>
@@ -20993,8 +21981,8 @@
         <w:t xml:space="preserve">with its exercise, worked example and definition of the residual variance.</w:t>
       </w:r>
     </w:p>
-    <w:bookmarkEnd w:id="73"/>
-    <w:bookmarkStart w:id="121" w:name="covariance"/>
+    <w:bookmarkEnd w:id="75"/>
+    <w:bookmarkStart w:id="123" w:name="covariance"/>
     <w:p>
       <w:pPr>
         <w:pStyle w:val="Heading2"/>
@@ -21003,7 +21991,7 @@
         <w:t xml:space="preserve">5 Covariance</w:t>
       </w:r>
     </w:p>
-    <w:bookmarkStart w:id="74" w:name="def-cov"/>
+    <w:bookmarkStart w:id="76" w:name="def-cov"/>
     <w:p>
       <w:pPr>
         <w:pStyle w:val="FirstParagraph"/>
@@ -21370,8 +22358,8 @@
         </m:oMath>
       </m:oMathPara>
     </w:p>
-    <w:bookmarkEnd w:id="74"/>
-    <w:bookmarkStart w:id="75" w:name="thm-alt-cov"/>
+    <w:bookmarkEnd w:id="76"/>
+    <w:bookmarkStart w:id="77" w:name="thm-alt-cov"/>
     <w:p>
       <w:pPr>
         <w:pStyle w:val="FirstParagraph"/>
@@ -21523,7 +22511,7 @@
         </m:oMath>
       </m:oMathPara>
     </w:p>
-    <w:bookmarkEnd w:id="75"/>
+    <w:bookmarkEnd w:id="77"/>
     <w:p>
       <w:pPr>
         <w:pStyle w:val="FirstParagraph"/>
@@ -22822,7 +23810,7 @@
         </m:oMath>
       </m:oMathPara>
     </w:p>
-    <w:bookmarkStart w:id="76" w:name="exm-alt-cov"/>
+    <w:bookmarkStart w:id="78" w:name="exm-alt-cov"/>
     <w:p>
       <w:pPr>
         <w:pStyle w:val="FirstParagraph"/>
@@ -22832,7 +23820,7 @@
           <w:b/>
           <w:bCs/>
         </w:rPr>
-        <w:t xml:space="preserve">Example 10 (Covariance of a binary exposure and outcome)</w:t>
+        <w:t xml:space="preserve">Example 11 (Covariance of a binary exposure and outcome)</w:t>
       </w:r>
       <w:r>
         <w:t xml:space="preserve"> </w:t>
@@ -23297,8 +24285,8 @@
         </m:oMath>
       </m:oMathPara>
     </w:p>
-    <w:bookmarkEnd w:id="76"/>
-    <w:bookmarkStart w:id="78" w:name="thm-indpt-uncorrelated"/>
+    <w:bookmarkEnd w:id="78"/>
+    <w:bookmarkStart w:id="80" w:name="thm-indpt-uncorrelated"/>
     <w:p>
       <w:pPr>
         <w:pStyle w:val="FirstParagraph"/>
@@ -23347,7 +24335,7 @@
       <w:r>
         <w:t xml:space="preserve"> </w:t>
       </w:r>
-      <w:hyperlink r:id="rId77">
+      <w:hyperlink r:id="rId79">
         <w:r>
           <w:rPr>
             <w:rStyle w:val="Hyperlink"/>
@@ -23648,7 +24636,7 @@
         <w:t xml:space="preserve">.</w:t>
       </w:r>
     </w:p>
-    <w:bookmarkEnd w:id="78"/>
+    <w:bookmarkEnd w:id="80"/>
     <w:p>
       <w:pPr>
         <w:pStyle w:val="BodyText"/>
@@ -23798,7 +24786,7 @@
       <w:r>
         <w:t xml:space="preserve"> </w:t>
       </w:r>
-      <w:hyperlink r:id="rId79">
+      <w:hyperlink r:id="rId81">
         <w:r>
           <w:rPr>
             <w:rStyle w:val="Hyperlink"/>
@@ -23812,7 +24800,7 @@
       <w:r>
         <w:t xml:space="preserve">(</w:t>
       </w:r>
-      <w:hyperlink r:id="rId80">
+      <w:hyperlink r:id="rId82">
         <w:r>
           <w:rPr>
             <w:rStyle w:val="Hyperlink"/>
@@ -23994,7 +24982,7 @@
       <w:r>
         <w:t xml:space="preserve"> </w:t>
       </w:r>
-      <w:hyperlink r:id="rId77">
+      <w:hyperlink r:id="rId79">
         <w:r>
           <w:rPr>
             <w:rStyle w:val="Hyperlink"/>
@@ -26518,7 +27506,7 @@
         </m:oMath>
       </m:oMathPara>
     </w:p>
-    <w:bookmarkStart w:id="82" w:name="exm-indpt-uncorrelated"/>
+    <w:bookmarkStart w:id="84" w:name="exm-indpt-uncorrelated"/>
     <w:p>
       <w:pPr>
         <w:pStyle w:val="FirstParagraph"/>
@@ -26528,7 +27516,7 @@
           <w:b/>
           <w:bCs/>
         </w:rPr>
-        <w:t xml:space="preserve">Example 11 (Two independent coin flips)</w:t>
+        <w:t xml:space="preserve">Example 12 (Two independent coin flips)</w:t>
       </w:r>
       <w:r>
         <w:t xml:space="preserve"> </w:t>
@@ -26585,7 +27573,7 @@
       <w:r>
         <w:t xml:space="preserve"> </w:t>
       </w:r>
-      <w:hyperlink r:id="rId81">
+      <w:hyperlink r:id="rId83">
         <w:r>
           <w:rPr>
             <w:rStyle w:val="Hyperlink"/>
@@ -27170,8 +28158,8 @@
         <w:t xml:space="preserve">requires.</w:t>
       </w:r>
     </w:p>
-    <w:bookmarkEnd w:id="82"/>
-    <w:bookmarkStart w:id="83" w:name="exm-uncorrelated-not-indpt"/>
+    <w:bookmarkEnd w:id="84"/>
+    <w:bookmarkStart w:id="85" w:name="exm-uncorrelated-not-indpt"/>
     <w:p>
       <w:pPr>
         <w:pStyle w:val="BodyText"/>
@@ -27181,7 +28169,7 @@
           <w:b/>
           <w:bCs/>
         </w:rPr>
-        <w:t xml:space="preserve">Example 12 (Zero covariance without independence)</w:t>
+        <w:t xml:space="preserve">Example 13 (Zero covariance without independence)</w:t>
       </w:r>
       <w:r>
         <w:t xml:space="preserve"> </w:t>
@@ -28408,8 +29396,8 @@
         </m:oMath>
       </m:oMathPara>
     </w:p>
-    <w:bookmarkEnd w:id="83"/>
-    <w:bookmarkStart w:id="84" w:name="def-correlation"/>
+    <w:bookmarkEnd w:id="85"/>
+    <w:bookmarkStart w:id="86" w:name="def-correlation"/>
     <w:p>
       <w:pPr>
         <w:pStyle w:val="FirstParagraph"/>
@@ -28681,7 +29669,7 @@
         </m:oMath>
       </m:oMathPara>
     </w:p>
-    <w:bookmarkEnd w:id="84"/>
+    <w:bookmarkEnd w:id="86"/>
     <w:p>
       <w:pPr>
         <w:pStyle w:val="FirstParagraph"/>
@@ -28737,7 +29725,7 @@
         <w:t xml:space="preserve">the sample (Pearson) correlation coefficient computed from data estimates it.</w:t>
       </w:r>
     </w:p>
-    <w:bookmarkStart w:id="85" w:name="exm-correlation"/>
+    <w:bookmarkStart w:id="87" w:name="exm-correlation"/>
     <w:p>
       <w:pPr>
         <w:pStyle w:val="BodyText"/>
@@ -28747,7 +29735,7 @@
           <w:b/>
           <w:bCs/>
         </w:rPr>
-        <w:t xml:space="preserve">Example 13 (Correlation of a binary exposure and outcome)</w:t>
+        <w:t xml:space="preserve">Example 14 (Correlation of a binary exposure and outcome)</w:t>
       </w:r>
       <w:r>
         <w:t xml:space="preserve"> </w:t>
@@ -28763,7 +29751,7 @@
           <w:rPr>
             <w:rStyle w:val="Hyperlink"/>
           </w:rPr>
-          <w:t xml:space="preserve">Example 10</w:t>
+          <w:t xml:space="preserve">Example 11</w:t>
         </w:r>
       </w:hyperlink>
       <w:r>
@@ -29384,8 +30372,8 @@
         </m:oMath>
       </m:oMathPara>
     </w:p>
-    <w:bookmarkEnd w:id="85"/>
-    <w:bookmarkStart w:id="86" w:name="def-uncorrelated"/>
+    <w:bookmarkEnd w:id="87"/>
+    <w:bookmarkStart w:id="88" w:name="def-uncorrelated"/>
     <w:p>
       <w:pPr>
         <w:pStyle w:val="FirstParagraph"/>
@@ -29636,7 +30624,7 @@
         </m:oMath>
       </m:oMathPara>
     </w:p>
-    <w:bookmarkEnd w:id="86"/>
+    <w:bookmarkEnd w:id="88"/>
     <w:p>
       <w:pPr>
         <w:pStyle w:val="FirstParagraph"/>
@@ -29679,7 +30667,7 @@
           <w:rPr>
             <w:rStyle w:val="Hyperlink"/>
           </w:rPr>
-          <w:t xml:space="preserve">Example 12</w:t>
+          <w:t xml:space="preserve">Example 13</w:t>
         </w:r>
       </w:hyperlink>
       <w:r>
@@ -29689,7 +30677,7 @@
         <w:t xml:space="preserve">shows the converse fails.</w:t>
       </w:r>
     </w:p>
-    <w:bookmarkStart w:id="87" w:name="exm-uncorrelated"/>
+    <w:bookmarkStart w:id="89" w:name="exm-uncorrelated"/>
     <w:p>
       <w:pPr>
         <w:pStyle w:val="BodyText"/>
@@ -29699,7 +30687,7 @@
           <w:b/>
           <w:bCs/>
         </w:rPr>
-        <w:t xml:space="preserve">Example 14 (Correlated and uncorrelated pairs)</w:t>
+        <w:t xml:space="preserve">Example 15 (Correlated and uncorrelated pairs)</w:t>
       </w:r>
       <w:r>
         <w:t xml:space="preserve"> </w:t>
@@ -29715,7 +30703,7 @@
           <w:rPr>
             <w:rStyle w:val="Hyperlink"/>
           </w:rPr>
-          <w:t xml:space="preserve">Example 12</w:t>
+          <w:t xml:space="preserve">Example 13</w:t>
         </w:r>
       </w:hyperlink>
       <w:r>
@@ -29838,7 +30826,7 @@
           <w:rPr>
             <w:rStyle w:val="Hyperlink"/>
           </w:rPr>
-          <w:t xml:space="preserve">Example 10</w:t>
+          <w:t xml:space="preserve">Example 11</w:t>
         </w:r>
       </w:hyperlink>
       <w:r>
@@ -29911,8 +30899,8 @@
         <w:t xml:space="preserve">so the binary exposure and outcome are not uncorrelated.</w:t>
       </w:r>
     </w:p>
-    <w:bookmarkEnd w:id="87"/>
-    <w:bookmarkStart w:id="88" w:name="cor-uncorrelated-cor-zero"/>
+    <w:bookmarkEnd w:id="89"/>
+    <w:bookmarkStart w:id="90" w:name="cor-uncorrelated-cor-zero"/>
     <w:p>
       <w:pPr>
         <w:pStyle w:val="BodyText"/>
@@ -30075,7 +31063,7 @@
         <w:t xml:space="preserve">.</w:t>
       </w:r>
     </w:p>
-    <w:bookmarkEnd w:id="88"/>
+    <w:bookmarkEnd w:id="90"/>
     <w:p>
       <w:pPr>
         <w:pStyle w:val="BodyText"/>
@@ -30475,7 +31463,7 @@
         <w:t xml:space="preserve">.</w:t>
       </w:r>
     </w:p>
-    <w:bookmarkStart w:id="89" w:name="def-cond-cov"/>
+    <w:bookmarkStart w:id="91" w:name="def-cond-cov"/>
     <w:p>
       <w:pPr>
         <w:pStyle w:val="BodyText"/>
@@ -30930,8 +31918,8 @@
         <w:t xml:space="preserve">.</w:t>
       </w:r>
     </w:p>
-    <w:bookmarkEnd w:id="89"/>
-    <w:bookmarkStart w:id="90" w:name="exm-cond-cov"/>
+    <w:bookmarkEnd w:id="91"/>
+    <w:bookmarkStart w:id="92" w:name="exm-cond-cov"/>
     <w:p>
       <w:pPr>
         <w:pStyle w:val="BodyText"/>
@@ -30941,7 +31929,7 @@
           <w:b/>
           <w:bCs/>
         </w:rPr>
-        <w:t xml:space="preserve">Example 15 (Conditional covariance of a variable with itself)</w:t>
+        <w:t xml:space="preserve">Example 16 (Conditional covariance of a variable with itself)</w:t>
       </w:r>
       <w:r>
         <w:t xml:space="preserve"> </w:t>
@@ -31202,8 +32190,8 @@
         <w:t xml:space="preserve">.</w:t>
       </w:r>
     </w:p>
-    <w:bookmarkEnd w:id="90"/>
-    <w:bookmarkStart w:id="91" w:name="thm-total-cov"/>
+    <w:bookmarkEnd w:id="92"/>
+    <w:bookmarkStart w:id="93" w:name="thm-total-cov"/>
     <w:p>
       <w:pPr>
         <w:pStyle w:val="BodyText"/>
@@ -31593,7 +32581,7 @@
         </m:oMath>
       </m:oMathPara>
     </w:p>
-    <w:bookmarkEnd w:id="91"/>
+    <w:bookmarkEnd w:id="93"/>
     <w:p>
       <w:pPr>
         <w:pStyle w:val="FirstParagraph"/>
@@ -34733,7 +35721,7 @@
         <w:t xml:space="preserve">.</w:t>
       </w:r>
     </w:p>
-    <w:bookmarkStart w:id="92" w:name="lem-cov-xx"/>
+    <w:bookmarkStart w:id="94" w:name="lem-cov-xx"/>
     <w:p>
       <w:pPr>
         <w:pStyle w:val="BodyText"/>
@@ -34743,7 +35731,7 @@
           <w:b/>
           <w:bCs/>
         </w:rPr>
-        <w:t xml:space="preserve">Lemma 1 (The covariance of a variable with itself is its variance)</w:t>
+        <w:t xml:space="preserve">Lemma 2 (The covariance of a variable with itself is its variance)</w:t>
       </w:r>
       <w:r>
         <w:t xml:space="preserve"> </w:t>
@@ -34898,7 +35886,7 @@
         </m:oMath>
       </m:oMathPara>
     </w:p>
-    <w:bookmarkEnd w:id="92"/>
+    <w:bookmarkEnd w:id="94"/>
     <w:p>
       <w:pPr>
         <w:pStyle w:val="FirstParagraph"/>
@@ -35305,7 +36293,7 @@
         </m:oMath>
       </m:oMathPara>
     </w:p>
-    <w:bookmarkStart w:id="93" w:name="def-cov-vec-x"/>
+    <w:bookmarkStart w:id="95" w:name="def-cov-vec-x"/>
     <w:p>
       <w:pPr>
         <w:pStyle w:val="FirstParagraph"/>
@@ -35406,8 +36394,8 @@
     $$</w:t>
       </w:r>
     </w:p>
-    <w:bookmarkEnd w:id="93"/>
-    <w:bookmarkStart w:id="94" w:name="thm-vcov-elements"/>
+    <w:bookmarkEnd w:id="95"/>
+    <w:bookmarkStart w:id="96" w:name="thm-vcov-elements"/>
     <w:p>
       <w:pPr>
         <w:pStyle w:val="FirstParagraph"/>
@@ -35584,7 +36572,7 @@
     $$</w:t>
       </w:r>
     </w:p>
-    <w:bookmarkEnd w:id="94"/>
+    <w:bookmarkEnd w:id="96"/>
     <w:p>
       <w:pPr>
         <w:pStyle w:val="FirstParagraph"/>
@@ -35815,7 +36803,7 @@
       <w:r>
         <w:t xml:space="preserve"> </w:t>
       </w:r>
-      <w:hyperlink r:id="rId95">
+      <w:hyperlink r:id="rId97">
         <w:r>
           <w:rPr>
             <w:rStyle w:val="Hyperlink"/>
@@ -35872,14 +36860,14 @@
           <w:rPr>
             <w:rStyle w:val="Hyperlink"/>
           </w:rPr>
-          <w:t xml:space="preserve">Lemma 1</w:t>
+          <w:t xml:space="preserve">Lemma 2</w:t>
         </w:r>
       </w:hyperlink>
       <w:r>
         <w:t xml:space="preserve">.</w:t>
       </w:r>
     </w:p>
-    <w:bookmarkStart w:id="96" w:name="thm-vcov-vec"/>
+    <w:bookmarkStart w:id="98" w:name="thm-vcov-vec"/>
     <w:p>
       <w:pPr>
         <w:pStyle w:val="FirstParagraph"/>
@@ -35905,7 +36893,7 @@
     $$</w:t>
       </w:r>
     </w:p>
-    <w:bookmarkEnd w:id="96"/>
+    <w:bookmarkEnd w:id="98"/>
     <w:p>
       <w:pPr>
         <w:pStyle w:val="FirstParagraph"/>
@@ -35956,7 +36944,7 @@
     $$</w:t>
       </w:r>
     </w:p>
-    <w:bookmarkStart w:id="97" w:name="thm-var-lincom"/>
+    <w:bookmarkStart w:id="99" w:name="thm-var-lincom"/>
     <w:p>
       <w:pPr>
         <w:pStyle w:val="FirstParagraph"/>
@@ -36017,7 +37005,7 @@
     $$</w:t>
       </w:r>
     </w:p>
-    <w:bookmarkEnd w:id="97"/>
+    <w:bookmarkEnd w:id="99"/>
     <w:p>
       <w:pPr>
         <w:pStyle w:val="FirstParagraph"/>
@@ -36149,7 +37137,7 @@
     $$</w:t>
       </w:r>
     </w:p>
-    <w:bookmarkStart w:id="98" w:name="cor-var-lincom2"/>
+    <w:bookmarkStart w:id="100" w:name="cor-var-lincom2"/>
     <w:p>
       <w:pPr>
         <w:pStyle w:val="FirstParagraph"/>
@@ -36426,7 +37414,7 @@
         </m:oMath>
       </m:oMathPara>
     </w:p>
-    <w:bookmarkEnd w:id="98"/>
+    <w:bookmarkEnd w:id="100"/>
     <w:p>
       <w:pPr>
         <w:pStyle w:val="FirstParagraph"/>
@@ -37934,7 +38922,7 @@
         </m:oMath>
       </m:oMathPara>
     </w:p>
-    <w:bookmarkStart w:id="99" w:name="cor-var-sum-indpt"/>
+    <w:bookmarkStart w:id="101" w:name="cor-var-sum-indpt"/>
     <w:p>
       <w:pPr>
         <w:pStyle w:val="FirstParagraph"/>
@@ -37983,7 +38971,7 @@
       <w:r>
         <w:t xml:space="preserve"> </w:t>
       </w:r>
-      <w:hyperlink r:id="rId77">
+      <w:hyperlink r:id="rId79">
         <w:r>
           <w:rPr>
             <w:rStyle w:val="Hyperlink"/>
@@ -38228,7 +39216,7 @@
         </m:oMath>
       </m:oMathPara>
     </w:p>
-    <w:bookmarkEnd w:id="99"/>
+    <w:bookmarkEnd w:id="101"/>
     <w:p>
       <w:pPr>
         <w:pStyle w:val="FirstParagraph"/>
@@ -38922,7 +39910,7 @@
         <w:t xml:space="preserve">is the case where that term is 0.</w:t>
       </w:r>
     </w:p>
-    <w:bookmarkStart w:id="102" w:name="thm-vcov-psd"/>
+    <w:bookmarkStart w:id="104" w:name="thm-vcov-psd"/>
     <w:p>
       <w:pPr>
         <w:pStyle w:val="BodyText"/>
@@ -39064,7 +40052,7 @@
       <w:r>
         <w:t xml:space="preserve"> </w:t>
       </w:r>
-      <w:hyperlink r:id="rId100">
+      <w:hyperlink r:id="rId102">
         <w:r>
           <w:rPr>
             <w:rStyle w:val="Hyperlink"/>
@@ -39081,7 +40069,7 @@
       <w:r>
         <w:t xml:space="preserve"> </w:t>
       </w:r>
-      <w:hyperlink r:id="rId101">
+      <w:hyperlink r:id="rId103">
         <w:r>
           <w:rPr>
             <w:rStyle w:val="Hyperlink"/>
@@ -39139,7 +40127,7 @@
         <w:t xml:space="preserve">$${\mathord{\smash[b]{\underset{\raise.3ex\hbox{$\scriptstyle\sim$}}{a}}\vphantom{a}}}^{\top} {\operatorname{Var}\mathopen{}\left(\mathord{\smash[b]{\underset{\raise.3ex\hbox{$\scriptstyle\sim$}}{X}}\vphantom{X}}\right)\mathclose{}} \mathord{\smash[b]{\underset{\raise.3ex\hbox{$\scriptstyle\sim$}}{a}}\vphantom{a}}\ge 0$$</w:t>
       </w:r>
     </w:p>
-    <w:bookmarkEnd w:id="102"/>
+    <w:bookmarkEnd w:id="104"/>
     <w:p>
       <w:pPr>
         <w:pStyle w:val="FirstParagraph"/>
@@ -39961,7 +40949,7 @@
         <w:t xml:space="preserve">).</w:t>
       </w:r>
     </w:p>
-    <w:bookmarkStart w:id="103" w:name="exm-vcov-psd"/>
+    <w:bookmarkStart w:id="105" w:name="exm-vcov-psd"/>
     <w:p>
       <w:pPr>
         <w:pStyle w:val="BodyText"/>
@@ -39971,7 +40959,7 @@
           <w:b/>
           <w:bCs/>
         </w:rPr>
-        <w:t xml:space="preserve">Example 16 (Two variance matrices that differ only in sign)</w:t>
+        <w:t xml:space="preserve">Example 17 (Two variance matrices that differ only in sign)</w:t>
       </w:r>
       <w:r>
         <w:t xml:space="preserve"> </w:t>
@@ -42327,7 +43315,7 @@
         <w:t xml:space="preserve">.</w:t>
       </w:r>
     </w:p>
-    <w:bookmarkEnd w:id="103"/>
+    <w:bookmarkEnd w:id="105"/>
     <w:p>
       <w:pPr>
         <w:pStyle w:val="BodyText"/>
@@ -42461,7 +43449,7 @@
         <w:t xml:space="preserve">has the larger spread.</w:t>
       </w:r>
     </w:p>
-    <w:bookmarkStart w:id="107" w:name="exm-vcov-singular"/>
+    <w:bookmarkStart w:id="109" w:name="exm-vcov-singular"/>
     <w:p>
       <w:pPr>
         <w:pStyle w:val="BodyText"/>
@@ -42471,7 +43459,7 @@
           <w:b/>
           <w:bCs/>
         </w:rPr>
-        <w:t xml:space="preserve">Example 17 (A variance matrix that is not positive definite)</w:t>
+        <w:t xml:space="preserve">Example 18 (A variance matrix that is not positive definite)</w:t>
       </w:r>
       <w:r>
         <w:t xml:space="preserve"> </w:t>
@@ -42673,7 +43661,7 @@
           <w:rPr>
             <w:rStyle w:val="Hyperlink"/>
           </w:rPr>
-          <w:t xml:space="preserve">Lemma 1</w:t>
+          <w:t xml:space="preserve">Lemma 2</w:t>
         </w:r>
       </w:hyperlink>
       <w:r>
@@ -42749,7 +43737,7 @@
       <w:r>
         <w:t xml:space="preserve"> </w:t>
       </w:r>
-      <w:hyperlink r:id="rId104">
+      <w:hyperlink r:id="rId106">
         <w:r>
           <w:rPr>
             <w:rStyle w:val="Hyperlink"/>
@@ -42766,7 +43754,7 @@
       <w:r>
         <w:t xml:space="preserve"> </w:t>
       </w:r>
-      <w:hyperlink r:id="rId105">
+      <w:hyperlink r:id="rId107">
         <w:r>
           <w:rPr>
             <w:rStyle w:val="Hyperlink"/>
@@ -42821,7 +43809,7 @@
       <w:r>
         <w:t xml:space="preserve"> </w:t>
       </w:r>
-      <w:hyperlink r:id="rId106">
+      <w:hyperlink r:id="rId108">
         <w:r>
           <w:rPr>
             <w:rStyle w:val="Hyperlink"/>
@@ -42833,8 +43821,8 @@
         <w:t xml:space="preserve">.</w:t>
       </w:r>
     </w:p>
-    <w:bookmarkEnd w:id="107"/>
-    <w:bookmarkStart w:id="109" w:name="cor-vcov-indpt-diagonal"/>
+    <w:bookmarkEnd w:id="109"/>
+    <w:bookmarkStart w:id="111" w:name="cor-vcov-indpt-diagonal"/>
     <w:p>
       <w:pPr>
         <w:pStyle w:val="BodyText"/>
@@ -43005,7 +43993,7 @@
       <w:r>
         <w:t xml:space="preserve"> </w:t>
       </w:r>
-      <w:hyperlink r:id="rId77">
+      <w:hyperlink r:id="rId79">
         <w:r>
           <w:rPr>
             <w:rStyle w:val="Hyperlink"/>
@@ -43062,7 +44050,7 @@
       <w:r>
         <w:t xml:space="preserve"> </w:t>
       </w:r>
-      <w:hyperlink r:id="rId108">
+      <w:hyperlink r:id="rId110">
         <w:r>
           <w:rPr>
             <w:rStyle w:val="Hyperlink"/>
@@ -43174,7 +44162,7 @@
         <w:t xml:space="preserve">.</w:t>
       </w:r>
     </w:p>
-    <w:bookmarkEnd w:id="109"/>
+    <w:bookmarkEnd w:id="111"/>
     <w:p>
       <w:pPr>
         <w:pStyle w:val="BodyText"/>
@@ -43623,14 +44611,14 @@
           <w:rPr>
             <w:rStyle w:val="Hyperlink"/>
           </w:rPr>
-          <w:t xml:space="preserve">Lemma 1</w:t>
+          <w:t xml:space="preserve">Lemma 2</w:t>
         </w:r>
       </w:hyperlink>
       <w:r>
         <w:t xml:space="preserve">.</w:t>
       </w:r>
     </w:p>
-    <w:bookmarkStart w:id="110" w:name="thm-cor-bounds"/>
+    <w:bookmarkStart w:id="112" w:name="thm-cor-bounds"/>
     <w:p>
       <w:pPr>
         <w:pStyle w:val="BodyText"/>
@@ -43879,7 +44867,7 @@
         </m:oMath>
       </m:oMathPara>
     </w:p>
-    <w:bookmarkEnd w:id="110"/>
+    <w:bookmarkEnd w:id="112"/>
     <w:p>
       <w:pPr>
         <w:pStyle w:val="FirstParagraph"/>
@@ -45101,7 +46089,7 @@
         <w:t xml:space="preserve">.</w:t>
       </w:r>
     </w:p>
-    <w:bookmarkStart w:id="118" w:name="exm-cor-auto"/>
+    <w:bookmarkStart w:id="120" w:name="exm-cor-auto"/>
     <w:p>
       <w:pPr>
         <w:pStyle w:val="BodyText"/>
@@ -45111,7 +46099,7 @@
           <w:b/>
           <w:bCs/>
         </w:rPr>
-        <w:t xml:space="preserve">Example 18 (Correlation of horsepower and fuel economy)</w:t>
+        <w:t xml:space="preserve">Example 19 (Correlation of horsepower and fuel economy)</w:t>
       </w:r>
       <w:r>
         <w:t xml:space="preserve"> </w:t>
@@ -45165,7 +46153,7 @@
       <w:r>
         <w:t xml:space="preserve"> </w:t>
       </w:r>
-      <w:hyperlink r:id="rId111">
+      <w:hyperlink r:id="rId113">
         <w:r>
           <w:rPr>
             <w:rStyle w:val="VerbatimChar"/>
@@ -45197,7 +46185,7 @@
       <w:r>
         <w:t xml:space="preserve"> </w:t>
       </w:r>
-      <w:hyperlink r:id="rId112">
+      <w:hyperlink r:id="rId114">
         <w:r>
           <w:rPr>
             <w:rStyle w:val="VerbatimChar"/>
@@ -45229,7 +46217,7 @@
       <w:r>
         <w:t xml:space="preserve"> </w:t>
       </w:r>
-      <w:hyperlink r:id="rId113">
+      <w:hyperlink r:id="rId115">
         <w:r>
           <w:rPr>
             <w:rStyle w:val="VerbatimChar"/>
@@ -46951,7 +47939,7 @@
       <w:tr>
         <w:tc>
           <w:tcPr/>
-          <w:bookmarkStart w:id="117" w:name="fig-cor-auto"/>
+          <w:bookmarkStart w:id="119" w:name="fig-cor-auto"/>
           <w:p>
             <w:pPr>
               <w:pStyle w:val="Compact"/>
@@ -46962,18 +47950,18 @@
                 <wp:inline>
                   <wp:extent cx="4620126" cy="3234088"/>
                   <wp:effectExtent b="0" l="0" r="0" t="0"/>
-                  <wp:docPr descr="" title="" id="115" name="Picture"/>
+                  <wp:docPr descr="" title="" id="117" name="Picture"/>
                   <a:graphic>
                     <a:graphicData uri="http://schemas.openxmlformats.org/drawingml/2006/picture">
                       <pic:pic>
                         <pic:nvPicPr>
-                          <pic:cNvPr descr="variance-covariance_files/figure-docx/fig-cor-auto-1.png" id="116" name="Picture"/>
+                          <pic:cNvPr descr="variance-covariance_files/figure-docx/fig-cor-auto-1.png" id="118" name="Picture"/>
                           <pic:cNvPicPr>
                             <a:picLocks noChangeArrowheads="1" noChangeAspect="1"/>
                           </pic:cNvPicPr>
                         </pic:nvPicPr>
                         <pic:blipFill>
-                          <a:blip r:embed="rId114"/>
+                          <a:blip r:embed="rId116"/>
                           <a:stretch>
                             <a:fillRect/>
                           </a:stretch>
@@ -47013,7 +48001,7 @@
               <w:t xml:space="preserve">Figure 2: Miles per gallon against horsepower for the cars in the Auto data. Cars with more horsepower tend to have lower fuel economy.</w:t>
             </w:r>
           </w:p>
-          <w:bookmarkEnd w:id="117"/>
+          <w:bookmarkEnd w:id="119"/>
         </w:tc>
       </w:tr>
     </w:tbl>
@@ -47160,7 +48148,7 @@
         <w:t xml:space="preserve">deviations by the same count, which cancels.</w:t>
       </w:r>
     </w:p>
-    <w:bookmarkEnd w:id="118"/>
+    <w:bookmarkEnd w:id="120"/>
     <w:p>
       <w:pPr>
         <w:pStyle w:val="BodyText"/>
@@ -47171,7 +48159,7 @@
       <w:r>
         <w:t xml:space="preserve"> </w:t>
       </w:r>
-      <w:hyperlink r:id="rId119">
+      <w:hyperlink r:id="rId121">
         <w:r>
           <w:rPr>
             <w:rStyle w:val="Hyperlink"/>
@@ -47188,7 +48176,7 @@
       <w:r>
         <w:t xml:space="preserve"> </w:t>
       </w:r>
-      <w:hyperlink r:id="rId120">
+      <w:hyperlink r:id="rId122">
         <w:r>
           <w:rPr>
             <w:rStyle w:val="Hyperlink"/>
@@ -47218,8 +48206,8 @@
         <w:t xml:space="preserve">.</w:t>
       </w:r>
     </w:p>
-    <w:bookmarkEnd w:id="121"/>
-    <w:bookmarkStart w:id="133" w:name="references"/>
+    <w:bookmarkEnd w:id="123"/>
+    <w:bookmarkStart w:id="135" w:name="references"/>
     <w:p>
       <w:pPr>
         <w:pStyle w:val="Heading2"/>
@@ -47228,8 +48216,8 @@
         <w:t xml:space="preserve">References</w:t>
       </w:r>
     </w:p>
-    <w:bookmarkStart w:id="132" w:name="refs"/>
-    <w:bookmarkStart w:id="122" w:name="ref-wikipedia_errors_and_residuals"/>
+    <w:bookmarkStart w:id="134" w:name="refs"/>
+    <w:bookmarkStart w:id="124" w:name="ref-wikipedia_errors_and_residuals"/>
     <w:p>
       <w:pPr>
         <w:pStyle w:val="Bibliography"/>
@@ -47285,8 +48273,8 @@
         </w:r>
       </w:hyperlink>
     </w:p>
-    <w:bookmarkEnd w:id="122"/>
-    <w:bookmarkStart w:id="124" w:name="ref-wikipedia_variance"/>
+    <w:bookmarkEnd w:id="124"/>
+    <w:bookmarkStart w:id="126" w:name="ref-wikipedia_variance"/>
     <w:p>
       <w:pPr>
         <w:pStyle w:val="Bibliography"/>
@@ -47333,7 +48321,7 @@
       <w:r>
         <w:t xml:space="preserve"> </w:t>
       </w:r>
-      <w:hyperlink r:id="rId123">
+      <w:hyperlink r:id="rId125">
         <w:r>
           <w:rPr>
             <w:rStyle w:val="Hyperlink"/>
@@ -47342,8 +48330,8 @@
         </w:r>
       </w:hyperlink>
     </w:p>
-    <w:bookmarkEnd w:id="124"/>
-    <w:bookmarkStart w:id="126" w:name="ref-wikipedia_covariance"/>
+    <w:bookmarkEnd w:id="126"/>
+    <w:bookmarkStart w:id="128" w:name="ref-wikipedia_covariance"/>
     <w:p>
       <w:pPr>
         <w:pStyle w:val="Bibliography"/>
@@ -47390,7 +48378,7 @@
       <w:r>
         <w:t xml:space="preserve"> </w:t>
       </w:r>
-      <w:hyperlink r:id="rId125">
+      <w:hyperlink r:id="rId127">
         <w:r>
           <w:rPr>
             <w:rStyle w:val="Hyperlink"/>
@@ -47399,8 +48387,8 @@
         </w:r>
       </w:hyperlink>
     </w:p>
-    <w:bookmarkEnd w:id="126"/>
-    <w:bookmarkStart w:id="127" w:name="ref-billingsley1995probability"/>
+    <w:bookmarkEnd w:id="128"/>
+    <w:bookmarkStart w:id="129" w:name="ref-billingsley1995probability"/>
     <w:p>
       <w:pPr>
         <w:pStyle w:val="Bibliography"/>
@@ -47431,8 +48419,8 @@
         <w:t xml:space="preserve">, 3rd ed. in Wiley series in probability and mathematical statistics. New York: Wiley, 1995.</w:t>
       </w:r>
     </w:p>
-    <w:bookmarkEnd w:id="127"/>
-    <w:bookmarkStart w:id="129" w:name="ref-CaseBerg01"/>
+    <w:bookmarkEnd w:id="129"/>
+    <w:bookmarkStart w:id="131" w:name="ref-CaseBerg01"/>
     <w:p>
       <w:pPr>
         <w:pStyle w:val="Bibliography"/>
@@ -47465,7 +48453,7 @@
       <w:r>
         <w:t xml:space="preserve"> </w:t>
       </w:r>
-      <w:hyperlink r:id="rId128">
+      <w:hyperlink r:id="rId130">
         <w:r>
           <w:rPr>
             <w:rStyle w:val="Hyperlink"/>
@@ -47474,8 +48462,8 @@
         </w:r>
       </w:hyperlink>
     </w:p>
-    <w:bookmarkEnd w:id="129"/>
-    <w:bookmarkStart w:id="131" w:name="ref-fiveminuteai_probstat"/>
+    <w:bookmarkEnd w:id="131"/>
+    <w:bookmarkStart w:id="133" w:name="ref-fiveminuteai_probstat"/>
     <w:p>
       <w:pPr>
         <w:pStyle w:val="Bibliography"/>
@@ -47507,7 +48495,7 @@
       <w:r>
         <w:t xml:space="preserve"> </w:t>
       </w:r>
-      <w:hyperlink r:id="rId130">
+      <w:hyperlink r:id="rId132">
         <w:r>
           <w:rPr>
             <w:rStyle w:val="Hyperlink"/>
@@ -47516,9 +48504,9 @@
         </w:r>
       </w:hyperlink>
     </w:p>
-    <w:bookmarkEnd w:id="131"/>
-    <w:bookmarkEnd w:id="132"/>
     <w:bookmarkEnd w:id="133"/>
+    <w:bookmarkEnd w:id="134"/>
+    <w:bookmarkEnd w:id="135"/>
     <w:sectPr>
       <w:footnotePr>
         <w:numRestart w:val="eachSect"/>

</xml_diff>